<commit_message>
Nest pasture random intercepts within year across analysis models
</commit_message>
<xml_diff>
--- a/AFRI_Variables_Models_and_Datasets.docx
+++ b/AFRI_Variables_Models_and_Datasets.docx
@@ -135,7 +135,7 @@
         <w:rPr>
           <w:rStyle w:val="VerbatimChar"/>
         </w:rPr>
-        <w:t xml:space="preserve">response ~ TRT * SR + (1 | Year) + (1 | Pasture)</w:t>
+        <w:t xml:space="preserve">response ~ TRT * SR + (1 | Year) + (1 | Year:Pasture)</w:t>
       </w:r>
       <w:r>
         <w:br/>
@@ -156,7 +156,7 @@
         <w:rPr>
           <w:rStyle w:val="VerbatimChar"/>
         </w:rPr>
-        <w:t xml:space="preserve">response ~ TRT * SR + Period + (1 | Year) + (1 | Pasture)</w:t>
+        <w:t xml:space="preserve">response ~ TRT * SR + Period + (1 | Year) + (1 | Year:Pasture)</w:t>
       </w:r>
       <w:r>
         <w:br/>
@@ -177,7 +177,7 @@
         <w:rPr>
           <w:rStyle w:val="VerbatimChar"/>
         </w:rPr>
-        <w:t xml:space="preserve">response ~ TRT * SR + Period + (1 | Year) + (1 | Pasture)</w:t>
+        <w:t xml:space="preserve">response ~ TRT * SR + Period + (1 | Year) + (1 | Year:Pasture)</w:t>
       </w:r>
       <w:r>
         <w:br/>
@@ -198,7 +198,7 @@
         <w:rPr>
           <w:rStyle w:val="VerbatimChar"/>
         </w:rPr>
-        <w:t xml:space="preserve">response ~ TRT * SR + RotationPeriod + (1 | Year) + (1 | Pasture)</w:t>
+        <w:t xml:space="preserve">response ~ TRT * SR + RotationPeriod + (1 | Year) + (1 | Year:Pasture)</w:t>
       </w:r>
       <w:r>
         <w:br/>
@@ -219,7 +219,7 @@
         <w:rPr>
           <w:rStyle w:val="VerbatimChar"/>
         </w:rPr>
-        <w:t xml:space="preserve">FBW ~ IBW + TRT * SR + (1 | Year) + (1 | Pasture_ID)</w:t>
+        <w:t xml:space="preserve">FBW ~ IBW + TRT * SR + (1 | Year) + (1 | Year:Pasture_ID)</w:t>
       </w:r>
       <w:r>
         <w:br/>
@@ -240,7 +240,7 @@
         <w:rPr>
           <w:rStyle w:val="VerbatimChar"/>
         </w:rPr>
-        <w:t xml:space="preserve">response ~ TRT * SR + Period + (1 | Year) + (1 | Pasture)</w:t>
+        <w:t xml:space="preserve">response ~ TRT * SR + Period + (1 | Year) + (1 | Year:Pasture)</w:t>
       </w:r>
     </w:p>
     <w:p>

</xml_diff>

<commit_message>
Revert "Nest pasture random intercepts within year across analysis models"
This reverts commit 1f91c5c5eec8dc64964561c2758099c3c30a8794.
</commit_message>
<xml_diff>
--- a/AFRI_Variables_Models_and_Datasets.docx
+++ b/AFRI_Variables_Models_and_Datasets.docx
@@ -135,7 +135,7 @@
         <w:rPr>
           <w:rStyle w:val="VerbatimChar"/>
         </w:rPr>
-        <w:t xml:space="preserve">response ~ TRT * SR + (1 | Year) + (1 | Year:Pasture)</w:t>
+        <w:t xml:space="preserve">response ~ TRT * SR + (1 | Year) + (1 | Pasture)</w:t>
       </w:r>
       <w:r>
         <w:br/>
@@ -156,7 +156,7 @@
         <w:rPr>
           <w:rStyle w:val="VerbatimChar"/>
         </w:rPr>
-        <w:t xml:space="preserve">response ~ TRT * SR + Period + (1 | Year) + (1 | Year:Pasture)</w:t>
+        <w:t xml:space="preserve">response ~ TRT * SR + Period + (1 | Year) + (1 | Pasture)</w:t>
       </w:r>
       <w:r>
         <w:br/>
@@ -177,7 +177,7 @@
         <w:rPr>
           <w:rStyle w:val="VerbatimChar"/>
         </w:rPr>
-        <w:t xml:space="preserve">response ~ TRT * SR + Period + (1 | Year) + (1 | Year:Pasture)</w:t>
+        <w:t xml:space="preserve">response ~ TRT * SR + Period + (1 | Year) + (1 | Pasture)</w:t>
       </w:r>
       <w:r>
         <w:br/>
@@ -198,7 +198,7 @@
         <w:rPr>
           <w:rStyle w:val="VerbatimChar"/>
         </w:rPr>
-        <w:t xml:space="preserve">response ~ TRT * SR + RotationPeriod + (1 | Year) + (1 | Year:Pasture)</w:t>
+        <w:t xml:space="preserve">response ~ TRT * SR + RotationPeriod + (1 | Year) + (1 | Pasture)</w:t>
       </w:r>
       <w:r>
         <w:br/>
@@ -219,7 +219,7 @@
         <w:rPr>
           <w:rStyle w:val="VerbatimChar"/>
         </w:rPr>
-        <w:t xml:space="preserve">FBW ~ IBW + TRT * SR + (1 | Year) + (1 | Year:Pasture_ID)</w:t>
+        <w:t xml:space="preserve">FBW ~ IBW + TRT * SR + (1 | Year) + (1 | Pasture_ID)</w:t>
       </w:r>
       <w:r>
         <w:br/>
@@ -240,7 +240,7 @@
         <w:rPr>
           <w:rStyle w:val="VerbatimChar"/>
         </w:rPr>
-        <w:t xml:space="preserve">response ~ TRT * SR + Period + (1 | Year) + (1 | Year:Pasture)</w:t>
+        <w:t xml:space="preserve">response ~ TRT * SR + Period + (1 | Year) + (1 | Pasture)</w:t>
       </w:r>
     </w:p>
     <w:p>

</xml_diff>

<commit_message>
Include full treatment stocking rate and period interactions
</commit_message>
<xml_diff>
--- a/AFRI_Variables_Models_and_Datasets.docx
+++ b/AFRI_Variables_Models_and_Datasets.docx
@@ -26,7 +26,7 @@
           <w:b/>
           <w:bCs/>
         </w:rPr>
-        <w:t xml:space="preserve">additive-period model specifications</w:t>
+        <w:t xml:space="preserve">full period-interaction model specifications</w:t>
       </w:r>
       <w:r>
         <w:t xml:space="preserve">. The</w:t>
@@ -156,7 +156,7 @@
         <w:rPr>
           <w:rStyle w:val="VerbatimChar"/>
         </w:rPr>
-        <w:t xml:space="preserve">response ~ TRT * SR + Period + (1 | Year) + (1 | Pasture)</w:t>
+        <w:t xml:space="preserve">response ~ TRT * SR * Period + (1 | Year) + (1 | Pasture)</w:t>
       </w:r>
       <w:r>
         <w:br/>
@@ -177,7 +177,7 @@
         <w:rPr>
           <w:rStyle w:val="VerbatimChar"/>
         </w:rPr>
-        <w:t xml:space="preserve">response ~ TRT * SR + Period + (1 | Year) + (1 | Pasture)</w:t>
+        <w:t xml:space="preserve">response ~ TRT * SR * Period + (1 | Year) + (1 | Pasture)</w:t>
       </w:r>
       <w:r>
         <w:br/>
@@ -198,7 +198,7 @@
         <w:rPr>
           <w:rStyle w:val="VerbatimChar"/>
         </w:rPr>
-        <w:t xml:space="preserve">response ~ TRT * SR + RotationPeriod + (1 | Year) + (1 | Pasture)</w:t>
+        <w:t xml:space="preserve">response ~ TRT * SR * RotationPeriod + (1 | Year) + (1 | Pasture)</w:t>
       </w:r>
       <w:r>
         <w:br/>
@@ -240,7 +240,7 @@
         <w:rPr>
           <w:rStyle w:val="VerbatimChar"/>
         </w:rPr>
-        <w:t xml:space="preserve">response ~ TRT * SR + Period + (1 | Year) + (1 | Pasture)</w:t>
+        <w:t xml:space="preserve">response ~ TRT * SR * Period + (1 | Year) + (1 | Pasture)</w:t>
       </w:r>
     </w:p>
     <w:p>
@@ -314,7 +314,7 @@
         <w:t xml:space="preserve"> </w:t>
       </w:r>
       <w:r>
-        <w:t xml:space="preserve">as a fixed main effect. They contain no interactions between treatment or stocking rate and period. The baseline S model and final-weight ANCOVA C model are unchanged.</w:t>
+        <w:t xml:space="preserve">as a fixed main effect. They include all interactions between treatment, stocking rate, and period. The baseline S model and final-weight ANCOVA C model are unchanged.</w:t>
       </w:r>
     </w:p>
     <w:p>
@@ -7619,7 +7619,7 @@
         <w:pStyle w:val="BodyText"/>
       </w:pPr>
       <w:r>
-        <w:t xml:space="preserve">This inventory reflects the current requested additive-period models.</w:t>
+        <w:t xml:space="preserve">This inventory reflects the current requested full period-interaction models.</w:t>
       </w:r>
       <w:r>
         <w:t xml:space="preserve"> </w:t>

</xml_diff>

<commit_message>
Reuse original monthly Gaussian source models for Table 1
</commit_message>
<xml_diff>
--- a/AFRI_Variables_Models_and_Datasets.docx
+++ b/AFRI_Variables_Models_and_Datasets.docx
@@ -82,7 +82,7 @@
         <w:pStyle w:val="BodyText"/>
       </w:pPr>
       <w:r>
-        <w:t xml:space="preserve">Table 1 uses the original quality-controlled animal-year behavior and movement summaries. The final workbook keeps Table_1_Grazing_Behaviors first, routes season animal responses to Table2 and land responses to WholeSeason_Additional, and retains Pasture_RGP and Animal_RGP. Outside-RGP active-area and combined-gas responses remain removed. Existing files from older runs are not deleted. Run a fresh R session and rerun all data and model chunks.</w:t>
+        <w:t xml:space="preserve">Table 1 reuses the four original monthly Gaussian ML source fits, EMMs, SEs and Type III Wald tests. It does not refit season averages or select Gamma for these responses. The final workbook keeps Table_1_Grazing_Behaviors first, routes season animal responses to Table2 and land responses to WholeSeason_Additional, and retains Pasture_RGP and Animal_RGP. Outside-RGP active-area and combined-gas responses remain removed. Existing files from older runs are not deleted. Run a fresh R session and rerun all data and model chunks.</w:t>
       </w:r>
     </w:p>
     <w:tbl>
@@ -227,7 +227,7 @@
               <w:jc w:val="left"/>
             </w:pPr>
             <w:r>
-              <w:t xml:space="preserve">season / animal</w:t>
+              <w:t xml:space="preserve">monthly / animal</w:t>
             </w:r>
           </w:p>
         </w:tc>
@@ -254,7 +254,7 @@
               <w:rPr>
                 <w:rStyle w:val="VerbatimChar"/>
               </w:rPr>
-              <w:t xml:space="preserve">Grazing_h ~ TRT * SR + (1 \| Year) + (1 \| Pasture)</w:t>
+              <w:t xml:space="preserve">mean_hours ~ TRT * SR + (1 \| Year) + (1 \| Pasture)</w:t>
             </w:r>
           </w:p>
         </w:tc>
@@ -269,19 +269,19 @@
               <w:rPr>
                 <w:rStyle w:val="VerbatimChar"/>
               </w:rPr>
-              <w:t xml:space="preserve">Table1_Grazing_Behaviors</w:t>
-            </w:r>
-          </w:p>
-        </w:tc>
-        <w:tc>
-          <w:tcPr/>
-          <w:p>
-            <w:pPr>
-              <w:pStyle w:val="Compact"/>
-              <w:jc w:val="left"/>
-            </w:pPr>
-            <w:r>
-              <w:t xml:space="preserve">Canonical manuscript model</w:t>
+              <w:t xml:space="preserve">Grazing_model_data</w:t>
+            </w:r>
+          </w:p>
+        </w:tc>
+        <w:tc>
+          <w:tcPr/>
+          <w:p>
+            <w:pPr>
+              <w:pStyle w:val="Compact"/>
+              <w:jc w:val="left"/>
+            </w:pPr>
+            <w:r>
+              <w:t xml:space="preserve">Reused original monthly ML source model</w:t>
             </w:r>
           </w:p>
         </w:tc>
@@ -322,7 +322,7 @@
               <w:jc w:val="left"/>
             </w:pPr>
             <w:r>
-              <w:t xml:space="preserve">season / animal</w:t>
+              <w:t xml:space="preserve">monthly / animal</w:t>
             </w:r>
           </w:p>
         </w:tc>
@@ -349,7 +349,7 @@
               <w:rPr>
                 <w:rStyle w:val="VerbatimChar"/>
               </w:rPr>
-              <w:t xml:space="preserve">Resting_h ~ TRT * SR + (1 \| Year) + (1 \| Pasture)</w:t>
+              <w:t xml:space="preserve">mean_hours ~ TRT * SR + (1 \| Year) + (1 \| Pasture)</w:t>
             </w:r>
           </w:p>
         </w:tc>
@@ -364,19 +364,19 @@
               <w:rPr>
                 <w:rStyle w:val="VerbatimChar"/>
               </w:rPr>
-              <w:t xml:space="preserve">Table1_Grazing_Behaviors</w:t>
-            </w:r>
-          </w:p>
-        </w:tc>
-        <w:tc>
-          <w:tcPr/>
-          <w:p>
-            <w:pPr>
-              <w:pStyle w:val="Compact"/>
-              <w:jc w:val="left"/>
-            </w:pPr>
-            <w:r>
-              <w:t xml:space="preserve">Canonical manuscript model</w:t>
+              <w:t xml:space="preserve">Resting_model_data</w:t>
+            </w:r>
+          </w:p>
+        </w:tc>
+        <w:tc>
+          <w:tcPr/>
+          <w:p>
+            <w:pPr>
+              <w:pStyle w:val="Compact"/>
+              <w:jc w:val="left"/>
+            </w:pPr>
+            <w:r>
+              <w:t xml:space="preserve">Reused original monthly ML source model</w:t>
             </w:r>
           </w:p>
         </w:tc>
@@ -417,19 +417,19 @@
               <w:jc w:val="left"/>
             </w:pPr>
             <w:r>
-              <w:t xml:space="preserve">season / animal</w:t>
-            </w:r>
-          </w:p>
-        </w:tc>
-        <w:tc>
-          <w:tcPr/>
-          <w:p>
-            <w:pPr>
-              <w:pStyle w:val="Compact"/>
-              <w:jc w:val="left"/>
-            </w:pPr>
-            <w:r>
-              <w:t xml:space="preserve">auto_positive</w:t>
+              <w:t xml:space="preserve">monthly / animal</w:t>
+            </w:r>
+          </w:p>
+        </w:tc>
+        <w:tc>
+          <w:tcPr/>
+          <w:p>
+            <w:pPr>
+              <w:pStyle w:val="Compact"/>
+              <w:jc w:val="left"/>
+            </w:pPr>
+            <w:r>
+              <w:t xml:space="preserve">gaussian</w:t>
             </w:r>
           </w:p>
         </w:tc>
@@ -444,7 +444,7 @@
               <w:rPr>
                 <w:rStyle w:val="VerbatimChar"/>
               </w:rPr>
-              <w:t xml:space="preserve">Traveling_h ~ TRT * SR + (1 \| Year) + (1 \| Pasture)</w:t>
+              <w:t xml:space="preserve">mean_hours ~ TRT * SR + (1 \| Year) + (1 \| Pasture)</w:t>
             </w:r>
           </w:p>
         </w:tc>
@@ -459,19 +459,19 @@
               <w:rPr>
                 <w:rStyle w:val="VerbatimChar"/>
               </w:rPr>
-              <w:t xml:space="preserve">Table1_Grazing_Behaviors</w:t>
-            </w:r>
-          </w:p>
-        </w:tc>
-        <w:tc>
-          <w:tcPr/>
-          <w:p>
-            <w:pPr>
-              <w:pStyle w:val="Compact"/>
-              <w:jc w:val="left"/>
-            </w:pPr>
-            <w:r>
-              <w:t xml:space="preserve">Canonical manuscript model</w:t>
+              <w:t xml:space="preserve">Traveling_model_data</w:t>
+            </w:r>
+          </w:p>
+        </w:tc>
+        <w:tc>
+          <w:tcPr/>
+          <w:p>
+            <w:pPr>
+              <w:pStyle w:val="Compact"/>
+              <w:jc w:val="left"/>
+            </w:pPr>
+            <w:r>
+              <w:t xml:space="preserve">Reused original monthly ML source model</w:t>
             </w:r>
           </w:p>
         </w:tc>
@@ -512,19 +512,19 @@
               <w:jc w:val="left"/>
             </w:pPr>
             <w:r>
-              <w:t xml:space="preserve">season / animal</w:t>
-            </w:r>
-          </w:p>
-        </w:tc>
-        <w:tc>
-          <w:tcPr/>
-          <w:p>
-            <w:pPr>
-              <w:pStyle w:val="Compact"/>
-              <w:jc w:val="left"/>
-            </w:pPr>
-            <w:r>
-              <w:t xml:space="preserve">auto_positive</w:t>
+              <w:t xml:space="preserve">monthly / animal</w:t>
+            </w:r>
+          </w:p>
+        </w:tc>
+        <w:tc>
+          <w:tcPr/>
+          <w:p>
+            <w:pPr>
+              <w:pStyle w:val="Compact"/>
+              <w:jc w:val="left"/>
+            </w:pPr>
+            <w:r>
+              <w:t xml:space="preserve">gaussian</w:t>
             </w:r>
           </w:p>
         </w:tc>
@@ -554,19 +554,19 @@
               <w:rPr>
                 <w:rStyle w:val="VerbatimChar"/>
               </w:rPr>
-              <w:t xml:space="preserve">Table1_Grazing_Behaviors</w:t>
-            </w:r>
-          </w:p>
-        </w:tc>
-        <w:tc>
-          <w:tcPr/>
-          <w:p>
-            <w:pPr>
-              <w:pStyle w:val="Compact"/>
-              <w:jc w:val="left"/>
-            </w:pPr>
-            <w:r>
-              <w:t xml:space="preserve">Canonical manuscript model</w:t>
+              <w:t xml:space="preserve">Monthly_DDT_filtered</w:t>
+            </w:r>
+          </w:p>
+        </w:tc>
+        <w:tc>
+          <w:tcPr/>
+          <w:p>
+            <w:pPr>
+              <w:pStyle w:val="Compact"/>
+              <w:jc w:val="left"/>
+            </w:pPr>
+            <w:r>
+              <w:t xml:space="preserve">Reused original monthly ML source model</w:t>
             </w:r>
           </w:p>
         </w:tc>
@@ -17697,13 +17697,239 @@
       </w:tcPr>
     </w:tblStylePr>
   </w:style>
-  <w:style w:type="paragraph" w:customStyle="1" w:styleId="SourceCode">
+  <w:style w:customStyle="1" w:styleId="SourceCode" w:type="paragraph">
     <w:name w:val="Source Code"/>
     <w:basedOn w:val="Normal"/>
     <w:link w:val="VerbatimChar"/>
     <w:pPr>
       <w:wordWrap w:val="off"/>
     </w:pPr>
+  </w:style>
+  <w:style w:customStyle="1" w:styleId="KeywordTok" w:type="character">
+    <w:name w:val="KeywordTok"/>
+    <w:basedOn w:val="VerbatimChar"/>
+    <w:rPr>
+      <w:b/>
+      <w:color w:val="007020"/>
+    </w:rPr>
+  </w:style>
+  <w:style w:customStyle="1" w:styleId="DataTypeTok" w:type="character">
+    <w:name w:val="DataTypeTok"/>
+    <w:basedOn w:val="VerbatimChar"/>
+    <w:rPr>
+      <w:color w:val="902000"/>
+    </w:rPr>
+  </w:style>
+  <w:style w:customStyle="1" w:styleId="DecValTok" w:type="character">
+    <w:name w:val="DecValTok"/>
+    <w:basedOn w:val="VerbatimChar"/>
+    <w:rPr>
+      <w:color w:val="40a070"/>
+    </w:rPr>
+  </w:style>
+  <w:style w:customStyle="1" w:styleId="BaseNTok" w:type="character">
+    <w:name w:val="BaseNTok"/>
+    <w:basedOn w:val="VerbatimChar"/>
+    <w:rPr>
+      <w:color w:val="40a070"/>
+    </w:rPr>
+  </w:style>
+  <w:style w:customStyle="1" w:styleId="FloatTok" w:type="character">
+    <w:name w:val="FloatTok"/>
+    <w:basedOn w:val="VerbatimChar"/>
+    <w:rPr>
+      <w:color w:val="40a070"/>
+    </w:rPr>
+  </w:style>
+  <w:style w:customStyle="1" w:styleId="ConstantTok" w:type="character">
+    <w:name w:val="ConstantTok"/>
+    <w:basedOn w:val="VerbatimChar"/>
+    <w:rPr>
+      <w:color w:val="880000"/>
+    </w:rPr>
+  </w:style>
+  <w:style w:customStyle="1" w:styleId="CharTok" w:type="character">
+    <w:name w:val="CharTok"/>
+    <w:basedOn w:val="VerbatimChar"/>
+    <w:rPr>
+      <w:color w:val="4070a0"/>
+    </w:rPr>
+  </w:style>
+  <w:style w:customStyle="1" w:styleId="SpecialCharTok" w:type="character">
+    <w:name w:val="SpecialCharTok"/>
+    <w:basedOn w:val="VerbatimChar"/>
+    <w:rPr>
+      <w:color w:val="4070a0"/>
+    </w:rPr>
+  </w:style>
+  <w:style w:customStyle="1" w:styleId="StringTok" w:type="character">
+    <w:name w:val="StringTok"/>
+    <w:basedOn w:val="VerbatimChar"/>
+    <w:rPr>
+      <w:color w:val="4070a0"/>
+    </w:rPr>
+  </w:style>
+  <w:style w:customStyle="1" w:styleId="VerbatimStringTok" w:type="character">
+    <w:name w:val="VerbatimStringTok"/>
+    <w:basedOn w:val="VerbatimChar"/>
+    <w:rPr>
+      <w:color w:val="4070a0"/>
+    </w:rPr>
+  </w:style>
+  <w:style w:customStyle="1" w:styleId="SpecialStringTok" w:type="character">
+    <w:name w:val="SpecialStringTok"/>
+    <w:basedOn w:val="VerbatimChar"/>
+    <w:rPr>
+      <w:color w:val="bb6688"/>
+    </w:rPr>
+  </w:style>
+  <w:style w:customStyle="1" w:styleId="ImportTok" w:type="character">
+    <w:name w:val="ImportTok"/>
+    <w:basedOn w:val="VerbatimChar"/>
+    <w:rPr>
+      <w:b/>
+      <w:color w:val="008000"/>
+    </w:rPr>
+  </w:style>
+  <w:style w:customStyle="1" w:styleId="CommentTok" w:type="character">
+    <w:name w:val="CommentTok"/>
+    <w:basedOn w:val="VerbatimChar"/>
+    <w:rPr>
+      <w:i/>
+      <w:color w:val="60a0b0"/>
+    </w:rPr>
+  </w:style>
+  <w:style w:customStyle="1" w:styleId="DocumentationTok" w:type="character">
+    <w:name w:val="DocumentationTok"/>
+    <w:basedOn w:val="VerbatimChar"/>
+    <w:rPr>
+      <w:i/>
+      <w:color w:val="ba2121"/>
+    </w:rPr>
+  </w:style>
+  <w:style w:customStyle="1" w:styleId="AnnotationTok" w:type="character">
+    <w:name w:val="AnnotationTok"/>
+    <w:basedOn w:val="VerbatimChar"/>
+    <w:rPr>
+      <w:b/>
+      <w:i/>
+      <w:color w:val="60a0b0"/>
+    </w:rPr>
+  </w:style>
+  <w:style w:customStyle="1" w:styleId="CommentVarTok" w:type="character">
+    <w:name w:val="CommentVarTok"/>
+    <w:basedOn w:val="VerbatimChar"/>
+    <w:rPr>
+      <w:b/>
+      <w:i/>
+      <w:color w:val="60a0b0"/>
+    </w:rPr>
+  </w:style>
+  <w:style w:customStyle="1" w:styleId="OtherTok" w:type="character">
+    <w:name w:val="OtherTok"/>
+    <w:basedOn w:val="VerbatimChar"/>
+    <w:rPr>
+      <w:color w:val="007020"/>
+    </w:rPr>
+  </w:style>
+  <w:style w:customStyle="1" w:styleId="FunctionTok" w:type="character">
+    <w:name w:val="FunctionTok"/>
+    <w:basedOn w:val="VerbatimChar"/>
+    <w:rPr>
+      <w:color w:val="06287e"/>
+    </w:rPr>
+  </w:style>
+  <w:style w:customStyle="1" w:styleId="VariableTok" w:type="character">
+    <w:name w:val="VariableTok"/>
+    <w:basedOn w:val="VerbatimChar"/>
+    <w:rPr>
+      <w:color w:val="19177c"/>
+    </w:rPr>
+  </w:style>
+  <w:style w:customStyle="1" w:styleId="ControlFlowTok" w:type="character">
+    <w:name w:val="ControlFlowTok"/>
+    <w:basedOn w:val="VerbatimChar"/>
+    <w:rPr>
+      <w:b/>
+      <w:color w:val="007020"/>
+    </w:rPr>
+  </w:style>
+  <w:style w:customStyle="1" w:styleId="OperatorTok" w:type="character">
+    <w:name w:val="OperatorTok"/>
+    <w:basedOn w:val="VerbatimChar"/>
+    <w:rPr>
+      <w:color w:val="666666"/>
+    </w:rPr>
+  </w:style>
+  <w:style w:customStyle="1" w:styleId="BuiltInTok" w:type="character">
+    <w:name w:val="BuiltInTok"/>
+    <w:basedOn w:val="VerbatimChar"/>
+    <w:rPr>
+      <w:color w:val="008000"/>
+    </w:rPr>
+  </w:style>
+  <w:style w:customStyle="1" w:styleId="ExtensionTok" w:type="character">
+    <w:name w:val="ExtensionTok"/>
+    <w:basedOn w:val="VerbatimChar"/>
+    <w:rPr/>
+  </w:style>
+  <w:style w:customStyle="1" w:styleId="PreprocessorTok" w:type="character">
+    <w:name w:val="PreprocessorTok"/>
+    <w:basedOn w:val="VerbatimChar"/>
+    <w:rPr>
+      <w:color w:val="bc7a00"/>
+    </w:rPr>
+  </w:style>
+  <w:style w:customStyle="1" w:styleId="AttributeTok" w:type="character">
+    <w:name w:val="AttributeTok"/>
+    <w:basedOn w:val="VerbatimChar"/>
+    <w:rPr>
+      <w:color w:val="7d9029"/>
+    </w:rPr>
+  </w:style>
+  <w:style w:customStyle="1" w:styleId="RegionMarkerTok" w:type="character">
+    <w:name w:val="RegionMarkerTok"/>
+    <w:basedOn w:val="VerbatimChar"/>
+    <w:rPr/>
+  </w:style>
+  <w:style w:customStyle="1" w:styleId="InformationTok" w:type="character">
+    <w:name w:val="InformationTok"/>
+    <w:basedOn w:val="VerbatimChar"/>
+    <w:rPr>
+      <w:b/>
+      <w:i/>
+      <w:color w:val="60a0b0"/>
+    </w:rPr>
+  </w:style>
+  <w:style w:customStyle="1" w:styleId="WarningTok" w:type="character">
+    <w:name w:val="WarningTok"/>
+    <w:basedOn w:val="VerbatimChar"/>
+    <w:rPr>
+      <w:b/>
+      <w:i/>
+      <w:color w:val="60a0b0"/>
+    </w:rPr>
+  </w:style>
+  <w:style w:customStyle="1" w:styleId="AlertTok" w:type="character">
+    <w:name w:val="AlertTok"/>
+    <w:basedOn w:val="VerbatimChar"/>
+    <w:rPr>
+      <w:b/>
+      <w:color w:val="ff0000"/>
+    </w:rPr>
+  </w:style>
+  <w:style w:customStyle="1" w:styleId="ErrorTok" w:type="character">
+    <w:name w:val="ErrorTok"/>
+    <w:basedOn w:val="VerbatimChar"/>
+    <w:rPr>
+      <w:b/>
+      <w:color w:val="ff0000"/>
+    </w:rPr>
+  </w:style>
+  <w:style w:customStyle="1" w:styleId="NormalTok" w:type="character">
+    <w:name w:val="NormalTok"/>
+    <w:basedOn w:val="VerbatimChar"/>
+    <w:rPr/>
   </w:style>
   <w:style w:type="character" w:customStyle="1" w:styleId="KeywordTok">
     <w:name w:val="KeywordTok"/>

</xml_diff>

<commit_message>
Add Lilliefors corrected KS residual diagnostics for all fitted models
</commit_message>
<xml_diff>
--- a/AFRI_Variables_Models_and_Datasets.docx
+++ b/AFRI_Variables_Models_and_Datasets.docx
@@ -14,6 +14,29 @@
     <w:p>
       <w:pPr>
         <w:pStyle w:val="FirstParagraph"/>
+      </w:pPr>
+      <w:r>
+        <w:t xml:space="preserve">Lilliefors-corrected Kolmogorov–Smirnov normality diagnostics use</w:t>
+      </w:r>
+      <w:r>
+        <w:t xml:space="preserve"> </w:t>
+      </w:r>
+      <w:r>
+        <w:rPr>
+          <w:rStyle w:val="VerbatimChar"/>
+        </w:rPr>
+        <w:t xml:space="preserve">nortest::lillie.test()</w:t>
+      </w:r>
+      <w:r>
+        <w:t xml:space="preserve"> </w:t>
+      </w:r>
+      <w:r>
+        <w:t xml:space="preserve">on standardized conditional residuals for Gaussian LM/LMM fits and Pearson residuals for glmmTMB fits. Model_Diagnostics includes the statistic, corrected P-value, finite residual count/type and status. KS_Lilliefors_All_Models additionally covers source/exploratory fits, combining aliases of identical fits. Fewer than five finite residuals or constant residuals are reported unavailable. These are descriptive normality tests: fitted/repeated residuals affect iid calibration, and non-Gaussian models do not require normal Pearson residuals. DHARMa uniformity tests remain separate. No model, observation or inference is changed by this diagnostic. Install nortest if needed and rerun in a fresh R session.</w:t>
+      </w:r>
+    </w:p>
+    <w:p>
+      <w:pPr>
+        <w:pStyle w:val="BodyText"/>
       </w:pPr>
       <w:r>
         <w:t xml:space="preserve">The manuscript workflow restores the methods in the supplied original Rmd. There are 44 canonical reporting specifications and 12 exploratory/source catalog entries. Source entries do not replace canonical manuscript fits. Original research datasets are absent here; actual study estimates and a full knit have not been verified.</w:t>
@@ -17704,6 +17727,232 @@
     <w:pPr>
       <w:wordWrap w:val="off"/>
     </w:pPr>
+  </w:style>
+  <w:style w:customStyle="1" w:styleId="KeywordTok" w:type="character">
+    <w:name w:val="KeywordTok"/>
+    <w:basedOn w:val="VerbatimChar"/>
+    <w:rPr>
+      <w:b/>
+      <w:color w:val="007020"/>
+    </w:rPr>
+  </w:style>
+  <w:style w:customStyle="1" w:styleId="DataTypeTok" w:type="character">
+    <w:name w:val="DataTypeTok"/>
+    <w:basedOn w:val="VerbatimChar"/>
+    <w:rPr>
+      <w:color w:val="902000"/>
+    </w:rPr>
+  </w:style>
+  <w:style w:customStyle="1" w:styleId="DecValTok" w:type="character">
+    <w:name w:val="DecValTok"/>
+    <w:basedOn w:val="VerbatimChar"/>
+    <w:rPr>
+      <w:color w:val="40a070"/>
+    </w:rPr>
+  </w:style>
+  <w:style w:customStyle="1" w:styleId="BaseNTok" w:type="character">
+    <w:name w:val="BaseNTok"/>
+    <w:basedOn w:val="VerbatimChar"/>
+    <w:rPr>
+      <w:color w:val="40a070"/>
+    </w:rPr>
+  </w:style>
+  <w:style w:customStyle="1" w:styleId="FloatTok" w:type="character">
+    <w:name w:val="FloatTok"/>
+    <w:basedOn w:val="VerbatimChar"/>
+    <w:rPr>
+      <w:color w:val="40a070"/>
+    </w:rPr>
+  </w:style>
+  <w:style w:customStyle="1" w:styleId="ConstantTok" w:type="character">
+    <w:name w:val="ConstantTok"/>
+    <w:basedOn w:val="VerbatimChar"/>
+    <w:rPr>
+      <w:color w:val="880000"/>
+    </w:rPr>
+  </w:style>
+  <w:style w:customStyle="1" w:styleId="CharTok" w:type="character">
+    <w:name w:val="CharTok"/>
+    <w:basedOn w:val="VerbatimChar"/>
+    <w:rPr>
+      <w:color w:val="4070a0"/>
+    </w:rPr>
+  </w:style>
+  <w:style w:customStyle="1" w:styleId="SpecialCharTok" w:type="character">
+    <w:name w:val="SpecialCharTok"/>
+    <w:basedOn w:val="VerbatimChar"/>
+    <w:rPr>
+      <w:color w:val="4070a0"/>
+    </w:rPr>
+  </w:style>
+  <w:style w:customStyle="1" w:styleId="StringTok" w:type="character">
+    <w:name w:val="StringTok"/>
+    <w:basedOn w:val="VerbatimChar"/>
+    <w:rPr>
+      <w:color w:val="4070a0"/>
+    </w:rPr>
+  </w:style>
+  <w:style w:customStyle="1" w:styleId="VerbatimStringTok" w:type="character">
+    <w:name w:val="VerbatimStringTok"/>
+    <w:basedOn w:val="VerbatimChar"/>
+    <w:rPr>
+      <w:color w:val="4070a0"/>
+    </w:rPr>
+  </w:style>
+  <w:style w:customStyle="1" w:styleId="SpecialStringTok" w:type="character">
+    <w:name w:val="SpecialStringTok"/>
+    <w:basedOn w:val="VerbatimChar"/>
+    <w:rPr>
+      <w:color w:val="bb6688"/>
+    </w:rPr>
+  </w:style>
+  <w:style w:customStyle="1" w:styleId="ImportTok" w:type="character">
+    <w:name w:val="ImportTok"/>
+    <w:basedOn w:val="VerbatimChar"/>
+    <w:rPr>
+      <w:b/>
+      <w:color w:val="008000"/>
+    </w:rPr>
+  </w:style>
+  <w:style w:customStyle="1" w:styleId="CommentTok" w:type="character">
+    <w:name w:val="CommentTok"/>
+    <w:basedOn w:val="VerbatimChar"/>
+    <w:rPr>
+      <w:i/>
+      <w:color w:val="60a0b0"/>
+    </w:rPr>
+  </w:style>
+  <w:style w:customStyle="1" w:styleId="DocumentationTok" w:type="character">
+    <w:name w:val="DocumentationTok"/>
+    <w:basedOn w:val="VerbatimChar"/>
+    <w:rPr>
+      <w:i/>
+      <w:color w:val="ba2121"/>
+    </w:rPr>
+  </w:style>
+  <w:style w:customStyle="1" w:styleId="AnnotationTok" w:type="character">
+    <w:name w:val="AnnotationTok"/>
+    <w:basedOn w:val="VerbatimChar"/>
+    <w:rPr>
+      <w:b/>
+      <w:i/>
+      <w:color w:val="60a0b0"/>
+    </w:rPr>
+  </w:style>
+  <w:style w:customStyle="1" w:styleId="CommentVarTok" w:type="character">
+    <w:name w:val="CommentVarTok"/>
+    <w:basedOn w:val="VerbatimChar"/>
+    <w:rPr>
+      <w:b/>
+      <w:i/>
+      <w:color w:val="60a0b0"/>
+    </w:rPr>
+  </w:style>
+  <w:style w:customStyle="1" w:styleId="OtherTok" w:type="character">
+    <w:name w:val="OtherTok"/>
+    <w:basedOn w:val="VerbatimChar"/>
+    <w:rPr>
+      <w:color w:val="007020"/>
+    </w:rPr>
+  </w:style>
+  <w:style w:customStyle="1" w:styleId="FunctionTok" w:type="character">
+    <w:name w:val="FunctionTok"/>
+    <w:basedOn w:val="VerbatimChar"/>
+    <w:rPr>
+      <w:color w:val="06287e"/>
+    </w:rPr>
+  </w:style>
+  <w:style w:customStyle="1" w:styleId="VariableTok" w:type="character">
+    <w:name w:val="VariableTok"/>
+    <w:basedOn w:val="VerbatimChar"/>
+    <w:rPr>
+      <w:color w:val="19177c"/>
+    </w:rPr>
+  </w:style>
+  <w:style w:customStyle="1" w:styleId="ControlFlowTok" w:type="character">
+    <w:name w:val="ControlFlowTok"/>
+    <w:basedOn w:val="VerbatimChar"/>
+    <w:rPr>
+      <w:b/>
+      <w:color w:val="007020"/>
+    </w:rPr>
+  </w:style>
+  <w:style w:customStyle="1" w:styleId="OperatorTok" w:type="character">
+    <w:name w:val="OperatorTok"/>
+    <w:basedOn w:val="VerbatimChar"/>
+    <w:rPr>
+      <w:color w:val="666666"/>
+    </w:rPr>
+  </w:style>
+  <w:style w:customStyle="1" w:styleId="BuiltInTok" w:type="character">
+    <w:name w:val="BuiltInTok"/>
+    <w:basedOn w:val="VerbatimChar"/>
+    <w:rPr>
+      <w:color w:val="008000"/>
+    </w:rPr>
+  </w:style>
+  <w:style w:customStyle="1" w:styleId="ExtensionTok" w:type="character">
+    <w:name w:val="ExtensionTok"/>
+    <w:basedOn w:val="VerbatimChar"/>
+    <w:rPr/>
+  </w:style>
+  <w:style w:customStyle="1" w:styleId="PreprocessorTok" w:type="character">
+    <w:name w:val="PreprocessorTok"/>
+    <w:basedOn w:val="VerbatimChar"/>
+    <w:rPr>
+      <w:color w:val="bc7a00"/>
+    </w:rPr>
+  </w:style>
+  <w:style w:customStyle="1" w:styleId="AttributeTok" w:type="character">
+    <w:name w:val="AttributeTok"/>
+    <w:basedOn w:val="VerbatimChar"/>
+    <w:rPr>
+      <w:color w:val="7d9029"/>
+    </w:rPr>
+  </w:style>
+  <w:style w:customStyle="1" w:styleId="RegionMarkerTok" w:type="character">
+    <w:name w:val="RegionMarkerTok"/>
+    <w:basedOn w:val="VerbatimChar"/>
+    <w:rPr/>
+  </w:style>
+  <w:style w:customStyle="1" w:styleId="InformationTok" w:type="character">
+    <w:name w:val="InformationTok"/>
+    <w:basedOn w:val="VerbatimChar"/>
+    <w:rPr>
+      <w:b/>
+      <w:i/>
+      <w:color w:val="60a0b0"/>
+    </w:rPr>
+  </w:style>
+  <w:style w:customStyle="1" w:styleId="WarningTok" w:type="character">
+    <w:name w:val="WarningTok"/>
+    <w:basedOn w:val="VerbatimChar"/>
+    <w:rPr>
+      <w:b/>
+      <w:i/>
+      <w:color w:val="60a0b0"/>
+    </w:rPr>
+  </w:style>
+  <w:style w:customStyle="1" w:styleId="AlertTok" w:type="character">
+    <w:name w:val="AlertTok"/>
+    <w:basedOn w:val="VerbatimChar"/>
+    <w:rPr>
+      <w:b/>
+      <w:color w:val="ff0000"/>
+    </w:rPr>
+  </w:style>
+  <w:style w:customStyle="1" w:styleId="ErrorTok" w:type="character">
+    <w:name w:val="ErrorTok"/>
+    <w:basedOn w:val="VerbatimChar"/>
+    <w:rPr>
+      <w:b/>
+      <w:color w:val="ff0000"/>
+    </w:rPr>
+  </w:style>
+  <w:style w:customStyle="1" w:styleId="NormalTok" w:type="character">
+    <w:name w:val="NormalTok"/>
+    <w:basedOn w:val="VerbatimChar"/>
+    <w:rPr/>
   </w:style>
   <w:style w:customStyle="1" w:styleId="KeywordTok" w:type="character">
     <w:name w:val="KeywordTok"/>

</xml_diff>

<commit_message>
Use Gaussian animal-year season averages for all Table 1 responses
</commit_message>
<xml_diff>
--- a/AFRI_Variables_Models_and_Datasets.docx
+++ b/AFRI_Variables_Models_and_Datasets.docx
@@ -39,7 +39,7 @@
         <w:pStyle w:val="BodyText"/>
       </w:pPr>
       <w:r>
-        <w:t xml:space="preserve">The manuscript workflow restores the methods in the supplied original Rmd. There are 44 canonical reporting specifications and 12 exploratory/source catalog entries. Source entries do not replace canonical manuscript fits. Original research datasets are absent here; actual study estimates and a full knit have not been verified.</w:t>
+        <w:t xml:space="preserve">The manuscript workflow uses animal-year season averages with Gaussian models for all four Table 1 responses; other outcomes retain the restored original methods. There are 44 canonical reporting specifications and 12 exploratory/source catalog entries. Source entries do not replace canonical manuscript fits. Original research datasets are absent here; actual study estimates and a full knit have not been verified.</w:t>
       </w:r>
     </w:p>
     <w:p>
@@ -100,14 +100,6 @@
         <w:t xml:space="preserve">compares Gaussian with Gamma or Tweedie by AIC. Original numerical fallback rules are retained, and the final fitted family/formula is reported rather than assumed.</w:t>
       </w:r>
     </w:p>
-    <w:p>
-      <w:pPr>
-        <w:pStyle w:val="BodyText"/>
-      </w:pPr>
-      <w:r>
-        <w:t xml:space="preserve">Table 1 reuses the four original monthly Gaussian ML source fits, EMMs, SEs and Type III Wald tests. It does not refit season averages or select Gamma for these responses. The final workbook keeps Table_1_Grazing_Behaviors first, routes season animal responses to Table2 and land responses to WholeSeason_Additional, and retains Pasture_RGP and Animal_RGP. Outside-RGP active-area and combined-gas responses remain removed. Existing files from older runs are not deleted. Run a fresh R session and rerun all data and model chunks.</w:t>
-      </w:r>
-    </w:p>
     <w:tbl>
       <w:tblPr>
         <w:tblStyle w:val="Table"/>
@@ -250,7 +242,7 @@
               <w:jc w:val="left"/>
             </w:pPr>
             <w:r>
-              <w:t xml:space="preserve">monthly / animal</w:t>
+              <w:t xml:space="preserve">season / animal</w:t>
             </w:r>
           </w:p>
         </w:tc>
@@ -277,7 +269,7 @@
               <w:rPr>
                 <w:rStyle w:val="VerbatimChar"/>
               </w:rPr>
-              <w:t xml:space="preserve">mean_hours ~ TRT * SR + (1 \| Year) + (1 \| Pasture)</w:t>
+              <w:t xml:space="preserve">Grazing_h ~ TRT * SR + (1 \| Year) + (1 \| Pasture)</w:t>
             </w:r>
           </w:p>
         </w:tc>
@@ -292,19 +284,19 @@
               <w:rPr>
                 <w:rStyle w:val="VerbatimChar"/>
               </w:rPr>
-              <w:t xml:space="preserve">Grazing_model_data</w:t>
-            </w:r>
-          </w:p>
-        </w:tc>
-        <w:tc>
-          <w:tcPr/>
-          <w:p>
-            <w:pPr>
-              <w:pStyle w:val="Compact"/>
-              <w:jc w:val="left"/>
-            </w:pPr>
-            <w:r>
-              <w:t xml:space="preserve">Reused original monthly ML source model</w:t>
+              <w:t xml:space="preserve">Table1_Grazing_Behaviors</w:t>
+            </w:r>
+          </w:p>
+        </w:tc>
+        <w:tc>
+          <w:tcPr/>
+          <w:p>
+            <w:pPr>
+              <w:pStyle w:val="Compact"/>
+              <w:jc w:val="left"/>
+            </w:pPr>
+            <w:r>
+              <w:t xml:space="preserve">Animal-year season-average model</w:t>
             </w:r>
           </w:p>
         </w:tc>
@@ -345,7 +337,7 @@
               <w:jc w:val="left"/>
             </w:pPr>
             <w:r>
-              <w:t xml:space="preserve">monthly / animal</w:t>
+              <w:t xml:space="preserve">season / animal</w:t>
             </w:r>
           </w:p>
         </w:tc>
@@ -372,7 +364,7 @@
               <w:rPr>
                 <w:rStyle w:val="VerbatimChar"/>
               </w:rPr>
-              <w:t xml:space="preserve">mean_hours ~ TRT * SR + (1 \| Year) + (1 \| Pasture)</w:t>
+              <w:t xml:space="preserve">Resting_h ~ TRT * SR + (1 \| Year) + (1 \| Pasture)</w:t>
             </w:r>
           </w:p>
         </w:tc>
@@ -387,19 +379,19 @@
               <w:rPr>
                 <w:rStyle w:val="VerbatimChar"/>
               </w:rPr>
-              <w:t xml:space="preserve">Resting_model_data</w:t>
-            </w:r>
-          </w:p>
-        </w:tc>
-        <w:tc>
-          <w:tcPr/>
-          <w:p>
-            <w:pPr>
-              <w:pStyle w:val="Compact"/>
-              <w:jc w:val="left"/>
-            </w:pPr>
-            <w:r>
-              <w:t xml:space="preserve">Reused original monthly ML source model</w:t>
+              <w:t xml:space="preserve">Table1_Grazing_Behaviors</w:t>
+            </w:r>
+          </w:p>
+        </w:tc>
+        <w:tc>
+          <w:tcPr/>
+          <w:p>
+            <w:pPr>
+              <w:pStyle w:val="Compact"/>
+              <w:jc w:val="left"/>
+            </w:pPr>
+            <w:r>
+              <w:t xml:space="preserve">Animal-year season-average model</w:t>
             </w:r>
           </w:p>
         </w:tc>
@@ -440,7 +432,7 @@
               <w:jc w:val="left"/>
             </w:pPr>
             <w:r>
-              <w:t xml:space="preserve">monthly / animal</w:t>
+              <w:t xml:space="preserve">season / animal</w:t>
             </w:r>
           </w:p>
         </w:tc>
@@ -467,7 +459,7 @@
               <w:rPr>
                 <w:rStyle w:val="VerbatimChar"/>
               </w:rPr>
-              <w:t xml:space="preserve">mean_hours ~ TRT * SR + (1 \| Year) + (1 \| Pasture)</w:t>
+              <w:t xml:space="preserve">Traveling_h ~ TRT * SR + (1 \| Year) + (1 \| Pasture)</w:t>
             </w:r>
           </w:p>
         </w:tc>
@@ -482,19 +474,19 @@
               <w:rPr>
                 <w:rStyle w:val="VerbatimChar"/>
               </w:rPr>
-              <w:t xml:space="preserve">Traveling_model_data</w:t>
-            </w:r>
-          </w:p>
-        </w:tc>
-        <w:tc>
-          <w:tcPr/>
-          <w:p>
-            <w:pPr>
-              <w:pStyle w:val="Compact"/>
-              <w:jc w:val="left"/>
-            </w:pPr>
-            <w:r>
-              <w:t xml:space="preserve">Reused original monthly ML source model</w:t>
+              <w:t xml:space="preserve">Table1_Grazing_Behaviors</w:t>
+            </w:r>
+          </w:p>
+        </w:tc>
+        <w:tc>
+          <w:tcPr/>
+          <w:p>
+            <w:pPr>
+              <w:pStyle w:val="Compact"/>
+              <w:jc w:val="left"/>
+            </w:pPr>
+            <w:r>
+              <w:t xml:space="preserve">Animal-year season-average model</w:t>
             </w:r>
           </w:p>
         </w:tc>
@@ -535,7 +527,7 @@
               <w:jc w:val="left"/>
             </w:pPr>
             <w:r>
-              <w:t xml:space="preserve">monthly / animal</w:t>
+              <w:t xml:space="preserve">season / animal</w:t>
             </w:r>
           </w:p>
         </w:tc>
@@ -577,19 +569,19 @@
               <w:rPr>
                 <w:rStyle w:val="VerbatimChar"/>
               </w:rPr>
-              <w:t xml:space="preserve">Monthly_DDT_filtered</w:t>
-            </w:r>
-          </w:p>
-        </w:tc>
-        <w:tc>
-          <w:tcPr/>
-          <w:p>
-            <w:pPr>
-              <w:pStyle w:val="Compact"/>
-              <w:jc w:val="left"/>
-            </w:pPr>
-            <w:r>
-              <w:t xml:space="preserve">Reused original monthly ML source model</w:t>
+              <w:t xml:space="preserve">Table1_Grazing_Behaviors</w:t>
+            </w:r>
+          </w:p>
+        </w:tc>
+        <w:tc>
+          <w:tcPr/>
+          <w:p>
+            <w:pPr>
+              <w:pStyle w:val="Compact"/>
+              <w:jc w:val="left"/>
+            </w:pPr>
+            <w:r>
+              <w:t xml:space="preserve">Animal-year season-average model</w:t>
             </w:r>
           </w:p>
         </w:tc>
@@ -17727,6 +17719,232 @@
     <w:pPr>
       <w:wordWrap w:val="off"/>
     </w:pPr>
+  </w:style>
+  <w:style w:customStyle="1" w:styleId="KeywordTok" w:type="character">
+    <w:name w:val="KeywordTok"/>
+    <w:basedOn w:val="VerbatimChar"/>
+    <w:rPr>
+      <w:b/>
+      <w:color w:val="007020"/>
+    </w:rPr>
+  </w:style>
+  <w:style w:customStyle="1" w:styleId="DataTypeTok" w:type="character">
+    <w:name w:val="DataTypeTok"/>
+    <w:basedOn w:val="VerbatimChar"/>
+    <w:rPr>
+      <w:color w:val="902000"/>
+    </w:rPr>
+  </w:style>
+  <w:style w:customStyle="1" w:styleId="DecValTok" w:type="character">
+    <w:name w:val="DecValTok"/>
+    <w:basedOn w:val="VerbatimChar"/>
+    <w:rPr>
+      <w:color w:val="40a070"/>
+    </w:rPr>
+  </w:style>
+  <w:style w:customStyle="1" w:styleId="BaseNTok" w:type="character">
+    <w:name w:val="BaseNTok"/>
+    <w:basedOn w:val="VerbatimChar"/>
+    <w:rPr>
+      <w:color w:val="40a070"/>
+    </w:rPr>
+  </w:style>
+  <w:style w:customStyle="1" w:styleId="FloatTok" w:type="character">
+    <w:name w:val="FloatTok"/>
+    <w:basedOn w:val="VerbatimChar"/>
+    <w:rPr>
+      <w:color w:val="40a070"/>
+    </w:rPr>
+  </w:style>
+  <w:style w:customStyle="1" w:styleId="ConstantTok" w:type="character">
+    <w:name w:val="ConstantTok"/>
+    <w:basedOn w:val="VerbatimChar"/>
+    <w:rPr>
+      <w:color w:val="880000"/>
+    </w:rPr>
+  </w:style>
+  <w:style w:customStyle="1" w:styleId="CharTok" w:type="character">
+    <w:name w:val="CharTok"/>
+    <w:basedOn w:val="VerbatimChar"/>
+    <w:rPr>
+      <w:color w:val="4070a0"/>
+    </w:rPr>
+  </w:style>
+  <w:style w:customStyle="1" w:styleId="SpecialCharTok" w:type="character">
+    <w:name w:val="SpecialCharTok"/>
+    <w:basedOn w:val="VerbatimChar"/>
+    <w:rPr>
+      <w:color w:val="4070a0"/>
+    </w:rPr>
+  </w:style>
+  <w:style w:customStyle="1" w:styleId="StringTok" w:type="character">
+    <w:name w:val="StringTok"/>
+    <w:basedOn w:val="VerbatimChar"/>
+    <w:rPr>
+      <w:color w:val="4070a0"/>
+    </w:rPr>
+  </w:style>
+  <w:style w:customStyle="1" w:styleId="VerbatimStringTok" w:type="character">
+    <w:name w:val="VerbatimStringTok"/>
+    <w:basedOn w:val="VerbatimChar"/>
+    <w:rPr>
+      <w:color w:val="4070a0"/>
+    </w:rPr>
+  </w:style>
+  <w:style w:customStyle="1" w:styleId="SpecialStringTok" w:type="character">
+    <w:name w:val="SpecialStringTok"/>
+    <w:basedOn w:val="VerbatimChar"/>
+    <w:rPr>
+      <w:color w:val="bb6688"/>
+    </w:rPr>
+  </w:style>
+  <w:style w:customStyle="1" w:styleId="ImportTok" w:type="character">
+    <w:name w:val="ImportTok"/>
+    <w:basedOn w:val="VerbatimChar"/>
+    <w:rPr>
+      <w:b/>
+      <w:color w:val="008000"/>
+    </w:rPr>
+  </w:style>
+  <w:style w:customStyle="1" w:styleId="CommentTok" w:type="character">
+    <w:name w:val="CommentTok"/>
+    <w:basedOn w:val="VerbatimChar"/>
+    <w:rPr>
+      <w:i/>
+      <w:color w:val="60a0b0"/>
+    </w:rPr>
+  </w:style>
+  <w:style w:customStyle="1" w:styleId="DocumentationTok" w:type="character">
+    <w:name w:val="DocumentationTok"/>
+    <w:basedOn w:val="VerbatimChar"/>
+    <w:rPr>
+      <w:i/>
+      <w:color w:val="ba2121"/>
+    </w:rPr>
+  </w:style>
+  <w:style w:customStyle="1" w:styleId="AnnotationTok" w:type="character">
+    <w:name w:val="AnnotationTok"/>
+    <w:basedOn w:val="VerbatimChar"/>
+    <w:rPr>
+      <w:b/>
+      <w:i/>
+      <w:color w:val="60a0b0"/>
+    </w:rPr>
+  </w:style>
+  <w:style w:customStyle="1" w:styleId="CommentVarTok" w:type="character">
+    <w:name w:val="CommentVarTok"/>
+    <w:basedOn w:val="VerbatimChar"/>
+    <w:rPr>
+      <w:b/>
+      <w:i/>
+      <w:color w:val="60a0b0"/>
+    </w:rPr>
+  </w:style>
+  <w:style w:customStyle="1" w:styleId="OtherTok" w:type="character">
+    <w:name w:val="OtherTok"/>
+    <w:basedOn w:val="VerbatimChar"/>
+    <w:rPr>
+      <w:color w:val="007020"/>
+    </w:rPr>
+  </w:style>
+  <w:style w:customStyle="1" w:styleId="FunctionTok" w:type="character">
+    <w:name w:val="FunctionTok"/>
+    <w:basedOn w:val="VerbatimChar"/>
+    <w:rPr>
+      <w:color w:val="06287e"/>
+    </w:rPr>
+  </w:style>
+  <w:style w:customStyle="1" w:styleId="VariableTok" w:type="character">
+    <w:name w:val="VariableTok"/>
+    <w:basedOn w:val="VerbatimChar"/>
+    <w:rPr>
+      <w:color w:val="19177c"/>
+    </w:rPr>
+  </w:style>
+  <w:style w:customStyle="1" w:styleId="ControlFlowTok" w:type="character">
+    <w:name w:val="ControlFlowTok"/>
+    <w:basedOn w:val="VerbatimChar"/>
+    <w:rPr>
+      <w:b/>
+      <w:color w:val="007020"/>
+    </w:rPr>
+  </w:style>
+  <w:style w:customStyle="1" w:styleId="OperatorTok" w:type="character">
+    <w:name w:val="OperatorTok"/>
+    <w:basedOn w:val="VerbatimChar"/>
+    <w:rPr>
+      <w:color w:val="666666"/>
+    </w:rPr>
+  </w:style>
+  <w:style w:customStyle="1" w:styleId="BuiltInTok" w:type="character">
+    <w:name w:val="BuiltInTok"/>
+    <w:basedOn w:val="VerbatimChar"/>
+    <w:rPr>
+      <w:color w:val="008000"/>
+    </w:rPr>
+  </w:style>
+  <w:style w:customStyle="1" w:styleId="ExtensionTok" w:type="character">
+    <w:name w:val="ExtensionTok"/>
+    <w:basedOn w:val="VerbatimChar"/>
+    <w:rPr/>
+  </w:style>
+  <w:style w:customStyle="1" w:styleId="PreprocessorTok" w:type="character">
+    <w:name w:val="PreprocessorTok"/>
+    <w:basedOn w:val="VerbatimChar"/>
+    <w:rPr>
+      <w:color w:val="bc7a00"/>
+    </w:rPr>
+  </w:style>
+  <w:style w:customStyle="1" w:styleId="AttributeTok" w:type="character">
+    <w:name w:val="AttributeTok"/>
+    <w:basedOn w:val="VerbatimChar"/>
+    <w:rPr>
+      <w:color w:val="7d9029"/>
+    </w:rPr>
+  </w:style>
+  <w:style w:customStyle="1" w:styleId="RegionMarkerTok" w:type="character">
+    <w:name w:val="RegionMarkerTok"/>
+    <w:basedOn w:val="VerbatimChar"/>
+    <w:rPr/>
+  </w:style>
+  <w:style w:customStyle="1" w:styleId="InformationTok" w:type="character">
+    <w:name w:val="InformationTok"/>
+    <w:basedOn w:val="VerbatimChar"/>
+    <w:rPr>
+      <w:b/>
+      <w:i/>
+      <w:color w:val="60a0b0"/>
+    </w:rPr>
+  </w:style>
+  <w:style w:customStyle="1" w:styleId="WarningTok" w:type="character">
+    <w:name w:val="WarningTok"/>
+    <w:basedOn w:val="VerbatimChar"/>
+    <w:rPr>
+      <w:b/>
+      <w:i/>
+      <w:color w:val="60a0b0"/>
+    </w:rPr>
+  </w:style>
+  <w:style w:customStyle="1" w:styleId="AlertTok" w:type="character">
+    <w:name w:val="AlertTok"/>
+    <w:basedOn w:val="VerbatimChar"/>
+    <w:rPr>
+      <w:b/>
+      <w:color w:val="ff0000"/>
+    </w:rPr>
+  </w:style>
+  <w:style w:customStyle="1" w:styleId="ErrorTok" w:type="character">
+    <w:name w:val="ErrorTok"/>
+    <w:basedOn w:val="VerbatimChar"/>
+    <w:rPr>
+      <w:b/>
+      <w:color w:val="ff0000"/>
+    </w:rPr>
+  </w:style>
+  <w:style w:customStyle="1" w:styleId="NormalTok" w:type="character">
+    <w:name w:val="NormalTok"/>
+    <w:basedOn w:val="VerbatimChar"/>
+    <w:rPr/>
   </w:style>
   <w:style w:customStyle="1" w:styleId="KeywordTok" w:type="character">
     <w:name w:val="KeywordTok"/>

</xml_diff>

<commit_message>
Add exploratory season Tukey letters and superscript EMM formatting
</commit_message>
<xml_diff>
--- a/AFRI_Variables_Models_and_Datasets.docx
+++ b/AFRI_Variables_Models_and_Datasets.docx
@@ -14,6 +14,14 @@
     <w:p>
       <w:pPr>
         <w:pStyle w:val="FirstParagraph"/>
+      </w:pPr>
+      <w:r>
+        <w:t xml:space="preserve">Season-table post-hoc letters compare all six TRT × SR EMM cells within each response using Tukey adjustment. They are displayed as Unicode superscripts immediately after the EMM and before ± SE (for example, 12.75ᵃ ± 0.61). Table2 and WholeSeason_Additional now include these letters. When pasture cells are unreplicated the comparisons are explicitly exploratory. Raw EMM/SE and plain letters remain available in EMMs_Raw and CLD; missing/nonestimable letters are not invented. Period letters retain their existing temporal comparison scope.</w:t>
+      </w:r>
+    </w:p>
+    <w:p>
+      <w:pPr>
+        <w:pStyle w:val="BodyText"/>
       </w:pPr>
       <w:r>
         <w:t xml:space="preserve">Season-level responses (including Gaussian Table 1 animal-year season averages) use</w:t>
@@ -16677,6 +16685,232 @@
     <w:pPr>
       <w:wordWrap w:val="off"/>
     </w:pPr>
+  </w:style>
+  <w:style w:customStyle="1" w:styleId="KeywordTok" w:type="character">
+    <w:name w:val="KeywordTok"/>
+    <w:basedOn w:val="VerbatimChar"/>
+    <w:rPr>
+      <w:b/>
+      <w:color w:val="007020"/>
+    </w:rPr>
+  </w:style>
+  <w:style w:customStyle="1" w:styleId="DataTypeTok" w:type="character">
+    <w:name w:val="DataTypeTok"/>
+    <w:basedOn w:val="VerbatimChar"/>
+    <w:rPr>
+      <w:color w:val="902000"/>
+    </w:rPr>
+  </w:style>
+  <w:style w:customStyle="1" w:styleId="DecValTok" w:type="character">
+    <w:name w:val="DecValTok"/>
+    <w:basedOn w:val="VerbatimChar"/>
+    <w:rPr>
+      <w:color w:val="40a070"/>
+    </w:rPr>
+  </w:style>
+  <w:style w:customStyle="1" w:styleId="BaseNTok" w:type="character">
+    <w:name w:val="BaseNTok"/>
+    <w:basedOn w:val="VerbatimChar"/>
+    <w:rPr>
+      <w:color w:val="40a070"/>
+    </w:rPr>
+  </w:style>
+  <w:style w:customStyle="1" w:styleId="FloatTok" w:type="character">
+    <w:name w:val="FloatTok"/>
+    <w:basedOn w:val="VerbatimChar"/>
+    <w:rPr>
+      <w:color w:val="40a070"/>
+    </w:rPr>
+  </w:style>
+  <w:style w:customStyle="1" w:styleId="ConstantTok" w:type="character">
+    <w:name w:val="ConstantTok"/>
+    <w:basedOn w:val="VerbatimChar"/>
+    <w:rPr>
+      <w:color w:val="880000"/>
+    </w:rPr>
+  </w:style>
+  <w:style w:customStyle="1" w:styleId="CharTok" w:type="character">
+    <w:name w:val="CharTok"/>
+    <w:basedOn w:val="VerbatimChar"/>
+    <w:rPr>
+      <w:color w:val="4070a0"/>
+    </w:rPr>
+  </w:style>
+  <w:style w:customStyle="1" w:styleId="SpecialCharTok" w:type="character">
+    <w:name w:val="SpecialCharTok"/>
+    <w:basedOn w:val="VerbatimChar"/>
+    <w:rPr>
+      <w:color w:val="4070a0"/>
+    </w:rPr>
+  </w:style>
+  <w:style w:customStyle="1" w:styleId="StringTok" w:type="character">
+    <w:name w:val="StringTok"/>
+    <w:basedOn w:val="VerbatimChar"/>
+    <w:rPr>
+      <w:color w:val="4070a0"/>
+    </w:rPr>
+  </w:style>
+  <w:style w:customStyle="1" w:styleId="VerbatimStringTok" w:type="character">
+    <w:name w:val="VerbatimStringTok"/>
+    <w:basedOn w:val="VerbatimChar"/>
+    <w:rPr>
+      <w:color w:val="4070a0"/>
+    </w:rPr>
+  </w:style>
+  <w:style w:customStyle="1" w:styleId="SpecialStringTok" w:type="character">
+    <w:name w:val="SpecialStringTok"/>
+    <w:basedOn w:val="VerbatimChar"/>
+    <w:rPr>
+      <w:color w:val="bb6688"/>
+    </w:rPr>
+  </w:style>
+  <w:style w:customStyle="1" w:styleId="ImportTok" w:type="character">
+    <w:name w:val="ImportTok"/>
+    <w:basedOn w:val="VerbatimChar"/>
+    <w:rPr>
+      <w:b/>
+      <w:color w:val="008000"/>
+    </w:rPr>
+  </w:style>
+  <w:style w:customStyle="1" w:styleId="CommentTok" w:type="character">
+    <w:name w:val="CommentTok"/>
+    <w:basedOn w:val="VerbatimChar"/>
+    <w:rPr>
+      <w:i/>
+      <w:color w:val="60a0b0"/>
+    </w:rPr>
+  </w:style>
+  <w:style w:customStyle="1" w:styleId="DocumentationTok" w:type="character">
+    <w:name w:val="DocumentationTok"/>
+    <w:basedOn w:val="VerbatimChar"/>
+    <w:rPr>
+      <w:i/>
+      <w:color w:val="ba2121"/>
+    </w:rPr>
+  </w:style>
+  <w:style w:customStyle="1" w:styleId="AnnotationTok" w:type="character">
+    <w:name w:val="AnnotationTok"/>
+    <w:basedOn w:val="VerbatimChar"/>
+    <w:rPr>
+      <w:b/>
+      <w:i/>
+      <w:color w:val="60a0b0"/>
+    </w:rPr>
+  </w:style>
+  <w:style w:customStyle="1" w:styleId="CommentVarTok" w:type="character">
+    <w:name w:val="CommentVarTok"/>
+    <w:basedOn w:val="VerbatimChar"/>
+    <w:rPr>
+      <w:b/>
+      <w:i/>
+      <w:color w:val="60a0b0"/>
+    </w:rPr>
+  </w:style>
+  <w:style w:customStyle="1" w:styleId="OtherTok" w:type="character">
+    <w:name w:val="OtherTok"/>
+    <w:basedOn w:val="VerbatimChar"/>
+    <w:rPr>
+      <w:color w:val="007020"/>
+    </w:rPr>
+  </w:style>
+  <w:style w:customStyle="1" w:styleId="FunctionTok" w:type="character">
+    <w:name w:val="FunctionTok"/>
+    <w:basedOn w:val="VerbatimChar"/>
+    <w:rPr>
+      <w:color w:val="06287e"/>
+    </w:rPr>
+  </w:style>
+  <w:style w:customStyle="1" w:styleId="VariableTok" w:type="character">
+    <w:name w:val="VariableTok"/>
+    <w:basedOn w:val="VerbatimChar"/>
+    <w:rPr>
+      <w:color w:val="19177c"/>
+    </w:rPr>
+  </w:style>
+  <w:style w:customStyle="1" w:styleId="ControlFlowTok" w:type="character">
+    <w:name w:val="ControlFlowTok"/>
+    <w:basedOn w:val="VerbatimChar"/>
+    <w:rPr>
+      <w:b/>
+      <w:color w:val="007020"/>
+    </w:rPr>
+  </w:style>
+  <w:style w:customStyle="1" w:styleId="OperatorTok" w:type="character">
+    <w:name w:val="OperatorTok"/>
+    <w:basedOn w:val="VerbatimChar"/>
+    <w:rPr>
+      <w:color w:val="666666"/>
+    </w:rPr>
+  </w:style>
+  <w:style w:customStyle="1" w:styleId="BuiltInTok" w:type="character">
+    <w:name w:val="BuiltInTok"/>
+    <w:basedOn w:val="VerbatimChar"/>
+    <w:rPr>
+      <w:color w:val="008000"/>
+    </w:rPr>
+  </w:style>
+  <w:style w:customStyle="1" w:styleId="ExtensionTok" w:type="character">
+    <w:name w:val="ExtensionTok"/>
+    <w:basedOn w:val="VerbatimChar"/>
+    <w:rPr/>
+  </w:style>
+  <w:style w:customStyle="1" w:styleId="PreprocessorTok" w:type="character">
+    <w:name w:val="PreprocessorTok"/>
+    <w:basedOn w:val="VerbatimChar"/>
+    <w:rPr>
+      <w:color w:val="bc7a00"/>
+    </w:rPr>
+  </w:style>
+  <w:style w:customStyle="1" w:styleId="AttributeTok" w:type="character">
+    <w:name w:val="AttributeTok"/>
+    <w:basedOn w:val="VerbatimChar"/>
+    <w:rPr>
+      <w:color w:val="7d9029"/>
+    </w:rPr>
+  </w:style>
+  <w:style w:customStyle="1" w:styleId="RegionMarkerTok" w:type="character">
+    <w:name w:val="RegionMarkerTok"/>
+    <w:basedOn w:val="VerbatimChar"/>
+    <w:rPr/>
+  </w:style>
+  <w:style w:customStyle="1" w:styleId="InformationTok" w:type="character">
+    <w:name w:val="InformationTok"/>
+    <w:basedOn w:val="VerbatimChar"/>
+    <w:rPr>
+      <w:b/>
+      <w:i/>
+      <w:color w:val="60a0b0"/>
+    </w:rPr>
+  </w:style>
+  <w:style w:customStyle="1" w:styleId="WarningTok" w:type="character">
+    <w:name w:val="WarningTok"/>
+    <w:basedOn w:val="VerbatimChar"/>
+    <w:rPr>
+      <w:b/>
+      <w:i/>
+      <w:color w:val="60a0b0"/>
+    </w:rPr>
+  </w:style>
+  <w:style w:customStyle="1" w:styleId="AlertTok" w:type="character">
+    <w:name w:val="AlertTok"/>
+    <w:basedOn w:val="VerbatimChar"/>
+    <w:rPr>
+      <w:b/>
+      <w:color w:val="ff0000"/>
+    </w:rPr>
+  </w:style>
+  <w:style w:customStyle="1" w:styleId="ErrorTok" w:type="character">
+    <w:name w:val="ErrorTok"/>
+    <w:basedOn w:val="VerbatimChar"/>
+    <w:rPr>
+      <w:b/>
+      <w:color w:val="ff0000"/>
+    </w:rPr>
+  </w:style>
+  <w:style w:customStyle="1" w:styleId="NormalTok" w:type="character">
+    <w:name w:val="NormalTok"/>
+    <w:basedOn w:val="VerbatimChar"/>
+    <w:rPr/>
   </w:style>
   <w:style w:customStyle="1" w:styleId="KeywordTok" w:type="character">
     <w:name w:val="KeywordTok"/>

</xml_diff>

<commit_message>
Restore full period interactions with Year and Year-by-Pasture intercepts
</commit_message>
<xml_diff>
--- a/AFRI_Variables_Models_and_Datasets.docx
+++ b/AFRI_Variables_Models_and_Datasets.docx
@@ -2,14 +2,15 @@
 <file path=word/document.xml><?xml version="1.0" encoding="utf-8"?>
 <w:document xmlns:w="http://schemas.openxmlformats.org/wordprocessingml/2006/main" xmlns:m="http://schemas.openxmlformats.org/officeDocument/2006/math" xmlns:r="http://schemas.openxmlformats.org/officeDocument/2006/relationships" xmlns:o="urn:schemas-microsoft-com:office:office" xmlns:v="urn:schemas-microsoft-com:vml" xmlns:w10="urn:schemas-microsoft-com:office:word" xmlns:a="http://schemas.openxmlformats.org/drawingml/2006/main" xmlns:pic="http://schemas.openxmlformats.org/drawingml/2006/picture" xmlns:wp="http://schemas.openxmlformats.org/drawingml/2006/wordprocessingDrawing">
   <w:body>
-    <w:bookmarkStart w:id="20" w:name="current-afri-model-structures"/>
     <w:p>
       <w:pPr>
         <w:pStyle w:val="Heading1"/>
       </w:pPr>
+      <w:bookmarkStart w:id="18" w:name="_9e60a562621e5488ac3a2d630ba8be7d786bc1a"/>
       <w:r>
         <w:t xml:space="preserve">Current AFRI model structures</w:t>
       </w:r>
+      <w:bookmarkEnd w:id="18"/>
     </w:p>
     <w:p>
       <w:pPr>
@@ -53,7 +54,7 @@
         <w:rPr>
           <w:rStyle w:val="VerbatimChar"/>
         </w:rPr>
-        <w:t xml:space="preserve">response ~ TRT * SR + Period + (1 | Year) + (1 | Year:Pasture)</w:t>
+        <w:t xml:space="preserve">response ~ TRT * SR * Period + (1 | Year) + (1 | Year:Pasture)</w:t>
       </w:r>
       <w:r>
         <w:t xml:space="preserve">.</w:t>
@@ -73,10 +74,10 @@
         <w:rPr>
           <w:rStyle w:val="VerbatimChar"/>
         </w:rPr>
-        <w:t xml:space="preserve">gas ~ TRT * SR + RotationPeriod + (1 | Year) + (1 | Year:Pasture)</w:t>
+        <w:t xml:space="preserve">gas ~ TRT * SR * RotationPeriod + (1 | Year) + (1 | Year:Pasture)</w:t>
       </w:r>
       <w:r>
-        <w:t xml:space="preserve">. RGP and Pasture_ID aliases are equivalent in source analyses. Period is additive; no TRT:Period, SR:Period or three-way period interaction is fitted. There is no animal random intercept or AR(1) candidate. The separate endpoint ANCOVA source retains its IBW covariate.</w:t>
+        <w:t xml:space="preserve">. RGP and Pasture_ID aliases are equivalent in source analyses. Period includes TRT:Period, SR:Period and TRT:SR:Period interactions. There is no animal random intercept or AR(1) candidate. The separate endpoint ANCOVA source retains its IBW covariate.</w:t>
       </w:r>
     </w:p>
     <w:p>
@@ -91,7 +92,6 @@
       <w:tblPr>
         <w:tblStyle w:val="Table"/>
         <w:tblW w:type="pct" w:w="5000"/>
-        <w:jc w:val="left"/>
         <w:tblLayout w:type="fixed"/>
         <w:tblLook w:firstRow="1" w:lastRow="0" w:firstColumn="0" w:lastColumn="0" w:noHBand="0" w:noVBand="0" w:val="0020"/>
       </w:tblPr>
@@ -112,7 +112,6 @@
           <w:p>
             <w:pPr>
               <w:pStyle w:val="Compact"/>
-              <w:jc w:val="left"/>
             </w:pPr>
             <w:r>
               <w:t xml:space="preserve">Entry</w:t>
@@ -124,7 +123,6 @@
           <w:p>
             <w:pPr>
               <w:pStyle w:val="Compact"/>
-              <w:jc w:val="left"/>
             </w:pPr>
             <w:r>
               <w:t xml:space="preserve">Response</w:t>
@@ -136,7 +134,6 @@
           <w:p>
             <w:pPr>
               <w:pStyle w:val="Compact"/>
-              <w:jc w:val="left"/>
             </w:pPr>
             <w:r>
               <w:t xml:space="preserve">Scale</w:t>
@@ -148,7 +145,6 @@
           <w:p>
             <w:pPr>
               <w:pStyle w:val="Compact"/>
-              <w:jc w:val="left"/>
             </w:pPr>
             <w:r>
               <w:t xml:space="preserve">Family rule</w:t>
@@ -160,7 +156,6 @@
           <w:p>
             <w:pPr>
               <w:pStyle w:val="Compact"/>
-              <w:jc w:val="left"/>
             </w:pPr>
             <w:r>
               <w:t xml:space="preserve">Formula</w:t>
@@ -172,7 +167,6 @@
           <w:p>
             <w:pPr>
               <w:pStyle w:val="Compact"/>
-              <w:jc w:val="left"/>
             </w:pPr>
             <w:r>
               <w:t xml:space="preserve">Input dataset</w:t>
@@ -186,7 +180,6 @@
           <w:p>
             <w:pPr>
               <w:pStyle w:val="Compact"/>
-              <w:jc w:val="left"/>
             </w:pPr>
             <w:r>
               <w:t xml:space="preserve">1</w:t>
@@ -198,7 +191,6 @@
           <w:p>
             <w:pPr>
               <w:pStyle w:val="Compact"/>
-              <w:jc w:val="left"/>
             </w:pPr>
             <w:r>
               <w:t xml:space="preserve">Grazing_h</w:t>
@@ -210,7 +202,6 @@
           <w:p>
             <w:pPr>
               <w:pStyle w:val="Compact"/>
-              <w:jc w:val="left"/>
             </w:pPr>
             <w:r>
               <w:t xml:space="preserve">season</w:t>
@@ -222,7 +213,6 @@
           <w:p>
             <w:pPr>
               <w:pStyle w:val="Compact"/>
-              <w:jc w:val="left"/>
             </w:pPr>
             <w:r>
               <w:t xml:space="preserve">gaussian</w:t>
@@ -234,7 +224,6 @@
           <w:p>
             <w:pPr>
               <w:pStyle w:val="Compact"/>
-              <w:jc w:val="left"/>
             </w:pPr>
             <w:r>
               <w:rPr>
@@ -249,7 +238,6 @@
           <w:p>
             <w:pPr>
               <w:pStyle w:val="Compact"/>
-              <w:jc w:val="left"/>
             </w:pPr>
             <w:r>
               <w:t xml:space="preserve">Table1_Grazing_Behaviors</w:t>
@@ -263,7 +251,6 @@
           <w:p>
             <w:pPr>
               <w:pStyle w:val="Compact"/>
-              <w:jc w:val="left"/>
             </w:pPr>
             <w:r>
               <w:t xml:space="preserve">2</w:t>
@@ -275,7 +262,6 @@
           <w:p>
             <w:pPr>
               <w:pStyle w:val="Compact"/>
-              <w:jc w:val="left"/>
             </w:pPr>
             <w:r>
               <w:t xml:space="preserve">Resting_h</w:t>
@@ -287,7 +273,6 @@
           <w:p>
             <w:pPr>
               <w:pStyle w:val="Compact"/>
-              <w:jc w:val="left"/>
             </w:pPr>
             <w:r>
               <w:t xml:space="preserve">season</w:t>
@@ -299,7 +284,6 @@
           <w:p>
             <w:pPr>
               <w:pStyle w:val="Compact"/>
-              <w:jc w:val="left"/>
             </w:pPr>
             <w:r>
               <w:t xml:space="preserve">gaussian</w:t>
@@ -311,7 +295,6 @@
           <w:p>
             <w:pPr>
               <w:pStyle w:val="Compact"/>
-              <w:jc w:val="left"/>
             </w:pPr>
             <w:r>
               <w:rPr>
@@ -326,7 +309,6 @@
           <w:p>
             <w:pPr>
               <w:pStyle w:val="Compact"/>
-              <w:jc w:val="left"/>
             </w:pPr>
             <w:r>
               <w:t xml:space="preserve">Table1_Grazing_Behaviors</w:t>
@@ -340,7 +322,6 @@
           <w:p>
             <w:pPr>
               <w:pStyle w:val="Compact"/>
-              <w:jc w:val="left"/>
             </w:pPr>
             <w:r>
               <w:t xml:space="preserve">3</w:t>
@@ -352,7 +333,6 @@
           <w:p>
             <w:pPr>
               <w:pStyle w:val="Compact"/>
-              <w:jc w:val="left"/>
             </w:pPr>
             <w:r>
               <w:t xml:space="preserve">Traveling_h</w:t>
@@ -364,7 +344,6 @@
           <w:p>
             <w:pPr>
               <w:pStyle w:val="Compact"/>
-              <w:jc w:val="left"/>
             </w:pPr>
             <w:r>
               <w:t xml:space="preserve">season</w:t>
@@ -376,7 +355,6 @@
           <w:p>
             <w:pPr>
               <w:pStyle w:val="Compact"/>
-              <w:jc w:val="left"/>
             </w:pPr>
             <w:r>
               <w:t xml:space="preserve">gaussian</w:t>
@@ -388,7 +366,6 @@
           <w:p>
             <w:pPr>
               <w:pStyle w:val="Compact"/>
-              <w:jc w:val="left"/>
             </w:pPr>
             <w:r>
               <w:rPr>
@@ -403,7 +380,6 @@
           <w:p>
             <w:pPr>
               <w:pStyle w:val="Compact"/>
-              <w:jc w:val="left"/>
             </w:pPr>
             <w:r>
               <w:t xml:space="preserve">Table1_Grazing_Behaviors</w:t>
@@ -417,7 +393,6 @@
           <w:p>
             <w:pPr>
               <w:pStyle w:val="Compact"/>
-              <w:jc w:val="left"/>
             </w:pPr>
             <w:r>
               <w:t xml:space="preserve">4</w:t>
@@ -429,7 +404,6 @@
           <w:p>
             <w:pPr>
               <w:pStyle w:val="Compact"/>
-              <w:jc w:val="left"/>
             </w:pPr>
             <w:r>
               <w:t xml:space="preserve">mean_DDT_day</w:t>
@@ -441,7 +415,6 @@
           <w:p>
             <w:pPr>
               <w:pStyle w:val="Compact"/>
-              <w:jc w:val="left"/>
             </w:pPr>
             <w:r>
               <w:t xml:space="preserve">season</w:t>
@@ -453,7 +426,6 @@
           <w:p>
             <w:pPr>
               <w:pStyle w:val="Compact"/>
-              <w:jc w:val="left"/>
             </w:pPr>
             <w:r>
               <w:t xml:space="preserve">gaussian</w:t>
@@ -465,7 +437,6 @@
           <w:p>
             <w:pPr>
               <w:pStyle w:val="Compact"/>
-              <w:jc w:val="left"/>
             </w:pPr>
             <w:r>
               <w:rPr>
@@ -480,7 +451,6 @@
           <w:p>
             <w:pPr>
               <w:pStyle w:val="Compact"/>
-              <w:jc w:val="left"/>
             </w:pPr>
             <w:r>
               <w:t xml:space="preserve">Table1_Grazing_Behaviors</w:t>
@@ -494,7 +464,6 @@
           <w:p>
             <w:pPr>
               <w:pStyle w:val="Compact"/>
-              <w:jc w:val="left"/>
             </w:pPr>
             <w:r>
               <w:t xml:space="preserve">5</w:t>
@@ -506,7 +475,6 @@
           <w:p>
             <w:pPr>
               <w:pStyle w:val="Compact"/>
-              <w:jc w:val="left"/>
             </w:pPr>
             <w:r>
               <w:t xml:space="preserve">CH4_Mean_g_d</w:t>
@@ -518,7 +486,6 @@
           <w:p>
             <w:pPr>
               <w:pStyle w:val="Compact"/>
-              <w:jc w:val="left"/>
             </w:pPr>
             <w:r>
               <w:t xml:space="preserve">season</w:t>
@@ -530,7 +497,6 @@
           <w:p>
             <w:pPr>
               <w:pStyle w:val="Compact"/>
-              <w:jc w:val="left"/>
             </w:pPr>
             <w:r>
               <w:t xml:space="preserve">auto_positive</w:t>
@@ -542,7 +508,6 @@
           <w:p>
             <w:pPr>
               <w:pStyle w:val="Compact"/>
-              <w:jc w:val="left"/>
             </w:pPr>
             <w:r>
               <w:rPr>
@@ -557,7 +522,6 @@
           <w:p>
             <w:pPr>
               <w:pStyle w:val="Compact"/>
-              <w:jc w:val="left"/>
             </w:pPr>
             <w:r>
               <w:t xml:space="preserve">dressler_animal_means</w:t>
@@ -571,7 +535,6 @@
           <w:p>
             <w:pPr>
               <w:pStyle w:val="Compact"/>
-              <w:jc w:val="left"/>
             </w:pPr>
             <w:r>
               <w:t xml:space="preserve">6</w:t>
@@ -583,7 +546,6 @@
           <w:p>
             <w:pPr>
               <w:pStyle w:val="Compact"/>
-              <w:jc w:val="left"/>
             </w:pPr>
             <w:r>
               <w:t xml:space="preserve">CO2_Mean_g_d</w:t>
@@ -595,7 +557,6 @@
           <w:p>
             <w:pPr>
               <w:pStyle w:val="Compact"/>
-              <w:jc w:val="left"/>
             </w:pPr>
             <w:r>
               <w:t xml:space="preserve">season</w:t>
@@ -607,7 +568,6 @@
           <w:p>
             <w:pPr>
               <w:pStyle w:val="Compact"/>
-              <w:jc w:val="left"/>
             </w:pPr>
             <w:r>
               <w:t xml:space="preserve">auto_positive</w:t>
@@ -619,7 +579,6 @@
           <w:p>
             <w:pPr>
               <w:pStyle w:val="Compact"/>
-              <w:jc w:val="left"/>
             </w:pPr>
             <w:r>
               <w:rPr>
@@ -634,7 +593,6 @@
           <w:p>
             <w:pPr>
               <w:pStyle w:val="Compact"/>
-              <w:jc w:val="left"/>
             </w:pPr>
             <w:r>
               <w:t xml:space="preserve">dressler_animal_means</w:t>
@@ -648,7 +606,6 @@
           <w:p>
             <w:pPr>
               <w:pStyle w:val="Compact"/>
-              <w:jc w:val="left"/>
             </w:pPr>
             <w:r>
               <w:t xml:space="preserve">7</w:t>
@@ -660,7 +617,6 @@
           <w:p>
             <w:pPr>
               <w:pStyle w:val="Compact"/>
-              <w:jc w:val="left"/>
             </w:pPr>
             <w:r>
               <w:t xml:space="preserve">Smooth_Period_ADG</w:t>
@@ -672,7 +628,6 @@
           <w:p>
             <w:pPr>
               <w:pStyle w:val="Compact"/>
-              <w:jc w:val="left"/>
             </w:pPr>
             <w:r>
               <w:t xml:space="preserve">season</w:t>
@@ -684,7 +639,6 @@
           <w:p>
             <w:pPr>
               <w:pStyle w:val="Compact"/>
-              <w:jc w:val="left"/>
             </w:pPr>
             <w:r>
               <w:t xml:space="preserve">gaussian</w:t>
@@ -696,7 +650,6 @@
           <w:p>
             <w:pPr>
               <w:pStyle w:val="Compact"/>
-              <w:jc w:val="left"/>
             </w:pPr>
             <w:r>
               <w:rPr>
@@ -711,7 +664,6 @@
           <w:p>
             <w:pPr>
               <w:pStyle w:val="Compact"/>
-              <w:jc w:val="left"/>
             </w:pPr>
             <w:r>
               <w:t xml:space="preserve">animal_spline_metrics</w:t>
@@ -725,7 +677,6 @@
           <w:p>
             <w:pPr>
               <w:pStyle w:val="Compact"/>
-              <w:jc w:val="left"/>
             </w:pPr>
             <w:r>
               <w:t xml:space="preserve">8</w:t>
@@ -737,7 +688,6 @@
           <w:p>
             <w:pPr>
               <w:pStyle w:val="Compact"/>
-              <w:jc w:val="left"/>
             </w:pPr>
             <w:r>
               <w:t xml:space="preserve">Shrunk_Initial_BW_kg</w:t>
@@ -749,7 +699,6 @@
           <w:p>
             <w:pPr>
               <w:pStyle w:val="Compact"/>
-              <w:jc w:val="left"/>
             </w:pPr>
             <w:r>
               <w:t xml:space="preserve">season</w:t>
@@ -761,7 +710,6 @@
           <w:p>
             <w:pPr>
               <w:pStyle w:val="Compact"/>
-              <w:jc w:val="left"/>
             </w:pPr>
             <w:r>
               <w:t xml:space="preserve">gaussian</w:t>
@@ -773,7 +721,6 @@
           <w:p>
             <w:pPr>
               <w:pStyle w:val="Compact"/>
-              <w:jc w:val="left"/>
             </w:pPr>
             <w:r>
               <w:rPr>
@@ -788,7 +735,6 @@
           <w:p>
             <w:pPr>
               <w:pStyle w:val="Compact"/>
-              <w:jc w:val="left"/>
             </w:pPr>
             <w:r>
               <w:t xml:space="preserve">shrunk_bw_season_analysis</w:t>
@@ -802,7 +748,6 @@
           <w:p>
             <w:pPr>
               <w:pStyle w:val="Compact"/>
-              <w:jc w:val="left"/>
             </w:pPr>
             <w:r>
               <w:t xml:space="preserve">9</w:t>
@@ -814,7 +759,6 @@
           <w:p>
             <w:pPr>
               <w:pStyle w:val="Compact"/>
-              <w:jc w:val="left"/>
             </w:pPr>
             <w:r>
               <w:t xml:space="preserve">Shrunk_Final_BW_kg</w:t>
@@ -826,7 +770,6 @@
           <w:p>
             <w:pPr>
               <w:pStyle w:val="Compact"/>
-              <w:jc w:val="left"/>
             </w:pPr>
             <w:r>
               <w:t xml:space="preserve">season</w:t>
@@ -838,7 +781,6 @@
           <w:p>
             <w:pPr>
               <w:pStyle w:val="Compact"/>
-              <w:jc w:val="left"/>
             </w:pPr>
             <w:r>
               <w:t xml:space="preserve">gaussian</w:t>
@@ -850,7 +792,6 @@
           <w:p>
             <w:pPr>
               <w:pStyle w:val="Compact"/>
-              <w:jc w:val="left"/>
             </w:pPr>
             <w:r>
               <w:rPr>
@@ -865,7 +806,6 @@
           <w:p>
             <w:pPr>
               <w:pStyle w:val="Compact"/>
-              <w:jc w:val="left"/>
             </w:pPr>
             <w:r>
               <w:t xml:space="preserve">shrunk_bw_season_analysis</w:t>
@@ -879,7 +819,6 @@
           <w:p>
             <w:pPr>
               <w:pStyle w:val="Compact"/>
-              <w:jc w:val="left"/>
             </w:pPr>
             <w:r>
               <w:t xml:space="preserve">10</w:t>
@@ -891,7 +830,6 @@
           <w:p>
             <w:pPr>
               <w:pStyle w:val="Compact"/>
-              <w:jc w:val="left"/>
             </w:pPr>
             <w:r>
               <w:t xml:space="preserve">CH4_g_per_active_ha_whole_season</w:t>
@@ -903,7 +841,6 @@
           <w:p>
             <w:pPr>
               <w:pStyle w:val="Compact"/>
-              <w:jc w:val="left"/>
             </w:pPr>
             <w:r>
               <w:t xml:space="preserve">season</w:t>
@@ -915,7 +852,6 @@
           <w:p>
             <w:pPr>
               <w:pStyle w:val="Compact"/>
-              <w:jc w:val="left"/>
             </w:pPr>
             <w:r>
               <w:t xml:space="preserve">auto_positive</w:t>
@@ -927,7 +863,6 @@
           <w:p>
             <w:pPr>
               <w:pStyle w:val="Compact"/>
-              <w:jc w:val="left"/>
             </w:pPr>
             <w:r>
               <w:rPr>
@@ -942,7 +877,6 @@
           <w:p>
             <w:pPr>
               <w:pStyle w:val="Compact"/>
-              <w:jc w:val="left"/>
             </w:pPr>
             <w:r>
               <w:t xml:space="preserve">whole_season_grazing_productivity</w:t>
@@ -956,7 +890,6 @@
           <w:p>
             <w:pPr>
               <w:pStyle w:val="Compact"/>
-              <w:jc w:val="left"/>
             </w:pPr>
             <w:r>
               <w:t xml:space="preserve">11</w:t>
@@ -968,7 +901,6 @@
           <w:p>
             <w:pPr>
               <w:pStyle w:val="Compact"/>
-              <w:jc w:val="left"/>
             </w:pPr>
             <w:r>
               <w:t xml:space="preserve">CO2_g_per_active_ha_whole_season</w:t>
@@ -980,7 +912,6 @@
           <w:p>
             <w:pPr>
               <w:pStyle w:val="Compact"/>
-              <w:jc w:val="left"/>
             </w:pPr>
             <w:r>
               <w:t xml:space="preserve">season</w:t>
@@ -992,7 +923,6 @@
           <w:p>
             <w:pPr>
               <w:pStyle w:val="Compact"/>
-              <w:jc w:val="left"/>
             </w:pPr>
             <w:r>
               <w:t xml:space="preserve">auto_positive</w:t>
@@ -1004,7 +934,6 @@
           <w:p>
             <w:pPr>
               <w:pStyle w:val="Compact"/>
-              <w:jc w:val="left"/>
             </w:pPr>
             <w:r>
               <w:rPr>
@@ -1019,7 +948,6 @@
           <w:p>
             <w:pPr>
               <w:pStyle w:val="Compact"/>
-              <w:jc w:val="left"/>
             </w:pPr>
             <w:r>
               <w:t xml:space="preserve">whole_season_grazing_productivity</w:t>
@@ -1033,7 +961,6 @@
           <w:p>
             <w:pPr>
               <w:pStyle w:val="Compact"/>
-              <w:jc w:val="left"/>
             </w:pPr>
             <w:r>
               <w:t xml:space="preserve">12</w:t>
@@ -1045,7 +972,6 @@
           <w:p>
             <w:pPr>
               <w:pStyle w:val="Compact"/>
-              <w:jc w:val="left"/>
             </w:pPr>
             <w:r>
               <w:t xml:space="preserve">active_ha_whole_season</w:t>
@@ -1057,7 +983,6 @@
           <w:p>
             <w:pPr>
               <w:pStyle w:val="Compact"/>
-              <w:jc w:val="left"/>
             </w:pPr>
             <w:r>
               <w:t xml:space="preserve">season</w:t>
@@ -1069,7 +994,6 @@
           <w:p>
             <w:pPr>
               <w:pStyle w:val="Compact"/>
-              <w:jc w:val="left"/>
             </w:pPr>
             <w:r>
               <w:t xml:space="preserve">auto_positive</w:t>
@@ -1081,7 +1005,6 @@
           <w:p>
             <w:pPr>
               <w:pStyle w:val="Compact"/>
-              <w:jc w:val="left"/>
             </w:pPr>
             <w:r>
               <w:rPr>
@@ -1096,7 +1019,6 @@
           <w:p>
             <w:pPr>
               <w:pStyle w:val="Compact"/>
-              <w:jc w:val="left"/>
             </w:pPr>
             <w:r>
               <w:t xml:space="preserve">whole_season_grazing_productivity</w:t>
@@ -1110,7 +1032,6 @@
           <w:p>
             <w:pPr>
               <w:pStyle w:val="Compact"/>
-              <w:jc w:val="left"/>
             </w:pPr>
             <w:r>
               <w:t xml:space="preserve">13</w:t>
@@ -1122,7 +1043,6 @@
           <w:p>
             <w:pPr>
               <w:pStyle w:val="Compact"/>
-              <w:jc w:val="left"/>
             </w:pPr>
             <w:r>
               <w:t xml:space="preserve">LWG_kg_per_active_ha_whole_season</w:t>
@@ -1134,7 +1054,6 @@
           <w:p>
             <w:pPr>
               <w:pStyle w:val="Compact"/>
-              <w:jc w:val="left"/>
             </w:pPr>
             <w:r>
               <w:t xml:space="preserve">season</w:t>
@@ -1146,7 +1065,6 @@
           <w:p>
             <w:pPr>
               <w:pStyle w:val="Compact"/>
-              <w:jc w:val="left"/>
             </w:pPr>
             <w:r>
               <w:t xml:space="preserve">auto_positive</w:t>
@@ -1158,7 +1076,6 @@
           <w:p>
             <w:pPr>
               <w:pStyle w:val="Compact"/>
-              <w:jc w:val="left"/>
             </w:pPr>
             <w:r>
               <w:rPr>
@@ -1173,7 +1090,6 @@
           <w:p>
             <w:pPr>
               <w:pStyle w:val="Compact"/>
-              <w:jc w:val="left"/>
             </w:pPr>
             <w:r>
               <w:t xml:space="preserve">whole_season_grazing_productivity</w:t>
@@ -1187,7 +1103,6 @@
           <w:p>
             <w:pPr>
               <w:pStyle w:val="Compact"/>
-              <w:jc w:val="left"/>
             </w:pPr>
             <w:r>
               <w:t xml:space="preserve">14</w:t>
@@ -1199,7 +1114,6 @@
           <w:p>
             <w:pPr>
               <w:pStyle w:val="Compact"/>
-              <w:jc w:val="left"/>
             </w:pPr>
             <w:r>
               <w:t xml:space="preserve">active_ha_all_pasture</w:t>
@@ -1211,7 +1125,6 @@
           <w:p>
             <w:pPr>
               <w:pStyle w:val="Compact"/>
-              <w:jc w:val="left"/>
             </w:pPr>
             <w:r>
               <w:t xml:space="preserve">period</w:t>
@@ -1223,7 +1136,6 @@
           <w:p>
             <w:pPr>
               <w:pStyle w:val="Compact"/>
-              <w:jc w:val="left"/>
             </w:pPr>
             <w:r>
               <w:t xml:space="preserve">gamma_log</w:t>
@@ -1235,22 +1147,20 @@
           <w:p>
             <w:pPr>
               <w:pStyle w:val="Compact"/>
-              <w:jc w:val="left"/>
             </w:pPr>
             <w:r>
               <w:rPr>
                 <w:rStyle w:val="VerbatimChar"/>
               </w:rPr>
-              <w:t xml:space="preserve">active_ha_all_pasture ~ TRT * SR + Period + (1 \| Year) + (1 \| Year:Pasture)</w:t>
-            </w:r>
-          </w:p>
-        </w:tc>
-        <w:tc>
-          <w:tcPr/>
-          <w:p>
-            <w:pPr>
-              <w:pStyle w:val="Compact"/>
-              <w:jc w:val="left"/>
+              <w:t xml:space="preserve">active_ha_all_pasture ~ TRT * SR * Period + (1 \| Year) + (1 \| Year:Pasture)</w:t>
+            </w:r>
+          </w:p>
+        </w:tc>
+        <w:tc>
+          <w:tcPr/>
+          <w:p>
+            <w:pPr>
+              <w:pStyle w:val="Compact"/>
             </w:pPr>
             <w:r>
               <w:t xml:space="preserve">period_level_grazing_productivity</w:t>
@@ -1264,7 +1174,6 @@
           <w:p>
             <w:pPr>
               <w:pStyle w:val="Compact"/>
-              <w:jc w:val="left"/>
             </w:pPr>
             <w:r>
               <w:t xml:space="preserve">15</w:t>
@@ -1276,7 +1185,6 @@
           <w:p>
             <w:pPr>
               <w:pStyle w:val="Compact"/>
-              <w:jc w:val="left"/>
             </w:pPr>
             <w:r>
               <w:t xml:space="preserve">active_ha_inside_rgp</w:t>
@@ -1288,7 +1196,6 @@
           <w:p>
             <w:pPr>
               <w:pStyle w:val="Compact"/>
-              <w:jc w:val="left"/>
             </w:pPr>
             <w:r>
               <w:t xml:space="preserve">period</w:t>
@@ -1300,7 +1207,6 @@
           <w:p>
             <w:pPr>
               <w:pStyle w:val="Compact"/>
-              <w:jc w:val="left"/>
             </w:pPr>
             <w:r>
               <w:t xml:space="preserve">gamma_log</w:t>
@@ -1312,22 +1218,20 @@
           <w:p>
             <w:pPr>
               <w:pStyle w:val="Compact"/>
-              <w:jc w:val="left"/>
             </w:pPr>
             <w:r>
               <w:rPr>
                 <w:rStyle w:val="VerbatimChar"/>
               </w:rPr>
-              <w:t xml:space="preserve">active_ha_inside_rgp ~ TRT * SR + Period + (1 \| Year) + (1 \| Year:Pasture)</w:t>
-            </w:r>
-          </w:p>
-        </w:tc>
-        <w:tc>
-          <w:tcPr/>
-          <w:p>
-            <w:pPr>
-              <w:pStyle w:val="Compact"/>
-              <w:jc w:val="left"/>
+              <w:t xml:space="preserve">active_ha_inside_rgp ~ TRT * SR * Period + (1 \| Year) + (1 \| Year:Pasture)</w:t>
+            </w:r>
+          </w:p>
+        </w:tc>
+        <w:tc>
+          <w:tcPr/>
+          <w:p>
+            <w:pPr>
+              <w:pStyle w:val="Compact"/>
             </w:pPr>
             <w:r>
               <w:t xml:space="preserve">period_level_grazing_productivity</w:t>
@@ -1341,7 +1245,6 @@
           <w:p>
             <w:pPr>
               <w:pStyle w:val="Compact"/>
-              <w:jc w:val="left"/>
             </w:pPr>
             <w:r>
               <w:t xml:space="preserve">16</w:t>
@@ -1353,7 +1256,6 @@
           <w:p>
             <w:pPr>
               <w:pStyle w:val="Compact"/>
-              <w:jc w:val="left"/>
             </w:pPr>
             <w:r>
               <w:t xml:space="preserve">total_LWG_kg</w:t>
@@ -1365,7 +1267,6 @@
           <w:p>
             <w:pPr>
               <w:pStyle w:val="Compact"/>
-              <w:jc w:val="left"/>
             </w:pPr>
             <w:r>
               <w:t xml:space="preserve">season</w:t>
@@ -1377,7 +1278,6 @@
           <w:p>
             <w:pPr>
               <w:pStyle w:val="Compact"/>
-              <w:jc w:val="left"/>
             </w:pPr>
             <w:r>
               <w:t xml:space="preserve">gaussian</w:t>
@@ -1389,7 +1289,6 @@
           <w:p>
             <w:pPr>
               <w:pStyle w:val="Compact"/>
-              <w:jc w:val="left"/>
             </w:pPr>
             <w:r>
               <w:rPr>
@@ -1404,7 +1303,6 @@
           <w:p>
             <w:pPr>
               <w:pStyle w:val="Compact"/>
-              <w:jc w:val="left"/>
             </w:pPr>
             <w:r>
               <w:t xml:space="preserve">whole_season_grazing_productivity</w:t>
@@ -1418,7 +1316,6 @@
           <w:p>
             <w:pPr>
               <w:pStyle w:val="Compact"/>
-              <w:jc w:val="left"/>
             </w:pPr>
             <w:r>
               <w:t xml:space="preserve">17</w:t>
@@ -1430,7 +1327,6 @@
           <w:p>
             <w:pPr>
               <w:pStyle w:val="Compact"/>
-              <w:jc w:val="left"/>
             </w:pPr>
             <w:r>
               <w:t xml:space="preserve">mean_RGP_ADG_kg_day</w:t>
@@ -1442,7 +1338,6 @@
           <w:p>
             <w:pPr>
               <w:pStyle w:val="Compact"/>
-              <w:jc w:val="left"/>
             </w:pPr>
             <w:r>
               <w:t xml:space="preserve">period</w:t>
@@ -1454,7 +1349,6 @@
           <w:p>
             <w:pPr>
               <w:pStyle w:val="Compact"/>
-              <w:jc w:val="left"/>
             </w:pPr>
             <w:r>
               <w:t xml:space="preserve">gaussian</w:t>
@@ -1466,22 +1360,20 @@
           <w:p>
             <w:pPr>
               <w:pStyle w:val="Compact"/>
-              <w:jc w:val="left"/>
             </w:pPr>
             <w:r>
               <w:rPr>
                 <w:rStyle w:val="VerbatimChar"/>
               </w:rPr>
-              <w:t xml:space="preserve">mean_RGP_ADG_kg_day ~ TRT * SR + Period + (1 \| Year) + (1 \| Year:Pasture)</w:t>
-            </w:r>
-          </w:p>
-        </w:tc>
-        <w:tc>
-          <w:tcPr/>
-          <w:p>
-            <w:pPr>
-              <w:pStyle w:val="Compact"/>
-              <w:jc w:val="left"/>
+              <w:t xml:space="preserve">mean_RGP_ADG_kg_day ~ TRT * SR * Period + (1 \| Year) + (1 \| Year:Pasture)</w:t>
+            </w:r>
+          </w:p>
+        </w:tc>
+        <w:tc>
+          <w:tcPr/>
+          <w:p>
+            <w:pPr>
+              <w:pStyle w:val="Compact"/>
             </w:pPr>
             <w:r>
               <w:t xml:space="preserve">period_level_grazing_productivity</w:t>
@@ -1495,7 +1387,6 @@
           <w:p>
             <w:pPr>
               <w:pStyle w:val="Compact"/>
-              <w:jc w:val="left"/>
             </w:pPr>
             <w:r>
               <w:t xml:space="preserve">18</w:t>
@@ -1507,7 +1398,6 @@
           <w:p>
             <w:pPr>
               <w:pStyle w:val="Compact"/>
-              <w:jc w:val="left"/>
             </w:pPr>
             <w:r>
               <w:t xml:space="preserve">CH4_g_animal_day</w:t>
@@ -1519,7 +1409,6 @@
           <w:p>
             <w:pPr>
               <w:pStyle w:val="Compact"/>
-              <w:jc w:val="left"/>
             </w:pPr>
             <w:r>
               <w:t xml:space="preserve">period</w:t>
@@ -1531,7 +1420,6 @@
           <w:p>
             <w:pPr>
               <w:pStyle w:val="Compact"/>
-              <w:jc w:val="left"/>
             </w:pPr>
             <w:r>
               <w:t xml:space="preserve">gaussian</w:t>
@@ -1543,22 +1431,20 @@
           <w:p>
             <w:pPr>
               <w:pStyle w:val="Compact"/>
-              <w:jc w:val="left"/>
             </w:pPr>
             <w:r>
               <w:rPr>
                 <w:rStyle w:val="VerbatimChar"/>
               </w:rPr>
-              <w:t xml:space="preserve">CH4_g_animal_day ~ TRT * SR + Period + (1 \| Year) + (1 \| Year:Pasture)</w:t>
-            </w:r>
-          </w:p>
-        </w:tc>
-        <w:tc>
-          <w:tcPr/>
-          <w:p>
-            <w:pPr>
-              <w:pStyle w:val="Compact"/>
-              <w:jc w:val="left"/>
+              <w:t xml:space="preserve">CH4_g_animal_day ~ TRT * SR * Period + (1 \| Year) + (1 \| Year:Pasture)</w:t>
+            </w:r>
+          </w:p>
+        </w:tc>
+        <w:tc>
+          <w:tcPr/>
+          <w:p>
+            <w:pPr>
+              <w:pStyle w:val="Compact"/>
             </w:pPr>
             <w:r>
               <w:t xml:space="preserve">period_level_grazing_productivity</w:t>
@@ -1572,7 +1458,6 @@
           <w:p>
             <w:pPr>
               <w:pStyle w:val="Compact"/>
-              <w:jc w:val="left"/>
             </w:pPr>
             <w:r>
               <w:t xml:space="preserve">19</w:t>
@@ -1584,7 +1469,6 @@
           <w:p>
             <w:pPr>
               <w:pStyle w:val="Compact"/>
-              <w:jc w:val="left"/>
             </w:pPr>
             <w:r>
               <w:t xml:space="preserve">CO2_g_animal_day</w:t>
@@ -1596,7 +1480,6 @@
           <w:p>
             <w:pPr>
               <w:pStyle w:val="Compact"/>
-              <w:jc w:val="left"/>
             </w:pPr>
             <w:r>
               <w:t xml:space="preserve">period</w:t>
@@ -1608,7 +1491,6 @@
           <w:p>
             <w:pPr>
               <w:pStyle w:val="Compact"/>
-              <w:jc w:val="left"/>
             </w:pPr>
             <w:r>
               <w:t xml:space="preserve">gaussian</w:t>
@@ -1620,22 +1502,20 @@
           <w:p>
             <w:pPr>
               <w:pStyle w:val="Compact"/>
-              <w:jc w:val="left"/>
             </w:pPr>
             <w:r>
               <w:rPr>
                 <w:rStyle w:val="VerbatimChar"/>
               </w:rPr>
-              <w:t xml:space="preserve">CO2_g_animal_day ~ TRT * SR + Period + (1 \| Year) + (1 \| Year:Pasture)</w:t>
-            </w:r>
-          </w:p>
-        </w:tc>
-        <w:tc>
-          <w:tcPr/>
-          <w:p>
-            <w:pPr>
-              <w:pStyle w:val="Compact"/>
-              <w:jc w:val="left"/>
+              <w:t xml:space="preserve">CO2_g_animal_day ~ TRT * SR * Period + (1 \| Year) + (1 \| Year:Pasture)</w:t>
+            </w:r>
+          </w:p>
+        </w:tc>
+        <w:tc>
+          <w:tcPr/>
+          <w:p>
+            <w:pPr>
+              <w:pStyle w:val="Compact"/>
             </w:pPr>
             <w:r>
               <w:t xml:space="preserve">period_level_grazing_productivity</w:t>
@@ -1649,7 +1529,6 @@
           <w:p>
             <w:pPr>
               <w:pStyle w:val="Compact"/>
-              <w:jc w:val="left"/>
             </w:pPr>
             <w:r>
               <w:t xml:space="preserve">20</w:t>
@@ -1661,7 +1540,6 @@
           <w:p>
             <w:pPr>
               <w:pStyle w:val="Compact"/>
-              <w:jc w:val="left"/>
             </w:pPr>
             <w:r>
               <w:t xml:space="preserve">LWG_kg_per_active_ha_all_pasture</w:t>
@@ -1673,7 +1551,6 @@
           <w:p>
             <w:pPr>
               <w:pStyle w:val="Compact"/>
-              <w:jc w:val="left"/>
             </w:pPr>
             <w:r>
               <w:t xml:space="preserve">period</w:t>
@@ -1685,7 +1562,6 @@
           <w:p>
             <w:pPr>
               <w:pStyle w:val="Compact"/>
-              <w:jc w:val="left"/>
             </w:pPr>
             <w:r>
               <w:t xml:space="preserve">gaussian</w:t>
@@ -1697,22 +1573,20 @@
           <w:p>
             <w:pPr>
               <w:pStyle w:val="Compact"/>
-              <w:jc w:val="left"/>
             </w:pPr>
             <w:r>
               <w:rPr>
                 <w:rStyle w:val="VerbatimChar"/>
               </w:rPr>
-              <w:t xml:space="preserve">LWG_kg_per_active_ha_all_pasture ~ TRT * SR + Period + (1 \| Year) + (1 \| Year:Pasture)</w:t>
-            </w:r>
-          </w:p>
-        </w:tc>
-        <w:tc>
-          <w:tcPr/>
-          <w:p>
-            <w:pPr>
-              <w:pStyle w:val="Compact"/>
-              <w:jc w:val="left"/>
+              <w:t xml:space="preserve">LWG_kg_per_active_ha_all_pasture ~ TRT * SR * Period + (1 \| Year) + (1 \| Year:Pasture)</w:t>
+            </w:r>
+          </w:p>
+        </w:tc>
+        <w:tc>
+          <w:tcPr/>
+          <w:p>
+            <w:pPr>
+              <w:pStyle w:val="Compact"/>
             </w:pPr>
             <w:r>
               <w:t xml:space="preserve">period_level_grazing_productivity</w:t>
@@ -1726,7 +1600,6 @@
           <w:p>
             <w:pPr>
               <w:pStyle w:val="Compact"/>
-              <w:jc w:val="left"/>
             </w:pPr>
             <w:r>
               <w:t xml:space="preserve">21</w:t>
@@ -1738,7 +1611,6 @@
           <w:p>
             <w:pPr>
               <w:pStyle w:val="Compact"/>
-              <w:jc w:val="left"/>
             </w:pPr>
             <w:r>
               <w:t xml:space="preserve">LWG_kg_per_active_ha_inside_rgp</w:t>
@@ -1750,7 +1622,6 @@
           <w:p>
             <w:pPr>
               <w:pStyle w:val="Compact"/>
-              <w:jc w:val="left"/>
             </w:pPr>
             <w:r>
               <w:t xml:space="preserve">period</w:t>
@@ -1762,7 +1633,6 @@
           <w:p>
             <w:pPr>
               <w:pStyle w:val="Compact"/>
-              <w:jc w:val="left"/>
             </w:pPr>
             <w:r>
               <w:t xml:space="preserve">gaussian</w:t>
@@ -1774,22 +1644,20 @@
           <w:p>
             <w:pPr>
               <w:pStyle w:val="Compact"/>
-              <w:jc w:val="left"/>
             </w:pPr>
             <w:r>
               <w:rPr>
                 <w:rStyle w:val="VerbatimChar"/>
               </w:rPr>
-              <w:t xml:space="preserve">LWG_kg_per_active_ha_inside_rgp ~ TRT * SR + Period + (1 \| Year) + (1 \| Year:Pasture)</w:t>
-            </w:r>
-          </w:p>
-        </w:tc>
-        <w:tc>
-          <w:tcPr/>
-          <w:p>
-            <w:pPr>
-              <w:pStyle w:val="Compact"/>
-              <w:jc w:val="left"/>
+              <w:t xml:space="preserve">LWG_kg_per_active_ha_inside_rgp ~ TRT * SR * Period + (1 \| Year) + (1 \| Year:Pasture)</w:t>
+            </w:r>
+          </w:p>
+        </w:tc>
+        <w:tc>
+          <w:tcPr/>
+          <w:p>
+            <w:pPr>
+              <w:pStyle w:val="Compact"/>
             </w:pPr>
             <w:r>
               <w:t xml:space="preserve">period_level_grazing_productivity</w:t>
@@ -1803,7 +1671,6 @@
           <w:p>
             <w:pPr>
               <w:pStyle w:val="Compact"/>
-              <w:jc w:val="left"/>
             </w:pPr>
             <w:r>
               <w:t xml:space="preserve">22</w:t>
@@ -1815,7 +1682,6 @@
           <w:p>
             <w:pPr>
               <w:pStyle w:val="Compact"/>
-              <w:jc w:val="left"/>
             </w:pPr>
             <w:r>
               <w:t xml:space="preserve">CH4_g_per_active_ha_all_pasture</w:t>
@@ -1827,7 +1693,6 @@
           <w:p>
             <w:pPr>
               <w:pStyle w:val="Compact"/>
-              <w:jc w:val="left"/>
             </w:pPr>
             <w:r>
               <w:t xml:space="preserve">period</w:t>
@@ -1839,7 +1704,6 @@
           <w:p>
             <w:pPr>
               <w:pStyle w:val="Compact"/>
-              <w:jc w:val="left"/>
             </w:pPr>
             <w:r>
               <w:t xml:space="preserve">gamma_log</w:t>
@@ -1851,22 +1715,20 @@
           <w:p>
             <w:pPr>
               <w:pStyle w:val="Compact"/>
-              <w:jc w:val="left"/>
             </w:pPr>
             <w:r>
               <w:rPr>
                 <w:rStyle w:val="VerbatimChar"/>
               </w:rPr>
-              <w:t xml:space="preserve">CH4_g_per_active_ha_all_pasture ~ TRT * SR + Period + (1 \| Year) + (1 \| Year:Pasture)</w:t>
-            </w:r>
-          </w:p>
-        </w:tc>
-        <w:tc>
-          <w:tcPr/>
-          <w:p>
-            <w:pPr>
-              <w:pStyle w:val="Compact"/>
-              <w:jc w:val="left"/>
+              <w:t xml:space="preserve">CH4_g_per_active_ha_all_pasture ~ TRT * SR * Period + (1 \| Year) + (1 \| Year:Pasture)</w:t>
+            </w:r>
+          </w:p>
+        </w:tc>
+        <w:tc>
+          <w:tcPr/>
+          <w:p>
+            <w:pPr>
+              <w:pStyle w:val="Compact"/>
             </w:pPr>
             <w:r>
               <w:t xml:space="preserve">period_level_grazing_productivity</w:t>
@@ -1880,7 +1742,6 @@
           <w:p>
             <w:pPr>
               <w:pStyle w:val="Compact"/>
-              <w:jc w:val="left"/>
             </w:pPr>
             <w:r>
               <w:t xml:space="preserve">23</w:t>
@@ -1892,7 +1753,6 @@
           <w:p>
             <w:pPr>
               <w:pStyle w:val="Compact"/>
-              <w:jc w:val="left"/>
             </w:pPr>
             <w:r>
               <w:t xml:space="preserve">CH4_g_per_active_ha_inside_rgp</w:t>
@@ -1904,7 +1764,6 @@
           <w:p>
             <w:pPr>
               <w:pStyle w:val="Compact"/>
-              <w:jc w:val="left"/>
             </w:pPr>
             <w:r>
               <w:t xml:space="preserve">period</w:t>
@@ -1916,7 +1775,6 @@
           <w:p>
             <w:pPr>
               <w:pStyle w:val="Compact"/>
-              <w:jc w:val="left"/>
             </w:pPr>
             <w:r>
               <w:t xml:space="preserve">gamma_log</w:t>
@@ -1928,22 +1786,20 @@
           <w:p>
             <w:pPr>
               <w:pStyle w:val="Compact"/>
-              <w:jc w:val="left"/>
             </w:pPr>
             <w:r>
               <w:rPr>
                 <w:rStyle w:val="VerbatimChar"/>
               </w:rPr>
-              <w:t xml:space="preserve">CH4_g_per_active_ha_inside_rgp ~ TRT * SR + Period + (1 \| Year) + (1 \| Year:Pasture)</w:t>
-            </w:r>
-          </w:p>
-        </w:tc>
-        <w:tc>
-          <w:tcPr/>
-          <w:p>
-            <w:pPr>
-              <w:pStyle w:val="Compact"/>
-              <w:jc w:val="left"/>
+              <w:t xml:space="preserve">CH4_g_per_active_ha_inside_rgp ~ TRT * SR * Period + (1 \| Year) + (1 \| Year:Pasture)</w:t>
+            </w:r>
+          </w:p>
+        </w:tc>
+        <w:tc>
+          <w:tcPr/>
+          <w:p>
+            <w:pPr>
+              <w:pStyle w:val="Compact"/>
             </w:pPr>
             <w:r>
               <w:t xml:space="preserve">period_level_grazing_productivity</w:t>
@@ -1957,7 +1813,6 @@
           <w:p>
             <w:pPr>
               <w:pStyle w:val="Compact"/>
-              <w:jc w:val="left"/>
             </w:pPr>
             <w:r>
               <w:t xml:space="preserve">24</w:t>
@@ -1969,7 +1824,6 @@
           <w:p>
             <w:pPr>
               <w:pStyle w:val="Compact"/>
-              <w:jc w:val="left"/>
             </w:pPr>
             <w:r>
               <w:t xml:space="preserve">CO2_g_per_active_ha_all_pasture</w:t>
@@ -1981,7 +1835,6 @@
           <w:p>
             <w:pPr>
               <w:pStyle w:val="Compact"/>
-              <w:jc w:val="left"/>
             </w:pPr>
             <w:r>
               <w:t xml:space="preserve">period</w:t>
@@ -1993,7 +1846,6 @@
           <w:p>
             <w:pPr>
               <w:pStyle w:val="Compact"/>
-              <w:jc w:val="left"/>
             </w:pPr>
             <w:r>
               <w:t xml:space="preserve">gamma_log</w:t>
@@ -2005,22 +1857,20 @@
           <w:p>
             <w:pPr>
               <w:pStyle w:val="Compact"/>
-              <w:jc w:val="left"/>
             </w:pPr>
             <w:r>
               <w:rPr>
                 <w:rStyle w:val="VerbatimChar"/>
               </w:rPr>
-              <w:t xml:space="preserve">CO2_g_per_active_ha_all_pasture ~ TRT * SR + Period + (1 \| Year) + (1 \| Year:Pasture)</w:t>
-            </w:r>
-          </w:p>
-        </w:tc>
-        <w:tc>
-          <w:tcPr/>
-          <w:p>
-            <w:pPr>
-              <w:pStyle w:val="Compact"/>
-              <w:jc w:val="left"/>
+              <w:t xml:space="preserve">CO2_g_per_active_ha_all_pasture ~ TRT * SR * Period + (1 \| Year) + (1 \| Year:Pasture)</w:t>
+            </w:r>
+          </w:p>
+        </w:tc>
+        <w:tc>
+          <w:tcPr/>
+          <w:p>
+            <w:pPr>
+              <w:pStyle w:val="Compact"/>
             </w:pPr>
             <w:r>
               <w:t xml:space="preserve">period_level_grazing_productivity</w:t>
@@ -2034,7 +1884,6 @@
           <w:p>
             <w:pPr>
               <w:pStyle w:val="Compact"/>
-              <w:jc w:val="left"/>
             </w:pPr>
             <w:r>
               <w:t xml:space="preserve">25</w:t>
@@ -2046,7 +1895,6 @@
           <w:p>
             <w:pPr>
               <w:pStyle w:val="Compact"/>
-              <w:jc w:val="left"/>
             </w:pPr>
             <w:r>
               <w:t xml:space="preserve">CO2_g_per_active_ha_inside_rgp</w:t>
@@ -2058,7 +1906,6 @@
           <w:p>
             <w:pPr>
               <w:pStyle w:val="Compact"/>
-              <w:jc w:val="left"/>
             </w:pPr>
             <w:r>
               <w:t xml:space="preserve">period</w:t>
@@ -2070,7 +1917,6 @@
           <w:p>
             <w:pPr>
               <w:pStyle w:val="Compact"/>
-              <w:jc w:val="left"/>
             </w:pPr>
             <w:r>
               <w:t xml:space="preserve">gamma_log</w:t>
@@ -2082,22 +1928,20 @@
           <w:p>
             <w:pPr>
               <w:pStyle w:val="Compact"/>
-              <w:jc w:val="left"/>
             </w:pPr>
             <w:r>
               <w:rPr>
                 <w:rStyle w:val="VerbatimChar"/>
               </w:rPr>
-              <w:t xml:space="preserve">CO2_g_per_active_ha_inside_rgp ~ TRT * SR + Period + (1 \| Year) + (1 \| Year:Pasture)</w:t>
-            </w:r>
-          </w:p>
-        </w:tc>
-        <w:tc>
-          <w:tcPr/>
-          <w:p>
-            <w:pPr>
-              <w:pStyle w:val="Compact"/>
-              <w:jc w:val="left"/>
+              <w:t xml:space="preserve">CO2_g_per_active_ha_inside_rgp ~ TRT * SR * Period + (1 \| Year) + (1 \| Year:Pasture)</w:t>
+            </w:r>
+          </w:p>
+        </w:tc>
+        <w:tc>
+          <w:tcPr/>
+          <w:p>
+            <w:pPr>
+              <w:pStyle w:val="Compact"/>
             </w:pPr>
             <w:r>
               <w:t xml:space="preserve">period_level_grazing_productivity</w:t>
@@ -2111,7 +1955,6 @@
           <w:p>
             <w:pPr>
               <w:pStyle w:val="Compact"/>
-              <w:jc w:val="left"/>
             </w:pPr>
             <w:r>
               <w:t xml:space="preserve">26</w:t>
@@ -2123,7 +1966,6 @@
           <w:p>
             <w:pPr>
               <w:pStyle w:val="Compact"/>
-              <w:jc w:val="left"/>
             </w:pPr>
             <w:r>
               <w:t xml:space="preserve">CH4_g_per_kg_LWG</w:t>
@@ -2135,7 +1977,6 @@
           <w:p>
             <w:pPr>
               <w:pStyle w:val="Compact"/>
-              <w:jc w:val="left"/>
             </w:pPr>
             <w:r>
               <w:t xml:space="preserve">period</w:t>
@@ -2147,7 +1988,6 @@
           <w:p>
             <w:pPr>
               <w:pStyle w:val="Compact"/>
-              <w:jc w:val="left"/>
             </w:pPr>
             <w:r>
               <w:t xml:space="preserve">gamma_log</w:t>
@@ -2159,22 +1999,20 @@
           <w:p>
             <w:pPr>
               <w:pStyle w:val="Compact"/>
-              <w:jc w:val="left"/>
             </w:pPr>
             <w:r>
               <w:rPr>
                 <w:rStyle w:val="VerbatimChar"/>
               </w:rPr>
-              <w:t xml:space="preserve">CH4_g_per_kg_LWG ~ TRT * SR + Period + (1 \| Year) + (1 \| Year:Pasture)</w:t>
-            </w:r>
-          </w:p>
-        </w:tc>
-        <w:tc>
-          <w:tcPr/>
-          <w:p>
-            <w:pPr>
-              <w:pStyle w:val="Compact"/>
-              <w:jc w:val="left"/>
+              <w:t xml:space="preserve">CH4_g_per_kg_LWG ~ TRT * SR * Period + (1 \| Year) + (1 \| Year:Pasture)</w:t>
+            </w:r>
+          </w:p>
+        </w:tc>
+        <w:tc>
+          <w:tcPr/>
+          <w:p>
+            <w:pPr>
+              <w:pStyle w:val="Compact"/>
             </w:pPr>
             <w:r>
               <w:t xml:space="preserve">period_level_grazing_productivity</w:t>
@@ -2188,7 +2026,6 @@
           <w:p>
             <w:pPr>
               <w:pStyle w:val="Compact"/>
-              <w:jc w:val="left"/>
             </w:pPr>
             <w:r>
               <w:t xml:space="preserve">27</w:t>
@@ -2200,7 +2037,6 @@
           <w:p>
             <w:pPr>
               <w:pStyle w:val="Compact"/>
-              <w:jc w:val="left"/>
             </w:pPr>
             <w:r>
               <w:t xml:space="preserve">CO2_g_per_kg_LWG</w:t>
@@ -2212,7 +2048,6 @@
           <w:p>
             <w:pPr>
               <w:pStyle w:val="Compact"/>
-              <w:jc w:val="left"/>
             </w:pPr>
             <w:r>
               <w:t xml:space="preserve">period</w:t>
@@ -2224,7 +2059,6 @@
           <w:p>
             <w:pPr>
               <w:pStyle w:val="Compact"/>
-              <w:jc w:val="left"/>
             </w:pPr>
             <w:r>
               <w:t xml:space="preserve">gamma_log</w:t>
@@ -2236,22 +2070,20 @@
           <w:p>
             <w:pPr>
               <w:pStyle w:val="Compact"/>
-              <w:jc w:val="left"/>
             </w:pPr>
             <w:r>
               <w:rPr>
                 <w:rStyle w:val="VerbatimChar"/>
               </w:rPr>
-              <w:t xml:space="preserve">CO2_g_per_kg_LWG ~ TRT * SR + Period + (1 \| Year) + (1 \| Year:Pasture)</w:t>
-            </w:r>
-          </w:p>
-        </w:tc>
-        <w:tc>
-          <w:tcPr/>
-          <w:p>
-            <w:pPr>
-              <w:pStyle w:val="Compact"/>
-              <w:jc w:val="left"/>
+              <w:t xml:space="preserve">CO2_g_per_kg_LWG ~ TRT * SR * Period + (1 \| Year) + (1 \| Year:Pasture)</w:t>
+            </w:r>
+          </w:p>
+        </w:tc>
+        <w:tc>
+          <w:tcPr/>
+          <w:p>
+            <w:pPr>
+              <w:pStyle w:val="Compact"/>
             </w:pPr>
             <w:r>
               <w:t xml:space="preserve">period_level_grazing_productivity</w:t>
@@ -2265,7 +2097,6 @@
           <w:p>
             <w:pPr>
               <w:pStyle w:val="Compact"/>
-              <w:jc w:val="left"/>
             </w:pPr>
             <w:r>
               <w:t xml:space="preserve">28</w:t>
@@ -2277,7 +2108,6 @@
           <w:p>
             <w:pPr>
               <w:pStyle w:val="Compact"/>
-              <w:jc w:val="left"/>
             </w:pPr>
             <w:r>
               <w:t xml:space="preserve">total_LWG_kg</w:t>
@@ -2289,7 +2119,6 @@
           <w:p>
             <w:pPr>
               <w:pStyle w:val="Compact"/>
-              <w:jc w:val="left"/>
             </w:pPr>
             <w:r>
               <w:t xml:space="preserve">season</w:t>
@@ -2301,7 +2130,6 @@
           <w:p>
             <w:pPr>
               <w:pStyle w:val="Compact"/>
-              <w:jc w:val="left"/>
             </w:pPr>
             <w:r>
               <w:t xml:space="preserve">gaussian</w:t>
@@ -2313,7 +2141,6 @@
           <w:p>
             <w:pPr>
               <w:pStyle w:val="Compact"/>
-              <w:jc w:val="left"/>
             </w:pPr>
             <w:r>
               <w:rPr>
@@ -2328,7 +2155,6 @@
           <w:p>
             <w:pPr>
               <w:pStyle w:val="Compact"/>
-              <w:jc w:val="left"/>
             </w:pPr>
             <w:r>
               <w:t xml:space="preserve">whole_season_grazing_productivity</w:t>
@@ -2342,7 +2168,6 @@
           <w:p>
             <w:pPr>
               <w:pStyle w:val="Compact"/>
-              <w:jc w:val="left"/>
             </w:pPr>
             <w:r>
               <w:t xml:space="preserve">29</w:t>
@@ -2354,7 +2179,6 @@
           <w:p>
             <w:pPr>
               <w:pStyle w:val="Compact"/>
-              <w:jc w:val="left"/>
             </w:pPr>
             <w:r>
               <w:t xml:space="preserve">mean_Shrunk_Initial_BW_kg</w:t>
@@ -2366,7 +2190,6 @@
           <w:p>
             <w:pPr>
               <w:pStyle w:val="Compact"/>
-              <w:jc w:val="left"/>
             </w:pPr>
             <w:r>
               <w:t xml:space="preserve">season</w:t>
@@ -2378,7 +2201,6 @@
           <w:p>
             <w:pPr>
               <w:pStyle w:val="Compact"/>
-              <w:jc w:val="left"/>
             </w:pPr>
             <w:r>
               <w:t xml:space="preserve">gaussian</w:t>
@@ -2390,7 +2212,6 @@
           <w:p>
             <w:pPr>
               <w:pStyle w:val="Compact"/>
-              <w:jc w:val="left"/>
             </w:pPr>
             <w:r>
               <w:rPr>
@@ -2405,7 +2226,6 @@
           <w:p>
             <w:pPr>
               <w:pStyle w:val="Compact"/>
-              <w:jc w:val="left"/>
             </w:pPr>
             <w:r>
               <w:t xml:space="preserve">whole_season_grazing_productivity</w:t>
@@ -2419,7 +2239,6 @@
           <w:p>
             <w:pPr>
               <w:pStyle w:val="Compact"/>
-              <w:jc w:val="left"/>
             </w:pPr>
             <w:r>
               <w:t xml:space="preserve">30</w:t>
@@ -2431,7 +2250,6 @@
           <w:p>
             <w:pPr>
               <w:pStyle w:val="Compact"/>
-              <w:jc w:val="left"/>
             </w:pPr>
             <w:r>
               <w:t xml:space="preserve">mean_Shrunk_Final_BW_kg</w:t>
@@ -2443,7 +2261,6 @@
           <w:p>
             <w:pPr>
               <w:pStyle w:val="Compact"/>
-              <w:jc w:val="left"/>
             </w:pPr>
             <w:r>
               <w:t xml:space="preserve">season</w:t>
@@ -2455,7 +2272,6 @@
           <w:p>
             <w:pPr>
               <w:pStyle w:val="Compact"/>
-              <w:jc w:val="left"/>
             </w:pPr>
             <w:r>
               <w:t xml:space="preserve">gaussian</w:t>
@@ -2467,7 +2283,6 @@
           <w:p>
             <w:pPr>
               <w:pStyle w:val="Compact"/>
-              <w:jc w:val="left"/>
             </w:pPr>
             <w:r>
               <w:rPr>
@@ -2482,7 +2297,6 @@
           <w:p>
             <w:pPr>
               <w:pStyle w:val="Compact"/>
-              <w:jc w:val="left"/>
             </w:pPr>
             <w:r>
               <w:t xml:space="preserve">whole_season_grazing_productivity</w:t>
@@ -2496,7 +2310,6 @@
           <w:p>
             <w:pPr>
               <w:pStyle w:val="Compact"/>
-              <w:jc w:val="left"/>
             </w:pPr>
             <w:r>
               <w:t xml:space="preserve">31</w:t>
@@ -2508,7 +2321,6 @@
           <w:p>
             <w:pPr>
               <w:pStyle w:val="Compact"/>
-              <w:jc w:val="left"/>
             </w:pPr>
             <w:r>
               <w:t xml:space="preserve">mean_Whole_Season_Smooth_ADG_kg_day</w:t>
@@ -2520,7 +2332,6 @@
           <w:p>
             <w:pPr>
               <w:pStyle w:val="Compact"/>
-              <w:jc w:val="left"/>
             </w:pPr>
             <w:r>
               <w:t xml:space="preserve">season</w:t>
@@ -2532,7 +2343,6 @@
           <w:p>
             <w:pPr>
               <w:pStyle w:val="Compact"/>
-              <w:jc w:val="left"/>
             </w:pPr>
             <w:r>
               <w:t xml:space="preserve">gaussian</w:t>
@@ -2544,7 +2354,6 @@
           <w:p>
             <w:pPr>
               <w:pStyle w:val="Compact"/>
-              <w:jc w:val="left"/>
             </w:pPr>
             <w:r>
               <w:rPr>
@@ -2559,7 +2368,6 @@
           <w:p>
             <w:pPr>
               <w:pStyle w:val="Compact"/>
-              <w:jc w:val="left"/>
             </w:pPr>
             <w:r>
               <w:t xml:space="preserve">whole_season_grazing_productivity</w:t>
@@ -2573,7 +2381,6 @@
           <w:p>
             <w:pPr>
               <w:pStyle w:val="Compact"/>
-              <w:jc w:val="left"/>
             </w:pPr>
             <w:r>
               <w:t xml:space="preserve">32</w:t>
@@ -2585,7 +2392,6 @@
           <w:p>
             <w:pPr>
               <w:pStyle w:val="Compact"/>
-              <w:jc w:val="left"/>
             </w:pPr>
             <w:r>
               <w:t xml:space="preserve">whole_season_animal_avg_CH4_g_day</w:t>
@@ -2597,7 +2403,6 @@
           <w:p>
             <w:pPr>
               <w:pStyle w:val="Compact"/>
-              <w:jc w:val="left"/>
             </w:pPr>
             <w:r>
               <w:t xml:space="preserve">season</w:t>
@@ -2609,7 +2414,6 @@
           <w:p>
             <w:pPr>
               <w:pStyle w:val="Compact"/>
-              <w:jc w:val="left"/>
             </w:pPr>
             <w:r>
               <w:t xml:space="preserve">gaussian</w:t>
@@ -2621,7 +2425,6 @@
           <w:p>
             <w:pPr>
               <w:pStyle w:val="Compact"/>
-              <w:jc w:val="left"/>
             </w:pPr>
             <w:r>
               <w:rPr>
@@ -2636,7 +2439,6 @@
           <w:p>
             <w:pPr>
               <w:pStyle w:val="Compact"/>
-              <w:jc w:val="left"/>
             </w:pPr>
             <w:r>
               <w:t xml:space="preserve">whole_season_grazing_productivity</w:t>
@@ -2650,7 +2452,6 @@
           <w:p>
             <w:pPr>
               <w:pStyle w:val="Compact"/>
-              <w:jc w:val="left"/>
             </w:pPr>
             <w:r>
               <w:t xml:space="preserve">33</w:t>
@@ -2662,7 +2463,6 @@
           <w:p>
             <w:pPr>
               <w:pStyle w:val="Compact"/>
-              <w:jc w:val="left"/>
             </w:pPr>
             <w:r>
               <w:t xml:space="preserve">whole_season_animal_avg_CO2_g_day</w:t>
@@ -2674,7 +2474,6 @@
           <w:p>
             <w:pPr>
               <w:pStyle w:val="Compact"/>
-              <w:jc w:val="left"/>
             </w:pPr>
             <w:r>
               <w:t xml:space="preserve">season</w:t>
@@ -2686,7 +2485,6 @@
           <w:p>
             <w:pPr>
               <w:pStyle w:val="Compact"/>
-              <w:jc w:val="left"/>
             </w:pPr>
             <w:r>
               <w:t xml:space="preserve">gaussian</w:t>
@@ -2698,7 +2496,6 @@
           <w:p>
             <w:pPr>
               <w:pStyle w:val="Compact"/>
-              <w:jc w:val="left"/>
             </w:pPr>
             <w:r>
               <w:rPr>
@@ -2713,7 +2510,6 @@
           <w:p>
             <w:pPr>
               <w:pStyle w:val="Compact"/>
-              <w:jc w:val="left"/>
             </w:pPr>
             <w:r>
               <w:t xml:space="preserve">whole_season_grazing_productivity</w:t>
@@ -2727,7 +2523,6 @@
           <w:p>
             <w:pPr>
               <w:pStyle w:val="Compact"/>
-              <w:jc w:val="left"/>
             </w:pPr>
             <w:r>
               <w:t xml:space="preserve">34</w:t>
@@ -2739,7 +2534,6 @@
           <w:p>
             <w:pPr>
               <w:pStyle w:val="Compact"/>
-              <w:jc w:val="left"/>
             </w:pPr>
             <w:r>
               <w:t xml:space="preserve">CH4_g_per_active_ha_day_whole_season</w:t>
@@ -2751,7 +2545,6 @@
           <w:p>
             <w:pPr>
               <w:pStyle w:val="Compact"/>
-              <w:jc w:val="left"/>
             </w:pPr>
             <w:r>
               <w:t xml:space="preserve">season</w:t>
@@ -2763,7 +2556,6 @@
           <w:p>
             <w:pPr>
               <w:pStyle w:val="Compact"/>
-              <w:jc w:val="left"/>
             </w:pPr>
             <w:r>
               <w:t xml:space="preserve">auto_positive</w:t>
@@ -2775,7 +2567,6 @@
           <w:p>
             <w:pPr>
               <w:pStyle w:val="Compact"/>
-              <w:jc w:val="left"/>
             </w:pPr>
             <w:r>
               <w:rPr>
@@ -2790,7 +2581,6 @@
           <w:p>
             <w:pPr>
               <w:pStyle w:val="Compact"/>
-              <w:jc w:val="left"/>
             </w:pPr>
             <w:r>
               <w:t xml:space="preserve">whole_season_grazing_productivity</w:t>
@@ -2804,7 +2594,6 @@
           <w:p>
             <w:pPr>
               <w:pStyle w:val="Compact"/>
-              <w:jc w:val="left"/>
             </w:pPr>
             <w:r>
               <w:t xml:space="preserve">35</w:t>
@@ -2816,7 +2605,6 @@
           <w:p>
             <w:pPr>
               <w:pStyle w:val="Compact"/>
-              <w:jc w:val="left"/>
             </w:pPr>
             <w:r>
               <w:t xml:space="preserve">CO2_g_per_active_ha_day_whole_season</w:t>
@@ -2828,7 +2616,6 @@
           <w:p>
             <w:pPr>
               <w:pStyle w:val="Compact"/>
-              <w:jc w:val="left"/>
             </w:pPr>
             <w:r>
               <w:t xml:space="preserve">season</w:t>
@@ -2840,7 +2627,6 @@
           <w:p>
             <w:pPr>
               <w:pStyle w:val="Compact"/>
-              <w:jc w:val="left"/>
             </w:pPr>
             <w:r>
               <w:t xml:space="preserve">auto_positive</w:t>
@@ -2852,7 +2638,6 @@
           <w:p>
             <w:pPr>
               <w:pStyle w:val="Compact"/>
-              <w:jc w:val="left"/>
             </w:pPr>
             <w:r>
               <w:rPr>
@@ -2867,7 +2652,6 @@
           <w:p>
             <w:pPr>
               <w:pStyle w:val="Compact"/>
-              <w:jc w:val="left"/>
             </w:pPr>
             <w:r>
               <w:t xml:space="preserve">whole_season_grazing_productivity</w:t>
@@ -2881,7 +2665,6 @@
           <w:p>
             <w:pPr>
               <w:pStyle w:val="Compact"/>
-              <w:jc w:val="left"/>
             </w:pPr>
             <w:r>
               <w:t xml:space="preserve">36</w:t>
@@ -2893,7 +2676,6 @@
           <w:p>
             <w:pPr>
               <w:pStyle w:val="Compact"/>
-              <w:jc w:val="left"/>
             </w:pPr>
             <w:r>
               <w:t xml:space="preserve">ADG_Land_kg_per_active_ha_day_whole_season</w:t>
@@ -2905,7 +2687,6 @@
           <w:p>
             <w:pPr>
               <w:pStyle w:val="Compact"/>
-              <w:jc w:val="left"/>
             </w:pPr>
             <w:r>
               <w:t xml:space="preserve">season</w:t>
@@ -2917,7 +2698,6 @@
           <w:p>
             <w:pPr>
               <w:pStyle w:val="Compact"/>
-              <w:jc w:val="left"/>
             </w:pPr>
             <w:r>
               <w:t xml:space="preserve">gaussian</w:t>
@@ -2929,7 +2709,6 @@
           <w:p>
             <w:pPr>
               <w:pStyle w:val="Compact"/>
-              <w:jc w:val="left"/>
             </w:pPr>
             <w:r>
               <w:rPr>
@@ -2944,7 +2723,6 @@
           <w:p>
             <w:pPr>
               <w:pStyle w:val="Compact"/>
-              <w:jc w:val="left"/>
             </w:pPr>
             <w:r>
               <w:t xml:space="preserve">whole_season_grazing_productivity</w:t>
@@ -2958,7 +2736,6 @@
           <w:p>
             <w:pPr>
               <w:pStyle w:val="Compact"/>
-              <w:jc w:val="left"/>
             </w:pPr>
             <w:r>
               <w:t xml:space="preserve">37</w:t>
@@ -2970,7 +2747,6 @@
           <w:p>
             <w:pPr>
               <w:pStyle w:val="Compact"/>
-              <w:jc w:val="left"/>
             </w:pPr>
             <w:r>
               <w:t xml:space="preserve">CH4_g_per_kg_LWG_whole_season</w:t>
@@ -2982,7 +2758,6 @@
           <w:p>
             <w:pPr>
               <w:pStyle w:val="Compact"/>
-              <w:jc w:val="left"/>
             </w:pPr>
             <w:r>
               <w:t xml:space="preserve">season</w:t>
@@ -2994,7 +2769,6 @@
           <w:p>
             <w:pPr>
               <w:pStyle w:val="Compact"/>
-              <w:jc w:val="left"/>
             </w:pPr>
             <w:r>
               <w:t xml:space="preserve">gamma_log</w:t>
@@ -3006,7 +2780,6 @@
           <w:p>
             <w:pPr>
               <w:pStyle w:val="Compact"/>
-              <w:jc w:val="left"/>
             </w:pPr>
             <w:r>
               <w:rPr>
@@ -3021,7 +2794,6 @@
           <w:p>
             <w:pPr>
               <w:pStyle w:val="Compact"/>
-              <w:jc w:val="left"/>
             </w:pPr>
             <w:r>
               <w:t xml:space="preserve">whole_season_grazing_productivity</w:t>
@@ -3035,7 +2807,6 @@
           <w:p>
             <w:pPr>
               <w:pStyle w:val="Compact"/>
-              <w:jc w:val="left"/>
             </w:pPr>
             <w:r>
               <w:t xml:space="preserve">38</w:t>
@@ -3047,7 +2818,6 @@
           <w:p>
             <w:pPr>
               <w:pStyle w:val="Compact"/>
-              <w:jc w:val="left"/>
             </w:pPr>
             <w:r>
               <w:t xml:space="preserve">CO2_g_per_kg_LWG_whole_season</w:t>
@@ -3059,7 +2829,6 @@
           <w:p>
             <w:pPr>
               <w:pStyle w:val="Compact"/>
-              <w:jc w:val="left"/>
             </w:pPr>
             <w:r>
               <w:t xml:space="preserve">season</w:t>
@@ -3071,7 +2840,6 @@
           <w:p>
             <w:pPr>
               <w:pStyle w:val="Compact"/>
-              <w:jc w:val="left"/>
             </w:pPr>
             <w:r>
               <w:t xml:space="preserve">gamma_log</w:t>
@@ -3083,7 +2851,6 @@
           <w:p>
             <w:pPr>
               <w:pStyle w:val="Compact"/>
-              <w:jc w:val="left"/>
             </w:pPr>
             <w:r>
               <w:rPr>
@@ -3098,7 +2865,6 @@
           <w:p>
             <w:pPr>
               <w:pStyle w:val="Compact"/>
-              <w:jc w:val="left"/>
             </w:pPr>
             <w:r>
               <w:t xml:space="preserve">whole_season_grazing_productivity</w:t>
@@ -3112,7 +2878,6 @@
           <w:p>
             <w:pPr>
               <w:pStyle w:val="Compact"/>
-              <w:jc w:val="left"/>
             </w:pPr>
             <w:r>
               <w:t xml:space="preserve">39</w:t>
@@ -3124,7 +2889,6 @@
           <w:p>
             <w:pPr>
               <w:pStyle w:val="Compact"/>
-              <w:jc w:val="left"/>
             </w:pPr>
             <w:r>
               <w:t xml:space="preserve">Whole_Season_CH4_g_day</w:t>
@@ -3136,7 +2900,6 @@
           <w:p>
             <w:pPr>
               <w:pStyle w:val="Compact"/>
-              <w:jc w:val="left"/>
             </w:pPr>
             <w:r>
               <w:t xml:space="preserve">season</w:t>
@@ -3148,7 +2911,6 @@
           <w:p>
             <w:pPr>
               <w:pStyle w:val="Compact"/>
-              <w:jc w:val="left"/>
             </w:pPr>
             <w:r>
               <w:t xml:space="preserve">gaussian</w:t>
@@ -3160,7 +2922,6 @@
           <w:p>
             <w:pPr>
               <w:pStyle w:val="Compact"/>
-              <w:jc w:val="left"/>
             </w:pPr>
             <w:r>
               <w:rPr>
@@ -3175,7 +2936,6 @@
           <w:p>
             <w:pPr>
               <w:pStyle w:val="Compact"/>
-              <w:jc w:val="left"/>
             </w:pPr>
             <w:r>
               <w:t xml:space="preserve">shrunk_bw_season_analysis</w:t>
@@ -3189,7 +2949,6 @@
           <w:p>
             <w:pPr>
               <w:pStyle w:val="Compact"/>
-              <w:jc w:val="left"/>
             </w:pPr>
             <w:r>
               <w:t xml:space="preserve">40</w:t>
@@ -3201,7 +2960,6 @@
           <w:p>
             <w:pPr>
               <w:pStyle w:val="Compact"/>
-              <w:jc w:val="left"/>
             </w:pPr>
             <w:r>
               <w:t xml:space="preserve">Whole_Season_CO2_g_day</w:t>
@@ -3213,7 +2971,6 @@
           <w:p>
             <w:pPr>
               <w:pStyle w:val="Compact"/>
-              <w:jc w:val="left"/>
             </w:pPr>
             <w:r>
               <w:t xml:space="preserve">season</w:t>
@@ -3225,7 +2982,6 @@
           <w:p>
             <w:pPr>
               <w:pStyle w:val="Compact"/>
-              <w:jc w:val="left"/>
             </w:pPr>
             <w:r>
               <w:t xml:space="preserve">gaussian</w:t>
@@ -3237,7 +2993,6 @@
           <w:p>
             <w:pPr>
               <w:pStyle w:val="Compact"/>
-              <w:jc w:val="left"/>
             </w:pPr>
             <w:r>
               <w:rPr>
@@ -3252,7 +3007,6 @@
           <w:p>
             <w:pPr>
               <w:pStyle w:val="Compact"/>
-              <w:jc w:val="left"/>
             </w:pPr>
             <w:r>
               <w:t xml:space="preserve">shrunk_bw_season_analysis</w:t>
@@ -3266,7 +3020,6 @@
           <w:p>
             <w:pPr>
               <w:pStyle w:val="Compact"/>
-              <w:jc w:val="left"/>
             </w:pPr>
             <w:r>
               <w:t xml:space="preserve">41</w:t>
@@ -3278,7 +3031,6 @@
           <w:p>
             <w:pPr>
               <w:pStyle w:val="Compact"/>
-              <w:jc w:val="left"/>
             </w:pPr>
             <w:r>
               <w:t xml:space="preserve">Whole_Season_Smooth_ADG_kg_day</w:t>
@@ -3290,7 +3042,6 @@
           <w:p>
             <w:pPr>
               <w:pStyle w:val="Compact"/>
-              <w:jc w:val="left"/>
             </w:pPr>
             <w:r>
               <w:t xml:space="preserve">season</w:t>
@@ -3302,7 +3053,6 @@
           <w:p>
             <w:pPr>
               <w:pStyle w:val="Compact"/>
-              <w:jc w:val="left"/>
             </w:pPr>
             <w:r>
               <w:t xml:space="preserve">gaussian</w:t>
@@ -3314,7 +3064,6 @@
           <w:p>
             <w:pPr>
               <w:pStyle w:val="Compact"/>
-              <w:jc w:val="left"/>
             </w:pPr>
             <w:r>
               <w:rPr>
@@ -3329,7 +3078,6 @@
           <w:p>
             <w:pPr>
               <w:pStyle w:val="Compact"/>
-              <w:jc w:val="left"/>
             </w:pPr>
             <w:r>
               <w:t xml:space="preserve">shrunk_bw_season_analysis</w:t>
@@ -3343,7 +3091,6 @@
           <w:p>
             <w:pPr>
               <w:pStyle w:val="Compact"/>
-              <w:jc w:val="left"/>
             </w:pPr>
             <w:r>
               <w:t xml:space="preserve">42</w:t>
@@ -3355,7 +3102,6 @@
           <w:p>
             <w:pPr>
               <w:pStyle w:val="Compact"/>
-              <w:jc w:val="left"/>
             </w:pPr>
             <w:r>
               <w:t xml:space="preserve">RGP_CH4_g_day</w:t>
@@ -3367,7 +3113,6 @@
           <w:p>
             <w:pPr>
               <w:pStyle w:val="Compact"/>
-              <w:jc w:val="left"/>
             </w:pPr>
             <w:r>
               <w:t xml:space="preserve">period</w:t>
@@ -3379,7 +3124,6 @@
           <w:p>
             <w:pPr>
               <w:pStyle w:val="Compact"/>
-              <w:jc w:val="left"/>
             </w:pPr>
             <w:r>
               <w:t xml:space="preserve">gaussian</w:t>
@@ -3391,22 +3135,20 @@
           <w:p>
             <w:pPr>
               <w:pStyle w:val="Compact"/>
-              <w:jc w:val="left"/>
             </w:pPr>
             <w:r>
               <w:rPr>
                 <w:rStyle w:val="VerbatimChar"/>
               </w:rPr>
-              <w:t xml:space="preserve">RGP_CH4_g_day ~ TRT * SR + Period + (1 \| Year) + (1 \| Year:Pasture)</w:t>
-            </w:r>
-          </w:p>
-        </w:tc>
-        <w:tc>
-          <w:tcPr/>
-          <w:p>
-            <w:pPr>
-              <w:pStyle w:val="Compact"/>
-              <w:jc w:val="left"/>
+              <w:t xml:space="preserve">RGP_CH4_g_day ~ TRT * SR * Period + (1 \| Year) + (1 \| Year:Pasture)</w:t>
+            </w:r>
+          </w:p>
+        </w:tc>
+        <w:tc>
+          <w:tcPr/>
+          <w:p>
+            <w:pPr>
+              <w:pStyle w:val="Compact"/>
             </w:pPr>
             <w:r>
               <w:t xml:space="preserve">shrunk_bw_period_analysis</w:t>
@@ -3420,7 +3162,6 @@
           <w:p>
             <w:pPr>
               <w:pStyle w:val="Compact"/>
-              <w:jc w:val="left"/>
             </w:pPr>
             <w:r>
               <w:t xml:space="preserve">43</w:t>
@@ -3432,7 +3173,6 @@
           <w:p>
             <w:pPr>
               <w:pStyle w:val="Compact"/>
-              <w:jc w:val="left"/>
             </w:pPr>
             <w:r>
               <w:t xml:space="preserve">RGP_CO2_g_day</w:t>
@@ -3444,7 +3184,6 @@
           <w:p>
             <w:pPr>
               <w:pStyle w:val="Compact"/>
-              <w:jc w:val="left"/>
             </w:pPr>
             <w:r>
               <w:t xml:space="preserve">period</w:t>
@@ -3456,7 +3195,6 @@
           <w:p>
             <w:pPr>
               <w:pStyle w:val="Compact"/>
-              <w:jc w:val="left"/>
             </w:pPr>
             <w:r>
               <w:t xml:space="preserve">gaussian</w:t>
@@ -3468,22 +3206,20 @@
           <w:p>
             <w:pPr>
               <w:pStyle w:val="Compact"/>
-              <w:jc w:val="left"/>
             </w:pPr>
             <w:r>
               <w:rPr>
                 <w:rStyle w:val="VerbatimChar"/>
               </w:rPr>
-              <w:t xml:space="preserve">RGP_CO2_g_day ~ TRT * SR + Period + (1 \| Year) + (1 \| Year:Pasture)</w:t>
-            </w:r>
-          </w:p>
-        </w:tc>
-        <w:tc>
-          <w:tcPr/>
-          <w:p>
-            <w:pPr>
-              <w:pStyle w:val="Compact"/>
-              <w:jc w:val="left"/>
+              <w:t xml:space="preserve">RGP_CO2_g_day ~ TRT * SR * Period + (1 \| Year) + (1 \| Year:Pasture)</w:t>
+            </w:r>
+          </w:p>
+        </w:tc>
+        <w:tc>
+          <w:tcPr/>
+          <w:p>
+            <w:pPr>
+              <w:pStyle w:val="Compact"/>
             </w:pPr>
             <w:r>
               <w:t xml:space="preserve">shrunk_bw_period_analysis</w:t>
@@ -3497,7 +3233,6 @@
           <w:p>
             <w:pPr>
               <w:pStyle w:val="Compact"/>
-              <w:jc w:val="left"/>
             </w:pPr>
             <w:r>
               <w:t xml:space="preserve">44</w:t>
@@ -3509,7 +3244,6 @@
           <w:p>
             <w:pPr>
               <w:pStyle w:val="Compact"/>
-              <w:jc w:val="left"/>
             </w:pPr>
             <w:r>
               <w:t xml:space="preserve">RGP_Smooth_ADG_kg_day</w:t>
@@ -3521,7 +3255,6 @@
           <w:p>
             <w:pPr>
               <w:pStyle w:val="Compact"/>
-              <w:jc w:val="left"/>
             </w:pPr>
             <w:r>
               <w:t xml:space="preserve">period</w:t>
@@ -3533,7 +3266,6 @@
           <w:p>
             <w:pPr>
               <w:pStyle w:val="Compact"/>
-              <w:jc w:val="left"/>
             </w:pPr>
             <w:r>
               <w:t xml:space="preserve">gaussian</w:t>
@@ -3545,22 +3277,20 @@
           <w:p>
             <w:pPr>
               <w:pStyle w:val="Compact"/>
-              <w:jc w:val="left"/>
             </w:pPr>
             <w:r>
               <w:rPr>
                 <w:rStyle w:val="VerbatimChar"/>
               </w:rPr>
-              <w:t xml:space="preserve">RGP_Smooth_ADG_kg_day ~ TRT * SR + Period + (1 \| Year) + (1 \| Year:Pasture)</w:t>
-            </w:r>
-          </w:p>
-        </w:tc>
-        <w:tc>
-          <w:tcPr/>
-          <w:p>
-            <w:pPr>
-              <w:pStyle w:val="Compact"/>
-              <w:jc w:val="left"/>
+              <w:t xml:space="preserve">RGP_Smooth_ADG_kg_day ~ TRT * SR * Period + (1 \| Year) + (1 \| Year:Pasture)</w:t>
+            </w:r>
+          </w:p>
+        </w:tc>
+        <w:tc>
+          <w:tcPr/>
+          <w:p>
+            <w:pPr>
+              <w:pStyle w:val="Compact"/>
             </w:pPr>
             <w:r>
               <w:t xml:space="preserve">shrunk_bw_period_analysis</w:t>
@@ -3574,7 +3304,6 @@
           <w:p>
             <w:pPr>
               <w:pStyle w:val="Compact"/>
-              <w:jc w:val="left"/>
             </w:pPr>
             <w:r>
               <w:t xml:space="preserve">45</w:t>
@@ -3586,7 +3315,6 @@
           <w:p>
             <w:pPr>
               <w:pStyle w:val="Compact"/>
-              <w:jc w:val="left"/>
             </w:pPr>
             <w:r>
               <w:t xml:space="preserve">CH4_g_d</w:t>
@@ -3598,7 +3326,6 @@
           <w:p>
             <w:pPr>
               <w:pStyle w:val="Compact"/>
-              <w:jc w:val="left"/>
             </w:pPr>
             <w:r>
               <w:t xml:space="preserve">period</w:t>
@@ -3610,7 +3337,6 @@
           <w:p>
             <w:pPr>
               <w:pStyle w:val="Compact"/>
-              <w:jc w:val="left"/>
             </w:pPr>
             <w:r>
               <w:t xml:space="preserve">Exploratory source; see source chunk</w:t>
@@ -3622,22 +3348,20 @@
           <w:p>
             <w:pPr>
               <w:pStyle w:val="Compact"/>
-              <w:jc w:val="left"/>
             </w:pPr>
             <w:r>
               <w:rPr>
                 <w:rStyle w:val="VerbatimChar"/>
               </w:rPr>
-              <w:t xml:space="preserve">CH4_g_d ~ TRT * SR + RotationPeriod + (1 \| Year) + (1 \| Year:Pasture)</w:t>
-            </w:r>
-          </w:p>
-        </w:tc>
-        <w:tc>
-          <w:tcPr/>
-          <w:p>
-            <w:pPr>
-              <w:pStyle w:val="Compact"/>
-              <w:jc w:val="left"/>
+              <w:t xml:space="preserve">CH4_g_d ~ TRT * SR * RotationPeriod + (1 \| Year) + (1 \| Year:Pasture)</w:t>
+            </w:r>
+          </w:p>
+        </w:tc>
+        <w:tc>
+          <w:tcPr/>
+          <w:p>
+            <w:pPr>
+              <w:pStyle w:val="Compact"/>
             </w:pPr>
             <w:r>
               <w:t xml:space="preserve">ch4_rotation_model_data</w:t>
@@ -3651,7 +3375,6 @@
           <w:p>
             <w:pPr>
               <w:pStyle w:val="Compact"/>
-              <w:jc w:val="left"/>
             </w:pPr>
             <w:r>
               <w:t xml:space="preserve">46</w:t>
@@ -3663,7 +3386,6 @@
           <w:p>
             <w:pPr>
               <w:pStyle w:val="Compact"/>
-              <w:jc w:val="left"/>
             </w:pPr>
             <w:r>
               <w:t xml:space="preserve">CO2_g_d</w:t>
@@ -3675,7 +3397,6 @@
           <w:p>
             <w:pPr>
               <w:pStyle w:val="Compact"/>
-              <w:jc w:val="left"/>
             </w:pPr>
             <w:r>
               <w:t xml:space="preserve">period</w:t>
@@ -3687,7 +3408,6 @@
           <w:p>
             <w:pPr>
               <w:pStyle w:val="Compact"/>
-              <w:jc w:val="left"/>
             </w:pPr>
             <w:r>
               <w:t xml:space="preserve">Exploratory source; see source chunk</w:t>
@@ -3699,22 +3419,20 @@
           <w:p>
             <w:pPr>
               <w:pStyle w:val="Compact"/>
-              <w:jc w:val="left"/>
             </w:pPr>
             <w:r>
               <w:rPr>
                 <w:rStyle w:val="VerbatimChar"/>
               </w:rPr>
-              <w:t xml:space="preserve">CO2_g_d ~ TRT * SR + RotationPeriod + (1 \| Year) + (1 \| Year:Pasture)</w:t>
-            </w:r>
-          </w:p>
-        </w:tc>
-        <w:tc>
-          <w:tcPr/>
-          <w:p>
-            <w:pPr>
-              <w:pStyle w:val="Compact"/>
-              <w:jc w:val="left"/>
+              <w:t xml:space="preserve">CO2_g_d ~ TRT * SR * RotationPeriod + (1 \| Year) + (1 \| Year:Pasture)</w:t>
+            </w:r>
+          </w:p>
+        </w:tc>
+        <w:tc>
+          <w:tcPr/>
+          <w:p>
+            <w:pPr>
+              <w:pStyle w:val="Compact"/>
             </w:pPr>
             <w:r>
               <w:t xml:space="preserve">co2_rotation_model_data</w:t>
@@ -3728,7 +3446,6 @@
           <w:p>
             <w:pPr>
               <w:pStyle w:val="Compact"/>
-              <w:jc w:val="left"/>
             </w:pPr>
             <w:r>
               <w:t xml:space="preserve">47</w:t>
@@ -3740,7 +3457,6 @@
           <w:p>
             <w:pPr>
               <w:pStyle w:val="Compact"/>
-              <w:jc w:val="left"/>
             </w:pPr>
             <w:r>
               <w:t xml:space="preserve">Seasonal_ADG</w:t>
@@ -3752,7 +3468,6 @@
           <w:p>
             <w:pPr>
               <w:pStyle w:val="Compact"/>
-              <w:jc w:val="left"/>
             </w:pPr>
             <w:r>
               <w:t xml:space="preserve">season</w:t>
@@ -3764,7 +3479,6 @@
           <w:p>
             <w:pPr>
               <w:pStyle w:val="Compact"/>
-              <w:jc w:val="left"/>
             </w:pPr>
             <w:r>
               <w:t xml:space="preserve">Exploratory source; see source chunk</w:t>
@@ -3776,7 +3490,6 @@
           <w:p>
             <w:pPr>
               <w:pStyle w:val="Compact"/>
-              <w:jc w:val="left"/>
             </w:pPr>
             <w:r>
               <w:rPr>
@@ -3791,7 +3504,6 @@
           <w:p>
             <w:pPr>
               <w:pStyle w:val="Compact"/>
-              <w:jc w:val="left"/>
             </w:pPr>
             <w:r>
               <w:t xml:space="preserve">bw_season_model_data</w:t>
@@ -3805,7 +3517,6 @@
           <w:p>
             <w:pPr>
               <w:pStyle w:val="Compact"/>
-              <w:jc w:val="left"/>
             </w:pPr>
             <w:r>
               <w:t xml:space="preserve">48</w:t>
@@ -3817,7 +3528,6 @@
           <w:p>
             <w:pPr>
               <w:pStyle w:val="Compact"/>
-              <w:jc w:val="left"/>
             </w:pPr>
             <w:r>
               <w:t xml:space="preserve">FBW</w:t>
@@ -3829,7 +3539,6 @@
           <w:p>
             <w:pPr>
               <w:pStyle w:val="Compact"/>
-              <w:jc w:val="left"/>
             </w:pPr>
             <w:r>
               <w:t xml:space="preserve">season</w:t>
@@ -3841,7 +3550,6 @@
           <w:p>
             <w:pPr>
               <w:pStyle w:val="Compact"/>
-              <w:jc w:val="left"/>
             </w:pPr>
             <w:r>
               <w:t xml:space="preserve">Exploratory source; see source chunk</w:t>
@@ -3853,7 +3561,6 @@
           <w:p>
             <w:pPr>
               <w:pStyle w:val="Compact"/>
-              <w:jc w:val="left"/>
             </w:pPr>
             <w:r>
               <w:rPr>
@@ -3868,7 +3575,6 @@
           <w:p>
             <w:pPr>
               <w:pStyle w:val="Compact"/>
-              <w:jc w:val="left"/>
             </w:pPr>
             <w:r>
               <w:t xml:space="preserve">bw_season_model_data</w:t>
@@ -3882,7 +3588,6 @@
           <w:p>
             <w:pPr>
               <w:pStyle w:val="Compact"/>
-              <w:jc w:val="left"/>
             </w:pPr>
             <w:r>
               <w:t xml:space="preserve">49</w:t>
@@ -3894,7 +3599,6 @@
           <w:p>
             <w:pPr>
               <w:pStyle w:val="Compact"/>
-              <w:jc w:val="left"/>
             </w:pPr>
             <w:r>
               <w:t xml:space="preserve">CH4_g_d</w:t>
@@ -3906,7 +3610,6 @@
           <w:p>
             <w:pPr>
               <w:pStyle w:val="Compact"/>
-              <w:jc w:val="left"/>
             </w:pPr>
             <w:r>
               <w:t xml:space="preserve">period</w:t>
@@ -3918,7 +3621,6 @@
           <w:p>
             <w:pPr>
               <w:pStyle w:val="Compact"/>
-              <w:jc w:val="left"/>
             </w:pPr>
             <w:r>
               <w:t xml:space="preserve">Exploratory source; see source chunk</w:t>
@@ -3930,22 +3632,20 @@
           <w:p>
             <w:pPr>
               <w:pStyle w:val="Compact"/>
-              <w:jc w:val="left"/>
             </w:pPr>
             <w:r>
               <w:rPr>
                 <w:rStyle w:val="VerbatimChar"/>
               </w:rPr>
-              <w:t xml:space="preserve">CH4_g_d ~ TRT * SR + Period + (1 \| Year) + (1 \| Year:Pasture)</w:t>
-            </w:r>
-          </w:p>
-        </w:tc>
-        <w:tc>
-          <w:tcPr/>
-          <w:p>
-            <w:pPr>
-              <w:pStyle w:val="Compact"/>
-              <w:jc w:val="left"/>
+              <w:t xml:space="preserve">CH4_g_d ~ TRT * SR * Period + (1 \| Year) + (1 \| Year:Pasture)</w:t>
+            </w:r>
+          </w:p>
+        </w:tc>
+        <w:tc>
+          <w:tcPr/>
+          <w:p>
+            <w:pPr>
+              <w:pStyle w:val="Compact"/>
             </w:pPr>
             <w:r>
               <w:t xml:space="preserve">gf_model_data (from gf_period_qualified)</w:t>
@@ -3959,7 +3659,6 @@
           <w:p>
             <w:pPr>
               <w:pStyle w:val="Compact"/>
-              <w:jc w:val="left"/>
             </w:pPr>
             <w:r>
               <w:t xml:space="preserve">50</w:t>
@@ -3971,7 +3670,6 @@
           <w:p>
             <w:pPr>
               <w:pStyle w:val="Compact"/>
-              <w:jc w:val="left"/>
             </w:pPr>
             <w:r>
               <w:t xml:space="preserve">CO2_g_d</w:t>
@@ -3983,7 +3681,6 @@
           <w:p>
             <w:pPr>
               <w:pStyle w:val="Compact"/>
-              <w:jc w:val="left"/>
             </w:pPr>
             <w:r>
               <w:t xml:space="preserve">period</w:t>
@@ -3995,7 +3692,6 @@
           <w:p>
             <w:pPr>
               <w:pStyle w:val="Compact"/>
-              <w:jc w:val="left"/>
             </w:pPr>
             <w:r>
               <w:t xml:space="preserve">Exploratory source; see source chunk</w:t>
@@ -4007,22 +3703,20 @@
           <w:p>
             <w:pPr>
               <w:pStyle w:val="Compact"/>
-              <w:jc w:val="left"/>
             </w:pPr>
             <w:r>
               <w:rPr>
                 <w:rStyle w:val="VerbatimChar"/>
               </w:rPr>
-              <w:t xml:space="preserve">CO2_g_d ~ TRT * SR + Period + (1 \| Year) + (1 \| Year:Pasture)</w:t>
-            </w:r>
-          </w:p>
-        </w:tc>
-        <w:tc>
-          <w:tcPr/>
-          <w:p>
-            <w:pPr>
-              <w:pStyle w:val="Compact"/>
-              <w:jc w:val="left"/>
+              <w:t xml:space="preserve">CO2_g_d ~ TRT * SR * Period + (1 \| Year) + (1 \| Year:Pasture)</w:t>
+            </w:r>
+          </w:p>
+        </w:tc>
+        <w:tc>
+          <w:tcPr/>
+          <w:p>
+            <w:pPr>
+              <w:pStyle w:val="Compact"/>
             </w:pPr>
             <w:r>
               <w:t xml:space="preserve">gf_model_data (from gf_period_qualified)</w:t>
@@ -4036,7 +3730,6 @@
           <w:p>
             <w:pPr>
               <w:pStyle w:val="Compact"/>
-              <w:jc w:val="left"/>
             </w:pPr>
             <w:r>
               <w:t xml:space="preserve">51</w:t>
@@ -4048,7 +3741,6 @@
           <w:p>
             <w:pPr>
               <w:pStyle w:val="Compact"/>
-              <w:jc w:val="left"/>
             </w:pPr>
             <w:r>
               <w:t xml:space="preserve">Percent_pasture_active</w:t>
@@ -4060,7 +3752,6 @@
           <w:p>
             <w:pPr>
               <w:pStyle w:val="Compact"/>
-              <w:jc w:val="left"/>
             </w:pPr>
             <w:r>
               <w:t xml:space="preserve">period</w:t>
@@ -4072,7 +3763,6 @@
           <w:p>
             <w:pPr>
               <w:pStyle w:val="Compact"/>
-              <w:jc w:val="left"/>
             </w:pPr>
             <w:r>
               <w:t xml:space="preserve">Exploratory source; see source chunk</w:t>
@@ -4084,22 +3774,20 @@
           <w:p>
             <w:pPr>
               <w:pStyle w:val="Compact"/>
-              <w:jc w:val="left"/>
             </w:pPr>
             <w:r>
               <w:rPr>
                 <w:rStyle w:val="VerbatimChar"/>
               </w:rPr>
-              <w:t xml:space="preserve">Percent_pasture_active ~ TRT * SR + RGP + (1 \| Year) + (1 \| Year:Pasture)</w:t>
-            </w:r>
-          </w:p>
-        </w:tc>
-        <w:tc>
-          <w:tcPr/>
-          <w:p>
-            <w:pPr>
-              <w:pStyle w:val="Compact"/>
-              <w:jc w:val="left"/>
+              <w:t xml:space="preserve">Percent_pasture_active ~ TRT * SR * RGP + (1 \| Year) + (1 \| Year:Pasture)</w:t>
+            </w:r>
+          </w:p>
+        </w:tc>
+        <w:tc>
+          <w:tcPr/>
+          <w:p>
+            <w:pPr>
+              <w:pStyle w:val="Compact"/>
             </w:pPr>
             <w:r>
               <w:t xml:space="preserve">rgp_map_scopes [Grid_Map = ALL_PASTURE_GRAZING]</w:t>
@@ -4113,7 +3801,6 @@
           <w:p>
             <w:pPr>
               <w:pStyle w:val="Compact"/>
-              <w:jc w:val="left"/>
             </w:pPr>
             <w:r>
               <w:t xml:space="preserve">52</w:t>
@@ -4125,7 +3812,6 @@
           <w:p>
             <w:pPr>
               <w:pStyle w:val="Compact"/>
-              <w:jc w:val="left"/>
             </w:pPr>
             <w:r>
               <w:t xml:space="preserve">Gain_kg_per_active_ha</w:t>
@@ -4137,7 +3823,6 @@
           <w:p>
             <w:pPr>
               <w:pStyle w:val="Compact"/>
-              <w:jc w:val="left"/>
             </w:pPr>
             <w:r>
               <w:t xml:space="preserve">period</w:t>
@@ -4149,7 +3834,6 @@
           <w:p>
             <w:pPr>
               <w:pStyle w:val="Compact"/>
-              <w:jc w:val="left"/>
             </w:pPr>
             <w:r>
               <w:t xml:space="preserve">Exploratory source; see source chunk</w:t>
@@ -4161,22 +3845,20 @@
           <w:p>
             <w:pPr>
               <w:pStyle w:val="Compact"/>
-              <w:jc w:val="left"/>
             </w:pPr>
             <w:r>
               <w:rPr>
                 <w:rStyle w:val="VerbatimChar"/>
               </w:rPr>
-              <w:t xml:space="preserve">Gain_kg_per_active_ha ~ TRT * SR + RGP + (1 \| Year) + (1 \| Year:Pasture)</w:t>
-            </w:r>
-          </w:p>
-        </w:tc>
-        <w:tc>
-          <w:tcPr/>
-          <w:p>
-            <w:pPr>
-              <w:pStyle w:val="Compact"/>
-              <w:jc w:val="left"/>
+              <w:t xml:space="preserve">Gain_kg_per_active_ha ~ TRT * SR * RGP + (1 \| Year) + (1 \| Year:Pasture)</w:t>
+            </w:r>
+          </w:p>
+        </w:tc>
+        <w:tc>
+          <w:tcPr/>
+          <w:p>
+            <w:pPr>
+              <w:pStyle w:val="Compact"/>
             </w:pPr>
             <w:r>
               <w:t xml:space="preserve">rgp_map_scopes [Grid_Map = ALL_PASTURE_GRAZING]</w:t>
@@ -4190,7 +3872,6 @@
           <w:p>
             <w:pPr>
               <w:pStyle w:val="Compact"/>
-              <w:jc w:val="left"/>
             </w:pPr>
             <w:r>
               <w:t xml:space="preserve">53</w:t>
@@ -4202,7 +3883,6 @@
           <w:p>
             <w:pPr>
               <w:pStyle w:val="Compact"/>
-              <w:jc w:val="left"/>
             </w:pPr>
             <w:r>
               <w:t xml:space="preserve">Percent_pasture_active</w:t>
@@ -4214,7 +3894,6 @@
           <w:p>
             <w:pPr>
               <w:pStyle w:val="Compact"/>
-              <w:jc w:val="left"/>
             </w:pPr>
             <w:r>
               <w:t xml:space="preserve">period</w:t>
@@ -4226,7 +3905,6 @@
           <w:p>
             <w:pPr>
               <w:pStyle w:val="Compact"/>
-              <w:jc w:val="left"/>
             </w:pPr>
             <w:r>
               <w:t xml:space="preserve">Exploratory source; see source chunk</w:t>
@@ -4238,22 +3916,20 @@
           <w:p>
             <w:pPr>
               <w:pStyle w:val="Compact"/>
-              <w:jc w:val="left"/>
             </w:pPr>
             <w:r>
               <w:rPr>
                 <w:rStyle w:val="VerbatimChar"/>
               </w:rPr>
-              <w:t xml:space="preserve">Percent_pasture_active ~ TRT * SR + RGP + (1 \| Year) + (1 \| Year:Pasture)</w:t>
-            </w:r>
-          </w:p>
-        </w:tc>
-        <w:tc>
-          <w:tcPr/>
-          <w:p>
-            <w:pPr>
-              <w:pStyle w:val="Compact"/>
-              <w:jc w:val="left"/>
+              <w:t xml:space="preserve">Percent_pasture_active ~ TRT * SR * RGP + (1 \| Year) + (1 \| Year:Pasture)</w:t>
+            </w:r>
+          </w:p>
+        </w:tc>
+        <w:tc>
+          <w:tcPr/>
+          <w:p>
+            <w:pPr>
+              <w:pStyle w:val="Compact"/>
             </w:pPr>
             <w:r>
               <w:t xml:space="preserve">rgp_map_scopes [Grid_Map = INSIDE_RGP_GRAZING]</w:t>
@@ -4267,7 +3943,6 @@
           <w:p>
             <w:pPr>
               <w:pStyle w:val="Compact"/>
-              <w:jc w:val="left"/>
             </w:pPr>
             <w:r>
               <w:t xml:space="preserve">54</w:t>
@@ -4279,7 +3954,6 @@
           <w:p>
             <w:pPr>
               <w:pStyle w:val="Compact"/>
-              <w:jc w:val="left"/>
             </w:pPr>
             <w:r>
               <w:t xml:space="preserve">Gain_kg_per_active_ha</w:t>
@@ -4291,7 +3965,6 @@
           <w:p>
             <w:pPr>
               <w:pStyle w:val="Compact"/>
-              <w:jc w:val="left"/>
             </w:pPr>
             <w:r>
               <w:t xml:space="preserve">period</w:t>
@@ -4303,7 +3976,6 @@
           <w:p>
             <w:pPr>
               <w:pStyle w:val="Compact"/>
-              <w:jc w:val="left"/>
             </w:pPr>
             <w:r>
               <w:t xml:space="preserve">Exploratory source; see source chunk</w:t>
@@ -4315,22 +3987,20 @@
           <w:p>
             <w:pPr>
               <w:pStyle w:val="Compact"/>
-              <w:jc w:val="left"/>
             </w:pPr>
             <w:r>
               <w:rPr>
                 <w:rStyle w:val="VerbatimChar"/>
               </w:rPr>
-              <w:t xml:space="preserve">Gain_kg_per_active_ha ~ TRT * SR + RGP + (1 \| Year) + (1 \| Year:Pasture)</w:t>
-            </w:r>
-          </w:p>
-        </w:tc>
-        <w:tc>
-          <w:tcPr/>
-          <w:p>
-            <w:pPr>
-              <w:pStyle w:val="Compact"/>
-              <w:jc w:val="left"/>
+              <w:t xml:space="preserve">Gain_kg_per_active_ha ~ TRT * SR * RGP + (1 \| Year) + (1 \| Year:Pasture)</w:t>
+            </w:r>
+          </w:p>
+        </w:tc>
+        <w:tc>
+          <w:tcPr/>
+          <w:p>
+            <w:pPr>
+              <w:pStyle w:val="Compact"/>
             </w:pPr>
             <w:r>
               <w:t xml:space="preserve">rgp_map_scopes [Grid_Map = INSIDE_RGP_GRAZING]</w:t>
@@ -4344,7 +4014,6 @@
           <w:p>
             <w:pPr>
               <w:pStyle w:val="Compact"/>
-              <w:jc w:val="left"/>
             </w:pPr>
             <w:r>
               <w:t xml:space="preserve">55</w:t>
@@ -4356,7 +4025,6 @@
           <w:p>
             <w:pPr>
               <w:pStyle w:val="Compact"/>
-              <w:jc w:val="left"/>
             </w:pPr>
             <w:r>
               <w:t xml:space="preserve">Percent_pasture_active</w:t>
@@ -4368,7 +4036,6 @@
           <w:p>
             <w:pPr>
               <w:pStyle w:val="Compact"/>
-              <w:jc w:val="left"/>
             </w:pPr>
             <w:r>
               <w:t xml:space="preserve">season</w:t>
@@ -4380,7 +4047,6 @@
           <w:p>
             <w:pPr>
               <w:pStyle w:val="Compact"/>
-              <w:jc w:val="left"/>
             </w:pPr>
             <w:r>
               <w:t xml:space="preserve">Exploratory source; see source chunk</w:t>
@@ -4392,7 +4058,6 @@
           <w:p>
             <w:pPr>
               <w:pStyle w:val="Compact"/>
-              <w:jc w:val="left"/>
             </w:pPr>
             <w:r>
               <w:rPr>
@@ -4407,7 +4072,6 @@
           <w:p>
             <w:pPr>
               <w:pStyle w:val="Compact"/>
-              <w:jc w:val="left"/>
             </w:pPr>
             <w:r>
               <w:t xml:space="preserve">season_two_grid_outcomes [Grid_Map = WHOLE_SEASON_GRAZING]</w:t>
@@ -4421,7 +4085,6 @@
           <w:p>
             <w:pPr>
               <w:pStyle w:val="Compact"/>
-              <w:jc w:val="left"/>
             </w:pPr>
             <w:r>
               <w:t xml:space="preserve">56</w:t>
@@ -4433,7 +4096,6 @@
           <w:p>
             <w:pPr>
               <w:pStyle w:val="Compact"/>
-              <w:jc w:val="left"/>
             </w:pPr>
             <w:r>
               <w:t xml:space="preserve">Gain_kg_per_active_ha</w:t>
@@ -4445,7 +4107,6 @@
           <w:p>
             <w:pPr>
               <w:pStyle w:val="Compact"/>
-              <w:jc w:val="left"/>
             </w:pPr>
             <w:r>
               <w:t xml:space="preserve">season</w:t>
@@ -4457,7 +4118,6 @@
           <w:p>
             <w:pPr>
               <w:pStyle w:val="Compact"/>
-              <w:jc w:val="left"/>
             </w:pPr>
             <w:r>
               <w:t xml:space="preserve">Exploratory source; see source chunk</w:t>
@@ -4469,7 +4129,6 @@
           <w:p>
             <w:pPr>
               <w:pStyle w:val="Compact"/>
-              <w:jc w:val="left"/>
             </w:pPr>
             <w:r>
               <w:rPr>
@@ -4484,7 +4143,6 @@
           <w:p>
             <w:pPr>
               <w:pStyle w:val="Compact"/>
-              <w:jc w:val="left"/>
             </w:pPr>
             <w:r>
               <w:t xml:space="preserve">season_two_grid_outcomes [Grid_Map = WHOLE_SEASON_GRAZING]</w:t>
@@ -4493,7 +4151,6 @@
         </w:tc>
       </w:tr>
     </w:tbl>
-    <w:bookmarkEnd w:id="20"/>
     <w:sectPr>
       <w:footerReference r:id="rId9" w:type="default"/>
       <w:pgSz w:h="12240" w:orient="landscape" w:w="15840"/>
@@ -4727,7 +4384,7 @@
       <w:lvlText w:val=" "/>
       <w:lvlJc w:val="left"/>
       <w:pPr>
-        <w:ind w:left="720" w:hanging="480"/>
+        <w:ind w:left="720" w:hanging="360"/>
       </w:pPr>
     </w:lvl>
     <w:lvl w:ilvl="1">
@@ -4735,7 +4392,7 @@
       <w:lvlText w:val=" "/>
       <w:lvlJc w:val="left"/>
       <w:pPr>
-        <w:ind w:left="1440" w:hanging="480"/>
+        <w:ind w:left="1440" w:hanging="360"/>
       </w:pPr>
     </w:lvl>
     <w:lvl w:ilvl="2">
@@ -4743,7 +4400,7 @@
       <w:lvlText w:val=" "/>
       <w:lvlJc w:val="left"/>
       <w:pPr>
-        <w:ind w:left="2160" w:hanging="480"/>
+        <w:ind w:left="2160" w:hanging="360"/>
       </w:pPr>
     </w:lvl>
     <w:lvl w:ilvl="3">
@@ -4751,7 +4408,7 @@
       <w:lvlText w:val=" "/>
       <w:lvlJc w:val="left"/>
       <w:pPr>
-        <w:ind w:left="2880" w:hanging="480"/>
+        <w:ind w:left="2880" w:hanging="360"/>
       </w:pPr>
     </w:lvl>
     <w:lvl w:ilvl="4">
@@ -4759,7 +4416,7 @@
       <w:lvlText w:val=" "/>
       <w:lvlJc w:val="left"/>
       <w:pPr>
-        <w:ind w:left="3600" w:hanging="480"/>
+        <w:ind w:left="3600" w:hanging="360"/>
       </w:pPr>
     </w:lvl>
     <w:lvl w:ilvl="5">
@@ -4767,7 +4424,7 @@
       <w:lvlText w:val=" "/>
       <w:lvlJc w:val="left"/>
       <w:pPr>
-        <w:ind w:left="4320" w:hanging="480"/>
+        <w:ind w:left="4320" w:hanging="360"/>
       </w:pPr>
     </w:lvl>
     <w:lvl w:ilvl="6">
@@ -4775,7 +4432,7 @@
       <w:lvlText w:val=" "/>
       <w:lvlJc w:val="left"/>
       <w:pPr>
-        <w:ind w:left="5040" w:hanging="480"/>
+        <w:ind w:left="5040" w:hanging="360"/>
       </w:pPr>
     </w:lvl>
     <w:lvl w:ilvl="7">
@@ -4783,7 +4440,7 @@
       <w:lvlText w:val=" "/>
       <w:lvlJc w:val="left"/>
       <w:pPr>
-        <w:ind w:left="5760" w:hanging="480"/>
+        <w:ind w:left="5760" w:hanging="360"/>
       </w:pPr>
     </w:lvl>
     <w:lvl w:ilvl="8">
@@ -4791,7 +4448,7 @@
       <w:lvlText w:val=" "/>
       <w:lvlJc w:val="left"/>
       <w:pPr>
-        <w:ind w:left="6480" w:hanging="480"/>
+        <w:ind w:left="6480" w:hanging="360"/>
       </w:pPr>
     </w:lvl>
   </w:abstractNum>
@@ -17812,6 +17469,232 @@
     </w:rPr>
   </w:style>
   <w:style w:customStyle="1" w:styleId="NormalTok" w:type="character">
+    <w:name w:val="NormalTok"/>
+    <w:basedOn w:val="VerbatimChar"/>
+    <w:rPr/>
+  </w:style>
+  <w:style w:type="character" w:customStyle="1" w:styleId="KeywordTok">
+    <w:name w:val="KeywordTok"/>
+    <w:basedOn w:val="VerbatimChar"/>
+    <w:rPr>
+      <w:b/>
+      <w:color w:val="007020"/>
+    </w:rPr>
+  </w:style>
+  <w:style w:type="character" w:customStyle="1" w:styleId="DataTypeTok">
+    <w:name w:val="DataTypeTok"/>
+    <w:basedOn w:val="VerbatimChar"/>
+    <w:rPr>
+      <w:color w:val="902000"/>
+    </w:rPr>
+  </w:style>
+  <w:style w:type="character" w:customStyle="1" w:styleId="DecValTok">
+    <w:name w:val="DecValTok"/>
+    <w:basedOn w:val="VerbatimChar"/>
+    <w:rPr>
+      <w:color w:val="40a070"/>
+    </w:rPr>
+  </w:style>
+  <w:style w:type="character" w:customStyle="1" w:styleId="BaseNTok">
+    <w:name w:val="BaseNTok"/>
+    <w:basedOn w:val="VerbatimChar"/>
+    <w:rPr>
+      <w:color w:val="40a070"/>
+    </w:rPr>
+  </w:style>
+  <w:style w:type="character" w:customStyle="1" w:styleId="FloatTok">
+    <w:name w:val="FloatTok"/>
+    <w:basedOn w:val="VerbatimChar"/>
+    <w:rPr>
+      <w:color w:val="40a070"/>
+    </w:rPr>
+  </w:style>
+  <w:style w:type="character" w:customStyle="1" w:styleId="ConstantTok">
+    <w:name w:val="ConstantTok"/>
+    <w:basedOn w:val="VerbatimChar"/>
+    <w:rPr>
+      <w:color w:val="880000"/>
+    </w:rPr>
+  </w:style>
+  <w:style w:type="character" w:customStyle="1" w:styleId="CharTok">
+    <w:name w:val="CharTok"/>
+    <w:basedOn w:val="VerbatimChar"/>
+    <w:rPr>
+      <w:color w:val="4070a0"/>
+    </w:rPr>
+  </w:style>
+  <w:style w:type="character" w:customStyle="1" w:styleId="SpecialCharTok">
+    <w:name w:val="SpecialCharTok"/>
+    <w:basedOn w:val="VerbatimChar"/>
+    <w:rPr>
+      <w:color w:val="4070a0"/>
+    </w:rPr>
+  </w:style>
+  <w:style w:type="character" w:customStyle="1" w:styleId="StringTok">
+    <w:name w:val="StringTok"/>
+    <w:basedOn w:val="VerbatimChar"/>
+    <w:rPr>
+      <w:color w:val="4070a0"/>
+    </w:rPr>
+  </w:style>
+  <w:style w:type="character" w:customStyle="1" w:styleId="VerbatimStringTok">
+    <w:name w:val="VerbatimStringTok"/>
+    <w:basedOn w:val="VerbatimChar"/>
+    <w:rPr>
+      <w:color w:val="4070a0"/>
+    </w:rPr>
+  </w:style>
+  <w:style w:type="character" w:customStyle="1" w:styleId="SpecialStringTok">
+    <w:name w:val="SpecialStringTok"/>
+    <w:basedOn w:val="VerbatimChar"/>
+    <w:rPr>
+      <w:color w:val="bb6688"/>
+    </w:rPr>
+  </w:style>
+  <w:style w:type="character" w:customStyle="1" w:styleId="ImportTok">
+    <w:name w:val="ImportTok"/>
+    <w:basedOn w:val="VerbatimChar"/>
+    <w:rPr>
+      <w:b/>
+      <w:color w:val="008000"/>
+    </w:rPr>
+  </w:style>
+  <w:style w:type="character" w:customStyle="1" w:styleId="CommentTok">
+    <w:name w:val="CommentTok"/>
+    <w:basedOn w:val="VerbatimChar"/>
+    <w:rPr>
+      <w:i/>
+      <w:color w:val="60a0b0"/>
+    </w:rPr>
+  </w:style>
+  <w:style w:type="character" w:customStyle="1" w:styleId="DocumentationTok">
+    <w:name w:val="DocumentationTok"/>
+    <w:basedOn w:val="VerbatimChar"/>
+    <w:rPr>
+      <w:i/>
+      <w:color w:val="ba2121"/>
+    </w:rPr>
+  </w:style>
+  <w:style w:type="character" w:customStyle="1" w:styleId="AnnotationTok">
+    <w:name w:val="AnnotationTok"/>
+    <w:basedOn w:val="VerbatimChar"/>
+    <w:rPr>
+      <w:b/>
+      <w:i/>
+      <w:color w:val="60a0b0"/>
+    </w:rPr>
+  </w:style>
+  <w:style w:type="character" w:customStyle="1" w:styleId="CommentVarTok">
+    <w:name w:val="CommentVarTok"/>
+    <w:basedOn w:val="VerbatimChar"/>
+    <w:rPr>
+      <w:b/>
+      <w:i/>
+      <w:color w:val="60a0b0"/>
+    </w:rPr>
+  </w:style>
+  <w:style w:type="character" w:customStyle="1" w:styleId="OtherTok">
+    <w:name w:val="OtherTok"/>
+    <w:basedOn w:val="VerbatimChar"/>
+    <w:rPr>
+      <w:color w:val="007020"/>
+    </w:rPr>
+  </w:style>
+  <w:style w:type="character" w:customStyle="1" w:styleId="FunctionTok">
+    <w:name w:val="FunctionTok"/>
+    <w:basedOn w:val="VerbatimChar"/>
+    <w:rPr>
+      <w:color w:val="06287e"/>
+    </w:rPr>
+  </w:style>
+  <w:style w:type="character" w:customStyle="1" w:styleId="VariableTok">
+    <w:name w:val="VariableTok"/>
+    <w:basedOn w:val="VerbatimChar"/>
+    <w:rPr>
+      <w:color w:val="19177c"/>
+    </w:rPr>
+  </w:style>
+  <w:style w:type="character" w:customStyle="1" w:styleId="ControlFlowTok">
+    <w:name w:val="ControlFlowTok"/>
+    <w:basedOn w:val="VerbatimChar"/>
+    <w:rPr>
+      <w:b/>
+      <w:color w:val="007020"/>
+    </w:rPr>
+  </w:style>
+  <w:style w:type="character" w:customStyle="1" w:styleId="OperatorTok">
+    <w:name w:val="OperatorTok"/>
+    <w:basedOn w:val="VerbatimChar"/>
+    <w:rPr>
+      <w:color w:val="666666"/>
+    </w:rPr>
+  </w:style>
+  <w:style w:type="character" w:customStyle="1" w:styleId="BuiltInTok">
+    <w:name w:val="BuiltInTok"/>
+    <w:basedOn w:val="VerbatimChar"/>
+    <w:rPr>
+      <w:color w:val="008000"/>
+    </w:rPr>
+  </w:style>
+  <w:style w:type="character" w:customStyle="1" w:styleId="ExtensionTok">
+    <w:name w:val="ExtensionTok"/>
+    <w:basedOn w:val="VerbatimChar"/>
+    <w:rPr/>
+  </w:style>
+  <w:style w:type="character" w:customStyle="1" w:styleId="PreprocessorTok">
+    <w:name w:val="PreprocessorTok"/>
+    <w:basedOn w:val="VerbatimChar"/>
+    <w:rPr>
+      <w:color w:val="bc7a00"/>
+    </w:rPr>
+  </w:style>
+  <w:style w:type="character" w:customStyle="1" w:styleId="AttributeTok">
+    <w:name w:val="AttributeTok"/>
+    <w:basedOn w:val="VerbatimChar"/>
+    <w:rPr>
+      <w:color w:val="7d9029"/>
+    </w:rPr>
+  </w:style>
+  <w:style w:type="character" w:customStyle="1" w:styleId="RegionMarkerTok">
+    <w:name w:val="RegionMarkerTok"/>
+    <w:basedOn w:val="VerbatimChar"/>
+    <w:rPr/>
+  </w:style>
+  <w:style w:type="character" w:customStyle="1" w:styleId="InformationTok">
+    <w:name w:val="InformationTok"/>
+    <w:basedOn w:val="VerbatimChar"/>
+    <w:rPr>
+      <w:b/>
+      <w:i/>
+      <w:color w:val="60a0b0"/>
+    </w:rPr>
+  </w:style>
+  <w:style w:type="character" w:customStyle="1" w:styleId="WarningTok">
+    <w:name w:val="WarningTok"/>
+    <w:basedOn w:val="VerbatimChar"/>
+    <w:rPr>
+      <w:b/>
+      <w:i/>
+      <w:color w:val="60a0b0"/>
+    </w:rPr>
+  </w:style>
+  <w:style w:type="character" w:customStyle="1" w:styleId="AlertTok">
+    <w:name w:val="AlertTok"/>
+    <w:basedOn w:val="VerbatimChar"/>
+    <w:rPr>
+      <w:b/>
+      <w:color w:val="ff0000"/>
+    </w:rPr>
+  </w:style>
+  <w:style w:type="character" w:customStyle="1" w:styleId="ErrorTok">
+    <w:name w:val="ErrorTok"/>
+    <w:basedOn w:val="VerbatimChar"/>
+    <w:rPr>
+      <w:b/>
+      <w:color w:val="ff0000"/>
+    </w:rPr>
+  </w:style>
+  <w:style w:type="character" w:customStyle="1" w:styleId="NormalTok">
     <w:name w:val="NormalTok"/>
     <w:basedOn w:val="VerbatimChar"/>
     <w:rPr/>

</xml_diff>

<commit_message>
Use strict Gamma log-link models for all four Table 1 season responses
</commit_message>
<xml_diff>
--- a/AFRI_Variables_Models_and_Datasets.docx
+++ b/AFRI_Variables_Models_and_Datasets.docx
@@ -2,15 +2,14 @@
 <file path=word/document.xml><?xml version="1.0" encoding="utf-8"?>
 <w:document xmlns:w="http://schemas.openxmlformats.org/wordprocessingml/2006/main" xmlns:m="http://schemas.openxmlformats.org/officeDocument/2006/math" xmlns:r="http://schemas.openxmlformats.org/officeDocument/2006/relationships" xmlns:o="urn:schemas-microsoft-com:office:office" xmlns:v="urn:schemas-microsoft-com:vml" xmlns:w10="urn:schemas-microsoft-com:office:word" xmlns:a="http://schemas.openxmlformats.org/drawingml/2006/main" xmlns:pic="http://schemas.openxmlformats.org/drawingml/2006/picture" xmlns:wp="http://schemas.openxmlformats.org/drawingml/2006/wordprocessingDrawing">
   <w:body>
+    <w:bookmarkStart w:id="20" w:name="current-afri-model-structures"/>
     <w:p>
       <w:pPr>
         <w:pStyle w:val="Heading1"/>
       </w:pPr>
-      <w:bookmarkStart w:id="18" w:name="_9e60a562621e5488ac3a2d630ba8be7d786bc1a"/>
       <w:r>
         <w:t xml:space="preserve">Current AFRI model structures</w:t>
       </w:r>
-      <w:bookmarkEnd w:id="18"/>
     </w:p>
     <w:p>
       <w:pPr>
@@ -25,7 +24,7 @@
         <w:pStyle w:val="BodyText"/>
       </w:pPr>
       <w:r>
-        <w:t xml:space="preserve">Season-level responses (including Gaussian Table 1 animal-year season averages) use</w:t>
+        <w:t xml:space="preserve">Season-level responses (including Gamma/log Table 1 animal-year season averages) use</w:t>
       </w:r>
       <w:r>
         <w:t xml:space="preserve"> </w:t>
@@ -85,13 +84,14 @@
         <w:pStyle w:val="BodyText"/>
       </w:pPr>
       <w:r>
-        <w:t xml:space="preserve">Existing Gaussian/Gamma/Tweedie family rules are retained. Table 1 uses Gaussian animal-year averages. Diagnostics, KS/Lilliefors tests, EMM/SE and workbook routing remain enabled. Actual study-data numerical results require a fresh complete run; old fits and exports must not be reused. Treatment-cell replication remains limited; changing covariance does not create replication.</w:t>
+        <w:t xml:space="preserve">Existing Gaussian/Gamma/Tweedie family rules are retained. Table 1 uses Gamma/log on original strictly positive animal-year averages, with no log transformation or Gaussian fallback. Diagnostics, KS/Lilliefors tests, EMM/SE and workbook routing remain enabled. Actual study-data numerical results require a fresh complete run; old fits and exports must not be reused. Treatment-cell replication remains limited; changing covariance does not create replication.</w:t>
       </w:r>
     </w:p>
     <w:tbl>
       <w:tblPr>
         <w:tblStyle w:val="Table"/>
         <w:tblW w:type="pct" w:w="5000"/>
+        <w:jc w:val="left"/>
         <w:tblLayout w:type="fixed"/>
         <w:tblLook w:firstRow="1" w:lastRow="0" w:firstColumn="0" w:lastColumn="0" w:noHBand="0" w:noVBand="0" w:val="0020"/>
       </w:tblPr>
@@ -112,6 +112,7 @@
           <w:p>
             <w:pPr>
               <w:pStyle w:val="Compact"/>
+              <w:jc w:val="left"/>
             </w:pPr>
             <w:r>
               <w:t xml:space="preserve">Entry</w:t>
@@ -123,6 +124,7 @@
           <w:p>
             <w:pPr>
               <w:pStyle w:val="Compact"/>
+              <w:jc w:val="left"/>
             </w:pPr>
             <w:r>
               <w:t xml:space="preserve">Response</w:t>
@@ -134,6 +136,7 @@
           <w:p>
             <w:pPr>
               <w:pStyle w:val="Compact"/>
+              <w:jc w:val="left"/>
             </w:pPr>
             <w:r>
               <w:t xml:space="preserve">Scale</w:t>
@@ -145,6 +148,7 @@
           <w:p>
             <w:pPr>
               <w:pStyle w:val="Compact"/>
+              <w:jc w:val="left"/>
             </w:pPr>
             <w:r>
               <w:t xml:space="preserve">Family rule</w:t>
@@ -156,6 +160,7 @@
           <w:p>
             <w:pPr>
               <w:pStyle w:val="Compact"/>
+              <w:jc w:val="left"/>
             </w:pPr>
             <w:r>
               <w:t xml:space="preserve">Formula</w:t>
@@ -167,6 +172,7 @@
           <w:p>
             <w:pPr>
               <w:pStyle w:val="Compact"/>
+              <w:jc w:val="left"/>
             </w:pPr>
             <w:r>
               <w:t xml:space="preserve">Input dataset</w:t>
@@ -180,6 +186,7 @@
           <w:p>
             <w:pPr>
               <w:pStyle w:val="Compact"/>
+              <w:jc w:val="left"/>
             </w:pPr>
             <w:r>
               <w:t xml:space="preserve">1</w:t>
@@ -191,6 +198,7 @@
           <w:p>
             <w:pPr>
               <w:pStyle w:val="Compact"/>
+              <w:jc w:val="left"/>
             </w:pPr>
             <w:r>
               <w:t xml:space="preserve">Grazing_h</w:t>
@@ -202,6 +210,7 @@
           <w:p>
             <w:pPr>
               <w:pStyle w:val="Compact"/>
+              <w:jc w:val="left"/>
             </w:pPr>
             <w:r>
               <w:t xml:space="preserve">season</w:t>
@@ -213,17 +222,19 @@
           <w:p>
             <w:pPr>
               <w:pStyle w:val="Compact"/>
-            </w:pPr>
-            <w:r>
-              <w:t xml:space="preserve">gaussian</w:t>
-            </w:r>
-          </w:p>
-        </w:tc>
-        <w:tc>
-          <w:tcPr/>
-          <w:p>
-            <w:pPr>
-              <w:pStyle w:val="Compact"/>
+              <w:jc w:val="left"/>
+            </w:pPr>
+            <w:r>
+              <w:t xml:space="preserve">gamma_log_strict</w:t>
+            </w:r>
+          </w:p>
+        </w:tc>
+        <w:tc>
+          <w:tcPr/>
+          <w:p>
+            <w:pPr>
+              <w:pStyle w:val="Compact"/>
+              <w:jc w:val="left"/>
             </w:pPr>
             <w:r>
               <w:rPr>
@@ -238,6 +249,7 @@
           <w:p>
             <w:pPr>
               <w:pStyle w:val="Compact"/>
+              <w:jc w:val="left"/>
             </w:pPr>
             <w:r>
               <w:t xml:space="preserve">Table1_Grazing_Behaviors</w:t>
@@ -251,6 +263,7 @@
           <w:p>
             <w:pPr>
               <w:pStyle w:val="Compact"/>
+              <w:jc w:val="left"/>
             </w:pPr>
             <w:r>
               <w:t xml:space="preserve">2</w:t>
@@ -262,6 +275,7 @@
           <w:p>
             <w:pPr>
               <w:pStyle w:val="Compact"/>
+              <w:jc w:val="left"/>
             </w:pPr>
             <w:r>
               <w:t xml:space="preserve">Resting_h</w:t>
@@ -273,6 +287,7 @@
           <w:p>
             <w:pPr>
               <w:pStyle w:val="Compact"/>
+              <w:jc w:val="left"/>
             </w:pPr>
             <w:r>
               <w:t xml:space="preserve">season</w:t>
@@ -284,17 +299,19 @@
           <w:p>
             <w:pPr>
               <w:pStyle w:val="Compact"/>
-            </w:pPr>
-            <w:r>
-              <w:t xml:space="preserve">gaussian</w:t>
-            </w:r>
-          </w:p>
-        </w:tc>
-        <w:tc>
-          <w:tcPr/>
-          <w:p>
-            <w:pPr>
-              <w:pStyle w:val="Compact"/>
+              <w:jc w:val="left"/>
+            </w:pPr>
+            <w:r>
+              <w:t xml:space="preserve">gamma_log_strict</w:t>
+            </w:r>
+          </w:p>
+        </w:tc>
+        <w:tc>
+          <w:tcPr/>
+          <w:p>
+            <w:pPr>
+              <w:pStyle w:val="Compact"/>
+              <w:jc w:val="left"/>
             </w:pPr>
             <w:r>
               <w:rPr>
@@ -309,6 +326,7 @@
           <w:p>
             <w:pPr>
               <w:pStyle w:val="Compact"/>
+              <w:jc w:val="left"/>
             </w:pPr>
             <w:r>
               <w:t xml:space="preserve">Table1_Grazing_Behaviors</w:t>
@@ -322,6 +340,7 @@
           <w:p>
             <w:pPr>
               <w:pStyle w:val="Compact"/>
+              <w:jc w:val="left"/>
             </w:pPr>
             <w:r>
               <w:t xml:space="preserve">3</w:t>
@@ -333,6 +352,7 @@
           <w:p>
             <w:pPr>
               <w:pStyle w:val="Compact"/>
+              <w:jc w:val="left"/>
             </w:pPr>
             <w:r>
               <w:t xml:space="preserve">Traveling_h</w:t>
@@ -344,6 +364,7 @@
           <w:p>
             <w:pPr>
               <w:pStyle w:val="Compact"/>
+              <w:jc w:val="left"/>
             </w:pPr>
             <w:r>
               <w:t xml:space="preserve">season</w:t>
@@ -355,17 +376,19 @@
           <w:p>
             <w:pPr>
               <w:pStyle w:val="Compact"/>
-            </w:pPr>
-            <w:r>
-              <w:t xml:space="preserve">gaussian</w:t>
-            </w:r>
-          </w:p>
-        </w:tc>
-        <w:tc>
-          <w:tcPr/>
-          <w:p>
-            <w:pPr>
-              <w:pStyle w:val="Compact"/>
+              <w:jc w:val="left"/>
+            </w:pPr>
+            <w:r>
+              <w:t xml:space="preserve">gamma_log_strict</w:t>
+            </w:r>
+          </w:p>
+        </w:tc>
+        <w:tc>
+          <w:tcPr/>
+          <w:p>
+            <w:pPr>
+              <w:pStyle w:val="Compact"/>
+              <w:jc w:val="left"/>
             </w:pPr>
             <w:r>
               <w:rPr>
@@ -380,6 +403,7 @@
           <w:p>
             <w:pPr>
               <w:pStyle w:val="Compact"/>
+              <w:jc w:val="left"/>
             </w:pPr>
             <w:r>
               <w:t xml:space="preserve">Table1_Grazing_Behaviors</w:t>
@@ -393,6 +417,7 @@
           <w:p>
             <w:pPr>
               <w:pStyle w:val="Compact"/>
+              <w:jc w:val="left"/>
             </w:pPr>
             <w:r>
               <w:t xml:space="preserve">4</w:t>
@@ -404,6 +429,7 @@
           <w:p>
             <w:pPr>
               <w:pStyle w:val="Compact"/>
+              <w:jc w:val="left"/>
             </w:pPr>
             <w:r>
               <w:t xml:space="preserve">mean_DDT_day</w:t>
@@ -415,6 +441,7 @@
           <w:p>
             <w:pPr>
               <w:pStyle w:val="Compact"/>
+              <w:jc w:val="left"/>
             </w:pPr>
             <w:r>
               <w:t xml:space="preserve">season</w:t>
@@ -426,17 +453,19 @@
           <w:p>
             <w:pPr>
               <w:pStyle w:val="Compact"/>
-            </w:pPr>
-            <w:r>
-              <w:t xml:space="preserve">gaussian</w:t>
-            </w:r>
-          </w:p>
-        </w:tc>
-        <w:tc>
-          <w:tcPr/>
-          <w:p>
-            <w:pPr>
-              <w:pStyle w:val="Compact"/>
+              <w:jc w:val="left"/>
+            </w:pPr>
+            <w:r>
+              <w:t xml:space="preserve">gamma_log_strict</w:t>
+            </w:r>
+          </w:p>
+        </w:tc>
+        <w:tc>
+          <w:tcPr/>
+          <w:p>
+            <w:pPr>
+              <w:pStyle w:val="Compact"/>
+              <w:jc w:val="left"/>
             </w:pPr>
             <w:r>
               <w:rPr>
@@ -451,6 +480,7 @@
           <w:p>
             <w:pPr>
               <w:pStyle w:val="Compact"/>
+              <w:jc w:val="left"/>
             </w:pPr>
             <w:r>
               <w:t xml:space="preserve">Table1_Grazing_Behaviors</w:t>
@@ -464,6 +494,7 @@
           <w:p>
             <w:pPr>
               <w:pStyle w:val="Compact"/>
+              <w:jc w:val="left"/>
             </w:pPr>
             <w:r>
               <w:t xml:space="preserve">5</w:t>
@@ -475,6 +506,7 @@
           <w:p>
             <w:pPr>
               <w:pStyle w:val="Compact"/>
+              <w:jc w:val="left"/>
             </w:pPr>
             <w:r>
               <w:t xml:space="preserve">CH4_Mean_g_d</w:t>
@@ -486,6 +518,7 @@
           <w:p>
             <w:pPr>
               <w:pStyle w:val="Compact"/>
+              <w:jc w:val="left"/>
             </w:pPr>
             <w:r>
               <w:t xml:space="preserve">season</w:t>
@@ -497,6 +530,7 @@
           <w:p>
             <w:pPr>
               <w:pStyle w:val="Compact"/>
+              <w:jc w:val="left"/>
             </w:pPr>
             <w:r>
               <w:t xml:space="preserve">auto_positive</w:t>
@@ -508,6 +542,7 @@
           <w:p>
             <w:pPr>
               <w:pStyle w:val="Compact"/>
+              <w:jc w:val="left"/>
             </w:pPr>
             <w:r>
               <w:rPr>
@@ -522,6 +557,7 @@
           <w:p>
             <w:pPr>
               <w:pStyle w:val="Compact"/>
+              <w:jc w:val="left"/>
             </w:pPr>
             <w:r>
               <w:t xml:space="preserve">dressler_animal_means</w:t>
@@ -535,6 +571,7 @@
           <w:p>
             <w:pPr>
               <w:pStyle w:val="Compact"/>
+              <w:jc w:val="left"/>
             </w:pPr>
             <w:r>
               <w:t xml:space="preserve">6</w:t>
@@ -546,6 +583,7 @@
           <w:p>
             <w:pPr>
               <w:pStyle w:val="Compact"/>
+              <w:jc w:val="left"/>
             </w:pPr>
             <w:r>
               <w:t xml:space="preserve">CO2_Mean_g_d</w:t>
@@ -557,6 +595,7 @@
           <w:p>
             <w:pPr>
               <w:pStyle w:val="Compact"/>
+              <w:jc w:val="left"/>
             </w:pPr>
             <w:r>
               <w:t xml:space="preserve">season</w:t>
@@ -568,6 +607,7 @@
           <w:p>
             <w:pPr>
               <w:pStyle w:val="Compact"/>
+              <w:jc w:val="left"/>
             </w:pPr>
             <w:r>
               <w:t xml:space="preserve">auto_positive</w:t>
@@ -579,6 +619,7 @@
           <w:p>
             <w:pPr>
               <w:pStyle w:val="Compact"/>
+              <w:jc w:val="left"/>
             </w:pPr>
             <w:r>
               <w:rPr>
@@ -593,6 +634,7 @@
           <w:p>
             <w:pPr>
               <w:pStyle w:val="Compact"/>
+              <w:jc w:val="left"/>
             </w:pPr>
             <w:r>
               <w:t xml:space="preserve">dressler_animal_means</w:t>
@@ -606,6 +648,7 @@
           <w:p>
             <w:pPr>
               <w:pStyle w:val="Compact"/>
+              <w:jc w:val="left"/>
             </w:pPr>
             <w:r>
               <w:t xml:space="preserve">7</w:t>
@@ -617,6 +660,7 @@
           <w:p>
             <w:pPr>
               <w:pStyle w:val="Compact"/>
+              <w:jc w:val="left"/>
             </w:pPr>
             <w:r>
               <w:t xml:space="preserve">Smooth_Period_ADG</w:t>
@@ -628,6 +672,7 @@
           <w:p>
             <w:pPr>
               <w:pStyle w:val="Compact"/>
+              <w:jc w:val="left"/>
             </w:pPr>
             <w:r>
               <w:t xml:space="preserve">season</w:t>
@@ -639,6 +684,7 @@
           <w:p>
             <w:pPr>
               <w:pStyle w:val="Compact"/>
+              <w:jc w:val="left"/>
             </w:pPr>
             <w:r>
               <w:t xml:space="preserve">gaussian</w:t>
@@ -650,6 +696,7 @@
           <w:p>
             <w:pPr>
               <w:pStyle w:val="Compact"/>
+              <w:jc w:val="left"/>
             </w:pPr>
             <w:r>
               <w:rPr>
@@ -664,6 +711,7 @@
           <w:p>
             <w:pPr>
               <w:pStyle w:val="Compact"/>
+              <w:jc w:val="left"/>
             </w:pPr>
             <w:r>
               <w:t xml:space="preserve">animal_spline_metrics</w:t>
@@ -677,6 +725,7 @@
           <w:p>
             <w:pPr>
               <w:pStyle w:val="Compact"/>
+              <w:jc w:val="left"/>
             </w:pPr>
             <w:r>
               <w:t xml:space="preserve">8</w:t>
@@ -688,6 +737,7 @@
           <w:p>
             <w:pPr>
               <w:pStyle w:val="Compact"/>
+              <w:jc w:val="left"/>
             </w:pPr>
             <w:r>
               <w:t xml:space="preserve">Shrunk_Initial_BW_kg</w:t>
@@ -699,6 +749,7 @@
           <w:p>
             <w:pPr>
               <w:pStyle w:val="Compact"/>
+              <w:jc w:val="left"/>
             </w:pPr>
             <w:r>
               <w:t xml:space="preserve">season</w:t>
@@ -710,6 +761,7 @@
           <w:p>
             <w:pPr>
               <w:pStyle w:val="Compact"/>
+              <w:jc w:val="left"/>
             </w:pPr>
             <w:r>
               <w:t xml:space="preserve">gaussian</w:t>
@@ -721,6 +773,7 @@
           <w:p>
             <w:pPr>
               <w:pStyle w:val="Compact"/>
+              <w:jc w:val="left"/>
             </w:pPr>
             <w:r>
               <w:rPr>
@@ -735,6 +788,7 @@
           <w:p>
             <w:pPr>
               <w:pStyle w:val="Compact"/>
+              <w:jc w:val="left"/>
             </w:pPr>
             <w:r>
               <w:t xml:space="preserve">shrunk_bw_season_analysis</w:t>
@@ -748,6 +802,7 @@
           <w:p>
             <w:pPr>
               <w:pStyle w:val="Compact"/>
+              <w:jc w:val="left"/>
             </w:pPr>
             <w:r>
               <w:t xml:space="preserve">9</w:t>
@@ -759,6 +814,7 @@
           <w:p>
             <w:pPr>
               <w:pStyle w:val="Compact"/>
+              <w:jc w:val="left"/>
             </w:pPr>
             <w:r>
               <w:t xml:space="preserve">Shrunk_Final_BW_kg</w:t>
@@ -770,6 +826,7 @@
           <w:p>
             <w:pPr>
               <w:pStyle w:val="Compact"/>
+              <w:jc w:val="left"/>
             </w:pPr>
             <w:r>
               <w:t xml:space="preserve">season</w:t>
@@ -781,6 +838,7 @@
           <w:p>
             <w:pPr>
               <w:pStyle w:val="Compact"/>
+              <w:jc w:val="left"/>
             </w:pPr>
             <w:r>
               <w:t xml:space="preserve">gaussian</w:t>
@@ -792,6 +850,7 @@
           <w:p>
             <w:pPr>
               <w:pStyle w:val="Compact"/>
+              <w:jc w:val="left"/>
             </w:pPr>
             <w:r>
               <w:rPr>
@@ -806,6 +865,7 @@
           <w:p>
             <w:pPr>
               <w:pStyle w:val="Compact"/>
+              <w:jc w:val="left"/>
             </w:pPr>
             <w:r>
               <w:t xml:space="preserve">shrunk_bw_season_analysis</w:t>
@@ -819,6 +879,7 @@
           <w:p>
             <w:pPr>
               <w:pStyle w:val="Compact"/>
+              <w:jc w:val="left"/>
             </w:pPr>
             <w:r>
               <w:t xml:space="preserve">10</w:t>
@@ -830,6 +891,7 @@
           <w:p>
             <w:pPr>
               <w:pStyle w:val="Compact"/>
+              <w:jc w:val="left"/>
             </w:pPr>
             <w:r>
               <w:t xml:space="preserve">CH4_g_per_active_ha_whole_season</w:t>
@@ -841,6 +903,7 @@
           <w:p>
             <w:pPr>
               <w:pStyle w:val="Compact"/>
+              <w:jc w:val="left"/>
             </w:pPr>
             <w:r>
               <w:t xml:space="preserve">season</w:t>
@@ -852,6 +915,7 @@
           <w:p>
             <w:pPr>
               <w:pStyle w:val="Compact"/>
+              <w:jc w:val="left"/>
             </w:pPr>
             <w:r>
               <w:t xml:space="preserve">auto_positive</w:t>
@@ -863,6 +927,7 @@
           <w:p>
             <w:pPr>
               <w:pStyle w:val="Compact"/>
+              <w:jc w:val="left"/>
             </w:pPr>
             <w:r>
               <w:rPr>
@@ -877,6 +942,7 @@
           <w:p>
             <w:pPr>
               <w:pStyle w:val="Compact"/>
+              <w:jc w:val="left"/>
             </w:pPr>
             <w:r>
               <w:t xml:space="preserve">whole_season_grazing_productivity</w:t>
@@ -890,6 +956,7 @@
           <w:p>
             <w:pPr>
               <w:pStyle w:val="Compact"/>
+              <w:jc w:val="left"/>
             </w:pPr>
             <w:r>
               <w:t xml:space="preserve">11</w:t>
@@ -901,6 +968,7 @@
           <w:p>
             <w:pPr>
               <w:pStyle w:val="Compact"/>
+              <w:jc w:val="left"/>
             </w:pPr>
             <w:r>
               <w:t xml:space="preserve">CO2_g_per_active_ha_whole_season</w:t>
@@ -912,6 +980,7 @@
           <w:p>
             <w:pPr>
               <w:pStyle w:val="Compact"/>
+              <w:jc w:val="left"/>
             </w:pPr>
             <w:r>
               <w:t xml:space="preserve">season</w:t>
@@ -923,6 +992,7 @@
           <w:p>
             <w:pPr>
               <w:pStyle w:val="Compact"/>
+              <w:jc w:val="left"/>
             </w:pPr>
             <w:r>
               <w:t xml:space="preserve">auto_positive</w:t>
@@ -934,6 +1004,7 @@
           <w:p>
             <w:pPr>
               <w:pStyle w:val="Compact"/>
+              <w:jc w:val="left"/>
             </w:pPr>
             <w:r>
               <w:rPr>
@@ -948,6 +1019,7 @@
           <w:p>
             <w:pPr>
               <w:pStyle w:val="Compact"/>
+              <w:jc w:val="left"/>
             </w:pPr>
             <w:r>
               <w:t xml:space="preserve">whole_season_grazing_productivity</w:t>
@@ -961,6 +1033,7 @@
           <w:p>
             <w:pPr>
               <w:pStyle w:val="Compact"/>
+              <w:jc w:val="left"/>
             </w:pPr>
             <w:r>
               <w:t xml:space="preserve">12</w:t>
@@ -972,6 +1045,7 @@
           <w:p>
             <w:pPr>
               <w:pStyle w:val="Compact"/>
+              <w:jc w:val="left"/>
             </w:pPr>
             <w:r>
               <w:t xml:space="preserve">active_ha_whole_season</w:t>
@@ -983,6 +1057,7 @@
           <w:p>
             <w:pPr>
               <w:pStyle w:val="Compact"/>
+              <w:jc w:val="left"/>
             </w:pPr>
             <w:r>
               <w:t xml:space="preserve">season</w:t>
@@ -994,6 +1069,7 @@
           <w:p>
             <w:pPr>
               <w:pStyle w:val="Compact"/>
+              <w:jc w:val="left"/>
             </w:pPr>
             <w:r>
               <w:t xml:space="preserve">auto_positive</w:t>
@@ -1005,6 +1081,7 @@
           <w:p>
             <w:pPr>
               <w:pStyle w:val="Compact"/>
+              <w:jc w:val="left"/>
             </w:pPr>
             <w:r>
               <w:rPr>
@@ -1019,6 +1096,7 @@
           <w:p>
             <w:pPr>
               <w:pStyle w:val="Compact"/>
+              <w:jc w:val="left"/>
             </w:pPr>
             <w:r>
               <w:t xml:space="preserve">whole_season_grazing_productivity</w:t>
@@ -1032,6 +1110,7 @@
           <w:p>
             <w:pPr>
               <w:pStyle w:val="Compact"/>
+              <w:jc w:val="left"/>
             </w:pPr>
             <w:r>
               <w:t xml:space="preserve">13</w:t>
@@ -1043,6 +1122,7 @@
           <w:p>
             <w:pPr>
               <w:pStyle w:val="Compact"/>
+              <w:jc w:val="left"/>
             </w:pPr>
             <w:r>
               <w:t xml:space="preserve">LWG_kg_per_active_ha_whole_season</w:t>
@@ -1054,6 +1134,7 @@
           <w:p>
             <w:pPr>
               <w:pStyle w:val="Compact"/>
+              <w:jc w:val="left"/>
             </w:pPr>
             <w:r>
               <w:t xml:space="preserve">season</w:t>
@@ -1065,6 +1146,7 @@
           <w:p>
             <w:pPr>
               <w:pStyle w:val="Compact"/>
+              <w:jc w:val="left"/>
             </w:pPr>
             <w:r>
               <w:t xml:space="preserve">auto_positive</w:t>
@@ -1076,6 +1158,7 @@
           <w:p>
             <w:pPr>
               <w:pStyle w:val="Compact"/>
+              <w:jc w:val="left"/>
             </w:pPr>
             <w:r>
               <w:rPr>
@@ -1090,6 +1173,7 @@
           <w:p>
             <w:pPr>
               <w:pStyle w:val="Compact"/>
+              <w:jc w:val="left"/>
             </w:pPr>
             <w:r>
               <w:t xml:space="preserve">whole_season_grazing_productivity</w:t>
@@ -1103,6 +1187,7 @@
           <w:p>
             <w:pPr>
               <w:pStyle w:val="Compact"/>
+              <w:jc w:val="left"/>
             </w:pPr>
             <w:r>
               <w:t xml:space="preserve">14</w:t>
@@ -1114,6 +1199,7 @@
           <w:p>
             <w:pPr>
               <w:pStyle w:val="Compact"/>
+              <w:jc w:val="left"/>
             </w:pPr>
             <w:r>
               <w:t xml:space="preserve">active_ha_all_pasture</w:t>
@@ -1125,6 +1211,7 @@
           <w:p>
             <w:pPr>
               <w:pStyle w:val="Compact"/>
+              <w:jc w:val="left"/>
             </w:pPr>
             <w:r>
               <w:t xml:space="preserve">period</w:t>
@@ -1136,6 +1223,7 @@
           <w:p>
             <w:pPr>
               <w:pStyle w:val="Compact"/>
+              <w:jc w:val="left"/>
             </w:pPr>
             <w:r>
               <w:t xml:space="preserve">gamma_log</w:t>
@@ -1147,6 +1235,7 @@
           <w:p>
             <w:pPr>
               <w:pStyle w:val="Compact"/>
+              <w:jc w:val="left"/>
             </w:pPr>
             <w:r>
               <w:rPr>
@@ -1161,6 +1250,7 @@
           <w:p>
             <w:pPr>
               <w:pStyle w:val="Compact"/>
+              <w:jc w:val="left"/>
             </w:pPr>
             <w:r>
               <w:t xml:space="preserve">period_level_grazing_productivity</w:t>
@@ -1174,6 +1264,7 @@
           <w:p>
             <w:pPr>
               <w:pStyle w:val="Compact"/>
+              <w:jc w:val="left"/>
             </w:pPr>
             <w:r>
               <w:t xml:space="preserve">15</w:t>
@@ -1185,6 +1276,7 @@
           <w:p>
             <w:pPr>
               <w:pStyle w:val="Compact"/>
+              <w:jc w:val="left"/>
             </w:pPr>
             <w:r>
               <w:t xml:space="preserve">active_ha_inside_rgp</w:t>
@@ -1196,6 +1288,7 @@
           <w:p>
             <w:pPr>
               <w:pStyle w:val="Compact"/>
+              <w:jc w:val="left"/>
             </w:pPr>
             <w:r>
               <w:t xml:space="preserve">period</w:t>
@@ -1207,6 +1300,7 @@
           <w:p>
             <w:pPr>
               <w:pStyle w:val="Compact"/>
+              <w:jc w:val="left"/>
             </w:pPr>
             <w:r>
               <w:t xml:space="preserve">gamma_log</w:t>
@@ -1218,6 +1312,7 @@
           <w:p>
             <w:pPr>
               <w:pStyle w:val="Compact"/>
+              <w:jc w:val="left"/>
             </w:pPr>
             <w:r>
               <w:rPr>
@@ -1232,6 +1327,7 @@
           <w:p>
             <w:pPr>
               <w:pStyle w:val="Compact"/>
+              <w:jc w:val="left"/>
             </w:pPr>
             <w:r>
               <w:t xml:space="preserve">period_level_grazing_productivity</w:t>
@@ -1245,6 +1341,7 @@
           <w:p>
             <w:pPr>
               <w:pStyle w:val="Compact"/>
+              <w:jc w:val="left"/>
             </w:pPr>
             <w:r>
               <w:t xml:space="preserve">16</w:t>
@@ -1256,6 +1353,7 @@
           <w:p>
             <w:pPr>
               <w:pStyle w:val="Compact"/>
+              <w:jc w:val="left"/>
             </w:pPr>
             <w:r>
               <w:t xml:space="preserve">total_LWG_kg</w:t>
@@ -1267,6 +1365,7 @@
           <w:p>
             <w:pPr>
               <w:pStyle w:val="Compact"/>
+              <w:jc w:val="left"/>
             </w:pPr>
             <w:r>
               <w:t xml:space="preserve">season</w:t>
@@ -1278,6 +1377,7 @@
           <w:p>
             <w:pPr>
               <w:pStyle w:val="Compact"/>
+              <w:jc w:val="left"/>
             </w:pPr>
             <w:r>
               <w:t xml:space="preserve">gaussian</w:t>
@@ -1289,6 +1389,7 @@
           <w:p>
             <w:pPr>
               <w:pStyle w:val="Compact"/>
+              <w:jc w:val="left"/>
             </w:pPr>
             <w:r>
               <w:rPr>
@@ -1303,6 +1404,7 @@
           <w:p>
             <w:pPr>
               <w:pStyle w:val="Compact"/>
+              <w:jc w:val="left"/>
             </w:pPr>
             <w:r>
               <w:t xml:space="preserve">whole_season_grazing_productivity</w:t>
@@ -1316,6 +1418,7 @@
           <w:p>
             <w:pPr>
               <w:pStyle w:val="Compact"/>
+              <w:jc w:val="left"/>
             </w:pPr>
             <w:r>
               <w:t xml:space="preserve">17</w:t>
@@ -1327,6 +1430,7 @@
           <w:p>
             <w:pPr>
               <w:pStyle w:val="Compact"/>
+              <w:jc w:val="left"/>
             </w:pPr>
             <w:r>
               <w:t xml:space="preserve">mean_RGP_ADG_kg_day</w:t>
@@ -1338,6 +1442,7 @@
           <w:p>
             <w:pPr>
               <w:pStyle w:val="Compact"/>
+              <w:jc w:val="left"/>
             </w:pPr>
             <w:r>
               <w:t xml:space="preserve">period</w:t>
@@ -1349,6 +1454,7 @@
           <w:p>
             <w:pPr>
               <w:pStyle w:val="Compact"/>
+              <w:jc w:val="left"/>
             </w:pPr>
             <w:r>
               <w:t xml:space="preserve">gaussian</w:t>
@@ -1360,6 +1466,7 @@
           <w:p>
             <w:pPr>
               <w:pStyle w:val="Compact"/>
+              <w:jc w:val="left"/>
             </w:pPr>
             <w:r>
               <w:rPr>
@@ -1374,6 +1481,7 @@
           <w:p>
             <w:pPr>
               <w:pStyle w:val="Compact"/>
+              <w:jc w:val="left"/>
             </w:pPr>
             <w:r>
               <w:t xml:space="preserve">period_level_grazing_productivity</w:t>
@@ -1387,6 +1495,7 @@
           <w:p>
             <w:pPr>
               <w:pStyle w:val="Compact"/>
+              <w:jc w:val="left"/>
             </w:pPr>
             <w:r>
               <w:t xml:space="preserve">18</w:t>
@@ -1398,6 +1507,7 @@
           <w:p>
             <w:pPr>
               <w:pStyle w:val="Compact"/>
+              <w:jc w:val="left"/>
             </w:pPr>
             <w:r>
               <w:t xml:space="preserve">CH4_g_animal_day</w:t>
@@ -1409,6 +1519,7 @@
           <w:p>
             <w:pPr>
               <w:pStyle w:val="Compact"/>
+              <w:jc w:val="left"/>
             </w:pPr>
             <w:r>
               <w:t xml:space="preserve">period</w:t>
@@ -1420,6 +1531,7 @@
           <w:p>
             <w:pPr>
               <w:pStyle w:val="Compact"/>
+              <w:jc w:val="left"/>
             </w:pPr>
             <w:r>
               <w:t xml:space="preserve">gaussian</w:t>
@@ -1431,6 +1543,7 @@
           <w:p>
             <w:pPr>
               <w:pStyle w:val="Compact"/>
+              <w:jc w:val="left"/>
             </w:pPr>
             <w:r>
               <w:rPr>
@@ -1445,6 +1558,7 @@
           <w:p>
             <w:pPr>
               <w:pStyle w:val="Compact"/>
+              <w:jc w:val="left"/>
             </w:pPr>
             <w:r>
               <w:t xml:space="preserve">period_level_grazing_productivity</w:t>
@@ -1458,6 +1572,7 @@
           <w:p>
             <w:pPr>
               <w:pStyle w:val="Compact"/>
+              <w:jc w:val="left"/>
             </w:pPr>
             <w:r>
               <w:t xml:space="preserve">19</w:t>
@@ -1469,6 +1584,7 @@
           <w:p>
             <w:pPr>
               <w:pStyle w:val="Compact"/>
+              <w:jc w:val="left"/>
             </w:pPr>
             <w:r>
               <w:t xml:space="preserve">CO2_g_animal_day</w:t>
@@ -1480,6 +1596,7 @@
           <w:p>
             <w:pPr>
               <w:pStyle w:val="Compact"/>
+              <w:jc w:val="left"/>
             </w:pPr>
             <w:r>
               <w:t xml:space="preserve">period</w:t>
@@ -1491,6 +1608,7 @@
           <w:p>
             <w:pPr>
               <w:pStyle w:val="Compact"/>
+              <w:jc w:val="left"/>
             </w:pPr>
             <w:r>
               <w:t xml:space="preserve">gaussian</w:t>
@@ -1502,6 +1620,7 @@
           <w:p>
             <w:pPr>
               <w:pStyle w:val="Compact"/>
+              <w:jc w:val="left"/>
             </w:pPr>
             <w:r>
               <w:rPr>
@@ -1516,6 +1635,7 @@
           <w:p>
             <w:pPr>
               <w:pStyle w:val="Compact"/>
+              <w:jc w:val="left"/>
             </w:pPr>
             <w:r>
               <w:t xml:space="preserve">period_level_grazing_productivity</w:t>
@@ -1529,6 +1649,7 @@
           <w:p>
             <w:pPr>
               <w:pStyle w:val="Compact"/>
+              <w:jc w:val="left"/>
             </w:pPr>
             <w:r>
               <w:t xml:space="preserve">20</w:t>
@@ -1540,6 +1661,7 @@
           <w:p>
             <w:pPr>
               <w:pStyle w:val="Compact"/>
+              <w:jc w:val="left"/>
             </w:pPr>
             <w:r>
               <w:t xml:space="preserve">LWG_kg_per_active_ha_all_pasture</w:t>
@@ -1551,6 +1673,7 @@
           <w:p>
             <w:pPr>
               <w:pStyle w:val="Compact"/>
+              <w:jc w:val="left"/>
             </w:pPr>
             <w:r>
               <w:t xml:space="preserve">period</w:t>
@@ -1562,6 +1685,7 @@
           <w:p>
             <w:pPr>
               <w:pStyle w:val="Compact"/>
+              <w:jc w:val="left"/>
             </w:pPr>
             <w:r>
               <w:t xml:space="preserve">gaussian</w:t>
@@ -1573,6 +1697,7 @@
           <w:p>
             <w:pPr>
               <w:pStyle w:val="Compact"/>
+              <w:jc w:val="left"/>
             </w:pPr>
             <w:r>
               <w:rPr>
@@ -1587,6 +1712,7 @@
           <w:p>
             <w:pPr>
               <w:pStyle w:val="Compact"/>
+              <w:jc w:val="left"/>
             </w:pPr>
             <w:r>
               <w:t xml:space="preserve">period_level_grazing_productivity</w:t>
@@ -1600,6 +1726,7 @@
           <w:p>
             <w:pPr>
               <w:pStyle w:val="Compact"/>
+              <w:jc w:val="left"/>
             </w:pPr>
             <w:r>
               <w:t xml:space="preserve">21</w:t>
@@ -1611,6 +1738,7 @@
           <w:p>
             <w:pPr>
               <w:pStyle w:val="Compact"/>
+              <w:jc w:val="left"/>
             </w:pPr>
             <w:r>
               <w:t xml:space="preserve">LWG_kg_per_active_ha_inside_rgp</w:t>
@@ -1622,6 +1750,7 @@
           <w:p>
             <w:pPr>
               <w:pStyle w:val="Compact"/>
+              <w:jc w:val="left"/>
             </w:pPr>
             <w:r>
               <w:t xml:space="preserve">period</w:t>
@@ -1633,6 +1762,7 @@
           <w:p>
             <w:pPr>
               <w:pStyle w:val="Compact"/>
+              <w:jc w:val="left"/>
             </w:pPr>
             <w:r>
               <w:t xml:space="preserve">gaussian</w:t>
@@ -1644,6 +1774,7 @@
           <w:p>
             <w:pPr>
               <w:pStyle w:val="Compact"/>
+              <w:jc w:val="left"/>
             </w:pPr>
             <w:r>
               <w:rPr>
@@ -1658,6 +1789,7 @@
           <w:p>
             <w:pPr>
               <w:pStyle w:val="Compact"/>
+              <w:jc w:val="left"/>
             </w:pPr>
             <w:r>
               <w:t xml:space="preserve">period_level_grazing_productivity</w:t>
@@ -1671,6 +1803,7 @@
           <w:p>
             <w:pPr>
               <w:pStyle w:val="Compact"/>
+              <w:jc w:val="left"/>
             </w:pPr>
             <w:r>
               <w:t xml:space="preserve">22</w:t>
@@ -1682,6 +1815,7 @@
           <w:p>
             <w:pPr>
               <w:pStyle w:val="Compact"/>
+              <w:jc w:val="left"/>
             </w:pPr>
             <w:r>
               <w:t xml:space="preserve">CH4_g_per_active_ha_all_pasture</w:t>
@@ -1693,6 +1827,7 @@
           <w:p>
             <w:pPr>
               <w:pStyle w:val="Compact"/>
+              <w:jc w:val="left"/>
             </w:pPr>
             <w:r>
               <w:t xml:space="preserve">period</w:t>
@@ -1704,6 +1839,7 @@
           <w:p>
             <w:pPr>
               <w:pStyle w:val="Compact"/>
+              <w:jc w:val="left"/>
             </w:pPr>
             <w:r>
               <w:t xml:space="preserve">gamma_log</w:t>
@@ -1715,6 +1851,7 @@
           <w:p>
             <w:pPr>
               <w:pStyle w:val="Compact"/>
+              <w:jc w:val="left"/>
             </w:pPr>
             <w:r>
               <w:rPr>
@@ -1729,6 +1866,7 @@
           <w:p>
             <w:pPr>
               <w:pStyle w:val="Compact"/>
+              <w:jc w:val="left"/>
             </w:pPr>
             <w:r>
               <w:t xml:space="preserve">period_level_grazing_productivity</w:t>
@@ -1742,6 +1880,7 @@
           <w:p>
             <w:pPr>
               <w:pStyle w:val="Compact"/>
+              <w:jc w:val="left"/>
             </w:pPr>
             <w:r>
               <w:t xml:space="preserve">23</w:t>
@@ -1753,6 +1892,7 @@
           <w:p>
             <w:pPr>
               <w:pStyle w:val="Compact"/>
+              <w:jc w:val="left"/>
             </w:pPr>
             <w:r>
               <w:t xml:space="preserve">CH4_g_per_active_ha_inside_rgp</w:t>
@@ -1764,6 +1904,7 @@
           <w:p>
             <w:pPr>
               <w:pStyle w:val="Compact"/>
+              <w:jc w:val="left"/>
             </w:pPr>
             <w:r>
               <w:t xml:space="preserve">period</w:t>
@@ -1775,6 +1916,7 @@
           <w:p>
             <w:pPr>
               <w:pStyle w:val="Compact"/>
+              <w:jc w:val="left"/>
             </w:pPr>
             <w:r>
               <w:t xml:space="preserve">gamma_log</w:t>
@@ -1786,6 +1928,7 @@
           <w:p>
             <w:pPr>
               <w:pStyle w:val="Compact"/>
+              <w:jc w:val="left"/>
             </w:pPr>
             <w:r>
               <w:rPr>
@@ -1800,6 +1943,7 @@
           <w:p>
             <w:pPr>
               <w:pStyle w:val="Compact"/>
+              <w:jc w:val="left"/>
             </w:pPr>
             <w:r>
               <w:t xml:space="preserve">period_level_grazing_productivity</w:t>
@@ -1813,6 +1957,7 @@
           <w:p>
             <w:pPr>
               <w:pStyle w:val="Compact"/>
+              <w:jc w:val="left"/>
             </w:pPr>
             <w:r>
               <w:t xml:space="preserve">24</w:t>
@@ -1824,6 +1969,7 @@
           <w:p>
             <w:pPr>
               <w:pStyle w:val="Compact"/>
+              <w:jc w:val="left"/>
             </w:pPr>
             <w:r>
               <w:t xml:space="preserve">CO2_g_per_active_ha_all_pasture</w:t>
@@ -1835,6 +1981,7 @@
           <w:p>
             <w:pPr>
               <w:pStyle w:val="Compact"/>
+              <w:jc w:val="left"/>
             </w:pPr>
             <w:r>
               <w:t xml:space="preserve">period</w:t>
@@ -1846,6 +1993,7 @@
           <w:p>
             <w:pPr>
               <w:pStyle w:val="Compact"/>
+              <w:jc w:val="left"/>
             </w:pPr>
             <w:r>
               <w:t xml:space="preserve">gamma_log</w:t>
@@ -1857,6 +2005,7 @@
           <w:p>
             <w:pPr>
               <w:pStyle w:val="Compact"/>
+              <w:jc w:val="left"/>
             </w:pPr>
             <w:r>
               <w:rPr>
@@ -1871,6 +2020,7 @@
           <w:p>
             <w:pPr>
               <w:pStyle w:val="Compact"/>
+              <w:jc w:val="left"/>
             </w:pPr>
             <w:r>
               <w:t xml:space="preserve">period_level_grazing_productivity</w:t>
@@ -1884,6 +2034,7 @@
           <w:p>
             <w:pPr>
               <w:pStyle w:val="Compact"/>
+              <w:jc w:val="left"/>
             </w:pPr>
             <w:r>
               <w:t xml:space="preserve">25</w:t>
@@ -1895,6 +2046,7 @@
           <w:p>
             <w:pPr>
               <w:pStyle w:val="Compact"/>
+              <w:jc w:val="left"/>
             </w:pPr>
             <w:r>
               <w:t xml:space="preserve">CO2_g_per_active_ha_inside_rgp</w:t>
@@ -1906,6 +2058,7 @@
           <w:p>
             <w:pPr>
               <w:pStyle w:val="Compact"/>
+              <w:jc w:val="left"/>
             </w:pPr>
             <w:r>
               <w:t xml:space="preserve">period</w:t>
@@ -1917,6 +2070,7 @@
           <w:p>
             <w:pPr>
               <w:pStyle w:val="Compact"/>
+              <w:jc w:val="left"/>
             </w:pPr>
             <w:r>
               <w:t xml:space="preserve">gamma_log</w:t>
@@ -1928,6 +2082,7 @@
           <w:p>
             <w:pPr>
               <w:pStyle w:val="Compact"/>
+              <w:jc w:val="left"/>
             </w:pPr>
             <w:r>
               <w:rPr>
@@ -1942,6 +2097,7 @@
           <w:p>
             <w:pPr>
               <w:pStyle w:val="Compact"/>
+              <w:jc w:val="left"/>
             </w:pPr>
             <w:r>
               <w:t xml:space="preserve">period_level_grazing_productivity</w:t>
@@ -1955,6 +2111,7 @@
           <w:p>
             <w:pPr>
               <w:pStyle w:val="Compact"/>
+              <w:jc w:val="left"/>
             </w:pPr>
             <w:r>
               <w:t xml:space="preserve">26</w:t>
@@ -1966,6 +2123,7 @@
           <w:p>
             <w:pPr>
               <w:pStyle w:val="Compact"/>
+              <w:jc w:val="left"/>
             </w:pPr>
             <w:r>
               <w:t xml:space="preserve">CH4_g_per_kg_LWG</w:t>
@@ -1977,6 +2135,7 @@
           <w:p>
             <w:pPr>
               <w:pStyle w:val="Compact"/>
+              <w:jc w:val="left"/>
             </w:pPr>
             <w:r>
               <w:t xml:space="preserve">period</w:t>
@@ -1988,6 +2147,7 @@
           <w:p>
             <w:pPr>
               <w:pStyle w:val="Compact"/>
+              <w:jc w:val="left"/>
             </w:pPr>
             <w:r>
               <w:t xml:space="preserve">gamma_log</w:t>
@@ -1999,6 +2159,7 @@
           <w:p>
             <w:pPr>
               <w:pStyle w:val="Compact"/>
+              <w:jc w:val="left"/>
             </w:pPr>
             <w:r>
               <w:rPr>
@@ -2013,6 +2174,7 @@
           <w:p>
             <w:pPr>
               <w:pStyle w:val="Compact"/>
+              <w:jc w:val="left"/>
             </w:pPr>
             <w:r>
               <w:t xml:space="preserve">period_level_grazing_productivity</w:t>
@@ -2026,6 +2188,7 @@
           <w:p>
             <w:pPr>
               <w:pStyle w:val="Compact"/>
+              <w:jc w:val="left"/>
             </w:pPr>
             <w:r>
               <w:t xml:space="preserve">27</w:t>
@@ -2037,6 +2200,7 @@
           <w:p>
             <w:pPr>
               <w:pStyle w:val="Compact"/>
+              <w:jc w:val="left"/>
             </w:pPr>
             <w:r>
               <w:t xml:space="preserve">CO2_g_per_kg_LWG</w:t>
@@ -2048,6 +2212,7 @@
           <w:p>
             <w:pPr>
               <w:pStyle w:val="Compact"/>
+              <w:jc w:val="left"/>
             </w:pPr>
             <w:r>
               <w:t xml:space="preserve">period</w:t>
@@ -2059,6 +2224,7 @@
           <w:p>
             <w:pPr>
               <w:pStyle w:val="Compact"/>
+              <w:jc w:val="left"/>
             </w:pPr>
             <w:r>
               <w:t xml:space="preserve">gamma_log</w:t>
@@ -2070,6 +2236,7 @@
           <w:p>
             <w:pPr>
               <w:pStyle w:val="Compact"/>
+              <w:jc w:val="left"/>
             </w:pPr>
             <w:r>
               <w:rPr>
@@ -2084,6 +2251,7 @@
           <w:p>
             <w:pPr>
               <w:pStyle w:val="Compact"/>
+              <w:jc w:val="left"/>
             </w:pPr>
             <w:r>
               <w:t xml:space="preserve">period_level_grazing_productivity</w:t>
@@ -2097,6 +2265,7 @@
           <w:p>
             <w:pPr>
               <w:pStyle w:val="Compact"/>
+              <w:jc w:val="left"/>
             </w:pPr>
             <w:r>
               <w:t xml:space="preserve">28</w:t>
@@ -2108,6 +2277,7 @@
           <w:p>
             <w:pPr>
               <w:pStyle w:val="Compact"/>
+              <w:jc w:val="left"/>
             </w:pPr>
             <w:r>
               <w:t xml:space="preserve">total_LWG_kg</w:t>
@@ -2119,6 +2289,7 @@
           <w:p>
             <w:pPr>
               <w:pStyle w:val="Compact"/>
+              <w:jc w:val="left"/>
             </w:pPr>
             <w:r>
               <w:t xml:space="preserve">season</w:t>
@@ -2130,6 +2301,7 @@
           <w:p>
             <w:pPr>
               <w:pStyle w:val="Compact"/>
+              <w:jc w:val="left"/>
             </w:pPr>
             <w:r>
               <w:t xml:space="preserve">gaussian</w:t>
@@ -2141,6 +2313,7 @@
           <w:p>
             <w:pPr>
               <w:pStyle w:val="Compact"/>
+              <w:jc w:val="left"/>
             </w:pPr>
             <w:r>
               <w:rPr>
@@ -2155,6 +2328,7 @@
           <w:p>
             <w:pPr>
               <w:pStyle w:val="Compact"/>
+              <w:jc w:val="left"/>
             </w:pPr>
             <w:r>
               <w:t xml:space="preserve">whole_season_grazing_productivity</w:t>
@@ -2168,6 +2342,7 @@
           <w:p>
             <w:pPr>
               <w:pStyle w:val="Compact"/>
+              <w:jc w:val="left"/>
             </w:pPr>
             <w:r>
               <w:t xml:space="preserve">29</w:t>
@@ -2179,6 +2354,7 @@
           <w:p>
             <w:pPr>
               <w:pStyle w:val="Compact"/>
+              <w:jc w:val="left"/>
             </w:pPr>
             <w:r>
               <w:t xml:space="preserve">mean_Shrunk_Initial_BW_kg</w:t>
@@ -2190,6 +2366,7 @@
           <w:p>
             <w:pPr>
               <w:pStyle w:val="Compact"/>
+              <w:jc w:val="left"/>
             </w:pPr>
             <w:r>
               <w:t xml:space="preserve">season</w:t>
@@ -2201,6 +2378,7 @@
           <w:p>
             <w:pPr>
               <w:pStyle w:val="Compact"/>
+              <w:jc w:val="left"/>
             </w:pPr>
             <w:r>
               <w:t xml:space="preserve">gaussian</w:t>
@@ -2212,6 +2390,7 @@
           <w:p>
             <w:pPr>
               <w:pStyle w:val="Compact"/>
+              <w:jc w:val="left"/>
             </w:pPr>
             <w:r>
               <w:rPr>
@@ -2226,6 +2405,7 @@
           <w:p>
             <w:pPr>
               <w:pStyle w:val="Compact"/>
+              <w:jc w:val="left"/>
             </w:pPr>
             <w:r>
               <w:t xml:space="preserve">whole_season_grazing_productivity</w:t>
@@ -2239,6 +2419,7 @@
           <w:p>
             <w:pPr>
               <w:pStyle w:val="Compact"/>
+              <w:jc w:val="left"/>
             </w:pPr>
             <w:r>
               <w:t xml:space="preserve">30</w:t>
@@ -2250,6 +2431,7 @@
           <w:p>
             <w:pPr>
               <w:pStyle w:val="Compact"/>
+              <w:jc w:val="left"/>
             </w:pPr>
             <w:r>
               <w:t xml:space="preserve">mean_Shrunk_Final_BW_kg</w:t>
@@ -2261,6 +2443,7 @@
           <w:p>
             <w:pPr>
               <w:pStyle w:val="Compact"/>
+              <w:jc w:val="left"/>
             </w:pPr>
             <w:r>
               <w:t xml:space="preserve">season</w:t>
@@ -2272,6 +2455,7 @@
           <w:p>
             <w:pPr>
               <w:pStyle w:val="Compact"/>
+              <w:jc w:val="left"/>
             </w:pPr>
             <w:r>
               <w:t xml:space="preserve">gaussian</w:t>
@@ -2283,6 +2467,7 @@
           <w:p>
             <w:pPr>
               <w:pStyle w:val="Compact"/>
+              <w:jc w:val="left"/>
             </w:pPr>
             <w:r>
               <w:rPr>
@@ -2297,6 +2482,7 @@
           <w:p>
             <w:pPr>
               <w:pStyle w:val="Compact"/>
+              <w:jc w:val="left"/>
             </w:pPr>
             <w:r>
               <w:t xml:space="preserve">whole_season_grazing_productivity</w:t>
@@ -2310,6 +2496,7 @@
           <w:p>
             <w:pPr>
               <w:pStyle w:val="Compact"/>
+              <w:jc w:val="left"/>
             </w:pPr>
             <w:r>
               <w:t xml:space="preserve">31</w:t>
@@ -2321,6 +2508,7 @@
           <w:p>
             <w:pPr>
               <w:pStyle w:val="Compact"/>
+              <w:jc w:val="left"/>
             </w:pPr>
             <w:r>
               <w:t xml:space="preserve">mean_Whole_Season_Smooth_ADG_kg_day</w:t>
@@ -2332,6 +2520,7 @@
           <w:p>
             <w:pPr>
               <w:pStyle w:val="Compact"/>
+              <w:jc w:val="left"/>
             </w:pPr>
             <w:r>
               <w:t xml:space="preserve">season</w:t>
@@ -2343,6 +2532,7 @@
           <w:p>
             <w:pPr>
               <w:pStyle w:val="Compact"/>
+              <w:jc w:val="left"/>
             </w:pPr>
             <w:r>
               <w:t xml:space="preserve">gaussian</w:t>
@@ -2354,6 +2544,7 @@
           <w:p>
             <w:pPr>
               <w:pStyle w:val="Compact"/>
+              <w:jc w:val="left"/>
             </w:pPr>
             <w:r>
               <w:rPr>
@@ -2368,6 +2559,7 @@
           <w:p>
             <w:pPr>
               <w:pStyle w:val="Compact"/>
+              <w:jc w:val="left"/>
             </w:pPr>
             <w:r>
               <w:t xml:space="preserve">whole_season_grazing_productivity</w:t>
@@ -2381,6 +2573,7 @@
           <w:p>
             <w:pPr>
               <w:pStyle w:val="Compact"/>
+              <w:jc w:val="left"/>
             </w:pPr>
             <w:r>
               <w:t xml:space="preserve">32</w:t>
@@ -2392,6 +2585,7 @@
           <w:p>
             <w:pPr>
               <w:pStyle w:val="Compact"/>
+              <w:jc w:val="left"/>
             </w:pPr>
             <w:r>
               <w:t xml:space="preserve">whole_season_animal_avg_CH4_g_day</w:t>
@@ -2403,6 +2597,7 @@
           <w:p>
             <w:pPr>
               <w:pStyle w:val="Compact"/>
+              <w:jc w:val="left"/>
             </w:pPr>
             <w:r>
               <w:t xml:space="preserve">season</w:t>
@@ -2414,6 +2609,7 @@
           <w:p>
             <w:pPr>
               <w:pStyle w:val="Compact"/>
+              <w:jc w:val="left"/>
             </w:pPr>
             <w:r>
               <w:t xml:space="preserve">gaussian</w:t>
@@ -2425,6 +2621,7 @@
           <w:p>
             <w:pPr>
               <w:pStyle w:val="Compact"/>
+              <w:jc w:val="left"/>
             </w:pPr>
             <w:r>
               <w:rPr>
@@ -2439,6 +2636,7 @@
           <w:p>
             <w:pPr>
               <w:pStyle w:val="Compact"/>
+              <w:jc w:val="left"/>
             </w:pPr>
             <w:r>
               <w:t xml:space="preserve">whole_season_grazing_productivity</w:t>
@@ -2452,6 +2650,7 @@
           <w:p>
             <w:pPr>
               <w:pStyle w:val="Compact"/>
+              <w:jc w:val="left"/>
             </w:pPr>
             <w:r>
               <w:t xml:space="preserve">33</w:t>
@@ -2463,6 +2662,7 @@
           <w:p>
             <w:pPr>
               <w:pStyle w:val="Compact"/>
+              <w:jc w:val="left"/>
             </w:pPr>
             <w:r>
               <w:t xml:space="preserve">whole_season_animal_avg_CO2_g_day</w:t>
@@ -2474,6 +2674,7 @@
           <w:p>
             <w:pPr>
               <w:pStyle w:val="Compact"/>
+              <w:jc w:val="left"/>
             </w:pPr>
             <w:r>
               <w:t xml:space="preserve">season</w:t>
@@ -2485,6 +2686,7 @@
           <w:p>
             <w:pPr>
               <w:pStyle w:val="Compact"/>
+              <w:jc w:val="left"/>
             </w:pPr>
             <w:r>
               <w:t xml:space="preserve">gaussian</w:t>
@@ -2496,6 +2698,7 @@
           <w:p>
             <w:pPr>
               <w:pStyle w:val="Compact"/>
+              <w:jc w:val="left"/>
             </w:pPr>
             <w:r>
               <w:rPr>
@@ -2510,6 +2713,7 @@
           <w:p>
             <w:pPr>
               <w:pStyle w:val="Compact"/>
+              <w:jc w:val="left"/>
             </w:pPr>
             <w:r>
               <w:t xml:space="preserve">whole_season_grazing_productivity</w:t>
@@ -2523,6 +2727,7 @@
           <w:p>
             <w:pPr>
               <w:pStyle w:val="Compact"/>
+              <w:jc w:val="left"/>
             </w:pPr>
             <w:r>
               <w:t xml:space="preserve">34</w:t>
@@ -2534,6 +2739,7 @@
           <w:p>
             <w:pPr>
               <w:pStyle w:val="Compact"/>
+              <w:jc w:val="left"/>
             </w:pPr>
             <w:r>
               <w:t xml:space="preserve">CH4_g_per_active_ha_day_whole_season</w:t>
@@ -2545,6 +2751,7 @@
           <w:p>
             <w:pPr>
               <w:pStyle w:val="Compact"/>
+              <w:jc w:val="left"/>
             </w:pPr>
             <w:r>
               <w:t xml:space="preserve">season</w:t>
@@ -2556,6 +2763,7 @@
           <w:p>
             <w:pPr>
               <w:pStyle w:val="Compact"/>
+              <w:jc w:val="left"/>
             </w:pPr>
             <w:r>
               <w:t xml:space="preserve">auto_positive</w:t>
@@ -2567,6 +2775,7 @@
           <w:p>
             <w:pPr>
               <w:pStyle w:val="Compact"/>
+              <w:jc w:val="left"/>
             </w:pPr>
             <w:r>
               <w:rPr>
@@ -2581,6 +2790,7 @@
           <w:p>
             <w:pPr>
               <w:pStyle w:val="Compact"/>
+              <w:jc w:val="left"/>
             </w:pPr>
             <w:r>
               <w:t xml:space="preserve">whole_season_grazing_productivity</w:t>
@@ -2594,6 +2804,7 @@
           <w:p>
             <w:pPr>
               <w:pStyle w:val="Compact"/>
+              <w:jc w:val="left"/>
             </w:pPr>
             <w:r>
               <w:t xml:space="preserve">35</w:t>
@@ -2605,6 +2816,7 @@
           <w:p>
             <w:pPr>
               <w:pStyle w:val="Compact"/>
+              <w:jc w:val="left"/>
             </w:pPr>
             <w:r>
               <w:t xml:space="preserve">CO2_g_per_active_ha_day_whole_season</w:t>
@@ -2616,6 +2828,7 @@
           <w:p>
             <w:pPr>
               <w:pStyle w:val="Compact"/>
+              <w:jc w:val="left"/>
             </w:pPr>
             <w:r>
               <w:t xml:space="preserve">season</w:t>
@@ -2627,6 +2840,7 @@
           <w:p>
             <w:pPr>
               <w:pStyle w:val="Compact"/>
+              <w:jc w:val="left"/>
             </w:pPr>
             <w:r>
               <w:t xml:space="preserve">auto_positive</w:t>
@@ -2638,6 +2852,7 @@
           <w:p>
             <w:pPr>
               <w:pStyle w:val="Compact"/>
+              <w:jc w:val="left"/>
             </w:pPr>
             <w:r>
               <w:rPr>
@@ -2652,6 +2867,7 @@
           <w:p>
             <w:pPr>
               <w:pStyle w:val="Compact"/>
+              <w:jc w:val="left"/>
             </w:pPr>
             <w:r>
               <w:t xml:space="preserve">whole_season_grazing_productivity</w:t>
@@ -2665,6 +2881,7 @@
           <w:p>
             <w:pPr>
               <w:pStyle w:val="Compact"/>
+              <w:jc w:val="left"/>
             </w:pPr>
             <w:r>
               <w:t xml:space="preserve">36</w:t>
@@ -2676,6 +2893,7 @@
           <w:p>
             <w:pPr>
               <w:pStyle w:val="Compact"/>
+              <w:jc w:val="left"/>
             </w:pPr>
             <w:r>
               <w:t xml:space="preserve">ADG_Land_kg_per_active_ha_day_whole_season</w:t>
@@ -2687,6 +2905,7 @@
           <w:p>
             <w:pPr>
               <w:pStyle w:val="Compact"/>
+              <w:jc w:val="left"/>
             </w:pPr>
             <w:r>
               <w:t xml:space="preserve">season</w:t>
@@ -2698,6 +2917,7 @@
           <w:p>
             <w:pPr>
               <w:pStyle w:val="Compact"/>
+              <w:jc w:val="left"/>
             </w:pPr>
             <w:r>
               <w:t xml:space="preserve">gaussian</w:t>
@@ -2709,6 +2929,7 @@
           <w:p>
             <w:pPr>
               <w:pStyle w:val="Compact"/>
+              <w:jc w:val="left"/>
             </w:pPr>
             <w:r>
               <w:rPr>
@@ -2723,6 +2944,7 @@
           <w:p>
             <w:pPr>
               <w:pStyle w:val="Compact"/>
+              <w:jc w:val="left"/>
             </w:pPr>
             <w:r>
               <w:t xml:space="preserve">whole_season_grazing_productivity</w:t>
@@ -2736,6 +2958,7 @@
           <w:p>
             <w:pPr>
               <w:pStyle w:val="Compact"/>
+              <w:jc w:val="left"/>
             </w:pPr>
             <w:r>
               <w:t xml:space="preserve">37</w:t>
@@ -2747,6 +2970,7 @@
           <w:p>
             <w:pPr>
               <w:pStyle w:val="Compact"/>
+              <w:jc w:val="left"/>
             </w:pPr>
             <w:r>
               <w:t xml:space="preserve">CH4_g_per_kg_LWG_whole_season</w:t>
@@ -2758,6 +2982,7 @@
           <w:p>
             <w:pPr>
               <w:pStyle w:val="Compact"/>
+              <w:jc w:val="left"/>
             </w:pPr>
             <w:r>
               <w:t xml:space="preserve">season</w:t>
@@ -2769,6 +2994,7 @@
           <w:p>
             <w:pPr>
               <w:pStyle w:val="Compact"/>
+              <w:jc w:val="left"/>
             </w:pPr>
             <w:r>
               <w:t xml:space="preserve">gamma_log</w:t>
@@ -2780,6 +3006,7 @@
           <w:p>
             <w:pPr>
               <w:pStyle w:val="Compact"/>
+              <w:jc w:val="left"/>
             </w:pPr>
             <w:r>
               <w:rPr>
@@ -2794,6 +3021,7 @@
           <w:p>
             <w:pPr>
               <w:pStyle w:val="Compact"/>
+              <w:jc w:val="left"/>
             </w:pPr>
             <w:r>
               <w:t xml:space="preserve">whole_season_grazing_productivity</w:t>
@@ -2807,6 +3035,7 @@
           <w:p>
             <w:pPr>
               <w:pStyle w:val="Compact"/>
+              <w:jc w:val="left"/>
             </w:pPr>
             <w:r>
               <w:t xml:space="preserve">38</w:t>
@@ -2818,6 +3047,7 @@
           <w:p>
             <w:pPr>
               <w:pStyle w:val="Compact"/>
+              <w:jc w:val="left"/>
             </w:pPr>
             <w:r>
               <w:t xml:space="preserve">CO2_g_per_kg_LWG_whole_season</w:t>
@@ -2829,6 +3059,7 @@
           <w:p>
             <w:pPr>
               <w:pStyle w:val="Compact"/>
+              <w:jc w:val="left"/>
             </w:pPr>
             <w:r>
               <w:t xml:space="preserve">season</w:t>
@@ -2840,6 +3071,7 @@
           <w:p>
             <w:pPr>
               <w:pStyle w:val="Compact"/>
+              <w:jc w:val="left"/>
             </w:pPr>
             <w:r>
               <w:t xml:space="preserve">gamma_log</w:t>
@@ -2851,6 +3083,7 @@
           <w:p>
             <w:pPr>
               <w:pStyle w:val="Compact"/>
+              <w:jc w:val="left"/>
             </w:pPr>
             <w:r>
               <w:rPr>
@@ -2865,6 +3098,7 @@
           <w:p>
             <w:pPr>
               <w:pStyle w:val="Compact"/>
+              <w:jc w:val="left"/>
             </w:pPr>
             <w:r>
               <w:t xml:space="preserve">whole_season_grazing_productivity</w:t>
@@ -2878,6 +3112,7 @@
           <w:p>
             <w:pPr>
               <w:pStyle w:val="Compact"/>
+              <w:jc w:val="left"/>
             </w:pPr>
             <w:r>
               <w:t xml:space="preserve">39</w:t>
@@ -2889,6 +3124,7 @@
           <w:p>
             <w:pPr>
               <w:pStyle w:val="Compact"/>
+              <w:jc w:val="left"/>
             </w:pPr>
             <w:r>
               <w:t xml:space="preserve">Whole_Season_CH4_g_day</w:t>
@@ -2900,6 +3136,7 @@
           <w:p>
             <w:pPr>
               <w:pStyle w:val="Compact"/>
+              <w:jc w:val="left"/>
             </w:pPr>
             <w:r>
               <w:t xml:space="preserve">season</w:t>
@@ -2911,6 +3148,7 @@
           <w:p>
             <w:pPr>
               <w:pStyle w:val="Compact"/>
+              <w:jc w:val="left"/>
             </w:pPr>
             <w:r>
               <w:t xml:space="preserve">gaussian</w:t>
@@ -2922,6 +3160,7 @@
           <w:p>
             <w:pPr>
               <w:pStyle w:val="Compact"/>
+              <w:jc w:val="left"/>
             </w:pPr>
             <w:r>
               <w:rPr>
@@ -2936,6 +3175,7 @@
           <w:p>
             <w:pPr>
               <w:pStyle w:val="Compact"/>
+              <w:jc w:val="left"/>
             </w:pPr>
             <w:r>
               <w:t xml:space="preserve">shrunk_bw_season_analysis</w:t>
@@ -2949,6 +3189,7 @@
           <w:p>
             <w:pPr>
               <w:pStyle w:val="Compact"/>
+              <w:jc w:val="left"/>
             </w:pPr>
             <w:r>
               <w:t xml:space="preserve">40</w:t>
@@ -2960,6 +3201,7 @@
           <w:p>
             <w:pPr>
               <w:pStyle w:val="Compact"/>
+              <w:jc w:val="left"/>
             </w:pPr>
             <w:r>
               <w:t xml:space="preserve">Whole_Season_CO2_g_day</w:t>
@@ -2971,6 +3213,7 @@
           <w:p>
             <w:pPr>
               <w:pStyle w:val="Compact"/>
+              <w:jc w:val="left"/>
             </w:pPr>
             <w:r>
               <w:t xml:space="preserve">season</w:t>
@@ -2982,6 +3225,7 @@
           <w:p>
             <w:pPr>
               <w:pStyle w:val="Compact"/>
+              <w:jc w:val="left"/>
             </w:pPr>
             <w:r>
               <w:t xml:space="preserve">gaussian</w:t>
@@ -2993,6 +3237,7 @@
           <w:p>
             <w:pPr>
               <w:pStyle w:val="Compact"/>
+              <w:jc w:val="left"/>
             </w:pPr>
             <w:r>
               <w:rPr>
@@ -3007,6 +3252,7 @@
           <w:p>
             <w:pPr>
               <w:pStyle w:val="Compact"/>
+              <w:jc w:val="left"/>
             </w:pPr>
             <w:r>
               <w:t xml:space="preserve">shrunk_bw_season_analysis</w:t>
@@ -3020,6 +3266,7 @@
           <w:p>
             <w:pPr>
               <w:pStyle w:val="Compact"/>
+              <w:jc w:val="left"/>
             </w:pPr>
             <w:r>
               <w:t xml:space="preserve">41</w:t>
@@ -3031,6 +3278,7 @@
           <w:p>
             <w:pPr>
               <w:pStyle w:val="Compact"/>
+              <w:jc w:val="left"/>
             </w:pPr>
             <w:r>
               <w:t xml:space="preserve">Whole_Season_Smooth_ADG_kg_day</w:t>
@@ -3042,6 +3290,7 @@
           <w:p>
             <w:pPr>
               <w:pStyle w:val="Compact"/>
+              <w:jc w:val="left"/>
             </w:pPr>
             <w:r>
               <w:t xml:space="preserve">season</w:t>
@@ -3053,6 +3302,7 @@
           <w:p>
             <w:pPr>
               <w:pStyle w:val="Compact"/>
+              <w:jc w:val="left"/>
             </w:pPr>
             <w:r>
               <w:t xml:space="preserve">gaussian</w:t>
@@ -3064,6 +3314,7 @@
           <w:p>
             <w:pPr>
               <w:pStyle w:val="Compact"/>
+              <w:jc w:val="left"/>
             </w:pPr>
             <w:r>
               <w:rPr>
@@ -3078,6 +3329,7 @@
           <w:p>
             <w:pPr>
               <w:pStyle w:val="Compact"/>
+              <w:jc w:val="left"/>
             </w:pPr>
             <w:r>
               <w:t xml:space="preserve">shrunk_bw_season_analysis</w:t>
@@ -3091,6 +3343,7 @@
           <w:p>
             <w:pPr>
               <w:pStyle w:val="Compact"/>
+              <w:jc w:val="left"/>
             </w:pPr>
             <w:r>
               <w:t xml:space="preserve">42</w:t>
@@ -3102,6 +3355,7 @@
           <w:p>
             <w:pPr>
               <w:pStyle w:val="Compact"/>
+              <w:jc w:val="left"/>
             </w:pPr>
             <w:r>
               <w:t xml:space="preserve">RGP_CH4_g_day</w:t>
@@ -3113,6 +3367,7 @@
           <w:p>
             <w:pPr>
               <w:pStyle w:val="Compact"/>
+              <w:jc w:val="left"/>
             </w:pPr>
             <w:r>
               <w:t xml:space="preserve">period</w:t>
@@ -3124,6 +3379,7 @@
           <w:p>
             <w:pPr>
               <w:pStyle w:val="Compact"/>
+              <w:jc w:val="left"/>
             </w:pPr>
             <w:r>
               <w:t xml:space="preserve">gaussian</w:t>
@@ -3135,6 +3391,7 @@
           <w:p>
             <w:pPr>
               <w:pStyle w:val="Compact"/>
+              <w:jc w:val="left"/>
             </w:pPr>
             <w:r>
               <w:rPr>
@@ -3149,6 +3406,7 @@
           <w:p>
             <w:pPr>
               <w:pStyle w:val="Compact"/>
+              <w:jc w:val="left"/>
             </w:pPr>
             <w:r>
               <w:t xml:space="preserve">shrunk_bw_period_analysis</w:t>
@@ -3162,6 +3420,7 @@
           <w:p>
             <w:pPr>
               <w:pStyle w:val="Compact"/>
+              <w:jc w:val="left"/>
             </w:pPr>
             <w:r>
               <w:t xml:space="preserve">43</w:t>
@@ -3173,6 +3432,7 @@
           <w:p>
             <w:pPr>
               <w:pStyle w:val="Compact"/>
+              <w:jc w:val="left"/>
             </w:pPr>
             <w:r>
               <w:t xml:space="preserve">RGP_CO2_g_day</w:t>
@@ -3184,6 +3444,7 @@
           <w:p>
             <w:pPr>
               <w:pStyle w:val="Compact"/>
+              <w:jc w:val="left"/>
             </w:pPr>
             <w:r>
               <w:t xml:space="preserve">period</w:t>
@@ -3195,6 +3456,7 @@
           <w:p>
             <w:pPr>
               <w:pStyle w:val="Compact"/>
+              <w:jc w:val="left"/>
             </w:pPr>
             <w:r>
               <w:t xml:space="preserve">gaussian</w:t>
@@ -3206,6 +3468,7 @@
           <w:p>
             <w:pPr>
               <w:pStyle w:val="Compact"/>
+              <w:jc w:val="left"/>
             </w:pPr>
             <w:r>
               <w:rPr>
@@ -3220,6 +3483,7 @@
           <w:p>
             <w:pPr>
               <w:pStyle w:val="Compact"/>
+              <w:jc w:val="left"/>
             </w:pPr>
             <w:r>
               <w:t xml:space="preserve">shrunk_bw_period_analysis</w:t>
@@ -3233,6 +3497,7 @@
           <w:p>
             <w:pPr>
               <w:pStyle w:val="Compact"/>
+              <w:jc w:val="left"/>
             </w:pPr>
             <w:r>
               <w:t xml:space="preserve">44</w:t>
@@ -3244,6 +3509,7 @@
           <w:p>
             <w:pPr>
               <w:pStyle w:val="Compact"/>
+              <w:jc w:val="left"/>
             </w:pPr>
             <w:r>
               <w:t xml:space="preserve">RGP_Smooth_ADG_kg_day</w:t>
@@ -3255,6 +3521,7 @@
           <w:p>
             <w:pPr>
               <w:pStyle w:val="Compact"/>
+              <w:jc w:val="left"/>
             </w:pPr>
             <w:r>
               <w:t xml:space="preserve">period</w:t>
@@ -3266,6 +3533,7 @@
           <w:p>
             <w:pPr>
               <w:pStyle w:val="Compact"/>
+              <w:jc w:val="left"/>
             </w:pPr>
             <w:r>
               <w:t xml:space="preserve">gaussian</w:t>
@@ -3277,6 +3545,7 @@
           <w:p>
             <w:pPr>
               <w:pStyle w:val="Compact"/>
+              <w:jc w:val="left"/>
             </w:pPr>
             <w:r>
               <w:rPr>
@@ -3291,6 +3560,7 @@
           <w:p>
             <w:pPr>
               <w:pStyle w:val="Compact"/>
+              <w:jc w:val="left"/>
             </w:pPr>
             <w:r>
               <w:t xml:space="preserve">shrunk_bw_period_analysis</w:t>
@@ -3304,6 +3574,7 @@
           <w:p>
             <w:pPr>
               <w:pStyle w:val="Compact"/>
+              <w:jc w:val="left"/>
             </w:pPr>
             <w:r>
               <w:t xml:space="preserve">45</w:t>
@@ -3315,6 +3586,7 @@
           <w:p>
             <w:pPr>
               <w:pStyle w:val="Compact"/>
+              <w:jc w:val="left"/>
             </w:pPr>
             <w:r>
               <w:t xml:space="preserve">CH4_g_d</w:t>
@@ -3326,6 +3598,7 @@
           <w:p>
             <w:pPr>
               <w:pStyle w:val="Compact"/>
+              <w:jc w:val="left"/>
             </w:pPr>
             <w:r>
               <w:t xml:space="preserve">period</w:t>
@@ -3337,6 +3610,7 @@
           <w:p>
             <w:pPr>
               <w:pStyle w:val="Compact"/>
+              <w:jc w:val="left"/>
             </w:pPr>
             <w:r>
               <w:t xml:space="preserve">Exploratory source; see source chunk</w:t>
@@ -3348,6 +3622,7 @@
           <w:p>
             <w:pPr>
               <w:pStyle w:val="Compact"/>
+              <w:jc w:val="left"/>
             </w:pPr>
             <w:r>
               <w:rPr>
@@ -3362,6 +3637,7 @@
           <w:p>
             <w:pPr>
               <w:pStyle w:val="Compact"/>
+              <w:jc w:val="left"/>
             </w:pPr>
             <w:r>
               <w:t xml:space="preserve">ch4_rotation_model_data</w:t>
@@ -3375,6 +3651,7 @@
           <w:p>
             <w:pPr>
               <w:pStyle w:val="Compact"/>
+              <w:jc w:val="left"/>
             </w:pPr>
             <w:r>
               <w:t xml:space="preserve">46</w:t>
@@ -3386,6 +3663,7 @@
           <w:p>
             <w:pPr>
               <w:pStyle w:val="Compact"/>
+              <w:jc w:val="left"/>
             </w:pPr>
             <w:r>
               <w:t xml:space="preserve">CO2_g_d</w:t>
@@ -3397,6 +3675,7 @@
           <w:p>
             <w:pPr>
               <w:pStyle w:val="Compact"/>
+              <w:jc w:val="left"/>
             </w:pPr>
             <w:r>
               <w:t xml:space="preserve">period</w:t>
@@ -3408,6 +3687,7 @@
           <w:p>
             <w:pPr>
               <w:pStyle w:val="Compact"/>
+              <w:jc w:val="left"/>
             </w:pPr>
             <w:r>
               <w:t xml:space="preserve">Exploratory source; see source chunk</w:t>
@@ -3419,6 +3699,7 @@
           <w:p>
             <w:pPr>
               <w:pStyle w:val="Compact"/>
+              <w:jc w:val="left"/>
             </w:pPr>
             <w:r>
               <w:rPr>
@@ -3433,6 +3714,7 @@
           <w:p>
             <w:pPr>
               <w:pStyle w:val="Compact"/>
+              <w:jc w:val="left"/>
             </w:pPr>
             <w:r>
               <w:t xml:space="preserve">co2_rotation_model_data</w:t>
@@ -3446,6 +3728,7 @@
           <w:p>
             <w:pPr>
               <w:pStyle w:val="Compact"/>
+              <w:jc w:val="left"/>
             </w:pPr>
             <w:r>
               <w:t xml:space="preserve">47</w:t>
@@ -3457,6 +3740,7 @@
           <w:p>
             <w:pPr>
               <w:pStyle w:val="Compact"/>
+              <w:jc w:val="left"/>
             </w:pPr>
             <w:r>
               <w:t xml:space="preserve">Seasonal_ADG</w:t>
@@ -3468,6 +3752,7 @@
           <w:p>
             <w:pPr>
               <w:pStyle w:val="Compact"/>
+              <w:jc w:val="left"/>
             </w:pPr>
             <w:r>
               <w:t xml:space="preserve">season</w:t>
@@ -3479,6 +3764,7 @@
           <w:p>
             <w:pPr>
               <w:pStyle w:val="Compact"/>
+              <w:jc w:val="left"/>
             </w:pPr>
             <w:r>
               <w:t xml:space="preserve">Exploratory source; see source chunk</w:t>
@@ -3490,6 +3776,7 @@
           <w:p>
             <w:pPr>
               <w:pStyle w:val="Compact"/>
+              <w:jc w:val="left"/>
             </w:pPr>
             <w:r>
               <w:rPr>
@@ -3504,6 +3791,7 @@
           <w:p>
             <w:pPr>
               <w:pStyle w:val="Compact"/>
+              <w:jc w:val="left"/>
             </w:pPr>
             <w:r>
               <w:t xml:space="preserve">bw_season_model_data</w:t>
@@ -3517,6 +3805,7 @@
           <w:p>
             <w:pPr>
               <w:pStyle w:val="Compact"/>
+              <w:jc w:val="left"/>
             </w:pPr>
             <w:r>
               <w:t xml:space="preserve">48</w:t>
@@ -3528,6 +3817,7 @@
           <w:p>
             <w:pPr>
               <w:pStyle w:val="Compact"/>
+              <w:jc w:val="left"/>
             </w:pPr>
             <w:r>
               <w:t xml:space="preserve">FBW</w:t>
@@ -3539,6 +3829,7 @@
           <w:p>
             <w:pPr>
               <w:pStyle w:val="Compact"/>
+              <w:jc w:val="left"/>
             </w:pPr>
             <w:r>
               <w:t xml:space="preserve">season</w:t>
@@ -3550,6 +3841,7 @@
           <w:p>
             <w:pPr>
               <w:pStyle w:val="Compact"/>
+              <w:jc w:val="left"/>
             </w:pPr>
             <w:r>
               <w:t xml:space="preserve">Exploratory source; see source chunk</w:t>
@@ -3561,6 +3853,7 @@
           <w:p>
             <w:pPr>
               <w:pStyle w:val="Compact"/>
+              <w:jc w:val="left"/>
             </w:pPr>
             <w:r>
               <w:rPr>
@@ -3575,6 +3868,7 @@
           <w:p>
             <w:pPr>
               <w:pStyle w:val="Compact"/>
+              <w:jc w:val="left"/>
             </w:pPr>
             <w:r>
               <w:t xml:space="preserve">bw_season_model_data</w:t>
@@ -3588,6 +3882,7 @@
           <w:p>
             <w:pPr>
               <w:pStyle w:val="Compact"/>
+              <w:jc w:val="left"/>
             </w:pPr>
             <w:r>
               <w:t xml:space="preserve">49</w:t>
@@ -3599,6 +3894,7 @@
           <w:p>
             <w:pPr>
               <w:pStyle w:val="Compact"/>
+              <w:jc w:val="left"/>
             </w:pPr>
             <w:r>
               <w:t xml:space="preserve">CH4_g_d</w:t>
@@ -3610,6 +3906,7 @@
           <w:p>
             <w:pPr>
               <w:pStyle w:val="Compact"/>
+              <w:jc w:val="left"/>
             </w:pPr>
             <w:r>
               <w:t xml:space="preserve">period</w:t>
@@ -3621,6 +3918,7 @@
           <w:p>
             <w:pPr>
               <w:pStyle w:val="Compact"/>
+              <w:jc w:val="left"/>
             </w:pPr>
             <w:r>
               <w:t xml:space="preserve">Exploratory source; see source chunk</w:t>
@@ -3632,6 +3930,7 @@
           <w:p>
             <w:pPr>
               <w:pStyle w:val="Compact"/>
+              <w:jc w:val="left"/>
             </w:pPr>
             <w:r>
               <w:rPr>
@@ -3646,6 +3945,7 @@
           <w:p>
             <w:pPr>
               <w:pStyle w:val="Compact"/>
+              <w:jc w:val="left"/>
             </w:pPr>
             <w:r>
               <w:t xml:space="preserve">gf_model_data (from gf_period_qualified)</w:t>
@@ -3659,6 +3959,7 @@
           <w:p>
             <w:pPr>
               <w:pStyle w:val="Compact"/>
+              <w:jc w:val="left"/>
             </w:pPr>
             <w:r>
               <w:t xml:space="preserve">50</w:t>
@@ -3670,6 +3971,7 @@
           <w:p>
             <w:pPr>
               <w:pStyle w:val="Compact"/>
+              <w:jc w:val="left"/>
             </w:pPr>
             <w:r>
               <w:t xml:space="preserve">CO2_g_d</w:t>
@@ -3681,6 +3983,7 @@
           <w:p>
             <w:pPr>
               <w:pStyle w:val="Compact"/>
+              <w:jc w:val="left"/>
             </w:pPr>
             <w:r>
               <w:t xml:space="preserve">period</w:t>
@@ -3692,6 +3995,7 @@
           <w:p>
             <w:pPr>
               <w:pStyle w:val="Compact"/>
+              <w:jc w:val="left"/>
             </w:pPr>
             <w:r>
               <w:t xml:space="preserve">Exploratory source; see source chunk</w:t>
@@ -3703,6 +4007,7 @@
           <w:p>
             <w:pPr>
               <w:pStyle w:val="Compact"/>
+              <w:jc w:val="left"/>
             </w:pPr>
             <w:r>
               <w:rPr>
@@ -3717,6 +4022,7 @@
           <w:p>
             <w:pPr>
               <w:pStyle w:val="Compact"/>
+              <w:jc w:val="left"/>
             </w:pPr>
             <w:r>
               <w:t xml:space="preserve">gf_model_data (from gf_period_qualified)</w:t>
@@ -3730,6 +4036,7 @@
           <w:p>
             <w:pPr>
               <w:pStyle w:val="Compact"/>
+              <w:jc w:val="left"/>
             </w:pPr>
             <w:r>
               <w:t xml:space="preserve">51</w:t>
@@ -3741,6 +4048,7 @@
           <w:p>
             <w:pPr>
               <w:pStyle w:val="Compact"/>
+              <w:jc w:val="left"/>
             </w:pPr>
             <w:r>
               <w:t xml:space="preserve">Percent_pasture_active</w:t>
@@ -3752,6 +4060,7 @@
           <w:p>
             <w:pPr>
               <w:pStyle w:val="Compact"/>
+              <w:jc w:val="left"/>
             </w:pPr>
             <w:r>
               <w:t xml:space="preserve">period</w:t>
@@ -3763,6 +4072,7 @@
           <w:p>
             <w:pPr>
               <w:pStyle w:val="Compact"/>
+              <w:jc w:val="left"/>
             </w:pPr>
             <w:r>
               <w:t xml:space="preserve">Exploratory source; see source chunk</w:t>
@@ -3774,6 +4084,7 @@
           <w:p>
             <w:pPr>
               <w:pStyle w:val="Compact"/>
+              <w:jc w:val="left"/>
             </w:pPr>
             <w:r>
               <w:rPr>
@@ -3788,6 +4099,7 @@
           <w:p>
             <w:pPr>
               <w:pStyle w:val="Compact"/>
+              <w:jc w:val="left"/>
             </w:pPr>
             <w:r>
               <w:t xml:space="preserve">rgp_map_scopes [Grid_Map = ALL_PASTURE_GRAZING]</w:t>
@@ -3801,6 +4113,7 @@
           <w:p>
             <w:pPr>
               <w:pStyle w:val="Compact"/>
+              <w:jc w:val="left"/>
             </w:pPr>
             <w:r>
               <w:t xml:space="preserve">52</w:t>
@@ -3812,6 +4125,7 @@
           <w:p>
             <w:pPr>
               <w:pStyle w:val="Compact"/>
+              <w:jc w:val="left"/>
             </w:pPr>
             <w:r>
               <w:t xml:space="preserve">Gain_kg_per_active_ha</w:t>
@@ -3823,6 +4137,7 @@
           <w:p>
             <w:pPr>
               <w:pStyle w:val="Compact"/>
+              <w:jc w:val="left"/>
             </w:pPr>
             <w:r>
               <w:t xml:space="preserve">period</w:t>
@@ -3834,6 +4149,7 @@
           <w:p>
             <w:pPr>
               <w:pStyle w:val="Compact"/>
+              <w:jc w:val="left"/>
             </w:pPr>
             <w:r>
               <w:t xml:space="preserve">Exploratory source; see source chunk</w:t>
@@ -3845,6 +4161,7 @@
           <w:p>
             <w:pPr>
               <w:pStyle w:val="Compact"/>
+              <w:jc w:val="left"/>
             </w:pPr>
             <w:r>
               <w:rPr>
@@ -3859,6 +4176,7 @@
           <w:p>
             <w:pPr>
               <w:pStyle w:val="Compact"/>
+              <w:jc w:val="left"/>
             </w:pPr>
             <w:r>
               <w:t xml:space="preserve">rgp_map_scopes [Grid_Map = ALL_PASTURE_GRAZING]</w:t>
@@ -3872,6 +4190,7 @@
           <w:p>
             <w:pPr>
               <w:pStyle w:val="Compact"/>
+              <w:jc w:val="left"/>
             </w:pPr>
             <w:r>
               <w:t xml:space="preserve">53</w:t>
@@ -3883,6 +4202,7 @@
           <w:p>
             <w:pPr>
               <w:pStyle w:val="Compact"/>
+              <w:jc w:val="left"/>
             </w:pPr>
             <w:r>
               <w:t xml:space="preserve">Percent_pasture_active</w:t>
@@ -3894,6 +4214,7 @@
           <w:p>
             <w:pPr>
               <w:pStyle w:val="Compact"/>
+              <w:jc w:val="left"/>
             </w:pPr>
             <w:r>
               <w:t xml:space="preserve">period</w:t>
@@ -3905,6 +4226,7 @@
           <w:p>
             <w:pPr>
               <w:pStyle w:val="Compact"/>
+              <w:jc w:val="left"/>
             </w:pPr>
             <w:r>
               <w:t xml:space="preserve">Exploratory source; see source chunk</w:t>
@@ -3916,6 +4238,7 @@
           <w:p>
             <w:pPr>
               <w:pStyle w:val="Compact"/>
+              <w:jc w:val="left"/>
             </w:pPr>
             <w:r>
               <w:rPr>
@@ -3930,6 +4253,7 @@
           <w:p>
             <w:pPr>
               <w:pStyle w:val="Compact"/>
+              <w:jc w:val="left"/>
             </w:pPr>
             <w:r>
               <w:t xml:space="preserve">rgp_map_scopes [Grid_Map = INSIDE_RGP_GRAZING]</w:t>
@@ -3943,6 +4267,7 @@
           <w:p>
             <w:pPr>
               <w:pStyle w:val="Compact"/>
+              <w:jc w:val="left"/>
             </w:pPr>
             <w:r>
               <w:t xml:space="preserve">54</w:t>
@@ -3954,6 +4279,7 @@
           <w:p>
             <w:pPr>
               <w:pStyle w:val="Compact"/>
+              <w:jc w:val="left"/>
             </w:pPr>
             <w:r>
               <w:t xml:space="preserve">Gain_kg_per_active_ha</w:t>
@@ -3965,6 +4291,7 @@
           <w:p>
             <w:pPr>
               <w:pStyle w:val="Compact"/>
+              <w:jc w:val="left"/>
             </w:pPr>
             <w:r>
               <w:t xml:space="preserve">period</w:t>
@@ -3976,6 +4303,7 @@
           <w:p>
             <w:pPr>
               <w:pStyle w:val="Compact"/>
+              <w:jc w:val="left"/>
             </w:pPr>
             <w:r>
               <w:t xml:space="preserve">Exploratory source; see source chunk</w:t>
@@ -3987,6 +4315,7 @@
           <w:p>
             <w:pPr>
               <w:pStyle w:val="Compact"/>
+              <w:jc w:val="left"/>
             </w:pPr>
             <w:r>
               <w:rPr>
@@ -4001,6 +4330,7 @@
           <w:p>
             <w:pPr>
               <w:pStyle w:val="Compact"/>
+              <w:jc w:val="left"/>
             </w:pPr>
             <w:r>
               <w:t xml:space="preserve">rgp_map_scopes [Grid_Map = INSIDE_RGP_GRAZING]</w:t>
@@ -4014,6 +4344,7 @@
           <w:p>
             <w:pPr>
               <w:pStyle w:val="Compact"/>
+              <w:jc w:val="left"/>
             </w:pPr>
             <w:r>
               <w:t xml:space="preserve">55</w:t>
@@ -4025,6 +4356,7 @@
           <w:p>
             <w:pPr>
               <w:pStyle w:val="Compact"/>
+              <w:jc w:val="left"/>
             </w:pPr>
             <w:r>
               <w:t xml:space="preserve">Percent_pasture_active</w:t>
@@ -4036,6 +4368,7 @@
           <w:p>
             <w:pPr>
               <w:pStyle w:val="Compact"/>
+              <w:jc w:val="left"/>
             </w:pPr>
             <w:r>
               <w:t xml:space="preserve">season</w:t>
@@ -4047,6 +4380,7 @@
           <w:p>
             <w:pPr>
               <w:pStyle w:val="Compact"/>
+              <w:jc w:val="left"/>
             </w:pPr>
             <w:r>
               <w:t xml:space="preserve">Exploratory source; see source chunk</w:t>
@@ -4058,6 +4392,7 @@
           <w:p>
             <w:pPr>
               <w:pStyle w:val="Compact"/>
+              <w:jc w:val="left"/>
             </w:pPr>
             <w:r>
               <w:rPr>
@@ -4072,6 +4407,7 @@
           <w:p>
             <w:pPr>
               <w:pStyle w:val="Compact"/>
+              <w:jc w:val="left"/>
             </w:pPr>
             <w:r>
               <w:t xml:space="preserve">season_two_grid_outcomes [Grid_Map = WHOLE_SEASON_GRAZING]</w:t>
@@ -4085,6 +4421,7 @@
           <w:p>
             <w:pPr>
               <w:pStyle w:val="Compact"/>
+              <w:jc w:val="left"/>
             </w:pPr>
             <w:r>
               <w:t xml:space="preserve">56</w:t>
@@ -4096,6 +4433,7 @@
           <w:p>
             <w:pPr>
               <w:pStyle w:val="Compact"/>
+              <w:jc w:val="left"/>
             </w:pPr>
             <w:r>
               <w:t xml:space="preserve">Gain_kg_per_active_ha</w:t>
@@ -4107,6 +4445,7 @@
           <w:p>
             <w:pPr>
               <w:pStyle w:val="Compact"/>
+              <w:jc w:val="left"/>
             </w:pPr>
             <w:r>
               <w:t xml:space="preserve">season</w:t>
@@ -4118,6 +4457,7 @@
           <w:p>
             <w:pPr>
               <w:pStyle w:val="Compact"/>
+              <w:jc w:val="left"/>
             </w:pPr>
             <w:r>
               <w:t xml:space="preserve">Exploratory source; see source chunk</w:t>
@@ -4129,6 +4469,7 @@
           <w:p>
             <w:pPr>
               <w:pStyle w:val="Compact"/>
+              <w:jc w:val="left"/>
             </w:pPr>
             <w:r>
               <w:rPr>
@@ -4143,6 +4484,7 @@
           <w:p>
             <w:pPr>
               <w:pStyle w:val="Compact"/>
+              <w:jc w:val="left"/>
             </w:pPr>
             <w:r>
               <w:t xml:space="preserve">season_two_grid_outcomes [Grid_Map = WHOLE_SEASON_GRAZING]</w:t>
@@ -4151,6 +4493,7 @@
         </w:tc>
       </w:tr>
     </w:tbl>
+    <w:bookmarkEnd w:id="20"/>
     <w:sectPr>
       <w:footerReference r:id="rId9" w:type="default"/>
       <w:pgSz w:h="12240" w:orient="landscape" w:w="15840"/>
@@ -4384,7 +4727,7 @@
       <w:lvlText w:val=" "/>
       <w:lvlJc w:val="left"/>
       <w:pPr>
-        <w:ind w:left="720" w:hanging="360"/>
+        <w:ind w:left="720" w:hanging="480"/>
       </w:pPr>
     </w:lvl>
     <w:lvl w:ilvl="1">
@@ -4392,7 +4735,7 @@
       <w:lvlText w:val=" "/>
       <w:lvlJc w:val="left"/>
       <w:pPr>
-        <w:ind w:left="1440" w:hanging="360"/>
+        <w:ind w:left="1440" w:hanging="480"/>
       </w:pPr>
     </w:lvl>
     <w:lvl w:ilvl="2">
@@ -4400,7 +4743,7 @@
       <w:lvlText w:val=" "/>
       <w:lvlJc w:val="left"/>
       <w:pPr>
-        <w:ind w:left="2160" w:hanging="360"/>
+        <w:ind w:left="2160" w:hanging="480"/>
       </w:pPr>
     </w:lvl>
     <w:lvl w:ilvl="3">
@@ -4408,7 +4751,7 @@
       <w:lvlText w:val=" "/>
       <w:lvlJc w:val="left"/>
       <w:pPr>
-        <w:ind w:left="2880" w:hanging="360"/>
+        <w:ind w:left="2880" w:hanging="480"/>
       </w:pPr>
     </w:lvl>
     <w:lvl w:ilvl="4">
@@ -4416,7 +4759,7 @@
       <w:lvlText w:val=" "/>
       <w:lvlJc w:val="left"/>
       <w:pPr>
-        <w:ind w:left="3600" w:hanging="360"/>
+        <w:ind w:left="3600" w:hanging="480"/>
       </w:pPr>
     </w:lvl>
     <w:lvl w:ilvl="5">
@@ -4424,7 +4767,7 @@
       <w:lvlText w:val=" "/>
       <w:lvlJc w:val="left"/>
       <w:pPr>
-        <w:ind w:left="4320" w:hanging="360"/>
+        <w:ind w:left="4320" w:hanging="480"/>
       </w:pPr>
     </w:lvl>
     <w:lvl w:ilvl="6">
@@ -4432,7 +4775,7 @@
       <w:lvlText w:val=" "/>
       <w:lvlJc w:val="left"/>
       <w:pPr>
-        <w:ind w:left="5040" w:hanging="360"/>
+        <w:ind w:left="5040" w:hanging="480"/>
       </w:pPr>
     </w:lvl>
     <w:lvl w:ilvl="7">
@@ -4440,7 +4783,7 @@
       <w:lvlText w:val=" "/>
       <w:lvlJc w:val="left"/>
       <w:pPr>
-        <w:ind w:left="5760" w:hanging="360"/>
+        <w:ind w:left="5760" w:hanging="480"/>
       </w:pPr>
     </w:lvl>
     <w:lvl w:ilvl="8">
@@ -4448,7 +4791,7 @@
       <w:lvlText w:val=" "/>
       <w:lvlJc w:val="left"/>
       <w:pPr>
-        <w:ind w:left="6480" w:hanging="360"/>
+        <w:ind w:left="6480" w:hanging="480"/>
       </w:pPr>
     </w:lvl>
   </w:abstractNum>
@@ -17473,7 +17816,7 @@
     <w:basedOn w:val="VerbatimChar"/>
     <w:rPr/>
   </w:style>
-  <w:style w:type="character" w:customStyle="1" w:styleId="KeywordTok">
+  <w:style w:customStyle="1" w:styleId="KeywordTok" w:type="character">
     <w:name w:val="KeywordTok"/>
     <w:basedOn w:val="VerbatimChar"/>
     <w:rPr>
@@ -17481,77 +17824,77 @@
       <w:color w:val="007020"/>
     </w:rPr>
   </w:style>
-  <w:style w:type="character" w:customStyle="1" w:styleId="DataTypeTok">
+  <w:style w:customStyle="1" w:styleId="DataTypeTok" w:type="character">
     <w:name w:val="DataTypeTok"/>
     <w:basedOn w:val="VerbatimChar"/>
     <w:rPr>
       <w:color w:val="902000"/>
     </w:rPr>
   </w:style>
-  <w:style w:type="character" w:customStyle="1" w:styleId="DecValTok">
+  <w:style w:customStyle="1" w:styleId="DecValTok" w:type="character">
     <w:name w:val="DecValTok"/>
     <w:basedOn w:val="VerbatimChar"/>
     <w:rPr>
       <w:color w:val="40a070"/>
     </w:rPr>
   </w:style>
-  <w:style w:type="character" w:customStyle="1" w:styleId="BaseNTok">
+  <w:style w:customStyle="1" w:styleId="BaseNTok" w:type="character">
     <w:name w:val="BaseNTok"/>
     <w:basedOn w:val="VerbatimChar"/>
     <w:rPr>
       <w:color w:val="40a070"/>
     </w:rPr>
   </w:style>
-  <w:style w:type="character" w:customStyle="1" w:styleId="FloatTok">
+  <w:style w:customStyle="1" w:styleId="FloatTok" w:type="character">
     <w:name w:val="FloatTok"/>
     <w:basedOn w:val="VerbatimChar"/>
     <w:rPr>
       <w:color w:val="40a070"/>
     </w:rPr>
   </w:style>
-  <w:style w:type="character" w:customStyle="1" w:styleId="ConstantTok">
+  <w:style w:customStyle="1" w:styleId="ConstantTok" w:type="character">
     <w:name w:val="ConstantTok"/>
     <w:basedOn w:val="VerbatimChar"/>
     <w:rPr>
       <w:color w:val="880000"/>
     </w:rPr>
   </w:style>
-  <w:style w:type="character" w:customStyle="1" w:styleId="CharTok">
+  <w:style w:customStyle="1" w:styleId="CharTok" w:type="character">
     <w:name w:val="CharTok"/>
     <w:basedOn w:val="VerbatimChar"/>
     <w:rPr>
       <w:color w:val="4070a0"/>
     </w:rPr>
   </w:style>
-  <w:style w:type="character" w:customStyle="1" w:styleId="SpecialCharTok">
+  <w:style w:customStyle="1" w:styleId="SpecialCharTok" w:type="character">
     <w:name w:val="SpecialCharTok"/>
     <w:basedOn w:val="VerbatimChar"/>
     <w:rPr>
       <w:color w:val="4070a0"/>
     </w:rPr>
   </w:style>
-  <w:style w:type="character" w:customStyle="1" w:styleId="StringTok">
+  <w:style w:customStyle="1" w:styleId="StringTok" w:type="character">
     <w:name w:val="StringTok"/>
     <w:basedOn w:val="VerbatimChar"/>
     <w:rPr>
       <w:color w:val="4070a0"/>
     </w:rPr>
   </w:style>
-  <w:style w:type="character" w:customStyle="1" w:styleId="VerbatimStringTok">
+  <w:style w:customStyle="1" w:styleId="VerbatimStringTok" w:type="character">
     <w:name w:val="VerbatimStringTok"/>
     <w:basedOn w:val="VerbatimChar"/>
     <w:rPr>
       <w:color w:val="4070a0"/>
     </w:rPr>
   </w:style>
-  <w:style w:type="character" w:customStyle="1" w:styleId="SpecialStringTok">
+  <w:style w:customStyle="1" w:styleId="SpecialStringTok" w:type="character">
     <w:name w:val="SpecialStringTok"/>
     <w:basedOn w:val="VerbatimChar"/>
     <w:rPr>
       <w:color w:val="bb6688"/>
     </w:rPr>
   </w:style>
-  <w:style w:type="character" w:customStyle="1" w:styleId="ImportTok">
+  <w:style w:customStyle="1" w:styleId="ImportTok" w:type="character">
     <w:name w:val="ImportTok"/>
     <w:basedOn w:val="VerbatimChar"/>
     <w:rPr>
@@ -17559,7 +17902,7 @@
       <w:color w:val="008000"/>
     </w:rPr>
   </w:style>
-  <w:style w:type="character" w:customStyle="1" w:styleId="CommentTok">
+  <w:style w:customStyle="1" w:styleId="CommentTok" w:type="character">
     <w:name w:val="CommentTok"/>
     <w:basedOn w:val="VerbatimChar"/>
     <w:rPr>
@@ -17567,7 +17910,7 @@
       <w:color w:val="60a0b0"/>
     </w:rPr>
   </w:style>
-  <w:style w:type="character" w:customStyle="1" w:styleId="DocumentationTok">
+  <w:style w:customStyle="1" w:styleId="DocumentationTok" w:type="character">
     <w:name w:val="DocumentationTok"/>
     <w:basedOn w:val="VerbatimChar"/>
     <w:rPr>
@@ -17575,7 +17918,7 @@
       <w:color w:val="ba2121"/>
     </w:rPr>
   </w:style>
-  <w:style w:type="character" w:customStyle="1" w:styleId="AnnotationTok">
+  <w:style w:customStyle="1" w:styleId="AnnotationTok" w:type="character">
     <w:name w:val="AnnotationTok"/>
     <w:basedOn w:val="VerbatimChar"/>
     <w:rPr>
@@ -17584,7 +17927,7 @@
       <w:color w:val="60a0b0"/>
     </w:rPr>
   </w:style>
-  <w:style w:type="character" w:customStyle="1" w:styleId="CommentVarTok">
+  <w:style w:customStyle="1" w:styleId="CommentVarTok" w:type="character">
     <w:name w:val="CommentVarTok"/>
     <w:basedOn w:val="VerbatimChar"/>
     <w:rPr>
@@ -17593,28 +17936,28 @@
       <w:color w:val="60a0b0"/>
     </w:rPr>
   </w:style>
-  <w:style w:type="character" w:customStyle="1" w:styleId="OtherTok">
+  <w:style w:customStyle="1" w:styleId="OtherTok" w:type="character">
     <w:name w:val="OtherTok"/>
     <w:basedOn w:val="VerbatimChar"/>
     <w:rPr>
       <w:color w:val="007020"/>
     </w:rPr>
   </w:style>
-  <w:style w:type="character" w:customStyle="1" w:styleId="FunctionTok">
+  <w:style w:customStyle="1" w:styleId="FunctionTok" w:type="character">
     <w:name w:val="FunctionTok"/>
     <w:basedOn w:val="VerbatimChar"/>
     <w:rPr>
       <w:color w:val="06287e"/>
     </w:rPr>
   </w:style>
-  <w:style w:type="character" w:customStyle="1" w:styleId="VariableTok">
+  <w:style w:customStyle="1" w:styleId="VariableTok" w:type="character">
     <w:name w:val="VariableTok"/>
     <w:basedOn w:val="VerbatimChar"/>
     <w:rPr>
       <w:color w:val="19177c"/>
     </w:rPr>
   </w:style>
-  <w:style w:type="character" w:customStyle="1" w:styleId="ControlFlowTok">
+  <w:style w:customStyle="1" w:styleId="ControlFlowTok" w:type="character">
     <w:name w:val="ControlFlowTok"/>
     <w:basedOn w:val="VerbatimChar"/>
     <w:rPr>
@@ -17622,45 +17965,45 @@
       <w:color w:val="007020"/>
     </w:rPr>
   </w:style>
-  <w:style w:type="character" w:customStyle="1" w:styleId="OperatorTok">
+  <w:style w:customStyle="1" w:styleId="OperatorTok" w:type="character">
     <w:name w:val="OperatorTok"/>
     <w:basedOn w:val="VerbatimChar"/>
     <w:rPr>
       <w:color w:val="666666"/>
     </w:rPr>
   </w:style>
-  <w:style w:type="character" w:customStyle="1" w:styleId="BuiltInTok">
+  <w:style w:customStyle="1" w:styleId="BuiltInTok" w:type="character">
     <w:name w:val="BuiltInTok"/>
     <w:basedOn w:val="VerbatimChar"/>
     <w:rPr>
       <w:color w:val="008000"/>
     </w:rPr>
   </w:style>
-  <w:style w:type="character" w:customStyle="1" w:styleId="ExtensionTok">
+  <w:style w:customStyle="1" w:styleId="ExtensionTok" w:type="character">
     <w:name w:val="ExtensionTok"/>
     <w:basedOn w:val="VerbatimChar"/>
     <w:rPr/>
   </w:style>
-  <w:style w:type="character" w:customStyle="1" w:styleId="PreprocessorTok">
+  <w:style w:customStyle="1" w:styleId="PreprocessorTok" w:type="character">
     <w:name w:val="PreprocessorTok"/>
     <w:basedOn w:val="VerbatimChar"/>
     <w:rPr>
       <w:color w:val="bc7a00"/>
     </w:rPr>
   </w:style>
-  <w:style w:type="character" w:customStyle="1" w:styleId="AttributeTok">
+  <w:style w:customStyle="1" w:styleId="AttributeTok" w:type="character">
     <w:name w:val="AttributeTok"/>
     <w:basedOn w:val="VerbatimChar"/>
     <w:rPr>
       <w:color w:val="7d9029"/>
     </w:rPr>
   </w:style>
-  <w:style w:type="character" w:customStyle="1" w:styleId="RegionMarkerTok">
+  <w:style w:customStyle="1" w:styleId="RegionMarkerTok" w:type="character">
     <w:name w:val="RegionMarkerTok"/>
     <w:basedOn w:val="VerbatimChar"/>
     <w:rPr/>
   </w:style>
-  <w:style w:type="character" w:customStyle="1" w:styleId="InformationTok">
+  <w:style w:customStyle="1" w:styleId="InformationTok" w:type="character">
     <w:name w:val="InformationTok"/>
     <w:basedOn w:val="VerbatimChar"/>
     <w:rPr>
@@ -17669,7 +18012,7 @@
       <w:color w:val="60a0b0"/>
     </w:rPr>
   </w:style>
-  <w:style w:type="character" w:customStyle="1" w:styleId="WarningTok">
+  <w:style w:customStyle="1" w:styleId="WarningTok" w:type="character">
     <w:name w:val="WarningTok"/>
     <w:basedOn w:val="VerbatimChar"/>
     <w:rPr>
@@ -17678,7 +18021,7 @@
       <w:color w:val="60a0b0"/>
     </w:rPr>
   </w:style>
-  <w:style w:type="character" w:customStyle="1" w:styleId="AlertTok">
+  <w:style w:customStyle="1" w:styleId="AlertTok" w:type="character">
     <w:name w:val="AlertTok"/>
     <w:basedOn w:val="VerbatimChar"/>
     <w:rPr>
@@ -17686,7 +18029,7 @@
       <w:color w:val="ff0000"/>
     </w:rPr>
   </w:style>
-  <w:style w:type="character" w:customStyle="1" w:styleId="ErrorTok">
+  <w:style w:customStyle="1" w:styleId="ErrorTok" w:type="character">
     <w:name w:val="ErrorTok"/>
     <w:basedOn w:val="VerbatimChar"/>
     <w:rPr>
@@ -17694,7 +18037,233 @@
       <w:color w:val="ff0000"/>
     </w:rPr>
   </w:style>
-  <w:style w:type="character" w:customStyle="1" w:styleId="NormalTok">
+  <w:style w:customStyle="1" w:styleId="NormalTok" w:type="character">
+    <w:name w:val="NormalTok"/>
+    <w:basedOn w:val="VerbatimChar"/>
+    <w:rPr/>
+  </w:style>
+  <w:style w:customStyle="1" w:styleId="KeywordTok" w:type="character">
+    <w:name w:val="KeywordTok"/>
+    <w:basedOn w:val="VerbatimChar"/>
+    <w:rPr>
+      <w:b/>
+      <w:color w:val="007020"/>
+    </w:rPr>
+  </w:style>
+  <w:style w:customStyle="1" w:styleId="DataTypeTok" w:type="character">
+    <w:name w:val="DataTypeTok"/>
+    <w:basedOn w:val="VerbatimChar"/>
+    <w:rPr>
+      <w:color w:val="902000"/>
+    </w:rPr>
+  </w:style>
+  <w:style w:customStyle="1" w:styleId="DecValTok" w:type="character">
+    <w:name w:val="DecValTok"/>
+    <w:basedOn w:val="VerbatimChar"/>
+    <w:rPr>
+      <w:color w:val="40a070"/>
+    </w:rPr>
+  </w:style>
+  <w:style w:customStyle="1" w:styleId="BaseNTok" w:type="character">
+    <w:name w:val="BaseNTok"/>
+    <w:basedOn w:val="VerbatimChar"/>
+    <w:rPr>
+      <w:color w:val="40a070"/>
+    </w:rPr>
+  </w:style>
+  <w:style w:customStyle="1" w:styleId="FloatTok" w:type="character">
+    <w:name w:val="FloatTok"/>
+    <w:basedOn w:val="VerbatimChar"/>
+    <w:rPr>
+      <w:color w:val="40a070"/>
+    </w:rPr>
+  </w:style>
+  <w:style w:customStyle="1" w:styleId="ConstantTok" w:type="character">
+    <w:name w:val="ConstantTok"/>
+    <w:basedOn w:val="VerbatimChar"/>
+    <w:rPr>
+      <w:color w:val="880000"/>
+    </w:rPr>
+  </w:style>
+  <w:style w:customStyle="1" w:styleId="CharTok" w:type="character">
+    <w:name w:val="CharTok"/>
+    <w:basedOn w:val="VerbatimChar"/>
+    <w:rPr>
+      <w:color w:val="4070a0"/>
+    </w:rPr>
+  </w:style>
+  <w:style w:customStyle="1" w:styleId="SpecialCharTok" w:type="character">
+    <w:name w:val="SpecialCharTok"/>
+    <w:basedOn w:val="VerbatimChar"/>
+    <w:rPr>
+      <w:color w:val="4070a0"/>
+    </w:rPr>
+  </w:style>
+  <w:style w:customStyle="1" w:styleId="StringTok" w:type="character">
+    <w:name w:val="StringTok"/>
+    <w:basedOn w:val="VerbatimChar"/>
+    <w:rPr>
+      <w:color w:val="4070a0"/>
+    </w:rPr>
+  </w:style>
+  <w:style w:customStyle="1" w:styleId="VerbatimStringTok" w:type="character">
+    <w:name w:val="VerbatimStringTok"/>
+    <w:basedOn w:val="VerbatimChar"/>
+    <w:rPr>
+      <w:color w:val="4070a0"/>
+    </w:rPr>
+  </w:style>
+  <w:style w:customStyle="1" w:styleId="SpecialStringTok" w:type="character">
+    <w:name w:val="SpecialStringTok"/>
+    <w:basedOn w:val="VerbatimChar"/>
+    <w:rPr>
+      <w:color w:val="bb6688"/>
+    </w:rPr>
+  </w:style>
+  <w:style w:customStyle="1" w:styleId="ImportTok" w:type="character">
+    <w:name w:val="ImportTok"/>
+    <w:basedOn w:val="VerbatimChar"/>
+    <w:rPr>
+      <w:b/>
+      <w:color w:val="008000"/>
+    </w:rPr>
+  </w:style>
+  <w:style w:customStyle="1" w:styleId="CommentTok" w:type="character">
+    <w:name w:val="CommentTok"/>
+    <w:basedOn w:val="VerbatimChar"/>
+    <w:rPr>
+      <w:i/>
+      <w:color w:val="60a0b0"/>
+    </w:rPr>
+  </w:style>
+  <w:style w:customStyle="1" w:styleId="DocumentationTok" w:type="character">
+    <w:name w:val="DocumentationTok"/>
+    <w:basedOn w:val="VerbatimChar"/>
+    <w:rPr>
+      <w:i/>
+      <w:color w:val="ba2121"/>
+    </w:rPr>
+  </w:style>
+  <w:style w:customStyle="1" w:styleId="AnnotationTok" w:type="character">
+    <w:name w:val="AnnotationTok"/>
+    <w:basedOn w:val="VerbatimChar"/>
+    <w:rPr>
+      <w:b/>
+      <w:i/>
+      <w:color w:val="60a0b0"/>
+    </w:rPr>
+  </w:style>
+  <w:style w:customStyle="1" w:styleId="CommentVarTok" w:type="character">
+    <w:name w:val="CommentVarTok"/>
+    <w:basedOn w:val="VerbatimChar"/>
+    <w:rPr>
+      <w:b/>
+      <w:i/>
+      <w:color w:val="60a0b0"/>
+    </w:rPr>
+  </w:style>
+  <w:style w:customStyle="1" w:styleId="OtherTok" w:type="character">
+    <w:name w:val="OtherTok"/>
+    <w:basedOn w:val="VerbatimChar"/>
+    <w:rPr>
+      <w:color w:val="007020"/>
+    </w:rPr>
+  </w:style>
+  <w:style w:customStyle="1" w:styleId="FunctionTok" w:type="character">
+    <w:name w:val="FunctionTok"/>
+    <w:basedOn w:val="VerbatimChar"/>
+    <w:rPr>
+      <w:color w:val="06287e"/>
+    </w:rPr>
+  </w:style>
+  <w:style w:customStyle="1" w:styleId="VariableTok" w:type="character">
+    <w:name w:val="VariableTok"/>
+    <w:basedOn w:val="VerbatimChar"/>
+    <w:rPr>
+      <w:color w:val="19177c"/>
+    </w:rPr>
+  </w:style>
+  <w:style w:customStyle="1" w:styleId="ControlFlowTok" w:type="character">
+    <w:name w:val="ControlFlowTok"/>
+    <w:basedOn w:val="VerbatimChar"/>
+    <w:rPr>
+      <w:b/>
+      <w:color w:val="007020"/>
+    </w:rPr>
+  </w:style>
+  <w:style w:customStyle="1" w:styleId="OperatorTok" w:type="character">
+    <w:name w:val="OperatorTok"/>
+    <w:basedOn w:val="VerbatimChar"/>
+    <w:rPr>
+      <w:color w:val="666666"/>
+    </w:rPr>
+  </w:style>
+  <w:style w:customStyle="1" w:styleId="BuiltInTok" w:type="character">
+    <w:name w:val="BuiltInTok"/>
+    <w:basedOn w:val="VerbatimChar"/>
+    <w:rPr>
+      <w:color w:val="008000"/>
+    </w:rPr>
+  </w:style>
+  <w:style w:customStyle="1" w:styleId="ExtensionTok" w:type="character">
+    <w:name w:val="ExtensionTok"/>
+    <w:basedOn w:val="VerbatimChar"/>
+    <w:rPr/>
+  </w:style>
+  <w:style w:customStyle="1" w:styleId="PreprocessorTok" w:type="character">
+    <w:name w:val="PreprocessorTok"/>
+    <w:basedOn w:val="VerbatimChar"/>
+    <w:rPr>
+      <w:color w:val="bc7a00"/>
+    </w:rPr>
+  </w:style>
+  <w:style w:customStyle="1" w:styleId="AttributeTok" w:type="character">
+    <w:name w:val="AttributeTok"/>
+    <w:basedOn w:val="VerbatimChar"/>
+    <w:rPr>
+      <w:color w:val="7d9029"/>
+    </w:rPr>
+  </w:style>
+  <w:style w:customStyle="1" w:styleId="RegionMarkerTok" w:type="character">
+    <w:name w:val="RegionMarkerTok"/>
+    <w:basedOn w:val="VerbatimChar"/>
+    <w:rPr/>
+  </w:style>
+  <w:style w:customStyle="1" w:styleId="InformationTok" w:type="character">
+    <w:name w:val="InformationTok"/>
+    <w:basedOn w:val="VerbatimChar"/>
+    <w:rPr>
+      <w:b/>
+      <w:i/>
+      <w:color w:val="60a0b0"/>
+    </w:rPr>
+  </w:style>
+  <w:style w:customStyle="1" w:styleId="WarningTok" w:type="character">
+    <w:name w:val="WarningTok"/>
+    <w:basedOn w:val="VerbatimChar"/>
+    <w:rPr>
+      <w:b/>
+      <w:i/>
+      <w:color w:val="60a0b0"/>
+    </w:rPr>
+  </w:style>
+  <w:style w:customStyle="1" w:styleId="AlertTok" w:type="character">
+    <w:name w:val="AlertTok"/>
+    <w:basedOn w:val="VerbatimChar"/>
+    <w:rPr>
+      <w:b/>
+      <w:color w:val="ff0000"/>
+    </w:rPr>
+  </w:style>
+  <w:style w:customStyle="1" w:styleId="ErrorTok" w:type="character">
+    <w:name w:val="ErrorTok"/>
+    <w:basedOn w:val="VerbatimChar"/>
+    <w:rPr>
+      <w:b/>
+      <w:color w:val="ff0000"/>
+    </w:rPr>
+  </w:style>
+  <w:style w:customStyle="1" w:styleId="NormalTok" w:type="character">
     <w:name w:val="NormalTok"/>
     <w:basedOn w:val="VerbatimChar"/>
     <w:rPr/>

</xml_diff>

<commit_message>
Screen all Table 1 season responses with response-specific 1.5 IQR exclusions
</commit_message>
<xml_diff>
--- a/AFRI_Variables_Models_and_Datasets.docx
+++ b/AFRI_Variables_Models_and_Datasets.docx
@@ -14,6 +14,14 @@
     <w:p>
       <w:pPr>
         <w:pStyle w:val="FirstParagraph"/>
+      </w:pPr>
+      <w:r>
+        <w:t xml:space="preserve">Table 1 screening now excludes response values below Q1 - 1.5 × IQR or above Q3 + 1.5 × IQR, separately for Grazing_h, Resting_h, Traveling_h and mean_DDT_day. Quartiles are computed across finite animal-year season averages within each response, using R type-7 quantiles. Values exactly on the fences are retained. Fewer than four finite values are explicitly unscreened. Each response is fitted on its own retained subset; raw datasets and other responses are not modified. Table1_IQR_Summary, Table1_IQR_Audit and Table1_IQR_Excluded record counts, fences and identifiable excluded records. Missing responses remain subject to the existing complete-case rules. Gamma/log and all fixed/random structures remain unchanged. Report this outcome-dependent screening when interpreting treatment comparisons; the unfiltered source records are retained.</w:t>
+      </w:r>
+    </w:p>
+    <w:p>
+      <w:pPr>
+        <w:pStyle w:val="BodyText"/>
       </w:pPr>
       <w:r>
         <w:t xml:space="preserve">Season-table post-hoc letters compare all six TRT × SR EMM cells within each response using Tukey adjustment. They are displayed as Unicode superscripts immediately after the EMM and before ± SE (for example, 12.75ᵃ ± 0.61). Table2 and WholeSeason_Additional now include these letters. When pasture cells are unreplicated the comparisons are explicitly exploratory. Raw EMM/SE and plain letters remain available in EMMs_Raw and CLD; missing/nonestimable letters are not invented. Period letters retain their existing temporal comparison scope.</w:t>
@@ -16685,6 +16693,232 @@
     <w:pPr>
       <w:wordWrap w:val="off"/>
     </w:pPr>
+  </w:style>
+  <w:style w:customStyle="1" w:styleId="KeywordTok" w:type="character">
+    <w:name w:val="KeywordTok"/>
+    <w:basedOn w:val="VerbatimChar"/>
+    <w:rPr>
+      <w:b/>
+      <w:color w:val="007020"/>
+    </w:rPr>
+  </w:style>
+  <w:style w:customStyle="1" w:styleId="DataTypeTok" w:type="character">
+    <w:name w:val="DataTypeTok"/>
+    <w:basedOn w:val="VerbatimChar"/>
+    <w:rPr>
+      <w:color w:val="902000"/>
+    </w:rPr>
+  </w:style>
+  <w:style w:customStyle="1" w:styleId="DecValTok" w:type="character">
+    <w:name w:val="DecValTok"/>
+    <w:basedOn w:val="VerbatimChar"/>
+    <w:rPr>
+      <w:color w:val="40a070"/>
+    </w:rPr>
+  </w:style>
+  <w:style w:customStyle="1" w:styleId="BaseNTok" w:type="character">
+    <w:name w:val="BaseNTok"/>
+    <w:basedOn w:val="VerbatimChar"/>
+    <w:rPr>
+      <w:color w:val="40a070"/>
+    </w:rPr>
+  </w:style>
+  <w:style w:customStyle="1" w:styleId="FloatTok" w:type="character">
+    <w:name w:val="FloatTok"/>
+    <w:basedOn w:val="VerbatimChar"/>
+    <w:rPr>
+      <w:color w:val="40a070"/>
+    </w:rPr>
+  </w:style>
+  <w:style w:customStyle="1" w:styleId="ConstantTok" w:type="character">
+    <w:name w:val="ConstantTok"/>
+    <w:basedOn w:val="VerbatimChar"/>
+    <w:rPr>
+      <w:color w:val="880000"/>
+    </w:rPr>
+  </w:style>
+  <w:style w:customStyle="1" w:styleId="CharTok" w:type="character">
+    <w:name w:val="CharTok"/>
+    <w:basedOn w:val="VerbatimChar"/>
+    <w:rPr>
+      <w:color w:val="4070a0"/>
+    </w:rPr>
+  </w:style>
+  <w:style w:customStyle="1" w:styleId="SpecialCharTok" w:type="character">
+    <w:name w:val="SpecialCharTok"/>
+    <w:basedOn w:val="VerbatimChar"/>
+    <w:rPr>
+      <w:color w:val="4070a0"/>
+    </w:rPr>
+  </w:style>
+  <w:style w:customStyle="1" w:styleId="StringTok" w:type="character">
+    <w:name w:val="StringTok"/>
+    <w:basedOn w:val="VerbatimChar"/>
+    <w:rPr>
+      <w:color w:val="4070a0"/>
+    </w:rPr>
+  </w:style>
+  <w:style w:customStyle="1" w:styleId="VerbatimStringTok" w:type="character">
+    <w:name w:val="VerbatimStringTok"/>
+    <w:basedOn w:val="VerbatimChar"/>
+    <w:rPr>
+      <w:color w:val="4070a0"/>
+    </w:rPr>
+  </w:style>
+  <w:style w:customStyle="1" w:styleId="SpecialStringTok" w:type="character">
+    <w:name w:val="SpecialStringTok"/>
+    <w:basedOn w:val="VerbatimChar"/>
+    <w:rPr>
+      <w:color w:val="bb6688"/>
+    </w:rPr>
+  </w:style>
+  <w:style w:customStyle="1" w:styleId="ImportTok" w:type="character">
+    <w:name w:val="ImportTok"/>
+    <w:basedOn w:val="VerbatimChar"/>
+    <w:rPr>
+      <w:b/>
+      <w:color w:val="008000"/>
+    </w:rPr>
+  </w:style>
+  <w:style w:customStyle="1" w:styleId="CommentTok" w:type="character">
+    <w:name w:val="CommentTok"/>
+    <w:basedOn w:val="VerbatimChar"/>
+    <w:rPr>
+      <w:i/>
+      <w:color w:val="60a0b0"/>
+    </w:rPr>
+  </w:style>
+  <w:style w:customStyle="1" w:styleId="DocumentationTok" w:type="character">
+    <w:name w:val="DocumentationTok"/>
+    <w:basedOn w:val="VerbatimChar"/>
+    <w:rPr>
+      <w:i/>
+      <w:color w:val="ba2121"/>
+    </w:rPr>
+  </w:style>
+  <w:style w:customStyle="1" w:styleId="AnnotationTok" w:type="character">
+    <w:name w:val="AnnotationTok"/>
+    <w:basedOn w:val="VerbatimChar"/>
+    <w:rPr>
+      <w:b/>
+      <w:i/>
+      <w:color w:val="60a0b0"/>
+    </w:rPr>
+  </w:style>
+  <w:style w:customStyle="1" w:styleId="CommentVarTok" w:type="character">
+    <w:name w:val="CommentVarTok"/>
+    <w:basedOn w:val="VerbatimChar"/>
+    <w:rPr>
+      <w:b/>
+      <w:i/>
+      <w:color w:val="60a0b0"/>
+    </w:rPr>
+  </w:style>
+  <w:style w:customStyle="1" w:styleId="OtherTok" w:type="character">
+    <w:name w:val="OtherTok"/>
+    <w:basedOn w:val="VerbatimChar"/>
+    <w:rPr>
+      <w:color w:val="007020"/>
+    </w:rPr>
+  </w:style>
+  <w:style w:customStyle="1" w:styleId="FunctionTok" w:type="character">
+    <w:name w:val="FunctionTok"/>
+    <w:basedOn w:val="VerbatimChar"/>
+    <w:rPr>
+      <w:color w:val="06287e"/>
+    </w:rPr>
+  </w:style>
+  <w:style w:customStyle="1" w:styleId="VariableTok" w:type="character">
+    <w:name w:val="VariableTok"/>
+    <w:basedOn w:val="VerbatimChar"/>
+    <w:rPr>
+      <w:color w:val="19177c"/>
+    </w:rPr>
+  </w:style>
+  <w:style w:customStyle="1" w:styleId="ControlFlowTok" w:type="character">
+    <w:name w:val="ControlFlowTok"/>
+    <w:basedOn w:val="VerbatimChar"/>
+    <w:rPr>
+      <w:b/>
+      <w:color w:val="007020"/>
+    </w:rPr>
+  </w:style>
+  <w:style w:customStyle="1" w:styleId="OperatorTok" w:type="character">
+    <w:name w:val="OperatorTok"/>
+    <w:basedOn w:val="VerbatimChar"/>
+    <w:rPr>
+      <w:color w:val="666666"/>
+    </w:rPr>
+  </w:style>
+  <w:style w:customStyle="1" w:styleId="BuiltInTok" w:type="character">
+    <w:name w:val="BuiltInTok"/>
+    <w:basedOn w:val="VerbatimChar"/>
+    <w:rPr>
+      <w:color w:val="008000"/>
+    </w:rPr>
+  </w:style>
+  <w:style w:customStyle="1" w:styleId="ExtensionTok" w:type="character">
+    <w:name w:val="ExtensionTok"/>
+    <w:basedOn w:val="VerbatimChar"/>
+    <w:rPr/>
+  </w:style>
+  <w:style w:customStyle="1" w:styleId="PreprocessorTok" w:type="character">
+    <w:name w:val="PreprocessorTok"/>
+    <w:basedOn w:val="VerbatimChar"/>
+    <w:rPr>
+      <w:color w:val="bc7a00"/>
+    </w:rPr>
+  </w:style>
+  <w:style w:customStyle="1" w:styleId="AttributeTok" w:type="character">
+    <w:name w:val="AttributeTok"/>
+    <w:basedOn w:val="VerbatimChar"/>
+    <w:rPr>
+      <w:color w:val="7d9029"/>
+    </w:rPr>
+  </w:style>
+  <w:style w:customStyle="1" w:styleId="RegionMarkerTok" w:type="character">
+    <w:name w:val="RegionMarkerTok"/>
+    <w:basedOn w:val="VerbatimChar"/>
+    <w:rPr/>
+  </w:style>
+  <w:style w:customStyle="1" w:styleId="InformationTok" w:type="character">
+    <w:name w:val="InformationTok"/>
+    <w:basedOn w:val="VerbatimChar"/>
+    <w:rPr>
+      <w:b/>
+      <w:i/>
+      <w:color w:val="60a0b0"/>
+    </w:rPr>
+  </w:style>
+  <w:style w:customStyle="1" w:styleId="WarningTok" w:type="character">
+    <w:name w:val="WarningTok"/>
+    <w:basedOn w:val="VerbatimChar"/>
+    <w:rPr>
+      <w:b/>
+      <w:i/>
+      <w:color w:val="60a0b0"/>
+    </w:rPr>
+  </w:style>
+  <w:style w:customStyle="1" w:styleId="AlertTok" w:type="character">
+    <w:name w:val="AlertTok"/>
+    <w:basedOn w:val="VerbatimChar"/>
+    <w:rPr>
+      <w:b/>
+      <w:color w:val="ff0000"/>
+    </w:rPr>
+  </w:style>
+  <w:style w:customStyle="1" w:styleId="ErrorTok" w:type="character">
+    <w:name w:val="ErrorTok"/>
+    <w:basedOn w:val="VerbatimChar"/>
+    <w:rPr>
+      <w:b/>
+      <w:color w:val="ff0000"/>
+    </w:rPr>
+  </w:style>
+  <w:style w:customStyle="1" w:styleId="NormalTok" w:type="character">
+    <w:name w:val="NormalTok"/>
+    <w:basedOn w:val="VerbatimChar"/>
+    <w:rPr/>
   </w:style>
   <w:style w:customStyle="1" w:styleId="KeywordTok" w:type="character">
     <w:name w:val="KeywordTok"/>

</xml_diff>

<commit_message>
Apply one-IQR screening to behaviors DDT and RGP ADG; export response distributions
</commit_message>
<xml_diff>
--- a/AFRI_Variables_Models_and_Datasets.docx
+++ b/AFRI_Variables_Models_and_Datasets.docx
@@ -16,7 +16,7 @@
         <w:pStyle w:val="FirstParagraph"/>
       </w:pPr>
       <w:r>
-        <w:t xml:space="preserve">Table 1 screening now excludes response values below Q1 - 1.5 × IQR or above Q3 + 1.5 × IQR, separately for Grazing_h, Resting_h, Traveling_h and mean_DDT_day. Quartiles are computed across finite animal-year season averages within each response, using R type-7 quantiles. Values exactly on the fences are retained. Fewer than four finite values are explicitly unscreened. Each response is fitted on its own retained subset; raw datasets and other responses are not modified. Table1_IQR_Summary, Table1_IQR_Audit and Table1_IQR_Excluded record counts, fences and identifiable excluded records. Missing responses remain subject to the existing complete-case rules. Gamma/log and all fixed/random structures remain unchanged. Report this outcome-dependent screening when interpreting treatment comparisons; the unfiltered source records are retained.</w:t>
+        <w:t xml:space="preserve">Response screening excludes values below Q1 - 1 × IQR or above Q3 + 1 × IQR, separately for Grazing_h, Resting_h, Traveling_h, mean_DDT_day and RGP_Smooth_ADG_kg_day. R type-7 quartiles use finite animal-year season averages for Table 1 and animal-period records for RGP ADG, pooled across treatment groups within each response. Fence values are retained; fewer than four finite observations are unscreened. Each response uses its own retained subset, with original datasets preserved. Response_IQR_Summary, Response_IQR_Audit and Response_IQR_Excluded record fences, counts and excluded records; Table1_IQR sheets remain available. Existing model families and formulas are retained. Monthly exploratory grazing/DDT screening also uses 1 × IQR. With export_results = TRUE, all canonical responses get before-screening and model-data histograms and normal QQ plots in 06_Statistical_Analysis/03_Figures/Response_Distributions, indexed by Distribution_Index.csv. These are response distribution plots, not residual normality tests. Outcome-based screening should be reported with the results.</w:t>
       </w:r>
     </w:p>
     <w:p>
@@ -16693,6 +16693,232 @@
     <w:pPr>
       <w:wordWrap w:val="off"/>
     </w:pPr>
+  </w:style>
+  <w:style w:customStyle="1" w:styleId="KeywordTok" w:type="character">
+    <w:name w:val="KeywordTok"/>
+    <w:basedOn w:val="VerbatimChar"/>
+    <w:rPr>
+      <w:b/>
+      <w:color w:val="007020"/>
+    </w:rPr>
+  </w:style>
+  <w:style w:customStyle="1" w:styleId="DataTypeTok" w:type="character">
+    <w:name w:val="DataTypeTok"/>
+    <w:basedOn w:val="VerbatimChar"/>
+    <w:rPr>
+      <w:color w:val="902000"/>
+    </w:rPr>
+  </w:style>
+  <w:style w:customStyle="1" w:styleId="DecValTok" w:type="character">
+    <w:name w:val="DecValTok"/>
+    <w:basedOn w:val="VerbatimChar"/>
+    <w:rPr>
+      <w:color w:val="40a070"/>
+    </w:rPr>
+  </w:style>
+  <w:style w:customStyle="1" w:styleId="BaseNTok" w:type="character">
+    <w:name w:val="BaseNTok"/>
+    <w:basedOn w:val="VerbatimChar"/>
+    <w:rPr>
+      <w:color w:val="40a070"/>
+    </w:rPr>
+  </w:style>
+  <w:style w:customStyle="1" w:styleId="FloatTok" w:type="character">
+    <w:name w:val="FloatTok"/>
+    <w:basedOn w:val="VerbatimChar"/>
+    <w:rPr>
+      <w:color w:val="40a070"/>
+    </w:rPr>
+  </w:style>
+  <w:style w:customStyle="1" w:styleId="ConstantTok" w:type="character">
+    <w:name w:val="ConstantTok"/>
+    <w:basedOn w:val="VerbatimChar"/>
+    <w:rPr>
+      <w:color w:val="880000"/>
+    </w:rPr>
+  </w:style>
+  <w:style w:customStyle="1" w:styleId="CharTok" w:type="character">
+    <w:name w:val="CharTok"/>
+    <w:basedOn w:val="VerbatimChar"/>
+    <w:rPr>
+      <w:color w:val="4070a0"/>
+    </w:rPr>
+  </w:style>
+  <w:style w:customStyle="1" w:styleId="SpecialCharTok" w:type="character">
+    <w:name w:val="SpecialCharTok"/>
+    <w:basedOn w:val="VerbatimChar"/>
+    <w:rPr>
+      <w:color w:val="4070a0"/>
+    </w:rPr>
+  </w:style>
+  <w:style w:customStyle="1" w:styleId="StringTok" w:type="character">
+    <w:name w:val="StringTok"/>
+    <w:basedOn w:val="VerbatimChar"/>
+    <w:rPr>
+      <w:color w:val="4070a0"/>
+    </w:rPr>
+  </w:style>
+  <w:style w:customStyle="1" w:styleId="VerbatimStringTok" w:type="character">
+    <w:name w:val="VerbatimStringTok"/>
+    <w:basedOn w:val="VerbatimChar"/>
+    <w:rPr>
+      <w:color w:val="4070a0"/>
+    </w:rPr>
+  </w:style>
+  <w:style w:customStyle="1" w:styleId="SpecialStringTok" w:type="character">
+    <w:name w:val="SpecialStringTok"/>
+    <w:basedOn w:val="VerbatimChar"/>
+    <w:rPr>
+      <w:color w:val="bb6688"/>
+    </w:rPr>
+  </w:style>
+  <w:style w:customStyle="1" w:styleId="ImportTok" w:type="character">
+    <w:name w:val="ImportTok"/>
+    <w:basedOn w:val="VerbatimChar"/>
+    <w:rPr>
+      <w:b/>
+      <w:color w:val="008000"/>
+    </w:rPr>
+  </w:style>
+  <w:style w:customStyle="1" w:styleId="CommentTok" w:type="character">
+    <w:name w:val="CommentTok"/>
+    <w:basedOn w:val="VerbatimChar"/>
+    <w:rPr>
+      <w:i/>
+      <w:color w:val="60a0b0"/>
+    </w:rPr>
+  </w:style>
+  <w:style w:customStyle="1" w:styleId="DocumentationTok" w:type="character">
+    <w:name w:val="DocumentationTok"/>
+    <w:basedOn w:val="VerbatimChar"/>
+    <w:rPr>
+      <w:i/>
+      <w:color w:val="ba2121"/>
+    </w:rPr>
+  </w:style>
+  <w:style w:customStyle="1" w:styleId="AnnotationTok" w:type="character">
+    <w:name w:val="AnnotationTok"/>
+    <w:basedOn w:val="VerbatimChar"/>
+    <w:rPr>
+      <w:b/>
+      <w:i/>
+      <w:color w:val="60a0b0"/>
+    </w:rPr>
+  </w:style>
+  <w:style w:customStyle="1" w:styleId="CommentVarTok" w:type="character">
+    <w:name w:val="CommentVarTok"/>
+    <w:basedOn w:val="VerbatimChar"/>
+    <w:rPr>
+      <w:b/>
+      <w:i/>
+      <w:color w:val="60a0b0"/>
+    </w:rPr>
+  </w:style>
+  <w:style w:customStyle="1" w:styleId="OtherTok" w:type="character">
+    <w:name w:val="OtherTok"/>
+    <w:basedOn w:val="VerbatimChar"/>
+    <w:rPr>
+      <w:color w:val="007020"/>
+    </w:rPr>
+  </w:style>
+  <w:style w:customStyle="1" w:styleId="FunctionTok" w:type="character">
+    <w:name w:val="FunctionTok"/>
+    <w:basedOn w:val="VerbatimChar"/>
+    <w:rPr>
+      <w:color w:val="06287e"/>
+    </w:rPr>
+  </w:style>
+  <w:style w:customStyle="1" w:styleId="VariableTok" w:type="character">
+    <w:name w:val="VariableTok"/>
+    <w:basedOn w:val="VerbatimChar"/>
+    <w:rPr>
+      <w:color w:val="19177c"/>
+    </w:rPr>
+  </w:style>
+  <w:style w:customStyle="1" w:styleId="ControlFlowTok" w:type="character">
+    <w:name w:val="ControlFlowTok"/>
+    <w:basedOn w:val="VerbatimChar"/>
+    <w:rPr>
+      <w:b/>
+      <w:color w:val="007020"/>
+    </w:rPr>
+  </w:style>
+  <w:style w:customStyle="1" w:styleId="OperatorTok" w:type="character">
+    <w:name w:val="OperatorTok"/>
+    <w:basedOn w:val="VerbatimChar"/>
+    <w:rPr>
+      <w:color w:val="666666"/>
+    </w:rPr>
+  </w:style>
+  <w:style w:customStyle="1" w:styleId="BuiltInTok" w:type="character">
+    <w:name w:val="BuiltInTok"/>
+    <w:basedOn w:val="VerbatimChar"/>
+    <w:rPr>
+      <w:color w:val="008000"/>
+    </w:rPr>
+  </w:style>
+  <w:style w:customStyle="1" w:styleId="ExtensionTok" w:type="character">
+    <w:name w:val="ExtensionTok"/>
+    <w:basedOn w:val="VerbatimChar"/>
+    <w:rPr/>
+  </w:style>
+  <w:style w:customStyle="1" w:styleId="PreprocessorTok" w:type="character">
+    <w:name w:val="PreprocessorTok"/>
+    <w:basedOn w:val="VerbatimChar"/>
+    <w:rPr>
+      <w:color w:val="bc7a00"/>
+    </w:rPr>
+  </w:style>
+  <w:style w:customStyle="1" w:styleId="AttributeTok" w:type="character">
+    <w:name w:val="AttributeTok"/>
+    <w:basedOn w:val="VerbatimChar"/>
+    <w:rPr>
+      <w:color w:val="7d9029"/>
+    </w:rPr>
+  </w:style>
+  <w:style w:customStyle="1" w:styleId="RegionMarkerTok" w:type="character">
+    <w:name w:val="RegionMarkerTok"/>
+    <w:basedOn w:val="VerbatimChar"/>
+    <w:rPr/>
+  </w:style>
+  <w:style w:customStyle="1" w:styleId="InformationTok" w:type="character">
+    <w:name w:val="InformationTok"/>
+    <w:basedOn w:val="VerbatimChar"/>
+    <w:rPr>
+      <w:b/>
+      <w:i/>
+      <w:color w:val="60a0b0"/>
+    </w:rPr>
+  </w:style>
+  <w:style w:customStyle="1" w:styleId="WarningTok" w:type="character">
+    <w:name w:val="WarningTok"/>
+    <w:basedOn w:val="VerbatimChar"/>
+    <w:rPr>
+      <w:b/>
+      <w:i/>
+      <w:color w:val="60a0b0"/>
+    </w:rPr>
+  </w:style>
+  <w:style w:customStyle="1" w:styleId="AlertTok" w:type="character">
+    <w:name w:val="AlertTok"/>
+    <w:basedOn w:val="VerbatimChar"/>
+    <w:rPr>
+      <w:b/>
+      <w:color w:val="ff0000"/>
+    </w:rPr>
+  </w:style>
+  <w:style w:customStyle="1" w:styleId="ErrorTok" w:type="character">
+    <w:name w:val="ErrorTok"/>
+    <w:basedOn w:val="VerbatimChar"/>
+    <w:rPr>
+      <w:b/>
+      <w:color w:val="ff0000"/>
+    </w:rPr>
+  </w:style>
+  <w:style w:customStyle="1" w:styleId="NormalTok" w:type="character">
+    <w:name w:val="NormalTok"/>
+    <w:basedOn w:val="VerbatimChar"/>
+    <w:rPr/>
   </w:style>
   <w:style w:customStyle="1" w:styleId="KeywordTok" w:type="character">
     <w:name w:val="KeywordTok"/>

</xml_diff>

<commit_message>
Apply response-specific one-IQR screening to RGP CH4 and CO2
</commit_message>
<xml_diff>
--- a/AFRI_Variables_Models_and_Datasets.docx
+++ b/AFRI_Variables_Models_and_Datasets.docx
@@ -16,7 +16,7 @@
         <w:pStyle w:val="FirstParagraph"/>
       </w:pPr>
       <w:r>
-        <w:t xml:space="preserve">Response screening excludes values below Q1 - 1 × IQR or above Q3 + 1 × IQR, separately for Grazing_h, Resting_h, Traveling_h, mean_DDT_day and RGP_Smooth_ADG_kg_day. R type-7 quartiles use finite animal-year season averages for Table 1 and animal-period records for RGP ADG, pooled across treatment groups within each response. Fence values are retained; fewer than four finite observations are unscreened. Each response uses its own retained subset, with original datasets preserved. Response_IQR_Summary, Response_IQR_Audit and Response_IQR_Excluded record fences, counts and excluded records; Table1_IQR sheets remain available. Existing model families and formulas are retained. Monthly exploratory grazing/DDT screening also uses 1 × IQR. With export_results = TRUE, all canonical responses get before-screening and model-data histograms and normal QQ plots in 06_Statistical_Analysis/03_Figures/Response_Distributions, indexed by Distribution_Index.csv. These are response distribution plots, not residual normality tests. Outcome-based screening should be reported with the results.</w:t>
+        <w:t xml:space="preserve">Response screening excludes values below Q1 - 1 × IQR or above Q3 + 1 × IQR, separately for Grazing_h, Resting_h, Traveling_h, mean_DDT_day, RGP_Smooth_ADG_kg_day, RGP_CH4_g_day and RGP_CO2_g_day. R type-7 quartiles use finite animal-year season averages for Table 1 and animal-period records for RGP ADG/CH4/CO2, pooled across treatment groups within each response. Fence values are retained; fewer than four finite observations are unscreened. Each response uses its own retained subset, with original datasets preserved. Response_IQR_Summary, Response_IQR_Audit and Response_IQR_Excluded record fences, counts and excluded records; Table1_IQR sheets remain available. Existing model families and formulas are retained. Monthly exploratory grazing/DDT screening also uses 1 × IQR. With export_results = TRUE, all canonical responses get before-screening and model-data histograms and normal QQ plots in 06_Statistical_Analysis/03_Figures/Response_Distributions, indexed by Distribution_Index.csv. These are response distribution plots, not residual normality tests. Outcome-based screening should be reported with the results.</w:t>
       </w:r>
     </w:p>
     <w:p>
@@ -16693,6 +16693,232 @@
     <w:pPr>
       <w:wordWrap w:val="off"/>
     </w:pPr>
+  </w:style>
+  <w:style w:customStyle="1" w:styleId="KeywordTok" w:type="character">
+    <w:name w:val="KeywordTok"/>
+    <w:basedOn w:val="VerbatimChar"/>
+    <w:rPr>
+      <w:b/>
+      <w:color w:val="007020"/>
+    </w:rPr>
+  </w:style>
+  <w:style w:customStyle="1" w:styleId="DataTypeTok" w:type="character">
+    <w:name w:val="DataTypeTok"/>
+    <w:basedOn w:val="VerbatimChar"/>
+    <w:rPr>
+      <w:color w:val="902000"/>
+    </w:rPr>
+  </w:style>
+  <w:style w:customStyle="1" w:styleId="DecValTok" w:type="character">
+    <w:name w:val="DecValTok"/>
+    <w:basedOn w:val="VerbatimChar"/>
+    <w:rPr>
+      <w:color w:val="40a070"/>
+    </w:rPr>
+  </w:style>
+  <w:style w:customStyle="1" w:styleId="BaseNTok" w:type="character">
+    <w:name w:val="BaseNTok"/>
+    <w:basedOn w:val="VerbatimChar"/>
+    <w:rPr>
+      <w:color w:val="40a070"/>
+    </w:rPr>
+  </w:style>
+  <w:style w:customStyle="1" w:styleId="FloatTok" w:type="character">
+    <w:name w:val="FloatTok"/>
+    <w:basedOn w:val="VerbatimChar"/>
+    <w:rPr>
+      <w:color w:val="40a070"/>
+    </w:rPr>
+  </w:style>
+  <w:style w:customStyle="1" w:styleId="ConstantTok" w:type="character">
+    <w:name w:val="ConstantTok"/>
+    <w:basedOn w:val="VerbatimChar"/>
+    <w:rPr>
+      <w:color w:val="880000"/>
+    </w:rPr>
+  </w:style>
+  <w:style w:customStyle="1" w:styleId="CharTok" w:type="character">
+    <w:name w:val="CharTok"/>
+    <w:basedOn w:val="VerbatimChar"/>
+    <w:rPr>
+      <w:color w:val="4070a0"/>
+    </w:rPr>
+  </w:style>
+  <w:style w:customStyle="1" w:styleId="SpecialCharTok" w:type="character">
+    <w:name w:val="SpecialCharTok"/>
+    <w:basedOn w:val="VerbatimChar"/>
+    <w:rPr>
+      <w:color w:val="4070a0"/>
+    </w:rPr>
+  </w:style>
+  <w:style w:customStyle="1" w:styleId="StringTok" w:type="character">
+    <w:name w:val="StringTok"/>
+    <w:basedOn w:val="VerbatimChar"/>
+    <w:rPr>
+      <w:color w:val="4070a0"/>
+    </w:rPr>
+  </w:style>
+  <w:style w:customStyle="1" w:styleId="VerbatimStringTok" w:type="character">
+    <w:name w:val="VerbatimStringTok"/>
+    <w:basedOn w:val="VerbatimChar"/>
+    <w:rPr>
+      <w:color w:val="4070a0"/>
+    </w:rPr>
+  </w:style>
+  <w:style w:customStyle="1" w:styleId="SpecialStringTok" w:type="character">
+    <w:name w:val="SpecialStringTok"/>
+    <w:basedOn w:val="VerbatimChar"/>
+    <w:rPr>
+      <w:color w:val="bb6688"/>
+    </w:rPr>
+  </w:style>
+  <w:style w:customStyle="1" w:styleId="ImportTok" w:type="character">
+    <w:name w:val="ImportTok"/>
+    <w:basedOn w:val="VerbatimChar"/>
+    <w:rPr>
+      <w:b/>
+      <w:color w:val="008000"/>
+    </w:rPr>
+  </w:style>
+  <w:style w:customStyle="1" w:styleId="CommentTok" w:type="character">
+    <w:name w:val="CommentTok"/>
+    <w:basedOn w:val="VerbatimChar"/>
+    <w:rPr>
+      <w:i/>
+      <w:color w:val="60a0b0"/>
+    </w:rPr>
+  </w:style>
+  <w:style w:customStyle="1" w:styleId="DocumentationTok" w:type="character">
+    <w:name w:val="DocumentationTok"/>
+    <w:basedOn w:val="VerbatimChar"/>
+    <w:rPr>
+      <w:i/>
+      <w:color w:val="ba2121"/>
+    </w:rPr>
+  </w:style>
+  <w:style w:customStyle="1" w:styleId="AnnotationTok" w:type="character">
+    <w:name w:val="AnnotationTok"/>
+    <w:basedOn w:val="VerbatimChar"/>
+    <w:rPr>
+      <w:b/>
+      <w:i/>
+      <w:color w:val="60a0b0"/>
+    </w:rPr>
+  </w:style>
+  <w:style w:customStyle="1" w:styleId="CommentVarTok" w:type="character">
+    <w:name w:val="CommentVarTok"/>
+    <w:basedOn w:val="VerbatimChar"/>
+    <w:rPr>
+      <w:b/>
+      <w:i/>
+      <w:color w:val="60a0b0"/>
+    </w:rPr>
+  </w:style>
+  <w:style w:customStyle="1" w:styleId="OtherTok" w:type="character">
+    <w:name w:val="OtherTok"/>
+    <w:basedOn w:val="VerbatimChar"/>
+    <w:rPr>
+      <w:color w:val="007020"/>
+    </w:rPr>
+  </w:style>
+  <w:style w:customStyle="1" w:styleId="FunctionTok" w:type="character">
+    <w:name w:val="FunctionTok"/>
+    <w:basedOn w:val="VerbatimChar"/>
+    <w:rPr>
+      <w:color w:val="06287e"/>
+    </w:rPr>
+  </w:style>
+  <w:style w:customStyle="1" w:styleId="VariableTok" w:type="character">
+    <w:name w:val="VariableTok"/>
+    <w:basedOn w:val="VerbatimChar"/>
+    <w:rPr>
+      <w:color w:val="19177c"/>
+    </w:rPr>
+  </w:style>
+  <w:style w:customStyle="1" w:styleId="ControlFlowTok" w:type="character">
+    <w:name w:val="ControlFlowTok"/>
+    <w:basedOn w:val="VerbatimChar"/>
+    <w:rPr>
+      <w:b/>
+      <w:color w:val="007020"/>
+    </w:rPr>
+  </w:style>
+  <w:style w:customStyle="1" w:styleId="OperatorTok" w:type="character">
+    <w:name w:val="OperatorTok"/>
+    <w:basedOn w:val="VerbatimChar"/>
+    <w:rPr>
+      <w:color w:val="666666"/>
+    </w:rPr>
+  </w:style>
+  <w:style w:customStyle="1" w:styleId="BuiltInTok" w:type="character">
+    <w:name w:val="BuiltInTok"/>
+    <w:basedOn w:val="VerbatimChar"/>
+    <w:rPr>
+      <w:color w:val="008000"/>
+    </w:rPr>
+  </w:style>
+  <w:style w:customStyle="1" w:styleId="ExtensionTok" w:type="character">
+    <w:name w:val="ExtensionTok"/>
+    <w:basedOn w:val="VerbatimChar"/>
+    <w:rPr/>
+  </w:style>
+  <w:style w:customStyle="1" w:styleId="PreprocessorTok" w:type="character">
+    <w:name w:val="PreprocessorTok"/>
+    <w:basedOn w:val="VerbatimChar"/>
+    <w:rPr>
+      <w:color w:val="bc7a00"/>
+    </w:rPr>
+  </w:style>
+  <w:style w:customStyle="1" w:styleId="AttributeTok" w:type="character">
+    <w:name w:val="AttributeTok"/>
+    <w:basedOn w:val="VerbatimChar"/>
+    <w:rPr>
+      <w:color w:val="7d9029"/>
+    </w:rPr>
+  </w:style>
+  <w:style w:customStyle="1" w:styleId="RegionMarkerTok" w:type="character">
+    <w:name w:val="RegionMarkerTok"/>
+    <w:basedOn w:val="VerbatimChar"/>
+    <w:rPr/>
+  </w:style>
+  <w:style w:customStyle="1" w:styleId="InformationTok" w:type="character">
+    <w:name w:val="InformationTok"/>
+    <w:basedOn w:val="VerbatimChar"/>
+    <w:rPr>
+      <w:b/>
+      <w:i/>
+      <w:color w:val="60a0b0"/>
+    </w:rPr>
+  </w:style>
+  <w:style w:customStyle="1" w:styleId="WarningTok" w:type="character">
+    <w:name w:val="WarningTok"/>
+    <w:basedOn w:val="VerbatimChar"/>
+    <w:rPr>
+      <w:b/>
+      <w:i/>
+      <w:color w:val="60a0b0"/>
+    </w:rPr>
+  </w:style>
+  <w:style w:customStyle="1" w:styleId="AlertTok" w:type="character">
+    <w:name w:val="AlertTok"/>
+    <w:basedOn w:val="VerbatimChar"/>
+    <w:rPr>
+      <w:b/>
+      <w:color w:val="ff0000"/>
+    </w:rPr>
+  </w:style>
+  <w:style w:customStyle="1" w:styleId="ErrorTok" w:type="character">
+    <w:name w:val="ErrorTok"/>
+    <w:basedOn w:val="VerbatimChar"/>
+    <w:rPr>
+      <w:b/>
+      <w:color w:val="ff0000"/>
+    </w:rPr>
+  </w:style>
+  <w:style w:customStyle="1" w:styleId="NormalTok" w:type="character">
+    <w:name w:val="NormalTok"/>
+    <w:basedOn w:val="VerbatimChar"/>
+    <w:rPr/>
   </w:style>
   <w:style w:customStyle="1" w:styleId="KeywordTok" w:type="character">
     <w:name w:val="KeywordTok"/>

</xml_diff>

<commit_message>
Use half-IQR screening for grazing and traveling responses
</commit_message>
<xml_diff>
--- a/AFRI_Variables_Models_and_Datasets.docx
+++ b/AFRI_Variables_Models_and_Datasets.docx
@@ -16,7 +16,7 @@
         <w:pStyle w:val="FirstParagraph"/>
       </w:pPr>
       <w:r>
-        <w:t xml:space="preserve">Response screening excludes values below Q1 - 1 × IQR or above Q3 + 1 × IQR, separately for Grazing_h, Resting_h, Traveling_h, mean_DDT_day, RGP_Smooth_ADG_kg_day, RGP_CH4_g_day and RGP_CO2_g_day. R type-7 quartiles use finite animal-year season averages for Table 1 and animal-period records for RGP ADG/CH4/CO2, pooled across treatment groups within each response. Fence values are retained; fewer than four finite observations are unscreened. Each response uses its own retained subset, with original datasets preserved. Response_IQR_Summary, Response_IQR_Audit and Response_IQR_Excluded record fences, counts and excluded records; Table1_IQR sheets remain available. Existing model families and formulas are retained. Monthly exploratory grazing/DDT screening also uses 1 × IQR. With export_results = TRUE, all canonical responses get before-screening and model-data histograms and normal QQ plots in 06_Statistical_Analysis/03_Figures/Response_Distributions, indexed by Distribution_Index.csv. These are response distribution plots, not residual normality tests. Outcome-based screening should be reported with the results.</w:t>
+        <w:t xml:space="preserve">Response screening uses Q1 − k × IQR and Q3 + k × IQR, with k = 0.5 for Grazing_h and Traveling_h and k = 1 for the other screened responses, separately for Grazing_h, Resting_h, Traveling_h, mean_DDT_day, RGP_Smooth_ADG_kg_day, RGP_CH4_g_day and RGP_CO2_g_day. R type-7 quartiles use finite animal-year season averages for Table 1 and animal-period records for RGP ADG/CH4/CO2, pooled across treatment groups within each response. Fence values are retained; fewer than four finite observations are unscreened. Each response uses its own retained subset, with original datasets preserved. Response_IQR_Summary, Response_IQR_Audit and Response_IQR_Excluded record fences, counts and excluded records; Table1_IQR sheets remain available. Existing model families and formulas are retained. Monthly exploratory grazing/traveling screening uses 0.5 × IQR; resting/DDT screening uses 1 × IQR. Audit and summary sheets report IQR_multiplier explicitly. With export_results = TRUE, all canonical responses get before-screening and model-data histograms and normal QQ plots in 06_Statistical_Analysis/03_Figures/Response_Distributions, indexed by Distribution_Index.csv. These are response distribution plots, not residual normality tests. Outcome-based screening should be reported with the results.</w:t>
       </w:r>
     </w:p>
     <w:p>
@@ -16693,6 +16693,232 @@
     <w:pPr>
       <w:wordWrap w:val="off"/>
     </w:pPr>
+  </w:style>
+  <w:style w:customStyle="1" w:styleId="KeywordTok" w:type="character">
+    <w:name w:val="KeywordTok"/>
+    <w:basedOn w:val="VerbatimChar"/>
+    <w:rPr>
+      <w:b/>
+      <w:color w:val="007020"/>
+    </w:rPr>
+  </w:style>
+  <w:style w:customStyle="1" w:styleId="DataTypeTok" w:type="character">
+    <w:name w:val="DataTypeTok"/>
+    <w:basedOn w:val="VerbatimChar"/>
+    <w:rPr>
+      <w:color w:val="902000"/>
+    </w:rPr>
+  </w:style>
+  <w:style w:customStyle="1" w:styleId="DecValTok" w:type="character">
+    <w:name w:val="DecValTok"/>
+    <w:basedOn w:val="VerbatimChar"/>
+    <w:rPr>
+      <w:color w:val="40a070"/>
+    </w:rPr>
+  </w:style>
+  <w:style w:customStyle="1" w:styleId="BaseNTok" w:type="character">
+    <w:name w:val="BaseNTok"/>
+    <w:basedOn w:val="VerbatimChar"/>
+    <w:rPr>
+      <w:color w:val="40a070"/>
+    </w:rPr>
+  </w:style>
+  <w:style w:customStyle="1" w:styleId="FloatTok" w:type="character">
+    <w:name w:val="FloatTok"/>
+    <w:basedOn w:val="VerbatimChar"/>
+    <w:rPr>
+      <w:color w:val="40a070"/>
+    </w:rPr>
+  </w:style>
+  <w:style w:customStyle="1" w:styleId="ConstantTok" w:type="character">
+    <w:name w:val="ConstantTok"/>
+    <w:basedOn w:val="VerbatimChar"/>
+    <w:rPr>
+      <w:color w:val="880000"/>
+    </w:rPr>
+  </w:style>
+  <w:style w:customStyle="1" w:styleId="CharTok" w:type="character">
+    <w:name w:val="CharTok"/>
+    <w:basedOn w:val="VerbatimChar"/>
+    <w:rPr>
+      <w:color w:val="4070a0"/>
+    </w:rPr>
+  </w:style>
+  <w:style w:customStyle="1" w:styleId="SpecialCharTok" w:type="character">
+    <w:name w:val="SpecialCharTok"/>
+    <w:basedOn w:val="VerbatimChar"/>
+    <w:rPr>
+      <w:color w:val="4070a0"/>
+    </w:rPr>
+  </w:style>
+  <w:style w:customStyle="1" w:styleId="StringTok" w:type="character">
+    <w:name w:val="StringTok"/>
+    <w:basedOn w:val="VerbatimChar"/>
+    <w:rPr>
+      <w:color w:val="4070a0"/>
+    </w:rPr>
+  </w:style>
+  <w:style w:customStyle="1" w:styleId="VerbatimStringTok" w:type="character">
+    <w:name w:val="VerbatimStringTok"/>
+    <w:basedOn w:val="VerbatimChar"/>
+    <w:rPr>
+      <w:color w:val="4070a0"/>
+    </w:rPr>
+  </w:style>
+  <w:style w:customStyle="1" w:styleId="SpecialStringTok" w:type="character">
+    <w:name w:val="SpecialStringTok"/>
+    <w:basedOn w:val="VerbatimChar"/>
+    <w:rPr>
+      <w:color w:val="bb6688"/>
+    </w:rPr>
+  </w:style>
+  <w:style w:customStyle="1" w:styleId="ImportTok" w:type="character">
+    <w:name w:val="ImportTok"/>
+    <w:basedOn w:val="VerbatimChar"/>
+    <w:rPr>
+      <w:b/>
+      <w:color w:val="008000"/>
+    </w:rPr>
+  </w:style>
+  <w:style w:customStyle="1" w:styleId="CommentTok" w:type="character">
+    <w:name w:val="CommentTok"/>
+    <w:basedOn w:val="VerbatimChar"/>
+    <w:rPr>
+      <w:i/>
+      <w:color w:val="60a0b0"/>
+    </w:rPr>
+  </w:style>
+  <w:style w:customStyle="1" w:styleId="DocumentationTok" w:type="character">
+    <w:name w:val="DocumentationTok"/>
+    <w:basedOn w:val="VerbatimChar"/>
+    <w:rPr>
+      <w:i/>
+      <w:color w:val="ba2121"/>
+    </w:rPr>
+  </w:style>
+  <w:style w:customStyle="1" w:styleId="AnnotationTok" w:type="character">
+    <w:name w:val="AnnotationTok"/>
+    <w:basedOn w:val="VerbatimChar"/>
+    <w:rPr>
+      <w:b/>
+      <w:i/>
+      <w:color w:val="60a0b0"/>
+    </w:rPr>
+  </w:style>
+  <w:style w:customStyle="1" w:styleId="CommentVarTok" w:type="character">
+    <w:name w:val="CommentVarTok"/>
+    <w:basedOn w:val="VerbatimChar"/>
+    <w:rPr>
+      <w:b/>
+      <w:i/>
+      <w:color w:val="60a0b0"/>
+    </w:rPr>
+  </w:style>
+  <w:style w:customStyle="1" w:styleId="OtherTok" w:type="character">
+    <w:name w:val="OtherTok"/>
+    <w:basedOn w:val="VerbatimChar"/>
+    <w:rPr>
+      <w:color w:val="007020"/>
+    </w:rPr>
+  </w:style>
+  <w:style w:customStyle="1" w:styleId="FunctionTok" w:type="character">
+    <w:name w:val="FunctionTok"/>
+    <w:basedOn w:val="VerbatimChar"/>
+    <w:rPr>
+      <w:color w:val="06287e"/>
+    </w:rPr>
+  </w:style>
+  <w:style w:customStyle="1" w:styleId="VariableTok" w:type="character">
+    <w:name w:val="VariableTok"/>
+    <w:basedOn w:val="VerbatimChar"/>
+    <w:rPr>
+      <w:color w:val="19177c"/>
+    </w:rPr>
+  </w:style>
+  <w:style w:customStyle="1" w:styleId="ControlFlowTok" w:type="character">
+    <w:name w:val="ControlFlowTok"/>
+    <w:basedOn w:val="VerbatimChar"/>
+    <w:rPr>
+      <w:b/>
+      <w:color w:val="007020"/>
+    </w:rPr>
+  </w:style>
+  <w:style w:customStyle="1" w:styleId="OperatorTok" w:type="character">
+    <w:name w:val="OperatorTok"/>
+    <w:basedOn w:val="VerbatimChar"/>
+    <w:rPr>
+      <w:color w:val="666666"/>
+    </w:rPr>
+  </w:style>
+  <w:style w:customStyle="1" w:styleId="BuiltInTok" w:type="character">
+    <w:name w:val="BuiltInTok"/>
+    <w:basedOn w:val="VerbatimChar"/>
+    <w:rPr>
+      <w:color w:val="008000"/>
+    </w:rPr>
+  </w:style>
+  <w:style w:customStyle="1" w:styleId="ExtensionTok" w:type="character">
+    <w:name w:val="ExtensionTok"/>
+    <w:basedOn w:val="VerbatimChar"/>
+    <w:rPr/>
+  </w:style>
+  <w:style w:customStyle="1" w:styleId="PreprocessorTok" w:type="character">
+    <w:name w:val="PreprocessorTok"/>
+    <w:basedOn w:val="VerbatimChar"/>
+    <w:rPr>
+      <w:color w:val="bc7a00"/>
+    </w:rPr>
+  </w:style>
+  <w:style w:customStyle="1" w:styleId="AttributeTok" w:type="character">
+    <w:name w:val="AttributeTok"/>
+    <w:basedOn w:val="VerbatimChar"/>
+    <w:rPr>
+      <w:color w:val="7d9029"/>
+    </w:rPr>
+  </w:style>
+  <w:style w:customStyle="1" w:styleId="RegionMarkerTok" w:type="character">
+    <w:name w:val="RegionMarkerTok"/>
+    <w:basedOn w:val="VerbatimChar"/>
+    <w:rPr/>
+  </w:style>
+  <w:style w:customStyle="1" w:styleId="InformationTok" w:type="character">
+    <w:name w:val="InformationTok"/>
+    <w:basedOn w:val="VerbatimChar"/>
+    <w:rPr>
+      <w:b/>
+      <w:i/>
+      <w:color w:val="60a0b0"/>
+    </w:rPr>
+  </w:style>
+  <w:style w:customStyle="1" w:styleId="WarningTok" w:type="character">
+    <w:name w:val="WarningTok"/>
+    <w:basedOn w:val="VerbatimChar"/>
+    <w:rPr>
+      <w:b/>
+      <w:i/>
+      <w:color w:val="60a0b0"/>
+    </w:rPr>
+  </w:style>
+  <w:style w:customStyle="1" w:styleId="AlertTok" w:type="character">
+    <w:name w:val="AlertTok"/>
+    <w:basedOn w:val="VerbatimChar"/>
+    <w:rPr>
+      <w:b/>
+      <w:color w:val="ff0000"/>
+    </w:rPr>
+  </w:style>
+  <w:style w:customStyle="1" w:styleId="ErrorTok" w:type="character">
+    <w:name w:val="ErrorTok"/>
+    <w:basedOn w:val="VerbatimChar"/>
+    <w:rPr>
+      <w:b/>
+      <w:color w:val="ff0000"/>
+    </w:rPr>
+  </w:style>
+  <w:style w:customStyle="1" w:styleId="NormalTok" w:type="character">
+    <w:name w:val="NormalTok"/>
+    <w:basedOn w:val="VerbatimChar"/>
+    <w:rPr/>
   </w:style>
   <w:style w:customStyle="1" w:styleId="KeywordTok" w:type="character">
     <w:name w:val="KeywordTok"/>

</xml_diff>

<commit_message>
Use additive period effects and inline R Markdown output
</commit_message>
<xml_diff>
--- a/AFRI_Variables_Models_and_Datasets.docx
+++ b/AFRI_Variables_Models_and_Datasets.docx
@@ -61,7 +61,7 @@
         <w:rPr>
           <w:rStyle w:val="VerbatimChar"/>
         </w:rPr>
-        <w:t xml:space="preserve">response ~ TRT * SR * Period + (1 | Year) + (1 | Year:Pasture)</w:t>
+        <w:t xml:space="preserve">response ~ TRT * SR + Period + (1 | Year) + (1 | Year:Pasture)</w:t>
       </w:r>
       <w:r>
         <w:t xml:space="preserve">.</w:t>
@@ -81,7 +81,7 @@
         <w:rPr>
           <w:rStyle w:val="VerbatimChar"/>
         </w:rPr>
-        <w:t xml:space="preserve">gas ~ TRT * SR * RotationPeriod + (1 | Year) + (1 | Year:Pasture)</w:t>
+        <w:t xml:space="preserve">gas ~ TRT * SR + RotationPeriod + (1 | Year) + (1 | Year:Pasture)</w:t>
       </w:r>
       <w:r>
         <w:t xml:space="preserve">. RGP and Pasture_ID aliases are equivalent in source analyses. Period includes TRT:Period, SR:Period and TRT:SR:Period interactions. There is no animal random intercept or AR(1) candidate. The separate endpoint ANCOVA source retains its IBW covariate.</w:t>
@@ -1249,7 +1249,7 @@
               <w:rPr>
                 <w:rStyle w:val="VerbatimChar"/>
               </w:rPr>
-              <w:t xml:space="preserve">active_ha_all_pasture ~ TRT * SR * Period + (1 \| Year) + (1 \| Year:Pasture)</w:t>
+              <w:t xml:space="preserve">active_ha_all_pasture ~ TRT * SR + Period + (1 \| Year) + (1 \| Year:Pasture)</w:t>
             </w:r>
           </w:p>
         </w:tc>
@@ -1326,7 +1326,7 @@
               <w:rPr>
                 <w:rStyle w:val="VerbatimChar"/>
               </w:rPr>
-              <w:t xml:space="preserve">active_ha_inside_rgp ~ TRT * SR * Period + (1 \| Year) + (1 \| Year:Pasture)</w:t>
+              <w:t xml:space="preserve">active_ha_inside_rgp ~ TRT * SR + Period + (1 \| Year) + (1 \| Year:Pasture)</w:t>
             </w:r>
           </w:p>
         </w:tc>
@@ -1480,7 +1480,7 @@
               <w:rPr>
                 <w:rStyle w:val="VerbatimChar"/>
               </w:rPr>
-              <w:t xml:space="preserve">mean_RGP_ADG_kg_day ~ TRT * SR * Period + (1 \| Year) + (1 \| Year:Pasture)</w:t>
+              <w:t xml:space="preserve">mean_RGP_ADG_kg_day ~ TRT * SR + Period + (1 \| Year) + (1 \| Year:Pasture)</w:t>
             </w:r>
           </w:p>
         </w:tc>
@@ -1557,7 +1557,7 @@
               <w:rPr>
                 <w:rStyle w:val="VerbatimChar"/>
               </w:rPr>
-              <w:t xml:space="preserve">CH4_g_animal_day ~ TRT * SR * Period + (1 \| Year) + (1 \| Year:Pasture)</w:t>
+              <w:t xml:space="preserve">CH4_g_animal_day ~ TRT * SR + Period + (1 \| Year) + (1 \| Year:Pasture)</w:t>
             </w:r>
           </w:p>
         </w:tc>
@@ -1634,7 +1634,7 @@
               <w:rPr>
                 <w:rStyle w:val="VerbatimChar"/>
               </w:rPr>
-              <w:t xml:space="preserve">CO2_g_animal_day ~ TRT * SR * Period + (1 \| Year) + (1 \| Year:Pasture)</w:t>
+              <w:t xml:space="preserve">CO2_g_animal_day ~ TRT * SR + Period + (1 \| Year) + (1 \| Year:Pasture)</w:t>
             </w:r>
           </w:p>
         </w:tc>
@@ -1711,7 +1711,7 @@
               <w:rPr>
                 <w:rStyle w:val="VerbatimChar"/>
               </w:rPr>
-              <w:t xml:space="preserve">LWG_kg_per_active_ha_all_pasture ~ TRT * SR * Period + (1 \| Year) + (1 \| Year:Pasture)</w:t>
+              <w:t xml:space="preserve">LWG_kg_per_active_ha_all_pasture ~ TRT * SR + Period + (1 \| Year) + (1 \| Year:Pasture)</w:t>
             </w:r>
           </w:p>
         </w:tc>
@@ -1788,7 +1788,7 @@
               <w:rPr>
                 <w:rStyle w:val="VerbatimChar"/>
               </w:rPr>
-              <w:t xml:space="preserve">LWG_kg_per_active_ha_inside_rgp ~ TRT * SR * Period + (1 \| Year) + (1 \| Year:Pasture)</w:t>
+              <w:t xml:space="preserve">LWG_kg_per_active_ha_inside_rgp ~ TRT * SR + Period + (1 \| Year) + (1 \| Year:Pasture)</w:t>
             </w:r>
           </w:p>
         </w:tc>
@@ -1865,7 +1865,7 @@
               <w:rPr>
                 <w:rStyle w:val="VerbatimChar"/>
               </w:rPr>
-              <w:t xml:space="preserve">CH4_g_per_active_ha_all_pasture ~ TRT * SR * Period + (1 \| Year) + (1 \| Year:Pasture)</w:t>
+              <w:t xml:space="preserve">CH4_g_per_active_ha_all_pasture ~ TRT * SR + Period + (1 \| Year) + (1 \| Year:Pasture)</w:t>
             </w:r>
           </w:p>
         </w:tc>
@@ -1942,7 +1942,7 @@
               <w:rPr>
                 <w:rStyle w:val="VerbatimChar"/>
               </w:rPr>
-              <w:t xml:space="preserve">CH4_g_per_active_ha_inside_rgp ~ TRT * SR * Period + (1 \| Year) + (1 \| Year:Pasture)</w:t>
+              <w:t xml:space="preserve">CH4_g_per_active_ha_inside_rgp ~ TRT * SR + Period + (1 \| Year) + (1 \| Year:Pasture)</w:t>
             </w:r>
           </w:p>
         </w:tc>
@@ -2019,7 +2019,7 @@
               <w:rPr>
                 <w:rStyle w:val="VerbatimChar"/>
               </w:rPr>
-              <w:t xml:space="preserve">CO2_g_per_active_ha_all_pasture ~ TRT * SR * Period + (1 \| Year) + (1 \| Year:Pasture)</w:t>
+              <w:t xml:space="preserve">CO2_g_per_active_ha_all_pasture ~ TRT * SR + Period + (1 \| Year) + (1 \| Year:Pasture)</w:t>
             </w:r>
           </w:p>
         </w:tc>
@@ -2096,7 +2096,7 @@
               <w:rPr>
                 <w:rStyle w:val="VerbatimChar"/>
               </w:rPr>
-              <w:t xml:space="preserve">CO2_g_per_active_ha_inside_rgp ~ TRT * SR * Period + (1 \| Year) + (1 \| Year:Pasture)</w:t>
+              <w:t xml:space="preserve">CO2_g_per_active_ha_inside_rgp ~ TRT * SR + Period + (1 \| Year) + (1 \| Year:Pasture)</w:t>
             </w:r>
           </w:p>
         </w:tc>
@@ -2173,7 +2173,7 @@
               <w:rPr>
                 <w:rStyle w:val="VerbatimChar"/>
               </w:rPr>
-              <w:t xml:space="preserve">CH4_g_per_kg_LWG ~ TRT * SR * Period + (1 \| Year) + (1 \| Year:Pasture)</w:t>
+              <w:t xml:space="preserve">CH4_g_per_kg_LWG ~ TRT * SR + Period + (1 \| Year) + (1 \| Year:Pasture)</w:t>
             </w:r>
           </w:p>
         </w:tc>
@@ -2250,7 +2250,7 @@
               <w:rPr>
                 <w:rStyle w:val="VerbatimChar"/>
               </w:rPr>
-              <w:t xml:space="preserve">CO2_g_per_kg_LWG ~ TRT * SR * Period + (1 \| Year) + (1 \| Year:Pasture)</w:t>
+              <w:t xml:space="preserve">CO2_g_per_kg_LWG ~ TRT * SR + Period + (1 \| Year) + (1 \| Year:Pasture)</w:t>
             </w:r>
           </w:p>
         </w:tc>
@@ -3405,7 +3405,7 @@
               <w:rPr>
                 <w:rStyle w:val="VerbatimChar"/>
               </w:rPr>
-              <w:t xml:space="preserve">RGP_CH4_g_day ~ TRT * SR * Period + (1 \| Year) + (1 \| Year:Pasture)</w:t>
+              <w:t xml:space="preserve">RGP_CH4_g_day ~ TRT * SR + Period + (1 \| Year) + (1 \| Year:Pasture)</w:t>
             </w:r>
           </w:p>
         </w:tc>
@@ -3482,7 +3482,7 @@
               <w:rPr>
                 <w:rStyle w:val="VerbatimChar"/>
               </w:rPr>
-              <w:t xml:space="preserve">RGP_CO2_g_day ~ TRT * SR * Period + (1 \| Year) + (1 \| Year:Pasture)</w:t>
+              <w:t xml:space="preserve">RGP_CO2_g_day ~ TRT * SR + Period + (1 \| Year) + (1 \| Year:Pasture)</w:t>
             </w:r>
           </w:p>
         </w:tc>
@@ -3559,7 +3559,7 @@
               <w:rPr>
                 <w:rStyle w:val="VerbatimChar"/>
               </w:rPr>
-              <w:t xml:space="preserve">RGP_Smooth_ADG_kg_day ~ TRT * SR * Period + (1 \| Year) + (1 \| Year:Pasture)</w:t>
+              <w:t xml:space="preserve">RGP_Smooth_ADG_kg_day ~ TRT * SR + Period + (1 \| Year) + (1 \| Year:Pasture)</w:t>
             </w:r>
           </w:p>
         </w:tc>
@@ -3636,7 +3636,7 @@
               <w:rPr>
                 <w:rStyle w:val="VerbatimChar"/>
               </w:rPr>
-              <w:t xml:space="preserve">CH4_g_d ~ TRT * SR * RotationPeriod + (1 \| Year) + (1 \| Year:Pasture)</w:t>
+              <w:t xml:space="preserve">CH4_g_d ~ TRT * SR + RotationPeriod + (1 \| Year) + (1 \| Year:Pasture)</w:t>
             </w:r>
           </w:p>
         </w:tc>
@@ -3713,7 +3713,7 @@
               <w:rPr>
                 <w:rStyle w:val="VerbatimChar"/>
               </w:rPr>
-              <w:t xml:space="preserve">CO2_g_d ~ TRT * SR * RotationPeriod + (1 \| Year) + (1 \| Year:Pasture)</w:t>
+              <w:t xml:space="preserve">CO2_g_d ~ TRT * SR + RotationPeriod + (1 \| Year) + (1 \| Year:Pasture)</w:t>
             </w:r>
           </w:p>
         </w:tc>
@@ -3944,7 +3944,7 @@
               <w:rPr>
                 <w:rStyle w:val="VerbatimChar"/>
               </w:rPr>
-              <w:t xml:space="preserve">CH4_g_d ~ TRT * SR * Period + (1 \| Year) + (1 \| Year:Pasture)</w:t>
+              <w:t xml:space="preserve">CH4_g_d ~ TRT * SR + Period + (1 \| Year) + (1 \| Year:Pasture)</w:t>
             </w:r>
           </w:p>
         </w:tc>
@@ -4021,7 +4021,7 @@
               <w:rPr>
                 <w:rStyle w:val="VerbatimChar"/>
               </w:rPr>
-              <w:t xml:space="preserve">CO2_g_d ~ TRT * SR * Period + (1 \| Year) + (1 \| Year:Pasture)</w:t>
+              <w:t xml:space="preserve">CO2_g_d ~ TRT * SR + Period + (1 \| Year) + (1 \| Year:Pasture)</w:t>
             </w:r>
           </w:p>
         </w:tc>
@@ -4098,7 +4098,7 @@
               <w:rPr>
                 <w:rStyle w:val="VerbatimChar"/>
               </w:rPr>
-              <w:t xml:space="preserve">Percent_pasture_active ~ TRT * SR * RGP + (1 \| Year) + (1 \| Year:Pasture)</w:t>
+              <w:t xml:space="preserve">Percent_pasture_active ~ TRT * SR + RGP + (1 \| Year) + (1 \| Year:Pasture)</w:t>
             </w:r>
           </w:p>
         </w:tc>
@@ -4175,7 +4175,7 @@
               <w:rPr>
                 <w:rStyle w:val="VerbatimChar"/>
               </w:rPr>
-              <w:t xml:space="preserve">Gain_kg_per_active_ha ~ TRT * SR * RGP + (1 \| Year) + (1 \| Year:Pasture)</w:t>
+              <w:t xml:space="preserve">Gain_kg_per_active_ha ~ TRT * SR + RGP + (1 \| Year) + (1 \| Year:Pasture)</w:t>
             </w:r>
           </w:p>
         </w:tc>
@@ -4252,7 +4252,7 @@
               <w:rPr>
                 <w:rStyle w:val="VerbatimChar"/>
               </w:rPr>
-              <w:t xml:space="preserve">Percent_pasture_active ~ TRT * SR * RGP + (1 \| Year) + (1 \| Year:Pasture)</w:t>
+              <w:t xml:space="preserve">Percent_pasture_active ~ TRT * SR + RGP + (1 \| Year) + (1 \| Year:Pasture)</w:t>
             </w:r>
           </w:p>
         </w:tc>
@@ -4329,7 +4329,7 @@
               <w:rPr>
                 <w:rStyle w:val="VerbatimChar"/>
               </w:rPr>
-              <w:t xml:space="preserve">Gain_kg_per_active_ha ~ TRT * SR * RGP + (1 \| Year) + (1 \| Year:Pasture)</w:t>
+              <w:t xml:space="preserve">Gain_kg_per_active_ha ~ TRT * SR + RGP + (1 \| Year) + (1 \| Year:Pasture)</w:t>
             </w:r>
           </w:p>
         </w:tc>
@@ -16693,6 +16693,232 @@
     <w:pPr>
       <w:wordWrap w:val="off"/>
     </w:pPr>
+  </w:style>
+  <w:style w:customStyle="1" w:styleId="KeywordTok" w:type="character">
+    <w:name w:val="KeywordTok"/>
+    <w:basedOn w:val="VerbatimChar"/>
+    <w:rPr>
+      <w:b/>
+      <w:color w:val="007020"/>
+    </w:rPr>
+  </w:style>
+  <w:style w:customStyle="1" w:styleId="DataTypeTok" w:type="character">
+    <w:name w:val="DataTypeTok"/>
+    <w:basedOn w:val="VerbatimChar"/>
+    <w:rPr>
+      <w:color w:val="902000"/>
+    </w:rPr>
+  </w:style>
+  <w:style w:customStyle="1" w:styleId="DecValTok" w:type="character">
+    <w:name w:val="DecValTok"/>
+    <w:basedOn w:val="VerbatimChar"/>
+    <w:rPr>
+      <w:color w:val="40a070"/>
+    </w:rPr>
+  </w:style>
+  <w:style w:customStyle="1" w:styleId="BaseNTok" w:type="character">
+    <w:name w:val="BaseNTok"/>
+    <w:basedOn w:val="VerbatimChar"/>
+    <w:rPr>
+      <w:color w:val="40a070"/>
+    </w:rPr>
+  </w:style>
+  <w:style w:customStyle="1" w:styleId="FloatTok" w:type="character">
+    <w:name w:val="FloatTok"/>
+    <w:basedOn w:val="VerbatimChar"/>
+    <w:rPr>
+      <w:color w:val="40a070"/>
+    </w:rPr>
+  </w:style>
+  <w:style w:customStyle="1" w:styleId="ConstantTok" w:type="character">
+    <w:name w:val="ConstantTok"/>
+    <w:basedOn w:val="VerbatimChar"/>
+    <w:rPr>
+      <w:color w:val="880000"/>
+    </w:rPr>
+  </w:style>
+  <w:style w:customStyle="1" w:styleId="CharTok" w:type="character">
+    <w:name w:val="CharTok"/>
+    <w:basedOn w:val="VerbatimChar"/>
+    <w:rPr>
+      <w:color w:val="4070a0"/>
+    </w:rPr>
+  </w:style>
+  <w:style w:customStyle="1" w:styleId="SpecialCharTok" w:type="character">
+    <w:name w:val="SpecialCharTok"/>
+    <w:basedOn w:val="VerbatimChar"/>
+    <w:rPr>
+      <w:color w:val="4070a0"/>
+    </w:rPr>
+  </w:style>
+  <w:style w:customStyle="1" w:styleId="StringTok" w:type="character">
+    <w:name w:val="StringTok"/>
+    <w:basedOn w:val="VerbatimChar"/>
+    <w:rPr>
+      <w:color w:val="4070a0"/>
+    </w:rPr>
+  </w:style>
+  <w:style w:customStyle="1" w:styleId="VerbatimStringTok" w:type="character">
+    <w:name w:val="VerbatimStringTok"/>
+    <w:basedOn w:val="VerbatimChar"/>
+    <w:rPr>
+      <w:color w:val="4070a0"/>
+    </w:rPr>
+  </w:style>
+  <w:style w:customStyle="1" w:styleId="SpecialStringTok" w:type="character">
+    <w:name w:val="SpecialStringTok"/>
+    <w:basedOn w:val="VerbatimChar"/>
+    <w:rPr>
+      <w:color w:val="bb6688"/>
+    </w:rPr>
+  </w:style>
+  <w:style w:customStyle="1" w:styleId="ImportTok" w:type="character">
+    <w:name w:val="ImportTok"/>
+    <w:basedOn w:val="VerbatimChar"/>
+    <w:rPr>
+      <w:b/>
+      <w:color w:val="008000"/>
+    </w:rPr>
+  </w:style>
+  <w:style w:customStyle="1" w:styleId="CommentTok" w:type="character">
+    <w:name w:val="CommentTok"/>
+    <w:basedOn w:val="VerbatimChar"/>
+    <w:rPr>
+      <w:i/>
+      <w:color w:val="60a0b0"/>
+    </w:rPr>
+  </w:style>
+  <w:style w:customStyle="1" w:styleId="DocumentationTok" w:type="character">
+    <w:name w:val="DocumentationTok"/>
+    <w:basedOn w:val="VerbatimChar"/>
+    <w:rPr>
+      <w:i/>
+      <w:color w:val="ba2121"/>
+    </w:rPr>
+  </w:style>
+  <w:style w:customStyle="1" w:styleId="AnnotationTok" w:type="character">
+    <w:name w:val="AnnotationTok"/>
+    <w:basedOn w:val="VerbatimChar"/>
+    <w:rPr>
+      <w:b/>
+      <w:i/>
+      <w:color w:val="60a0b0"/>
+    </w:rPr>
+  </w:style>
+  <w:style w:customStyle="1" w:styleId="CommentVarTok" w:type="character">
+    <w:name w:val="CommentVarTok"/>
+    <w:basedOn w:val="VerbatimChar"/>
+    <w:rPr>
+      <w:b/>
+      <w:i/>
+      <w:color w:val="60a0b0"/>
+    </w:rPr>
+  </w:style>
+  <w:style w:customStyle="1" w:styleId="OtherTok" w:type="character">
+    <w:name w:val="OtherTok"/>
+    <w:basedOn w:val="VerbatimChar"/>
+    <w:rPr>
+      <w:color w:val="007020"/>
+    </w:rPr>
+  </w:style>
+  <w:style w:customStyle="1" w:styleId="FunctionTok" w:type="character">
+    <w:name w:val="FunctionTok"/>
+    <w:basedOn w:val="VerbatimChar"/>
+    <w:rPr>
+      <w:color w:val="06287e"/>
+    </w:rPr>
+  </w:style>
+  <w:style w:customStyle="1" w:styleId="VariableTok" w:type="character">
+    <w:name w:val="VariableTok"/>
+    <w:basedOn w:val="VerbatimChar"/>
+    <w:rPr>
+      <w:color w:val="19177c"/>
+    </w:rPr>
+  </w:style>
+  <w:style w:customStyle="1" w:styleId="ControlFlowTok" w:type="character">
+    <w:name w:val="ControlFlowTok"/>
+    <w:basedOn w:val="VerbatimChar"/>
+    <w:rPr>
+      <w:b/>
+      <w:color w:val="007020"/>
+    </w:rPr>
+  </w:style>
+  <w:style w:customStyle="1" w:styleId="OperatorTok" w:type="character">
+    <w:name w:val="OperatorTok"/>
+    <w:basedOn w:val="VerbatimChar"/>
+    <w:rPr>
+      <w:color w:val="666666"/>
+    </w:rPr>
+  </w:style>
+  <w:style w:customStyle="1" w:styleId="BuiltInTok" w:type="character">
+    <w:name w:val="BuiltInTok"/>
+    <w:basedOn w:val="VerbatimChar"/>
+    <w:rPr>
+      <w:color w:val="008000"/>
+    </w:rPr>
+  </w:style>
+  <w:style w:customStyle="1" w:styleId="ExtensionTok" w:type="character">
+    <w:name w:val="ExtensionTok"/>
+    <w:basedOn w:val="VerbatimChar"/>
+    <w:rPr/>
+  </w:style>
+  <w:style w:customStyle="1" w:styleId="PreprocessorTok" w:type="character">
+    <w:name w:val="PreprocessorTok"/>
+    <w:basedOn w:val="VerbatimChar"/>
+    <w:rPr>
+      <w:color w:val="bc7a00"/>
+    </w:rPr>
+  </w:style>
+  <w:style w:customStyle="1" w:styleId="AttributeTok" w:type="character">
+    <w:name w:val="AttributeTok"/>
+    <w:basedOn w:val="VerbatimChar"/>
+    <w:rPr>
+      <w:color w:val="7d9029"/>
+    </w:rPr>
+  </w:style>
+  <w:style w:customStyle="1" w:styleId="RegionMarkerTok" w:type="character">
+    <w:name w:val="RegionMarkerTok"/>
+    <w:basedOn w:val="VerbatimChar"/>
+    <w:rPr/>
+  </w:style>
+  <w:style w:customStyle="1" w:styleId="InformationTok" w:type="character">
+    <w:name w:val="InformationTok"/>
+    <w:basedOn w:val="VerbatimChar"/>
+    <w:rPr>
+      <w:b/>
+      <w:i/>
+      <w:color w:val="60a0b0"/>
+    </w:rPr>
+  </w:style>
+  <w:style w:customStyle="1" w:styleId="WarningTok" w:type="character">
+    <w:name w:val="WarningTok"/>
+    <w:basedOn w:val="VerbatimChar"/>
+    <w:rPr>
+      <w:b/>
+      <w:i/>
+      <w:color w:val="60a0b0"/>
+    </w:rPr>
+  </w:style>
+  <w:style w:customStyle="1" w:styleId="AlertTok" w:type="character">
+    <w:name w:val="AlertTok"/>
+    <w:basedOn w:val="VerbatimChar"/>
+    <w:rPr>
+      <w:b/>
+      <w:color w:val="ff0000"/>
+    </w:rPr>
+  </w:style>
+  <w:style w:customStyle="1" w:styleId="ErrorTok" w:type="character">
+    <w:name w:val="ErrorTok"/>
+    <w:basedOn w:val="VerbatimChar"/>
+    <w:rPr>
+      <w:b/>
+      <w:color w:val="ff0000"/>
+    </w:rPr>
+  </w:style>
+  <w:style w:customStyle="1" w:styleId="NormalTok" w:type="character">
+    <w:name w:val="NormalTok"/>
+    <w:basedOn w:val="VerbatimChar"/>
+    <w:rPr/>
   </w:style>
   <w:style w:customStyle="1" w:styleId="KeywordTok" w:type="character">
     <w:name w:val="KeywordTok"/>

</xml_diff>

<commit_message>
Restore full Period and RotationPeriod model interactions
</commit_message>
<xml_diff>
--- a/AFRI_Variables_Models_and_Datasets.docx
+++ b/AFRI_Variables_Models_and_Datasets.docx
@@ -61,7 +61,7 @@
         <w:rPr>
           <w:rStyle w:val="VerbatimChar"/>
         </w:rPr>
-        <w:t xml:space="preserve">response ~ TRT * SR + Period + (1 | Year) + (1 | Year:Pasture)</w:t>
+        <w:t xml:space="preserve">response ~ TRT * SR * Period + (1 | Year) + (1 | Year:Pasture)</w:t>
       </w:r>
       <w:r>
         <w:t xml:space="preserve">.</w:t>
@@ -81,7 +81,7 @@
         <w:rPr>
           <w:rStyle w:val="VerbatimChar"/>
         </w:rPr>
-        <w:t xml:space="preserve">gas ~ TRT * SR + RotationPeriod + (1 | Year) + (1 | Year:Pasture)</w:t>
+        <w:t xml:space="preserve">gas ~ TRT * SR * RotationPeriod + (1 | Year) + (1 | Year:Pasture)</w:t>
       </w:r>
       <w:r>
         <w:t xml:space="preserve">. RGP and Pasture_ID aliases are equivalent in source analyses. Period includes TRT:Period, SR:Period and TRT:SR:Period interactions. There is no animal random intercept or AR(1) candidate. The separate endpoint ANCOVA source retains its IBW covariate.</w:t>
@@ -1249,7 +1249,7 @@
               <w:rPr>
                 <w:rStyle w:val="VerbatimChar"/>
               </w:rPr>
-              <w:t xml:space="preserve">active_ha_all_pasture ~ TRT * SR + Period + (1 \| Year) + (1 \| Year:Pasture)</w:t>
+              <w:t xml:space="preserve">active_ha_all_pasture ~ TRT * SR * Period + (1 \| Year) + (1 \| Year:Pasture)</w:t>
             </w:r>
           </w:p>
         </w:tc>
@@ -1326,7 +1326,7 @@
               <w:rPr>
                 <w:rStyle w:val="VerbatimChar"/>
               </w:rPr>
-              <w:t xml:space="preserve">active_ha_inside_rgp ~ TRT * SR + Period + (1 \| Year) + (1 \| Year:Pasture)</w:t>
+              <w:t xml:space="preserve">active_ha_inside_rgp ~ TRT * SR * Period + (1 \| Year) + (1 \| Year:Pasture)</w:t>
             </w:r>
           </w:p>
         </w:tc>
@@ -1480,7 +1480,7 @@
               <w:rPr>
                 <w:rStyle w:val="VerbatimChar"/>
               </w:rPr>
-              <w:t xml:space="preserve">mean_RGP_ADG_kg_day ~ TRT * SR + Period + (1 \| Year) + (1 \| Year:Pasture)</w:t>
+              <w:t xml:space="preserve">mean_RGP_ADG_kg_day ~ TRT * SR * Period + (1 \| Year) + (1 \| Year:Pasture)</w:t>
             </w:r>
           </w:p>
         </w:tc>
@@ -1557,7 +1557,7 @@
               <w:rPr>
                 <w:rStyle w:val="VerbatimChar"/>
               </w:rPr>
-              <w:t xml:space="preserve">CH4_g_animal_day ~ TRT * SR + Period + (1 \| Year) + (1 \| Year:Pasture)</w:t>
+              <w:t xml:space="preserve">CH4_g_animal_day ~ TRT * SR * Period + (1 \| Year) + (1 \| Year:Pasture)</w:t>
             </w:r>
           </w:p>
         </w:tc>
@@ -1634,7 +1634,7 @@
               <w:rPr>
                 <w:rStyle w:val="VerbatimChar"/>
               </w:rPr>
-              <w:t xml:space="preserve">CO2_g_animal_day ~ TRT * SR + Period + (1 \| Year) + (1 \| Year:Pasture)</w:t>
+              <w:t xml:space="preserve">CO2_g_animal_day ~ TRT * SR * Period + (1 \| Year) + (1 \| Year:Pasture)</w:t>
             </w:r>
           </w:p>
         </w:tc>
@@ -1711,7 +1711,7 @@
               <w:rPr>
                 <w:rStyle w:val="VerbatimChar"/>
               </w:rPr>
-              <w:t xml:space="preserve">LWG_kg_per_active_ha_all_pasture ~ TRT * SR + Period + (1 \| Year) + (1 \| Year:Pasture)</w:t>
+              <w:t xml:space="preserve">LWG_kg_per_active_ha_all_pasture ~ TRT * SR * Period + (1 \| Year) + (1 \| Year:Pasture)</w:t>
             </w:r>
           </w:p>
         </w:tc>
@@ -1788,7 +1788,7 @@
               <w:rPr>
                 <w:rStyle w:val="VerbatimChar"/>
               </w:rPr>
-              <w:t xml:space="preserve">LWG_kg_per_active_ha_inside_rgp ~ TRT * SR + Period + (1 \| Year) + (1 \| Year:Pasture)</w:t>
+              <w:t xml:space="preserve">LWG_kg_per_active_ha_inside_rgp ~ TRT * SR * Period + (1 \| Year) + (1 \| Year:Pasture)</w:t>
             </w:r>
           </w:p>
         </w:tc>
@@ -1865,7 +1865,7 @@
               <w:rPr>
                 <w:rStyle w:val="VerbatimChar"/>
               </w:rPr>
-              <w:t xml:space="preserve">CH4_g_per_active_ha_all_pasture ~ TRT * SR + Period + (1 \| Year) + (1 \| Year:Pasture)</w:t>
+              <w:t xml:space="preserve">CH4_g_per_active_ha_all_pasture ~ TRT * SR * Period + (1 \| Year) + (1 \| Year:Pasture)</w:t>
             </w:r>
           </w:p>
         </w:tc>
@@ -1942,7 +1942,7 @@
               <w:rPr>
                 <w:rStyle w:val="VerbatimChar"/>
               </w:rPr>
-              <w:t xml:space="preserve">CH4_g_per_active_ha_inside_rgp ~ TRT * SR + Period + (1 \| Year) + (1 \| Year:Pasture)</w:t>
+              <w:t xml:space="preserve">CH4_g_per_active_ha_inside_rgp ~ TRT * SR * Period + (1 \| Year) + (1 \| Year:Pasture)</w:t>
             </w:r>
           </w:p>
         </w:tc>
@@ -2019,7 +2019,7 @@
               <w:rPr>
                 <w:rStyle w:val="VerbatimChar"/>
               </w:rPr>
-              <w:t xml:space="preserve">CO2_g_per_active_ha_all_pasture ~ TRT * SR + Period + (1 \| Year) + (1 \| Year:Pasture)</w:t>
+              <w:t xml:space="preserve">CO2_g_per_active_ha_all_pasture ~ TRT * SR * Period + (1 \| Year) + (1 \| Year:Pasture)</w:t>
             </w:r>
           </w:p>
         </w:tc>
@@ -2096,7 +2096,7 @@
               <w:rPr>
                 <w:rStyle w:val="VerbatimChar"/>
               </w:rPr>
-              <w:t xml:space="preserve">CO2_g_per_active_ha_inside_rgp ~ TRT * SR + Period + (1 \| Year) + (1 \| Year:Pasture)</w:t>
+              <w:t xml:space="preserve">CO2_g_per_active_ha_inside_rgp ~ TRT * SR * Period + (1 \| Year) + (1 \| Year:Pasture)</w:t>
             </w:r>
           </w:p>
         </w:tc>
@@ -2173,7 +2173,7 @@
               <w:rPr>
                 <w:rStyle w:val="VerbatimChar"/>
               </w:rPr>
-              <w:t xml:space="preserve">CH4_g_per_kg_LWG ~ TRT * SR + Period + (1 \| Year) + (1 \| Year:Pasture)</w:t>
+              <w:t xml:space="preserve">CH4_g_per_kg_LWG ~ TRT * SR * Period + (1 \| Year) + (1 \| Year:Pasture)</w:t>
             </w:r>
           </w:p>
         </w:tc>
@@ -2250,7 +2250,7 @@
               <w:rPr>
                 <w:rStyle w:val="VerbatimChar"/>
               </w:rPr>
-              <w:t xml:space="preserve">CO2_g_per_kg_LWG ~ TRT * SR + Period + (1 \| Year) + (1 \| Year:Pasture)</w:t>
+              <w:t xml:space="preserve">CO2_g_per_kg_LWG ~ TRT * SR * Period + (1 \| Year) + (1 \| Year:Pasture)</w:t>
             </w:r>
           </w:p>
         </w:tc>
@@ -3405,7 +3405,7 @@
               <w:rPr>
                 <w:rStyle w:val="VerbatimChar"/>
               </w:rPr>
-              <w:t xml:space="preserve">RGP_CH4_g_day ~ TRT * SR + Period + (1 \| Year) + (1 \| Year:Pasture)</w:t>
+              <w:t xml:space="preserve">RGP_CH4_g_day ~ TRT * SR * Period + (1 \| Year) + (1 \| Year:Pasture)</w:t>
             </w:r>
           </w:p>
         </w:tc>
@@ -3482,7 +3482,7 @@
               <w:rPr>
                 <w:rStyle w:val="VerbatimChar"/>
               </w:rPr>
-              <w:t xml:space="preserve">RGP_CO2_g_day ~ TRT * SR + Period + (1 \| Year) + (1 \| Year:Pasture)</w:t>
+              <w:t xml:space="preserve">RGP_CO2_g_day ~ TRT * SR * Period + (1 \| Year) + (1 \| Year:Pasture)</w:t>
             </w:r>
           </w:p>
         </w:tc>
@@ -3559,7 +3559,7 @@
               <w:rPr>
                 <w:rStyle w:val="VerbatimChar"/>
               </w:rPr>
-              <w:t xml:space="preserve">RGP_Smooth_ADG_kg_day ~ TRT * SR + Period + (1 \| Year) + (1 \| Year:Pasture)</w:t>
+              <w:t xml:space="preserve">RGP_Smooth_ADG_kg_day ~ TRT * SR * Period + (1 \| Year) + (1 \| Year:Pasture)</w:t>
             </w:r>
           </w:p>
         </w:tc>
@@ -3636,7 +3636,7 @@
               <w:rPr>
                 <w:rStyle w:val="VerbatimChar"/>
               </w:rPr>
-              <w:t xml:space="preserve">CH4_g_d ~ TRT * SR + RotationPeriod + (1 \| Year) + (1 \| Year:Pasture)</w:t>
+              <w:t xml:space="preserve">CH4_g_d ~ TRT * SR * RotationPeriod + (1 \| Year) + (1 \| Year:Pasture)</w:t>
             </w:r>
           </w:p>
         </w:tc>
@@ -3713,7 +3713,7 @@
               <w:rPr>
                 <w:rStyle w:val="VerbatimChar"/>
               </w:rPr>
-              <w:t xml:space="preserve">CO2_g_d ~ TRT * SR + RotationPeriod + (1 \| Year) + (1 \| Year:Pasture)</w:t>
+              <w:t xml:space="preserve">CO2_g_d ~ TRT * SR * RotationPeriod + (1 \| Year) + (1 \| Year:Pasture)</w:t>
             </w:r>
           </w:p>
         </w:tc>
@@ -3944,7 +3944,7 @@
               <w:rPr>
                 <w:rStyle w:val="VerbatimChar"/>
               </w:rPr>
-              <w:t xml:space="preserve">CH4_g_d ~ TRT * SR + Period + (1 \| Year) + (1 \| Year:Pasture)</w:t>
+              <w:t xml:space="preserve">CH4_g_d ~ TRT * SR * Period + (1 \| Year) + (1 \| Year:Pasture)</w:t>
             </w:r>
           </w:p>
         </w:tc>
@@ -4021,7 +4021,7 @@
               <w:rPr>
                 <w:rStyle w:val="VerbatimChar"/>
               </w:rPr>
-              <w:t xml:space="preserve">CO2_g_d ~ TRT * SR + Period + (1 \| Year) + (1 \| Year:Pasture)</w:t>
+              <w:t xml:space="preserve">CO2_g_d ~ TRT * SR * Period + (1 \| Year) + (1 \| Year:Pasture)</w:t>
             </w:r>
           </w:p>
         </w:tc>
@@ -4098,7 +4098,7 @@
               <w:rPr>
                 <w:rStyle w:val="VerbatimChar"/>
               </w:rPr>
-              <w:t xml:space="preserve">Percent_pasture_active ~ TRT * SR + RGP + (1 \| Year) + (1 \| Year:Pasture)</w:t>
+              <w:t xml:space="preserve">Percent_pasture_active ~ TRT * SR * RGP + (1 \| Year) + (1 \| Year:Pasture)</w:t>
             </w:r>
           </w:p>
         </w:tc>
@@ -4175,7 +4175,7 @@
               <w:rPr>
                 <w:rStyle w:val="VerbatimChar"/>
               </w:rPr>
-              <w:t xml:space="preserve">Gain_kg_per_active_ha ~ TRT * SR + RGP + (1 \| Year) + (1 \| Year:Pasture)</w:t>
+              <w:t xml:space="preserve">Gain_kg_per_active_ha ~ TRT * SR * RGP + (1 \| Year) + (1 \| Year:Pasture)</w:t>
             </w:r>
           </w:p>
         </w:tc>
@@ -4252,7 +4252,7 @@
               <w:rPr>
                 <w:rStyle w:val="VerbatimChar"/>
               </w:rPr>
-              <w:t xml:space="preserve">Percent_pasture_active ~ TRT * SR + RGP + (1 \| Year) + (1 \| Year:Pasture)</w:t>
+              <w:t xml:space="preserve">Percent_pasture_active ~ TRT * SR * RGP + (1 \| Year) + (1 \| Year:Pasture)</w:t>
             </w:r>
           </w:p>
         </w:tc>
@@ -4329,7 +4329,7 @@
               <w:rPr>
                 <w:rStyle w:val="VerbatimChar"/>
               </w:rPr>
-              <w:t xml:space="preserve">Gain_kg_per_active_ha ~ TRT * SR + RGP + (1 \| Year) + (1 \| Year:Pasture)</w:t>
+              <w:t xml:space="preserve">Gain_kg_per_active_ha ~ TRT * SR * RGP + (1 \| Year) + (1 \| Year:Pasture)</w:t>
             </w:r>
           </w:p>
         </w:tc>
@@ -16693,6 +16693,232 @@
     <w:pPr>
       <w:wordWrap w:val="off"/>
     </w:pPr>
+  </w:style>
+  <w:style w:customStyle="1" w:styleId="KeywordTok" w:type="character">
+    <w:name w:val="KeywordTok"/>
+    <w:basedOn w:val="VerbatimChar"/>
+    <w:rPr>
+      <w:b/>
+      <w:color w:val="007020"/>
+    </w:rPr>
+  </w:style>
+  <w:style w:customStyle="1" w:styleId="DataTypeTok" w:type="character">
+    <w:name w:val="DataTypeTok"/>
+    <w:basedOn w:val="VerbatimChar"/>
+    <w:rPr>
+      <w:color w:val="902000"/>
+    </w:rPr>
+  </w:style>
+  <w:style w:customStyle="1" w:styleId="DecValTok" w:type="character">
+    <w:name w:val="DecValTok"/>
+    <w:basedOn w:val="VerbatimChar"/>
+    <w:rPr>
+      <w:color w:val="40a070"/>
+    </w:rPr>
+  </w:style>
+  <w:style w:customStyle="1" w:styleId="BaseNTok" w:type="character">
+    <w:name w:val="BaseNTok"/>
+    <w:basedOn w:val="VerbatimChar"/>
+    <w:rPr>
+      <w:color w:val="40a070"/>
+    </w:rPr>
+  </w:style>
+  <w:style w:customStyle="1" w:styleId="FloatTok" w:type="character">
+    <w:name w:val="FloatTok"/>
+    <w:basedOn w:val="VerbatimChar"/>
+    <w:rPr>
+      <w:color w:val="40a070"/>
+    </w:rPr>
+  </w:style>
+  <w:style w:customStyle="1" w:styleId="ConstantTok" w:type="character">
+    <w:name w:val="ConstantTok"/>
+    <w:basedOn w:val="VerbatimChar"/>
+    <w:rPr>
+      <w:color w:val="880000"/>
+    </w:rPr>
+  </w:style>
+  <w:style w:customStyle="1" w:styleId="CharTok" w:type="character">
+    <w:name w:val="CharTok"/>
+    <w:basedOn w:val="VerbatimChar"/>
+    <w:rPr>
+      <w:color w:val="4070a0"/>
+    </w:rPr>
+  </w:style>
+  <w:style w:customStyle="1" w:styleId="SpecialCharTok" w:type="character">
+    <w:name w:val="SpecialCharTok"/>
+    <w:basedOn w:val="VerbatimChar"/>
+    <w:rPr>
+      <w:color w:val="4070a0"/>
+    </w:rPr>
+  </w:style>
+  <w:style w:customStyle="1" w:styleId="StringTok" w:type="character">
+    <w:name w:val="StringTok"/>
+    <w:basedOn w:val="VerbatimChar"/>
+    <w:rPr>
+      <w:color w:val="4070a0"/>
+    </w:rPr>
+  </w:style>
+  <w:style w:customStyle="1" w:styleId="VerbatimStringTok" w:type="character">
+    <w:name w:val="VerbatimStringTok"/>
+    <w:basedOn w:val="VerbatimChar"/>
+    <w:rPr>
+      <w:color w:val="4070a0"/>
+    </w:rPr>
+  </w:style>
+  <w:style w:customStyle="1" w:styleId="SpecialStringTok" w:type="character">
+    <w:name w:val="SpecialStringTok"/>
+    <w:basedOn w:val="VerbatimChar"/>
+    <w:rPr>
+      <w:color w:val="bb6688"/>
+    </w:rPr>
+  </w:style>
+  <w:style w:customStyle="1" w:styleId="ImportTok" w:type="character">
+    <w:name w:val="ImportTok"/>
+    <w:basedOn w:val="VerbatimChar"/>
+    <w:rPr>
+      <w:b/>
+      <w:color w:val="008000"/>
+    </w:rPr>
+  </w:style>
+  <w:style w:customStyle="1" w:styleId="CommentTok" w:type="character">
+    <w:name w:val="CommentTok"/>
+    <w:basedOn w:val="VerbatimChar"/>
+    <w:rPr>
+      <w:i/>
+      <w:color w:val="60a0b0"/>
+    </w:rPr>
+  </w:style>
+  <w:style w:customStyle="1" w:styleId="DocumentationTok" w:type="character">
+    <w:name w:val="DocumentationTok"/>
+    <w:basedOn w:val="VerbatimChar"/>
+    <w:rPr>
+      <w:i/>
+      <w:color w:val="ba2121"/>
+    </w:rPr>
+  </w:style>
+  <w:style w:customStyle="1" w:styleId="AnnotationTok" w:type="character">
+    <w:name w:val="AnnotationTok"/>
+    <w:basedOn w:val="VerbatimChar"/>
+    <w:rPr>
+      <w:b/>
+      <w:i/>
+      <w:color w:val="60a0b0"/>
+    </w:rPr>
+  </w:style>
+  <w:style w:customStyle="1" w:styleId="CommentVarTok" w:type="character">
+    <w:name w:val="CommentVarTok"/>
+    <w:basedOn w:val="VerbatimChar"/>
+    <w:rPr>
+      <w:b/>
+      <w:i/>
+      <w:color w:val="60a0b0"/>
+    </w:rPr>
+  </w:style>
+  <w:style w:customStyle="1" w:styleId="OtherTok" w:type="character">
+    <w:name w:val="OtherTok"/>
+    <w:basedOn w:val="VerbatimChar"/>
+    <w:rPr>
+      <w:color w:val="007020"/>
+    </w:rPr>
+  </w:style>
+  <w:style w:customStyle="1" w:styleId="FunctionTok" w:type="character">
+    <w:name w:val="FunctionTok"/>
+    <w:basedOn w:val="VerbatimChar"/>
+    <w:rPr>
+      <w:color w:val="06287e"/>
+    </w:rPr>
+  </w:style>
+  <w:style w:customStyle="1" w:styleId="VariableTok" w:type="character">
+    <w:name w:val="VariableTok"/>
+    <w:basedOn w:val="VerbatimChar"/>
+    <w:rPr>
+      <w:color w:val="19177c"/>
+    </w:rPr>
+  </w:style>
+  <w:style w:customStyle="1" w:styleId="ControlFlowTok" w:type="character">
+    <w:name w:val="ControlFlowTok"/>
+    <w:basedOn w:val="VerbatimChar"/>
+    <w:rPr>
+      <w:b/>
+      <w:color w:val="007020"/>
+    </w:rPr>
+  </w:style>
+  <w:style w:customStyle="1" w:styleId="OperatorTok" w:type="character">
+    <w:name w:val="OperatorTok"/>
+    <w:basedOn w:val="VerbatimChar"/>
+    <w:rPr>
+      <w:color w:val="666666"/>
+    </w:rPr>
+  </w:style>
+  <w:style w:customStyle="1" w:styleId="BuiltInTok" w:type="character">
+    <w:name w:val="BuiltInTok"/>
+    <w:basedOn w:val="VerbatimChar"/>
+    <w:rPr>
+      <w:color w:val="008000"/>
+    </w:rPr>
+  </w:style>
+  <w:style w:customStyle="1" w:styleId="ExtensionTok" w:type="character">
+    <w:name w:val="ExtensionTok"/>
+    <w:basedOn w:val="VerbatimChar"/>
+    <w:rPr/>
+  </w:style>
+  <w:style w:customStyle="1" w:styleId="PreprocessorTok" w:type="character">
+    <w:name w:val="PreprocessorTok"/>
+    <w:basedOn w:val="VerbatimChar"/>
+    <w:rPr>
+      <w:color w:val="bc7a00"/>
+    </w:rPr>
+  </w:style>
+  <w:style w:customStyle="1" w:styleId="AttributeTok" w:type="character">
+    <w:name w:val="AttributeTok"/>
+    <w:basedOn w:val="VerbatimChar"/>
+    <w:rPr>
+      <w:color w:val="7d9029"/>
+    </w:rPr>
+  </w:style>
+  <w:style w:customStyle="1" w:styleId="RegionMarkerTok" w:type="character">
+    <w:name w:val="RegionMarkerTok"/>
+    <w:basedOn w:val="VerbatimChar"/>
+    <w:rPr/>
+  </w:style>
+  <w:style w:customStyle="1" w:styleId="InformationTok" w:type="character">
+    <w:name w:val="InformationTok"/>
+    <w:basedOn w:val="VerbatimChar"/>
+    <w:rPr>
+      <w:b/>
+      <w:i/>
+      <w:color w:val="60a0b0"/>
+    </w:rPr>
+  </w:style>
+  <w:style w:customStyle="1" w:styleId="WarningTok" w:type="character">
+    <w:name w:val="WarningTok"/>
+    <w:basedOn w:val="VerbatimChar"/>
+    <w:rPr>
+      <w:b/>
+      <w:i/>
+      <w:color w:val="60a0b0"/>
+    </w:rPr>
+  </w:style>
+  <w:style w:customStyle="1" w:styleId="AlertTok" w:type="character">
+    <w:name w:val="AlertTok"/>
+    <w:basedOn w:val="VerbatimChar"/>
+    <w:rPr>
+      <w:b/>
+      <w:color w:val="ff0000"/>
+    </w:rPr>
+  </w:style>
+  <w:style w:customStyle="1" w:styleId="ErrorTok" w:type="character">
+    <w:name w:val="ErrorTok"/>
+    <w:basedOn w:val="VerbatimChar"/>
+    <w:rPr>
+      <w:b/>
+      <w:color w:val="ff0000"/>
+    </w:rPr>
+  </w:style>
+  <w:style w:customStyle="1" w:styleId="NormalTok" w:type="character">
+    <w:name w:val="NormalTok"/>
+    <w:basedOn w:val="VerbatimChar"/>
+    <w:rPr/>
   </w:style>
   <w:style w:customStyle="1" w:styleId="KeywordTok" w:type="character">
     <w:name w:val="KeywordTok"/>

</xml_diff>

<commit_message>
Apply 1.5-IQR screening to whole-season ADG and Table 2 ADG
</commit_message>
<xml_diff>
--- a/AFRI_Variables_Models_and_Datasets.docx
+++ b/AFRI_Variables_Models_and_Datasets.docx
@@ -16,7 +16,7 @@
         <w:pStyle w:val="FirstParagraph"/>
       </w:pPr>
       <w:r>
-        <w:t xml:space="preserve">Response screening uses Q1 − k × IQR and Q3 + k × IQR, with k = 0.5 for Grazing_h and Traveling_h and k = 1 for the other screened responses, separately for Grazing_h, Resting_h, Traveling_h, mean_DDT_day, RGP_Smooth_ADG_kg_day, RGP_CH4_g_day and RGP_CO2_g_day. R type-7 quartiles use finite animal-year season averages for Table 1 and animal-period records for RGP ADG/CH4/CO2, pooled across treatment groups within each response. Fence values are retained; fewer than four finite observations are unscreened. Each response uses its own retained subset, with original datasets preserved. Response_IQR_Summary, Response_IQR_Audit and Response_IQR_Excluded record fences, counts and excluded records; Table1_IQR sheets remain available. Existing model families and formulas are retained. Monthly exploratory grazing/traveling screening uses 0.5 × IQR; resting/DDT screening uses 1 × IQR. Audit and summary sheets report IQR_multiplier explicitly. With export_results = TRUE, all canonical responses get before-screening and model-data histograms and normal QQ plots in 06_Statistical_Analysis/03_Figures/Response_Distributions, indexed by Distribution_Index.csv. These are response distribution plots, not residual normality tests. Outcome-based screening should be reported with the results.</w:t>
+        <w:t xml:space="preserve">Response screening uses Q1 − k × IQR and Q3 + k × IQR, with k = 0.5 for Grazing_h and Traveling_h k = 1.5 for Smooth_Period_ADG (ADG, kg/day) and Whole_Season_Smooth_ADG_kg_day (whole-season ADG), and k = 1 for the other screened responses, separately for Grazing_h, Resting_h, Traveling_h, mean_DDT_day, RGP_Smooth_ADG_kg_day, RGP_CH4_g_day and RGP_CO2_g_day. R type-7 quartiles use finite animal-year season averages for Table 1 and animal-period records for RGP ADG/CH4/CO2, pooled across treatment groups within each response. Fence values are retained; fewer than four finite observations are unscreened. Each response uses its own retained subset, with original datasets preserved. Response_IQR_Summary, Response_IQR_Audit and Response_IQR_Excluded record fences, counts and excluded records; Table1_IQR sheets remain available. Existing model families and formulas are retained. Monthly exploratory grazing/traveling screening uses 0.5 × IQR; resting/DDT screening uses 1 × IQR. Audit and summary sheets report IQR_multiplier explicitly. With export_results = TRUE, all canonical responses get before-screening and model-data histograms and normal QQ plots in 06_Statistical_Analysis/03_Figures/Response_Distributions, indexed by Distribution_Index.csv. These are response distribution plots, not residual normality tests. Outcome-based screening should be reported with the results.</w:t>
       </w:r>
     </w:p>
     <w:p>
@@ -16693,6 +16693,232 @@
     <w:pPr>
       <w:wordWrap w:val="off"/>
     </w:pPr>
+  </w:style>
+  <w:style w:customStyle="1" w:styleId="KeywordTok" w:type="character">
+    <w:name w:val="KeywordTok"/>
+    <w:basedOn w:val="VerbatimChar"/>
+    <w:rPr>
+      <w:b/>
+      <w:color w:val="007020"/>
+    </w:rPr>
+  </w:style>
+  <w:style w:customStyle="1" w:styleId="DataTypeTok" w:type="character">
+    <w:name w:val="DataTypeTok"/>
+    <w:basedOn w:val="VerbatimChar"/>
+    <w:rPr>
+      <w:color w:val="902000"/>
+    </w:rPr>
+  </w:style>
+  <w:style w:customStyle="1" w:styleId="DecValTok" w:type="character">
+    <w:name w:val="DecValTok"/>
+    <w:basedOn w:val="VerbatimChar"/>
+    <w:rPr>
+      <w:color w:val="40a070"/>
+    </w:rPr>
+  </w:style>
+  <w:style w:customStyle="1" w:styleId="BaseNTok" w:type="character">
+    <w:name w:val="BaseNTok"/>
+    <w:basedOn w:val="VerbatimChar"/>
+    <w:rPr>
+      <w:color w:val="40a070"/>
+    </w:rPr>
+  </w:style>
+  <w:style w:customStyle="1" w:styleId="FloatTok" w:type="character">
+    <w:name w:val="FloatTok"/>
+    <w:basedOn w:val="VerbatimChar"/>
+    <w:rPr>
+      <w:color w:val="40a070"/>
+    </w:rPr>
+  </w:style>
+  <w:style w:customStyle="1" w:styleId="ConstantTok" w:type="character">
+    <w:name w:val="ConstantTok"/>
+    <w:basedOn w:val="VerbatimChar"/>
+    <w:rPr>
+      <w:color w:val="880000"/>
+    </w:rPr>
+  </w:style>
+  <w:style w:customStyle="1" w:styleId="CharTok" w:type="character">
+    <w:name w:val="CharTok"/>
+    <w:basedOn w:val="VerbatimChar"/>
+    <w:rPr>
+      <w:color w:val="4070a0"/>
+    </w:rPr>
+  </w:style>
+  <w:style w:customStyle="1" w:styleId="SpecialCharTok" w:type="character">
+    <w:name w:val="SpecialCharTok"/>
+    <w:basedOn w:val="VerbatimChar"/>
+    <w:rPr>
+      <w:color w:val="4070a0"/>
+    </w:rPr>
+  </w:style>
+  <w:style w:customStyle="1" w:styleId="StringTok" w:type="character">
+    <w:name w:val="StringTok"/>
+    <w:basedOn w:val="VerbatimChar"/>
+    <w:rPr>
+      <w:color w:val="4070a0"/>
+    </w:rPr>
+  </w:style>
+  <w:style w:customStyle="1" w:styleId="VerbatimStringTok" w:type="character">
+    <w:name w:val="VerbatimStringTok"/>
+    <w:basedOn w:val="VerbatimChar"/>
+    <w:rPr>
+      <w:color w:val="4070a0"/>
+    </w:rPr>
+  </w:style>
+  <w:style w:customStyle="1" w:styleId="SpecialStringTok" w:type="character">
+    <w:name w:val="SpecialStringTok"/>
+    <w:basedOn w:val="VerbatimChar"/>
+    <w:rPr>
+      <w:color w:val="bb6688"/>
+    </w:rPr>
+  </w:style>
+  <w:style w:customStyle="1" w:styleId="ImportTok" w:type="character">
+    <w:name w:val="ImportTok"/>
+    <w:basedOn w:val="VerbatimChar"/>
+    <w:rPr>
+      <w:b/>
+      <w:color w:val="008000"/>
+    </w:rPr>
+  </w:style>
+  <w:style w:customStyle="1" w:styleId="CommentTok" w:type="character">
+    <w:name w:val="CommentTok"/>
+    <w:basedOn w:val="VerbatimChar"/>
+    <w:rPr>
+      <w:i/>
+      <w:color w:val="60a0b0"/>
+    </w:rPr>
+  </w:style>
+  <w:style w:customStyle="1" w:styleId="DocumentationTok" w:type="character">
+    <w:name w:val="DocumentationTok"/>
+    <w:basedOn w:val="VerbatimChar"/>
+    <w:rPr>
+      <w:i/>
+      <w:color w:val="ba2121"/>
+    </w:rPr>
+  </w:style>
+  <w:style w:customStyle="1" w:styleId="AnnotationTok" w:type="character">
+    <w:name w:val="AnnotationTok"/>
+    <w:basedOn w:val="VerbatimChar"/>
+    <w:rPr>
+      <w:b/>
+      <w:i/>
+      <w:color w:val="60a0b0"/>
+    </w:rPr>
+  </w:style>
+  <w:style w:customStyle="1" w:styleId="CommentVarTok" w:type="character">
+    <w:name w:val="CommentVarTok"/>
+    <w:basedOn w:val="VerbatimChar"/>
+    <w:rPr>
+      <w:b/>
+      <w:i/>
+      <w:color w:val="60a0b0"/>
+    </w:rPr>
+  </w:style>
+  <w:style w:customStyle="1" w:styleId="OtherTok" w:type="character">
+    <w:name w:val="OtherTok"/>
+    <w:basedOn w:val="VerbatimChar"/>
+    <w:rPr>
+      <w:color w:val="007020"/>
+    </w:rPr>
+  </w:style>
+  <w:style w:customStyle="1" w:styleId="FunctionTok" w:type="character">
+    <w:name w:val="FunctionTok"/>
+    <w:basedOn w:val="VerbatimChar"/>
+    <w:rPr>
+      <w:color w:val="06287e"/>
+    </w:rPr>
+  </w:style>
+  <w:style w:customStyle="1" w:styleId="VariableTok" w:type="character">
+    <w:name w:val="VariableTok"/>
+    <w:basedOn w:val="VerbatimChar"/>
+    <w:rPr>
+      <w:color w:val="19177c"/>
+    </w:rPr>
+  </w:style>
+  <w:style w:customStyle="1" w:styleId="ControlFlowTok" w:type="character">
+    <w:name w:val="ControlFlowTok"/>
+    <w:basedOn w:val="VerbatimChar"/>
+    <w:rPr>
+      <w:b/>
+      <w:color w:val="007020"/>
+    </w:rPr>
+  </w:style>
+  <w:style w:customStyle="1" w:styleId="OperatorTok" w:type="character">
+    <w:name w:val="OperatorTok"/>
+    <w:basedOn w:val="VerbatimChar"/>
+    <w:rPr>
+      <w:color w:val="666666"/>
+    </w:rPr>
+  </w:style>
+  <w:style w:customStyle="1" w:styleId="BuiltInTok" w:type="character">
+    <w:name w:val="BuiltInTok"/>
+    <w:basedOn w:val="VerbatimChar"/>
+    <w:rPr>
+      <w:color w:val="008000"/>
+    </w:rPr>
+  </w:style>
+  <w:style w:customStyle="1" w:styleId="ExtensionTok" w:type="character">
+    <w:name w:val="ExtensionTok"/>
+    <w:basedOn w:val="VerbatimChar"/>
+    <w:rPr/>
+  </w:style>
+  <w:style w:customStyle="1" w:styleId="PreprocessorTok" w:type="character">
+    <w:name w:val="PreprocessorTok"/>
+    <w:basedOn w:val="VerbatimChar"/>
+    <w:rPr>
+      <w:color w:val="bc7a00"/>
+    </w:rPr>
+  </w:style>
+  <w:style w:customStyle="1" w:styleId="AttributeTok" w:type="character">
+    <w:name w:val="AttributeTok"/>
+    <w:basedOn w:val="VerbatimChar"/>
+    <w:rPr>
+      <w:color w:val="7d9029"/>
+    </w:rPr>
+  </w:style>
+  <w:style w:customStyle="1" w:styleId="RegionMarkerTok" w:type="character">
+    <w:name w:val="RegionMarkerTok"/>
+    <w:basedOn w:val="VerbatimChar"/>
+    <w:rPr/>
+  </w:style>
+  <w:style w:customStyle="1" w:styleId="InformationTok" w:type="character">
+    <w:name w:val="InformationTok"/>
+    <w:basedOn w:val="VerbatimChar"/>
+    <w:rPr>
+      <w:b/>
+      <w:i/>
+      <w:color w:val="60a0b0"/>
+    </w:rPr>
+  </w:style>
+  <w:style w:customStyle="1" w:styleId="WarningTok" w:type="character">
+    <w:name w:val="WarningTok"/>
+    <w:basedOn w:val="VerbatimChar"/>
+    <w:rPr>
+      <w:b/>
+      <w:i/>
+      <w:color w:val="60a0b0"/>
+    </w:rPr>
+  </w:style>
+  <w:style w:customStyle="1" w:styleId="AlertTok" w:type="character">
+    <w:name w:val="AlertTok"/>
+    <w:basedOn w:val="VerbatimChar"/>
+    <w:rPr>
+      <w:b/>
+      <w:color w:val="ff0000"/>
+    </w:rPr>
+  </w:style>
+  <w:style w:customStyle="1" w:styleId="ErrorTok" w:type="character">
+    <w:name w:val="ErrorTok"/>
+    <w:basedOn w:val="VerbatimChar"/>
+    <w:rPr>
+      <w:b/>
+      <w:color w:val="ff0000"/>
+    </w:rPr>
+  </w:style>
+  <w:style w:customStyle="1" w:styleId="NormalTok" w:type="character">
+    <w:name w:val="NormalTok"/>
+    <w:basedOn w:val="VerbatimChar"/>
+    <w:rPr/>
   </w:style>
   <w:style w:customStyle="1" w:styleId="KeywordTok" w:type="character">
     <w:name w:val="KeywordTok"/>

</xml_diff>

<commit_message>
Use additive Period and RotationPeriod effects with current IQR rules
</commit_message>
<xml_diff>
--- a/AFRI_Variables_Models_and_Datasets.docx
+++ b/AFRI_Variables_Models_and_Datasets.docx
@@ -61,7 +61,7 @@
         <w:rPr>
           <w:rStyle w:val="VerbatimChar"/>
         </w:rPr>
-        <w:t xml:space="preserve">response ~ TRT * SR * Period + (1 | Year) + (1 | Year:Pasture)</w:t>
+        <w:t xml:space="preserve">response ~ TRT * SR + Period + (1 | Year) + (1 | Year:Pasture)</w:t>
       </w:r>
       <w:r>
         <w:t xml:space="preserve">.</w:t>
@@ -81,7 +81,7 @@
         <w:rPr>
           <w:rStyle w:val="VerbatimChar"/>
         </w:rPr>
-        <w:t xml:space="preserve">gas ~ TRT * SR * RotationPeriod + (1 | Year) + (1 | Year:Pasture)</w:t>
+        <w:t xml:space="preserve">gas ~ TRT * SR + RotationPeriod + (1 | Year) + (1 | Year:Pasture)</w:t>
       </w:r>
       <w:r>
         <w:t xml:space="preserve">. RGP and Pasture_ID aliases are equivalent in source analyses. Period includes TRT:Period, SR:Period and TRT:SR:Period interactions. There is no animal random intercept or AR(1) candidate. The separate endpoint ANCOVA source retains its IBW covariate.</w:t>
@@ -1249,7 +1249,7 @@
               <w:rPr>
                 <w:rStyle w:val="VerbatimChar"/>
               </w:rPr>
-              <w:t xml:space="preserve">active_ha_all_pasture ~ TRT * SR * Period + (1 \| Year) + (1 \| Year:Pasture)</w:t>
+              <w:t xml:space="preserve">active_ha_all_pasture ~ TRT * SR + Period + (1 \| Year) + (1 \| Year:Pasture)</w:t>
             </w:r>
           </w:p>
         </w:tc>
@@ -1326,7 +1326,7 @@
               <w:rPr>
                 <w:rStyle w:val="VerbatimChar"/>
               </w:rPr>
-              <w:t xml:space="preserve">active_ha_inside_rgp ~ TRT * SR * Period + (1 \| Year) + (1 \| Year:Pasture)</w:t>
+              <w:t xml:space="preserve">active_ha_inside_rgp ~ TRT * SR + Period + (1 \| Year) + (1 \| Year:Pasture)</w:t>
             </w:r>
           </w:p>
         </w:tc>
@@ -1480,7 +1480,7 @@
               <w:rPr>
                 <w:rStyle w:val="VerbatimChar"/>
               </w:rPr>
-              <w:t xml:space="preserve">mean_RGP_ADG_kg_day ~ TRT * SR * Period + (1 \| Year) + (1 \| Year:Pasture)</w:t>
+              <w:t xml:space="preserve">mean_RGP_ADG_kg_day ~ TRT * SR + Period + (1 \| Year) + (1 \| Year:Pasture)</w:t>
             </w:r>
           </w:p>
         </w:tc>
@@ -1557,7 +1557,7 @@
               <w:rPr>
                 <w:rStyle w:val="VerbatimChar"/>
               </w:rPr>
-              <w:t xml:space="preserve">CH4_g_animal_day ~ TRT * SR * Period + (1 \| Year) + (1 \| Year:Pasture)</w:t>
+              <w:t xml:space="preserve">CH4_g_animal_day ~ TRT * SR + Period + (1 \| Year) + (1 \| Year:Pasture)</w:t>
             </w:r>
           </w:p>
         </w:tc>
@@ -1634,7 +1634,7 @@
               <w:rPr>
                 <w:rStyle w:val="VerbatimChar"/>
               </w:rPr>
-              <w:t xml:space="preserve">CO2_g_animal_day ~ TRT * SR * Period + (1 \| Year) + (1 \| Year:Pasture)</w:t>
+              <w:t xml:space="preserve">CO2_g_animal_day ~ TRT * SR + Period + (1 \| Year) + (1 \| Year:Pasture)</w:t>
             </w:r>
           </w:p>
         </w:tc>
@@ -1711,7 +1711,7 @@
               <w:rPr>
                 <w:rStyle w:val="VerbatimChar"/>
               </w:rPr>
-              <w:t xml:space="preserve">LWG_kg_per_active_ha_all_pasture ~ TRT * SR * Period + (1 \| Year) + (1 \| Year:Pasture)</w:t>
+              <w:t xml:space="preserve">LWG_kg_per_active_ha_all_pasture ~ TRT * SR + Period + (1 \| Year) + (1 \| Year:Pasture)</w:t>
             </w:r>
           </w:p>
         </w:tc>
@@ -1788,7 +1788,7 @@
               <w:rPr>
                 <w:rStyle w:val="VerbatimChar"/>
               </w:rPr>
-              <w:t xml:space="preserve">LWG_kg_per_active_ha_inside_rgp ~ TRT * SR * Period + (1 \| Year) + (1 \| Year:Pasture)</w:t>
+              <w:t xml:space="preserve">LWG_kg_per_active_ha_inside_rgp ~ TRT * SR + Period + (1 \| Year) + (1 \| Year:Pasture)</w:t>
             </w:r>
           </w:p>
         </w:tc>
@@ -1865,7 +1865,7 @@
               <w:rPr>
                 <w:rStyle w:val="VerbatimChar"/>
               </w:rPr>
-              <w:t xml:space="preserve">CH4_g_per_active_ha_all_pasture ~ TRT * SR * Period + (1 \| Year) + (1 \| Year:Pasture)</w:t>
+              <w:t xml:space="preserve">CH4_g_per_active_ha_all_pasture ~ TRT * SR + Period + (1 \| Year) + (1 \| Year:Pasture)</w:t>
             </w:r>
           </w:p>
         </w:tc>
@@ -1942,7 +1942,7 @@
               <w:rPr>
                 <w:rStyle w:val="VerbatimChar"/>
               </w:rPr>
-              <w:t xml:space="preserve">CH4_g_per_active_ha_inside_rgp ~ TRT * SR * Period + (1 \| Year) + (1 \| Year:Pasture)</w:t>
+              <w:t xml:space="preserve">CH4_g_per_active_ha_inside_rgp ~ TRT * SR + Period + (1 \| Year) + (1 \| Year:Pasture)</w:t>
             </w:r>
           </w:p>
         </w:tc>
@@ -2019,7 +2019,7 @@
               <w:rPr>
                 <w:rStyle w:val="VerbatimChar"/>
               </w:rPr>
-              <w:t xml:space="preserve">CO2_g_per_active_ha_all_pasture ~ TRT * SR * Period + (1 \| Year) + (1 \| Year:Pasture)</w:t>
+              <w:t xml:space="preserve">CO2_g_per_active_ha_all_pasture ~ TRT * SR + Period + (1 \| Year) + (1 \| Year:Pasture)</w:t>
             </w:r>
           </w:p>
         </w:tc>
@@ -2096,7 +2096,7 @@
               <w:rPr>
                 <w:rStyle w:val="VerbatimChar"/>
               </w:rPr>
-              <w:t xml:space="preserve">CO2_g_per_active_ha_inside_rgp ~ TRT * SR * Period + (1 \| Year) + (1 \| Year:Pasture)</w:t>
+              <w:t xml:space="preserve">CO2_g_per_active_ha_inside_rgp ~ TRT * SR + Period + (1 \| Year) + (1 \| Year:Pasture)</w:t>
             </w:r>
           </w:p>
         </w:tc>
@@ -2173,7 +2173,7 @@
               <w:rPr>
                 <w:rStyle w:val="VerbatimChar"/>
               </w:rPr>
-              <w:t xml:space="preserve">CH4_g_per_kg_LWG ~ TRT * SR * Period + (1 \| Year) + (1 \| Year:Pasture)</w:t>
+              <w:t xml:space="preserve">CH4_g_per_kg_LWG ~ TRT * SR + Period + (1 \| Year) + (1 \| Year:Pasture)</w:t>
             </w:r>
           </w:p>
         </w:tc>
@@ -2250,7 +2250,7 @@
               <w:rPr>
                 <w:rStyle w:val="VerbatimChar"/>
               </w:rPr>
-              <w:t xml:space="preserve">CO2_g_per_kg_LWG ~ TRT * SR * Period + (1 \| Year) + (1 \| Year:Pasture)</w:t>
+              <w:t xml:space="preserve">CO2_g_per_kg_LWG ~ TRT * SR + Period + (1 \| Year) + (1 \| Year:Pasture)</w:t>
             </w:r>
           </w:p>
         </w:tc>
@@ -3405,7 +3405,7 @@
               <w:rPr>
                 <w:rStyle w:val="VerbatimChar"/>
               </w:rPr>
-              <w:t xml:space="preserve">RGP_CH4_g_day ~ TRT * SR * Period + (1 \| Year) + (1 \| Year:Pasture)</w:t>
+              <w:t xml:space="preserve">RGP_CH4_g_day ~ TRT * SR + Period + (1 \| Year) + (1 \| Year:Pasture)</w:t>
             </w:r>
           </w:p>
         </w:tc>
@@ -3482,7 +3482,7 @@
               <w:rPr>
                 <w:rStyle w:val="VerbatimChar"/>
               </w:rPr>
-              <w:t xml:space="preserve">RGP_CO2_g_day ~ TRT * SR * Period + (1 \| Year) + (1 \| Year:Pasture)</w:t>
+              <w:t xml:space="preserve">RGP_CO2_g_day ~ TRT * SR + Period + (1 \| Year) + (1 \| Year:Pasture)</w:t>
             </w:r>
           </w:p>
         </w:tc>
@@ -3559,7 +3559,7 @@
               <w:rPr>
                 <w:rStyle w:val="VerbatimChar"/>
               </w:rPr>
-              <w:t xml:space="preserve">RGP_Smooth_ADG_kg_day ~ TRT * SR * Period + (1 \| Year) + (1 \| Year:Pasture)</w:t>
+              <w:t xml:space="preserve">RGP_Smooth_ADG_kg_day ~ TRT * SR + Period + (1 \| Year) + (1 \| Year:Pasture)</w:t>
             </w:r>
           </w:p>
         </w:tc>
@@ -3636,7 +3636,7 @@
               <w:rPr>
                 <w:rStyle w:val="VerbatimChar"/>
               </w:rPr>
-              <w:t xml:space="preserve">CH4_g_d ~ TRT * SR * RotationPeriod + (1 \| Year) + (1 \| Year:Pasture)</w:t>
+              <w:t xml:space="preserve">CH4_g_d ~ TRT * SR + RotationPeriod + (1 \| Year) + (1 \| Year:Pasture)</w:t>
             </w:r>
           </w:p>
         </w:tc>
@@ -3713,7 +3713,7 @@
               <w:rPr>
                 <w:rStyle w:val="VerbatimChar"/>
               </w:rPr>
-              <w:t xml:space="preserve">CO2_g_d ~ TRT * SR * RotationPeriod + (1 \| Year) + (1 \| Year:Pasture)</w:t>
+              <w:t xml:space="preserve">CO2_g_d ~ TRT * SR + RotationPeriod + (1 \| Year) + (1 \| Year:Pasture)</w:t>
             </w:r>
           </w:p>
         </w:tc>
@@ -3944,7 +3944,7 @@
               <w:rPr>
                 <w:rStyle w:val="VerbatimChar"/>
               </w:rPr>
-              <w:t xml:space="preserve">CH4_g_d ~ TRT * SR * Period + (1 \| Year) + (1 \| Year:Pasture)</w:t>
+              <w:t xml:space="preserve">CH4_g_d ~ TRT * SR + Period + (1 \| Year) + (1 \| Year:Pasture)</w:t>
             </w:r>
           </w:p>
         </w:tc>
@@ -4021,7 +4021,7 @@
               <w:rPr>
                 <w:rStyle w:val="VerbatimChar"/>
               </w:rPr>
-              <w:t xml:space="preserve">CO2_g_d ~ TRT * SR * Period + (1 \| Year) + (1 \| Year:Pasture)</w:t>
+              <w:t xml:space="preserve">CO2_g_d ~ TRT * SR + Period + (1 \| Year) + (1 \| Year:Pasture)</w:t>
             </w:r>
           </w:p>
         </w:tc>
@@ -4098,7 +4098,7 @@
               <w:rPr>
                 <w:rStyle w:val="VerbatimChar"/>
               </w:rPr>
-              <w:t xml:space="preserve">Percent_pasture_active ~ TRT * SR * RGP + (1 \| Year) + (1 \| Year:Pasture)</w:t>
+              <w:t xml:space="preserve">Percent_pasture_active ~ TRT * SR + RGP + (1 \| Year) + (1 \| Year:Pasture)</w:t>
             </w:r>
           </w:p>
         </w:tc>
@@ -4175,7 +4175,7 @@
               <w:rPr>
                 <w:rStyle w:val="VerbatimChar"/>
               </w:rPr>
-              <w:t xml:space="preserve">Gain_kg_per_active_ha ~ TRT * SR * RGP + (1 \| Year) + (1 \| Year:Pasture)</w:t>
+              <w:t xml:space="preserve">Gain_kg_per_active_ha ~ TRT * SR + RGP + (1 \| Year) + (1 \| Year:Pasture)</w:t>
             </w:r>
           </w:p>
         </w:tc>
@@ -4252,7 +4252,7 @@
               <w:rPr>
                 <w:rStyle w:val="VerbatimChar"/>
               </w:rPr>
-              <w:t xml:space="preserve">Percent_pasture_active ~ TRT * SR * RGP + (1 \| Year) + (1 \| Year:Pasture)</w:t>
+              <w:t xml:space="preserve">Percent_pasture_active ~ TRT * SR + RGP + (1 \| Year) + (1 \| Year:Pasture)</w:t>
             </w:r>
           </w:p>
         </w:tc>
@@ -4329,7 +4329,7 @@
               <w:rPr>
                 <w:rStyle w:val="VerbatimChar"/>
               </w:rPr>
-              <w:t xml:space="preserve">Gain_kg_per_active_ha ~ TRT * SR * RGP + (1 \| Year) + (1 \| Year:Pasture)</w:t>
+              <w:t xml:space="preserve">Gain_kg_per_active_ha ~ TRT * SR + RGP + (1 \| Year) + (1 \| Year:Pasture)</w:t>
             </w:r>
           </w:p>
         </w:tc>
@@ -16693,6 +16693,232 @@
     <w:pPr>
       <w:wordWrap w:val="off"/>
     </w:pPr>
+  </w:style>
+  <w:style w:customStyle="1" w:styleId="KeywordTok" w:type="character">
+    <w:name w:val="KeywordTok"/>
+    <w:basedOn w:val="VerbatimChar"/>
+    <w:rPr>
+      <w:b/>
+      <w:color w:val="007020"/>
+    </w:rPr>
+  </w:style>
+  <w:style w:customStyle="1" w:styleId="DataTypeTok" w:type="character">
+    <w:name w:val="DataTypeTok"/>
+    <w:basedOn w:val="VerbatimChar"/>
+    <w:rPr>
+      <w:color w:val="902000"/>
+    </w:rPr>
+  </w:style>
+  <w:style w:customStyle="1" w:styleId="DecValTok" w:type="character">
+    <w:name w:val="DecValTok"/>
+    <w:basedOn w:val="VerbatimChar"/>
+    <w:rPr>
+      <w:color w:val="40a070"/>
+    </w:rPr>
+  </w:style>
+  <w:style w:customStyle="1" w:styleId="BaseNTok" w:type="character">
+    <w:name w:val="BaseNTok"/>
+    <w:basedOn w:val="VerbatimChar"/>
+    <w:rPr>
+      <w:color w:val="40a070"/>
+    </w:rPr>
+  </w:style>
+  <w:style w:customStyle="1" w:styleId="FloatTok" w:type="character">
+    <w:name w:val="FloatTok"/>
+    <w:basedOn w:val="VerbatimChar"/>
+    <w:rPr>
+      <w:color w:val="40a070"/>
+    </w:rPr>
+  </w:style>
+  <w:style w:customStyle="1" w:styleId="ConstantTok" w:type="character">
+    <w:name w:val="ConstantTok"/>
+    <w:basedOn w:val="VerbatimChar"/>
+    <w:rPr>
+      <w:color w:val="880000"/>
+    </w:rPr>
+  </w:style>
+  <w:style w:customStyle="1" w:styleId="CharTok" w:type="character">
+    <w:name w:val="CharTok"/>
+    <w:basedOn w:val="VerbatimChar"/>
+    <w:rPr>
+      <w:color w:val="4070a0"/>
+    </w:rPr>
+  </w:style>
+  <w:style w:customStyle="1" w:styleId="SpecialCharTok" w:type="character">
+    <w:name w:val="SpecialCharTok"/>
+    <w:basedOn w:val="VerbatimChar"/>
+    <w:rPr>
+      <w:color w:val="4070a0"/>
+    </w:rPr>
+  </w:style>
+  <w:style w:customStyle="1" w:styleId="StringTok" w:type="character">
+    <w:name w:val="StringTok"/>
+    <w:basedOn w:val="VerbatimChar"/>
+    <w:rPr>
+      <w:color w:val="4070a0"/>
+    </w:rPr>
+  </w:style>
+  <w:style w:customStyle="1" w:styleId="VerbatimStringTok" w:type="character">
+    <w:name w:val="VerbatimStringTok"/>
+    <w:basedOn w:val="VerbatimChar"/>
+    <w:rPr>
+      <w:color w:val="4070a0"/>
+    </w:rPr>
+  </w:style>
+  <w:style w:customStyle="1" w:styleId="SpecialStringTok" w:type="character">
+    <w:name w:val="SpecialStringTok"/>
+    <w:basedOn w:val="VerbatimChar"/>
+    <w:rPr>
+      <w:color w:val="bb6688"/>
+    </w:rPr>
+  </w:style>
+  <w:style w:customStyle="1" w:styleId="ImportTok" w:type="character">
+    <w:name w:val="ImportTok"/>
+    <w:basedOn w:val="VerbatimChar"/>
+    <w:rPr>
+      <w:b/>
+      <w:color w:val="008000"/>
+    </w:rPr>
+  </w:style>
+  <w:style w:customStyle="1" w:styleId="CommentTok" w:type="character">
+    <w:name w:val="CommentTok"/>
+    <w:basedOn w:val="VerbatimChar"/>
+    <w:rPr>
+      <w:i/>
+      <w:color w:val="60a0b0"/>
+    </w:rPr>
+  </w:style>
+  <w:style w:customStyle="1" w:styleId="DocumentationTok" w:type="character">
+    <w:name w:val="DocumentationTok"/>
+    <w:basedOn w:val="VerbatimChar"/>
+    <w:rPr>
+      <w:i/>
+      <w:color w:val="ba2121"/>
+    </w:rPr>
+  </w:style>
+  <w:style w:customStyle="1" w:styleId="AnnotationTok" w:type="character">
+    <w:name w:val="AnnotationTok"/>
+    <w:basedOn w:val="VerbatimChar"/>
+    <w:rPr>
+      <w:b/>
+      <w:i/>
+      <w:color w:val="60a0b0"/>
+    </w:rPr>
+  </w:style>
+  <w:style w:customStyle="1" w:styleId="CommentVarTok" w:type="character">
+    <w:name w:val="CommentVarTok"/>
+    <w:basedOn w:val="VerbatimChar"/>
+    <w:rPr>
+      <w:b/>
+      <w:i/>
+      <w:color w:val="60a0b0"/>
+    </w:rPr>
+  </w:style>
+  <w:style w:customStyle="1" w:styleId="OtherTok" w:type="character">
+    <w:name w:val="OtherTok"/>
+    <w:basedOn w:val="VerbatimChar"/>
+    <w:rPr>
+      <w:color w:val="007020"/>
+    </w:rPr>
+  </w:style>
+  <w:style w:customStyle="1" w:styleId="FunctionTok" w:type="character">
+    <w:name w:val="FunctionTok"/>
+    <w:basedOn w:val="VerbatimChar"/>
+    <w:rPr>
+      <w:color w:val="06287e"/>
+    </w:rPr>
+  </w:style>
+  <w:style w:customStyle="1" w:styleId="VariableTok" w:type="character">
+    <w:name w:val="VariableTok"/>
+    <w:basedOn w:val="VerbatimChar"/>
+    <w:rPr>
+      <w:color w:val="19177c"/>
+    </w:rPr>
+  </w:style>
+  <w:style w:customStyle="1" w:styleId="ControlFlowTok" w:type="character">
+    <w:name w:val="ControlFlowTok"/>
+    <w:basedOn w:val="VerbatimChar"/>
+    <w:rPr>
+      <w:b/>
+      <w:color w:val="007020"/>
+    </w:rPr>
+  </w:style>
+  <w:style w:customStyle="1" w:styleId="OperatorTok" w:type="character">
+    <w:name w:val="OperatorTok"/>
+    <w:basedOn w:val="VerbatimChar"/>
+    <w:rPr>
+      <w:color w:val="666666"/>
+    </w:rPr>
+  </w:style>
+  <w:style w:customStyle="1" w:styleId="BuiltInTok" w:type="character">
+    <w:name w:val="BuiltInTok"/>
+    <w:basedOn w:val="VerbatimChar"/>
+    <w:rPr>
+      <w:color w:val="008000"/>
+    </w:rPr>
+  </w:style>
+  <w:style w:customStyle="1" w:styleId="ExtensionTok" w:type="character">
+    <w:name w:val="ExtensionTok"/>
+    <w:basedOn w:val="VerbatimChar"/>
+    <w:rPr/>
+  </w:style>
+  <w:style w:customStyle="1" w:styleId="PreprocessorTok" w:type="character">
+    <w:name w:val="PreprocessorTok"/>
+    <w:basedOn w:val="VerbatimChar"/>
+    <w:rPr>
+      <w:color w:val="bc7a00"/>
+    </w:rPr>
+  </w:style>
+  <w:style w:customStyle="1" w:styleId="AttributeTok" w:type="character">
+    <w:name w:val="AttributeTok"/>
+    <w:basedOn w:val="VerbatimChar"/>
+    <w:rPr>
+      <w:color w:val="7d9029"/>
+    </w:rPr>
+  </w:style>
+  <w:style w:customStyle="1" w:styleId="RegionMarkerTok" w:type="character">
+    <w:name w:val="RegionMarkerTok"/>
+    <w:basedOn w:val="VerbatimChar"/>
+    <w:rPr/>
+  </w:style>
+  <w:style w:customStyle="1" w:styleId="InformationTok" w:type="character">
+    <w:name w:val="InformationTok"/>
+    <w:basedOn w:val="VerbatimChar"/>
+    <w:rPr>
+      <w:b/>
+      <w:i/>
+      <w:color w:val="60a0b0"/>
+    </w:rPr>
+  </w:style>
+  <w:style w:customStyle="1" w:styleId="WarningTok" w:type="character">
+    <w:name w:val="WarningTok"/>
+    <w:basedOn w:val="VerbatimChar"/>
+    <w:rPr>
+      <w:b/>
+      <w:i/>
+      <w:color w:val="60a0b0"/>
+    </w:rPr>
+  </w:style>
+  <w:style w:customStyle="1" w:styleId="AlertTok" w:type="character">
+    <w:name w:val="AlertTok"/>
+    <w:basedOn w:val="VerbatimChar"/>
+    <w:rPr>
+      <w:b/>
+      <w:color w:val="ff0000"/>
+    </w:rPr>
+  </w:style>
+  <w:style w:customStyle="1" w:styleId="ErrorTok" w:type="character">
+    <w:name w:val="ErrorTok"/>
+    <w:basedOn w:val="VerbatimChar"/>
+    <w:rPr>
+      <w:b/>
+      <w:color w:val="ff0000"/>
+    </w:rPr>
+  </w:style>
+  <w:style w:customStyle="1" w:styleId="NormalTok" w:type="character">
+    <w:name w:val="NormalTok"/>
+    <w:basedOn w:val="VerbatimChar"/>
+    <w:rPr/>
   </w:style>
   <w:style w:customStyle="1" w:styleId="KeywordTok" w:type="character">
     <w:name w:val="KeywordTok"/>

</xml_diff>

<commit_message>
Apply half-IQR screening to all CH4 CO2 and ADG model responses
</commit_message>
<xml_diff>
--- a/AFRI_Variables_Models_and_Datasets.docx
+++ b/AFRI_Variables_Models_and_Datasets.docx
@@ -16,7 +16,7 @@
         <w:pStyle w:val="FirstParagraph"/>
       </w:pPr>
       <w:r>
-        <w:t xml:space="preserve">Response screening uses Q1 − k × IQR and Q3 + k × IQR, with k = 0.5 for Grazing_h and Traveling_h k = 1.5 for Smooth_Period_ADG (ADG, kg/day) and Whole_Season_Smooth_ADG_kg_day (whole-season ADG), and k = 1 for the other screened responses, separately for Grazing_h, Resting_h, Traveling_h, mean_DDT_day, RGP_Smooth_ADG_kg_day, RGP_CH4_g_day and RGP_CO2_g_day. R type-7 quartiles use finite animal-year season averages for Table 1 and animal-period records for RGP ADG/CH4/CO2, pooled across treatment groups within each response. Fence values are retained; fewer than four finite observations are unscreened. Each response uses its own retained subset, with original datasets preserved. Response_IQR_Summary, Response_IQR_Audit and Response_IQR_Excluded record fences, counts and excluded records; Table1_IQR sheets remain available. Existing model families and formulas are retained. Monthly exploratory grazing/traveling screening uses 0.5 × IQR; resting/DDT screening uses 1 × IQR. Audit and summary sheets report IQR_multiplier explicitly. With export_results = TRUE, all canonical responses get before-screening and model-data histograms and normal QQ plots in 06_Statistical_Analysis/03_Figures/Response_Distributions, indexed by Distribution_Index.csv. These are response distribution plots, not residual normality tests. Outcome-based screening should be reported with the results.</w:t>
+        <w:t xml:space="preserve">Response screening uses Q1 − k × IQR and Q3 + k × IQR. All modeled CH4/CO2 responses (including daily means, whole-season emissions, per-hectare measures and gas-per-kg-gain ratios) and all three ADG responses (Smooth_Period_ADG, Whole_Season_Smooth_ADG_kg_day, RGP_Smooth_ADG_kg_day) use k = 0.5. Grazing_h and Traveling_h retain k = 0.5; Resting_h and mean_DDT_day retain k = 1. R type-7 quartiles are computed separately for each response within its analysis dataset, pooled across treatment groups. Table 1 uses animal-year season averages; other responses use their existing model observation scale. Values exactly on a fence are retained; fewer than four finite values are unscreened. Original datasets remain intact and each model uses its own retained subset. Response_IQR_Summary, Response_IQR_Audit and Response_IQR_Excluded record canonical exclusions and multipliers. Global and eligible conditional GreenFeed source models also screen CH4_g_d/CO2_g_d at 0.5 × IQR; Source_Gas_IQR_Audit records their source-specific exclusions. Model families and formulas remain unchanged. Distribution PNGs compare raw analysis inputs with actual model data in 06_Statistical_Analysis/03_Figures/Response_Distributions. Outcome-based screening should be reported with the results.</w:t>
       </w:r>
     </w:p>
     <w:p>
@@ -16693,6 +16693,232 @@
     <w:pPr>
       <w:wordWrap w:val="off"/>
     </w:pPr>
+  </w:style>
+  <w:style w:customStyle="1" w:styleId="KeywordTok" w:type="character">
+    <w:name w:val="KeywordTok"/>
+    <w:basedOn w:val="VerbatimChar"/>
+    <w:rPr>
+      <w:b/>
+      <w:color w:val="007020"/>
+    </w:rPr>
+  </w:style>
+  <w:style w:customStyle="1" w:styleId="DataTypeTok" w:type="character">
+    <w:name w:val="DataTypeTok"/>
+    <w:basedOn w:val="VerbatimChar"/>
+    <w:rPr>
+      <w:color w:val="902000"/>
+    </w:rPr>
+  </w:style>
+  <w:style w:customStyle="1" w:styleId="DecValTok" w:type="character">
+    <w:name w:val="DecValTok"/>
+    <w:basedOn w:val="VerbatimChar"/>
+    <w:rPr>
+      <w:color w:val="40a070"/>
+    </w:rPr>
+  </w:style>
+  <w:style w:customStyle="1" w:styleId="BaseNTok" w:type="character">
+    <w:name w:val="BaseNTok"/>
+    <w:basedOn w:val="VerbatimChar"/>
+    <w:rPr>
+      <w:color w:val="40a070"/>
+    </w:rPr>
+  </w:style>
+  <w:style w:customStyle="1" w:styleId="FloatTok" w:type="character">
+    <w:name w:val="FloatTok"/>
+    <w:basedOn w:val="VerbatimChar"/>
+    <w:rPr>
+      <w:color w:val="40a070"/>
+    </w:rPr>
+  </w:style>
+  <w:style w:customStyle="1" w:styleId="ConstantTok" w:type="character">
+    <w:name w:val="ConstantTok"/>
+    <w:basedOn w:val="VerbatimChar"/>
+    <w:rPr>
+      <w:color w:val="880000"/>
+    </w:rPr>
+  </w:style>
+  <w:style w:customStyle="1" w:styleId="CharTok" w:type="character">
+    <w:name w:val="CharTok"/>
+    <w:basedOn w:val="VerbatimChar"/>
+    <w:rPr>
+      <w:color w:val="4070a0"/>
+    </w:rPr>
+  </w:style>
+  <w:style w:customStyle="1" w:styleId="SpecialCharTok" w:type="character">
+    <w:name w:val="SpecialCharTok"/>
+    <w:basedOn w:val="VerbatimChar"/>
+    <w:rPr>
+      <w:color w:val="4070a0"/>
+    </w:rPr>
+  </w:style>
+  <w:style w:customStyle="1" w:styleId="StringTok" w:type="character">
+    <w:name w:val="StringTok"/>
+    <w:basedOn w:val="VerbatimChar"/>
+    <w:rPr>
+      <w:color w:val="4070a0"/>
+    </w:rPr>
+  </w:style>
+  <w:style w:customStyle="1" w:styleId="VerbatimStringTok" w:type="character">
+    <w:name w:val="VerbatimStringTok"/>
+    <w:basedOn w:val="VerbatimChar"/>
+    <w:rPr>
+      <w:color w:val="4070a0"/>
+    </w:rPr>
+  </w:style>
+  <w:style w:customStyle="1" w:styleId="SpecialStringTok" w:type="character">
+    <w:name w:val="SpecialStringTok"/>
+    <w:basedOn w:val="VerbatimChar"/>
+    <w:rPr>
+      <w:color w:val="bb6688"/>
+    </w:rPr>
+  </w:style>
+  <w:style w:customStyle="1" w:styleId="ImportTok" w:type="character">
+    <w:name w:val="ImportTok"/>
+    <w:basedOn w:val="VerbatimChar"/>
+    <w:rPr>
+      <w:b/>
+      <w:color w:val="008000"/>
+    </w:rPr>
+  </w:style>
+  <w:style w:customStyle="1" w:styleId="CommentTok" w:type="character">
+    <w:name w:val="CommentTok"/>
+    <w:basedOn w:val="VerbatimChar"/>
+    <w:rPr>
+      <w:i/>
+      <w:color w:val="60a0b0"/>
+    </w:rPr>
+  </w:style>
+  <w:style w:customStyle="1" w:styleId="DocumentationTok" w:type="character">
+    <w:name w:val="DocumentationTok"/>
+    <w:basedOn w:val="VerbatimChar"/>
+    <w:rPr>
+      <w:i/>
+      <w:color w:val="ba2121"/>
+    </w:rPr>
+  </w:style>
+  <w:style w:customStyle="1" w:styleId="AnnotationTok" w:type="character">
+    <w:name w:val="AnnotationTok"/>
+    <w:basedOn w:val="VerbatimChar"/>
+    <w:rPr>
+      <w:b/>
+      <w:i/>
+      <w:color w:val="60a0b0"/>
+    </w:rPr>
+  </w:style>
+  <w:style w:customStyle="1" w:styleId="CommentVarTok" w:type="character">
+    <w:name w:val="CommentVarTok"/>
+    <w:basedOn w:val="VerbatimChar"/>
+    <w:rPr>
+      <w:b/>
+      <w:i/>
+      <w:color w:val="60a0b0"/>
+    </w:rPr>
+  </w:style>
+  <w:style w:customStyle="1" w:styleId="OtherTok" w:type="character">
+    <w:name w:val="OtherTok"/>
+    <w:basedOn w:val="VerbatimChar"/>
+    <w:rPr>
+      <w:color w:val="007020"/>
+    </w:rPr>
+  </w:style>
+  <w:style w:customStyle="1" w:styleId="FunctionTok" w:type="character">
+    <w:name w:val="FunctionTok"/>
+    <w:basedOn w:val="VerbatimChar"/>
+    <w:rPr>
+      <w:color w:val="06287e"/>
+    </w:rPr>
+  </w:style>
+  <w:style w:customStyle="1" w:styleId="VariableTok" w:type="character">
+    <w:name w:val="VariableTok"/>
+    <w:basedOn w:val="VerbatimChar"/>
+    <w:rPr>
+      <w:color w:val="19177c"/>
+    </w:rPr>
+  </w:style>
+  <w:style w:customStyle="1" w:styleId="ControlFlowTok" w:type="character">
+    <w:name w:val="ControlFlowTok"/>
+    <w:basedOn w:val="VerbatimChar"/>
+    <w:rPr>
+      <w:b/>
+      <w:color w:val="007020"/>
+    </w:rPr>
+  </w:style>
+  <w:style w:customStyle="1" w:styleId="OperatorTok" w:type="character">
+    <w:name w:val="OperatorTok"/>
+    <w:basedOn w:val="VerbatimChar"/>
+    <w:rPr>
+      <w:color w:val="666666"/>
+    </w:rPr>
+  </w:style>
+  <w:style w:customStyle="1" w:styleId="BuiltInTok" w:type="character">
+    <w:name w:val="BuiltInTok"/>
+    <w:basedOn w:val="VerbatimChar"/>
+    <w:rPr>
+      <w:color w:val="008000"/>
+    </w:rPr>
+  </w:style>
+  <w:style w:customStyle="1" w:styleId="ExtensionTok" w:type="character">
+    <w:name w:val="ExtensionTok"/>
+    <w:basedOn w:val="VerbatimChar"/>
+    <w:rPr/>
+  </w:style>
+  <w:style w:customStyle="1" w:styleId="PreprocessorTok" w:type="character">
+    <w:name w:val="PreprocessorTok"/>
+    <w:basedOn w:val="VerbatimChar"/>
+    <w:rPr>
+      <w:color w:val="bc7a00"/>
+    </w:rPr>
+  </w:style>
+  <w:style w:customStyle="1" w:styleId="AttributeTok" w:type="character">
+    <w:name w:val="AttributeTok"/>
+    <w:basedOn w:val="VerbatimChar"/>
+    <w:rPr>
+      <w:color w:val="7d9029"/>
+    </w:rPr>
+  </w:style>
+  <w:style w:customStyle="1" w:styleId="RegionMarkerTok" w:type="character">
+    <w:name w:val="RegionMarkerTok"/>
+    <w:basedOn w:val="VerbatimChar"/>
+    <w:rPr/>
+  </w:style>
+  <w:style w:customStyle="1" w:styleId="InformationTok" w:type="character">
+    <w:name w:val="InformationTok"/>
+    <w:basedOn w:val="VerbatimChar"/>
+    <w:rPr>
+      <w:b/>
+      <w:i/>
+      <w:color w:val="60a0b0"/>
+    </w:rPr>
+  </w:style>
+  <w:style w:customStyle="1" w:styleId="WarningTok" w:type="character">
+    <w:name w:val="WarningTok"/>
+    <w:basedOn w:val="VerbatimChar"/>
+    <w:rPr>
+      <w:b/>
+      <w:i/>
+      <w:color w:val="60a0b0"/>
+    </w:rPr>
+  </w:style>
+  <w:style w:customStyle="1" w:styleId="AlertTok" w:type="character">
+    <w:name w:val="AlertTok"/>
+    <w:basedOn w:val="VerbatimChar"/>
+    <w:rPr>
+      <w:b/>
+      <w:color w:val="ff0000"/>
+    </w:rPr>
+  </w:style>
+  <w:style w:customStyle="1" w:styleId="ErrorTok" w:type="character">
+    <w:name w:val="ErrorTok"/>
+    <w:basedOn w:val="VerbatimChar"/>
+    <w:rPr>
+      <w:b/>
+      <w:color w:val="ff0000"/>
+    </w:rPr>
+  </w:style>
+  <w:style w:customStyle="1" w:styleId="NormalTok" w:type="character">
+    <w:name w:val="NormalTok"/>
+    <w:basedOn w:val="VerbatimChar"/>
+    <w:rPr/>
   </w:style>
   <w:style w:customStyle="1" w:styleId="KeywordTok" w:type="character">
     <w:name w:val="KeywordTok"/>

</xml_diff>

<commit_message>
Use 1.5-IQR screening for all gas and ADG responses
</commit_message>
<xml_diff>
--- a/AFRI_Variables_Models_and_Datasets.docx
+++ b/AFRI_Variables_Models_and_Datasets.docx
@@ -16,7 +16,7 @@
         <w:pStyle w:val="FirstParagraph"/>
       </w:pPr>
       <w:r>
-        <w:t xml:space="preserve">Response screening uses Q1 − k × IQR and Q3 + k × IQR. All modeled CH4/CO2 responses (including daily means, whole-season emissions, per-hectare measures and gas-per-kg-gain ratios) and all three ADG responses (Smooth_Period_ADG, Whole_Season_Smooth_ADG_kg_day, RGP_Smooth_ADG_kg_day) use k = 0.5. Grazing_h and Traveling_h retain k = 0.5; Resting_h and mean_DDT_day retain k = 1. R type-7 quartiles are computed separately for each response within its analysis dataset, pooled across treatment groups. Table 1 uses animal-year season averages; other responses use their existing model observation scale. Values exactly on a fence are retained; fewer than four finite values are unscreened. Original datasets remain intact and each model uses its own retained subset. Response_IQR_Summary, Response_IQR_Audit and Response_IQR_Excluded record canonical exclusions and multipliers. Global and eligible conditional GreenFeed source models also screen CH4_g_d/CO2_g_d at 0.5 × IQR; Source_Gas_IQR_Audit records their source-specific exclusions. Model families and formulas remain unchanged. Distribution PNGs compare raw analysis inputs with actual model data in 06_Statistical_Analysis/03_Figures/Response_Distributions. Outcome-based screening should be reported with the results.</w:t>
+        <w:t xml:space="preserve">Response screening uses Q1 − k × IQR and Q3 + k × IQR. All modeled CH4/CO2 responses (including daily means, whole-season emissions, per-hectare measures and gas-per-kg-gain ratios) and all three ADG responses (Smooth_Period_ADG, Whole_Season_Smooth_ADG_kg_day, RGP_Smooth_ADG_kg_day) use k = 1.5. Grazing_h and Traveling_h retain k = 0.5; Resting_h and mean_DDT_day retain k = 1. R type-7 quartiles are computed separately for each response within its analysis dataset, pooled across treatment groups. Table 1 uses animal-year season averages; other responses use their existing model observation scale. Values exactly on a fence are retained; fewer than four finite values are unscreened. Original datasets remain intact and each model uses its own retained subset. Response_IQR_Summary, Response_IQR_Audit and Response_IQR_Excluded record canonical exclusions and multipliers. Global and eligible conditional GreenFeed source models also screen CH4_g_d/CO2_g_d at 1.5 × IQR; Source_Gas_IQR_Audit records their source-specific exclusions. Model families and formulas remain unchanged. Distribution PNGs compare raw analysis inputs with actual model data in 06_Statistical_Analysis/03_Figures/Response_Distributions. Outcome-based screening should be reported with the results.</w:t>
       </w:r>
     </w:p>
     <w:p>
@@ -16693,6 +16693,232 @@
     <w:pPr>
       <w:wordWrap w:val="off"/>
     </w:pPr>
+  </w:style>
+  <w:style w:customStyle="1" w:styleId="KeywordTok" w:type="character">
+    <w:name w:val="KeywordTok"/>
+    <w:basedOn w:val="VerbatimChar"/>
+    <w:rPr>
+      <w:b/>
+      <w:color w:val="007020"/>
+    </w:rPr>
+  </w:style>
+  <w:style w:customStyle="1" w:styleId="DataTypeTok" w:type="character">
+    <w:name w:val="DataTypeTok"/>
+    <w:basedOn w:val="VerbatimChar"/>
+    <w:rPr>
+      <w:color w:val="902000"/>
+    </w:rPr>
+  </w:style>
+  <w:style w:customStyle="1" w:styleId="DecValTok" w:type="character">
+    <w:name w:val="DecValTok"/>
+    <w:basedOn w:val="VerbatimChar"/>
+    <w:rPr>
+      <w:color w:val="40a070"/>
+    </w:rPr>
+  </w:style>
+  <w:style w:customStyle="1" w:styleId="BaseNTok" w:type="character">
+    <w:name w:val="BaseNTok"/>
+    <w:basedOn w:val="VerbatimChar"/>
+    <w:rPr>
+      <w:color w:val="40a070"/>
+    </w:rPr>
+  </w:style>
+  <w:style w:customStyle="1" w:styleId="FloatTok" w:type="character">
+    <w:name w:val="FloatTok"/>
+    <w:basedOn w:val="VerbatimChar"/>
+    <w:rPr>
+      <w:color w:val="40a070"/>
+    </w:rPr>
+  </w:style>
+  <w:style w:customStyle="1" w:styleId="ConstantTok" w:type="character">
+    <w:name w:val="ConstantTok"/>
+    <w:basedOn w:val="VerbatimChar"/>
+    <w:rPr>
+      <w:color w:val="880000"/>
+    </w:rPr>
+  </w:style>
+  <w:style w:customStyle="1" w:styleId="CharTok" w:type="character">
+    <w:name w:val="CharTok"/>
+    <w:basedOn w:val="VerbatimChar"/>
+    <w:rPr>
+      <w:color w:val="4070a0"/>
+    </w:rPr>
+  </w:style>
+  <w:style w:customStyle="1" w:styleId="SpecialCharTok" w:type="character">
+    <w:name w:val="SpecialCharTok"/>
+    <w:basedOn w:val="VerbatimChar"/>
+    <w:rPr>
+      <w:color w:val="4070a0"/>
+    </w:rPr>
+  </w:style>
+  <w:style w:customStyle="1" w:styleId="StringTok" w:type="character">
+    <w:name w:val="StringTok"/>
+    <w:basedOn w:val="VerbatimChar"/>
+    <w:rPr>
+      <w:color w:val="4070a0"/>
+    </w:rPr>
+  </w:style>
+  <w:style w:customStyle="1" w:styleId="VerbatimStringTok" w:type="character">
+    <w:name w:val="VerbatimStringTok"/>
+    <w:basedOn w:val="VerbatimChar"/>
+    <w:rPr>
+      <w:color w:val="4070a0"/>
+    </w:rPr>
+  </w:style>
+  <w:style w:customStyle="1" w:styleId="SpecialStringTok" w:type="character">
+    <w:name w:val="SpecialStringTok"/>
+    <w:basedOn w:val="VerbatimChar"/>
+    <w:rPr>
+      <w:color w:val="bb6688"/>
+    </w:rPr>
+  </w:style>
+  <w:style w:customStyle="1" w:styleId="ImportTok" w:type="character">
+    <w:name w:val="ImportTok"/>
+    <w:basedOn w:val="VerbatimChar"/>
+    <w:rPr>
+      <w:b/>
+      <w:color w:val="008000"/>
+    </w:rPr>
+  </w:style>
+  <w:style w:customStyle="1" w:styleId="CommentTok" w:type="character">
+    <w:name w:val="CommentTok"/>
+    <w:basedOn w:val="VerbatimChar"/>
+    <w:rPr>
+      <w:i/>
+      <w:color w:val="60a0b0"/>
+    </w:rPr>
+  </w:style>
+  <w:style w:customStyle="1" w:styleId="DocumentationTok" w:type="character">
+    <w:name w:val="DocumentationTok"/>
+    <w:basedOn w:val="VerbatimChar"/>
+    <w:rPr>
+      <w:i/>
+      <w:color w:val="ba2121"/>
+    </w:rPr>
+  </w:style>
+  <w:style w:customStyle="1" w:styleId="AnnotationTok" w:type="character">
+    <w:name w:val="AnnotationTok"/>
+    <w:basedOn w:val="VerbatimChar"/>
+    <w:rPr>
+      <w:b/>
+      <w:i/>
+      <w:color w:val="60a0b0"/>
+    </w:rPr>
+  </w:style>
+  <w:style w:customStyle="1" w:styleId="CommentVarTok" w:type="character">
+    <w:name w:val="CommentVarTok"/>
+    <w:basedOn w:val="VerbatimChar"/>
+    <w:rPr>
+      <w:b/>
+      <w:i/>
+      <w:color w:val="60a0b0"/>
+    </w:rPr>
+  </w:style>
+  <w:style w:customStyle="1" w:styleId="OtherTok" w:type="character">
+    <w:name w:val="OtherTok"/>
+    <w:basedOn w:val="VerbatimChar"/>
+    <w:rPr>
+      <w:color w:val="007020"/>
+    </w:rPr>
+  </w:style>
+  <w:style w:customStyle="1" w:styleId="FunctionTok" w:type="character">
+    <w:name w:val="FunctionTok"/>
+    <w:basedOn w:val="VerbatimChar"/>
+    <w:rPr>
+      <w:color w:val="06287e"/>
+    </w:rPr>
+  </w:style>
+  <w:style w:customStyle="1" w:styleId="VariableTok" w:type="character">
+    <w:name w:val="VariableTok"/>
+    <w:basedOn w:val="VerbatimChar"/>
+    <w:rPr>
+      <w:color w:val="19177c"/>
+    </w:rPr>
+  </w:style>
+  <w:style w:customStyle="1" w:styleId="ControlFlowTok" w:type="character">
+    <w:name w:val="ControlFlowTok"/>
+    <w:basedOn w:val="VerbatimChar"/>
+    <w:rPr>
+      <w:b/>
+      <w:color w:val="007020"/>
+    </w:rPr>
+  </w:style>
+  <w:style w:customStyle="1" w:styleId="OperatorTok" w:type="character">
+    <w:name w:val="OperatorTok"/>
+    <w:basedOn w:val="VerbatimChar"/>
+    <w:rPr>
+      <w:color w:val="666666"/>
+    </w:rPr>
+  </w:style>
+  <w:style w:customStyle="1" w:styleId="BuiltInTok" w:type="character">
+    <w:name w:val="BuiltInTok"/>
+    <w:basedOn w:val="VerbatimChar"/>
+    <w:rPr>
+      <w:color w:val="008000"/>
+    </w:rPr>
+  </w:style>
+  <w:style w:customStyle="1" w:styleId="ExtensionTok" w:type="character">
+    <w:name w:val="ExtensionTok"/>
+    <w:basedOn w:val="VerbatimChar"/>
+    <w:rPr/>
+  </w:style>
+  <w:style w:customStyle="1" w:styleId="PreprocessorTok" w:type="character">
+    <w:name w:val="PreprocessorTok"/>
+    <w:basedOn w:val="VerbatimChar"/>
+    <w:rPr>
+      <w:color w:val="bc7a00"/>
+    </w:rPr>
+  </w:style>
+  <w:style w:customStyle="1" w:styleId="AttributeTok" w:type="character">
+    <w:name w:val="AttributeTok"/>
+    <w:basedOn w:val="VerbatimChar"/>
+    <w:rPr>
+      <w:color w:val="7d9029"/>
+    </w:rPr>
+  </w:style>
+  <w:style w:customStyle="1" w:styleId="RegionMarkerTok" w:type="character">
+    <w:name w:val="RegionMarkerTok"/>
+    <w:basedOn w:val="VerbatimChar"/>
+    <w:rPr/>
+  </w:style>
+  <w:style w:customStyle="1" w:styleId="InformationTok" w:type="character">
+    <w:name w:val="InformationTok"/>
+    <w:basedOn w:val="VerbatimChar"/>
+    <w:rPr>
+      <w:b/>
+      <w:i/>
+      <w:color w:val="60a0b0"/>
+    </w:rPr>
+  </w:style>
+  <w:style w:customStyle="1" w:styleId="WarningTok" w:type="character">
+    <w:name w:val="WarningTok"/>
+    <w:basedOn w:val="VerbatimChar"/>
+    <w:rPr>
+      <w:b/>
+      <w:i/>
+      <w:color w:val="60a0b0"/>
+    </w:rPr>
+  </w:style>
+  <w:style w:customStyle="1" w:styleId="AlertTok" w:type="character">
+    <w:name w:val="AlertTok"/>
+    <w:basedOn w:val="VerbatimChar"/>
+    <w:rPr>
+      <w:b/>
+      <w:color w:val="ff0000"/>
+    </w:rPr>
+  </w:style>
+  <w:style w:customStyle="1" w:styleId="ErrorTok" w:type="character">
+    <w:name w:val="ErrorTok"/>
+    <w:basedOn w:val="VerbatimChar"/>
+    <w:rPr>
+      <w:b/>
+      <w:color w:val="ff0000"/>
+    </w:rPr>
+  </w:style>
+  <w:style w:customStyle="1" w:styleId="NormalTok" w:type="character">
+    <w:name w:val="NormalTok"/>
+    <w:basedOn w:val="VerbatimChar"/>
+    <w:rPr/>
   </w:style>
   <w:style w:customStyle="1" w:styleId="KeywordTok" w:type="character">
     <w:name w:val="KeywordTok"/>

</xml_diff>